<commit_message>
Revise File Skripsi/Sri Darni.docx directly (remove point 9 & 10, standardize mediasi)
</commit_message>
<xml_diff>
--- a/File Skripsi/Sri Darni.docx
+++ b/File Skripsi/Sri Darni.docx
@@ -370,7 +370,6 @@
           <w:sz w:val="28"/>
           <w:szCs w:val="28"/>
         </w:rPr>
-        <w:lastRenderedPageBreak/>
         <w:t>PENGARUH GAYA KEPEMIMPINAN DAN KOMPENSASI TERHADAP KINERJA PERANGKAT DESA DENGAN MOTIVASI KERJA SEBAGAI VARIABEL MEDIASI DI KANTOR DESA PISANGAN JAYA KABUPATEN TANGERANG</w:t>
       </w:r>
     </w:p>
@@ -741,7 +740,6 @@
         <w:ind w:right="1089"/>
       </w:pPr>
       <w:r>
-        <w:lastRenderedPageBreak/>
         <w:t>ABSTRAK</w:t>
       </w:r>
       <w:bookmarkEnd w:id="4"/>
@@ -906,7 +904,6 @@
       </w:pPr>
       <w:bookmarkStart w:id="5" w:name="_Toc235393105"/>
       <w:r>
-        <w:lastRenderedPageBreak/>
         <w:t>ABSTRACT</w:t>
       </w:r>
       <w:bookmarkEnd w:id="5"/>
@@ -1123,7 +1120,6 @@
       </w:pPr>
       <w:bookmarkStart w:id="6" w:name="_Toc235393106"/>
       <w:r>
-        <w:lastRenderedPageBreak/>
         <w:t>KATA PENGANTAR</w:t>
       </w:r>
       <w:bookmarkEnd w:id="6"/>
@@ -1143,7 +1139,21 @@
           <w:b/>
           <w:bCs/>
         </w:rPr>
-        <w:t>PENGARUH GAYA KEPEMIMPINAN DAN KOMPENSASI TERHADAP KINERJA PERANGKAT DESA DENGAN MOTIVASI KERJA SEBAGAI VARIABEL INTERVENING PADA KANTOR DESA PISANGAN JAYA, KABUPATEN TANGERANG.</w:t>
+        <w:t xml:space="preserve">PENGARUH GAYA KEPEMIMPINAN DAN KOMPENSASI TERHADAP KINERJA PERANGKAT DESA DENGAN MOTIVASI KERJA SEBAGAI VARIABEL </w:t>
+      </w:r>
+      <w:r>
+        <w:rPr>
+          <w:b/>
+          <w:bCs/>
+        </w:rPr>
+        <w:t>MEDIASI</w:t>
+      </w:r>
+      <w:r>
+        <w:rPr>
+          <w:b/>
+          <w:bCs/>
+        </w:rPr>
+        <w:t xml:space="preserve"> PADA KANTOR DESA PISANGAN JAYA, KABUPATEN TANGERANG.</w:t>
       </w:r>
     </w:p>
     <w:p>
@@ -1384,7 +1394,6 @@
           <w:sz w:val="24"/>
           <w:szCs w:val="24"/>
         </w:rPr>
-        <w:lastRenderedPageBreak/>
         <w:t>Teman-teman diskusi yang telah banyak membantu penulis dalam menyusun skripsi.</w:t>
       </w:r>
     </w:p>
@@ -1593,7 +1602,6 @@
           <w:szCs w:val="28"/>
           <w:lang w:val="en-US"/>
         </w:rPr>
-        <w:lastRenderedPageBreak/>
         <w:t>DAFTAR ISI</w:t>
       </w:r>
       <w:bookmarkEnd w:id="7"/>
@@ -3504,7 +3512,6 @@
         <w:rPr>
           <w:szCs w:val="28"/>
         </w:rPr>
-        <w:lastRenderedPageBreak/>
         <w:t>BAB I</w:t>
       </w:r>
       <w:r>
@@ -3613,11 +3620,7 @@
         <w:jc w:val="both"/>
       </w:pPr>
       <w:r>
-        <w:t xml:space="preserve">Selain gaya kepemimpinan, dalam meningkatkan kinerja perangkat desa, pemberian kompensasi memiliki peran yang penting. Kompensasi merupakan hal yang penting untuk pegawai karena dengan pemberian kompensasi dapat menjadi upaya instansi dalam meningkatkan motivasi kerja. Apabila kompensasi diberikan </w:t>
-      </w:r>
-      <w:r>
-        <w:lastRenderedPageBreak/>
-        <w:t>sesuai dan sepadan dengan pekerjaan, maka hal itu dapat membuat pegawai lebih berusaha meningkatkan kinerjanya. Kompensasi berpengaruh terhadap kinerja, seperti penelitian yang telah dilakukan oleh Guntoro dkk. (2024), Putri &amp; Rozi (2024), dan Satria dkk. (2024).</w:t>
+        <w:t>Selain gaya kepemimpinan, dalam meningkatkan kinerja perangkat desa, pemberian kompensasi memiliki peran yang penting. Kompensasi merupakan hal yang penting untuk pegawai karena dengan pemberian kompensasi dapat menjadi upaya instansi dalam meningkatkan motivasi kerja. Apabila kompensasi diberikan sesuai dan sepadan dengan pekerjaan, maka hal itu dapat membuat pegawai lebih berusaha meningkatkan kinerjanya. Kompensasi berpengaruh terhadap kinerja, seperti penelitian yang telah dilakukan oleh Guntoro dkk. (2024), Putri &amp; Rozi (2024), dan Satria dkk. (2024).</w:t>
       </w:r>
     </w:p>
     <w:p>
@@ -3667,7 +3670,6 @@
         <w:jc w:val="both"/>
       </w:pPr>
       <w:r>
-        <w:lastRenderedPageBreak/>
         <w:t>Tinggi rendahnya kinerja pegawai tidak terlepas dari peran seorang pemimpin. Sebaliknya, di Kantor Desa Pisangan Jaya, terindikasi adanya permasalahan terkait gaya kepemimpinan, seperti komunikasi dan penyampaian instruksi dari pimpinan yang masih bersifat satu arah sehingga menimbulkan kesalahpahaman, kurangnya pemberian apresiasi dan umpan balik secara langsung dari pimpinan terhadap hasil kerja yang berdampak pada penurunan motivasi, koordinasi dan pengarahan dari pimpinan yang belum dilakukan secara konsisten, pimpinan belum melibatkan perangkat desa secara optimal dalam proses pengambilan keputusan, serta kurangnya pembinaan dan evaluasi kinerja secara berkala oleh pimpinan.</w:t>
       </w:r>
     </w:p>
@@ -3835,7 +3837,6 @@
           <w:sz w:val="24"/>
           <w:szCs w:val="24"/>
         </w:rPr>
-        <w:lastRenderedPageBreak/>
         <w:t>Gaya kepemimpinan berpengaruh pada kinerja perangkat desa.</w:t>
       </w:r>
     </w:p>
@@ -4277,7 +4278,6 @@
           <w:sz w:val="24"/>
           <w:szCs w:val="24"/>
         </w:rPr>
-        <w:lastRenderedPageBreak/>
         <w:t>Bagaimana motivasi kerja memediasi gaya kepemimpinan terhadap kinerja perangkat desa Kantor Desa Pisangan Jaya, Kabupaten Tangerang?</w:t>
       </w:r>
     </w:p>
@@ -4611,7 +4611,6 @@
           <w:sz w:val="24"/>
           <w:szCs w:val="24"/>
         </w:rPr>
-        <w:lastRenderedPageBreak/>
         <w:t xml:space="preserve">Manfaat Praktis </w:t>
       </w:r>
     </w:p>
@@ -4897,15 +4896,7 @@
           <w:sz w:val="24"/>
           <w:szCs w:val="24"/>
         </w:rPr>
-        <w:t xml:space="preserve"> Uraian dalam bab V ini mencakup kesimpulan, implikasi, keterbatasan, dan rekomendasi. Beberapa kesimpulan ditarik berdasarkan atas perumusan masalah, hipotesis, analisis hasil penelitian, dan persyaratan-persyaratan analisis. Kesimpulan dipakai </w:t>
-      </w:r>
-      <w:r>
-        <w:rPr>
-          <w:sz w:val="24"/>
-          <w:szCs w:val="24"/>
-        </w:rPr>
-        <w:lastRenderedPageBreak/>
-        <w:t>sebagai dasar untuk merumuskan saran-saran sebagai langkah pemecahan masalah.</w:t>
+        <w:t xml:space="preserve"> Uraian dalam bab V ini mencakup kesimpulan, implikasi, keterbatasan, dan rekomendasi. Beberapa kesimpulan ditarik berdasarkan atas perumusan masalah, hipotesis, analisis hasil penelitian, dan persyaratan-persyaratan analisis. Kesimpulan dipakai sebagai dasar untuk merumuskan saran-saran sebagai langkah pemecahan masalah.</w:t>
       </w:r>
     </w:p>
     <w:p>
@@ -5352,7 +5343,6 @@
       </w:pPr>
       <w:bookmarkStart w:id="19" w:name="_Toc235393117"/>
       <w:r>
-        <w:lastRenderedPageBreak/>
         <w:t>A.    Landasan Teori</w:t>
       </w:r>
       <w:bookmarkEnd w:id="19"/>
@@ -5715,7 +5705,6 @@
           <w:sz w:val="24"/>
           <w:szCs w:val="24"/>
         </w:rPr>
-        <w:lastRenderedPageBreak/>
         <w:t>Kualitas, yaitu tingkat proses atau hasil dari suatu kegiatan yang sempurna, dengan kata lain melaksanakan kegiatan dengan cara ideal atau sesuai dengan tujuan yang telah ditetapkan, atau dengan cara yang paling berkualitas.</w:t>
       </w:r>
     </w:p>
@@ -6049,7 +6038,6 @@
           <w:sz w:val="24"/>
           <w:szCs w:val="24"/>
         </w:rPr>
-        <w:lastRenderedPageBreak/>
         <w:t>Menurut Thoha (2018:49), gaya kepemimpinan merupakan norma perilaku yang digunakan oleh seseorang pada saat orang tersebut mencoba mempengaruhi perilaku orang lain seperti yang ia lihat. Gaya kepemimpinan yang efektif harus mampu menyesuaikan dengan situasi dan kondisi bawahannya.</w:t>
       </w:r>
     </w:p>
@@ -6290,16 +6278,7 @@
           <w:sz w:val="24"/>
           <w:szCs w:val="24"/>
         </w:rPr>
-        <w:t xml:space="preserve">Menurut Bahits dkk. (2023:109), kompensasi merupakan faktor penting dalam manajemen sumber daya manusia yang berkaitan dengan penghargaan yang diberikan kepada pegawai atas kontribusi mereka pada organisasi. Kompensasi mencakup hal-hal seperti gaji, tunjangan, bonus, dan manfaat lainnya. Sebagai faktor penting dalam manajemen sumber daya manusia, kompensasi juga memainkan peran yang sangat penting </w:t>
-      </w:r>
-      <w:r>
-        <w:rPr>
-          <w:color w:val="000000" w:themeColor="text1"/>
-          <w:sz w:val="24"/>
-          <w:szCs w:val="24"/>
-        </w:rPr>
-        <w:lastRenderedPageBreak/>
-        <w:t>dalam hubungan kerja.</w:t>
+        <w:t>Menurut Bahits dkk. (2023:109), kompensasi merupakan faktor penting dalam manajemen sumber daya manusia yang berkaitan dengan penghargaan yang diberikan kepada pegawai atas kontribusi mereka pada organisasi. Kompensasi mencakup hal-hal seperti gaji, tunjangan, bonus, dan manfaat lainnya. Sebagai faktor penting dalam manajemen sumber daya manusia, kompensasi juga memainkan peran yang sangat penting dalam hubungan kerja.</w:t>
       </w:r>
     </w:p>
     <w:p>
@@ -7043,16 +7022,7 @@
                 <w:szCs w:val="24"/>
                 <w:lang w:val="en-ID" w:eastAsia="en-ID"/>
               </w:rPr>
-              <w:t xml:space="preserve">Suplai dan </w:t>
-            </w:r>
-            <w:r>
-              <w:rPr>
-                <w:sz w:val="24"/>
-                <w:szCs w:val="24"/>
-                <w:lang w:val="en-ID" w:eastAsia="en-ID"/>
-              </w:rPr>
-              <w:lastRenderedPageBreak/>
-              <w:t>permintaan pegawai</w:t>
+              <w:t>Suplai dan permintaan pegawai</w:t>
             </w:r>
           </w:p>
         </w:tc>
@@ -7093,17 +7063,7 @@
                 <w:szCs w:val="24"/>
                 <w:lang w:val="en-ID" w:eastAsia="en-ID"/>
               </w:rPr>
-              <w:lastRenderedPageBreak/>
-              <w:t xml:space="preserve">Banyak sedikitnya pegawai di pasar kerja akan memengaruhi sistem </w:t>
-            </w:r>
-            <w:r>
-              <w:rPr>
-                <w:sz w:val="24"/>
-                <w:szCs w:val="24"/>
-                <w:lang w:val="en-ID" w:eastAsia="en-ID"/>
-              </w:rPr>
-              <w:lastRenderedPageBreak/>
-              <w:t>pemberian kompensasi. Pegawai yang tidak memiliki kemampuan dan keterampilan di atas rata-rata akan diberikan kompensasi yang lebih rendah.</w:t>
+              <w:t>Banyak sedikitnya pegawai di pasar kerja akan memengaruhi sistem pemberian kompensasi. Pegawai yang tidak memiliki kemampuan dan keterampilan di atas rata-rata akan diberikan kompensasi yang lebih rendah.</w:t>
             </w:r>
           </w:p>
         </w:tc>
@@ -7149,7 +7109,6 @@
                 <w:szCs w:val="24"/>
                 <w:lang w:val="en-ID" w:eastAsia="en-ID"/>
               </w:rPr>
-              <w:lastRenderedPageBreak/>
               <w:t>5</w:t>
             </w:r>
           </w:p>
@@ -7494,16 +7453,7 @@
           <w:sz w:val="24"/>
           <w:szCs w:val="24"/>
         </w:rPr>
-        <w:t xml:space="preserve"> Pemerintah berperan dalam menentukan batas minimal pembayaran upah kepada karyawan, </w:t>
-      </w:r>
-      <w:r>
-        <w:rPr>
-          <w:color w:val="000000" w:themeColor="text1"/>
-          <w:sz w:val="24"/>
-          <w:szCs w:val="24"/>
-        </w:rPr>
-        <w:lastRenderedPageBreak/>
-        <w:t>sehingga secara langsung mempengaruhi penetapan kompensasi yang dilakukan oleh suatu organisasi. Regulasi yang dikeluarkan pemerintah seperti Upah Minimum Regional (UMR) atau ketentuan upah bagi Aparatur Sipil Negara (ASN) wajib dijadikan acuan oleh setiap instansi dalam menetapkan besaran kompensasi.</w:t>
+        <w:t xml:space="preserve"> Pemerintah berperan dalam menentukan batas minimal pembayaran upah kepada karyawan, sehingga secara langsung mempengaruhi penetapan kompensasi yang dilakukan oleh suatu organisasi. Regulasi yang dikeluarkan pemerintah seperti Upah Minimum Regional (UMR) atau ketentuan upah bagi Aparatur Sipil Negara (ASN) wajib dijadikan acuan oleh setiap instansi dalam menetapkan besaran kompensasi.</w:t>
       </w:r>
     </w:p>
     <w:p>
@@ -7682,7 +7632,6 @@
           <w:sz w:val="24"/>
           <w:szCs w:val="24"/>
         </w:rPr>
-        <w:lastRenderedPageBreak/>
         <w:t>Menurut Hasibuan (2019:141), motivasi adalah pemberian daya penggerak yang menciptakan kegairahan kerja seseorang, agar mereka mau bekerja sama, bekerja efektif, dan terintegrasi dengan segala daya upayanya untuk mencapai kepuasan. Motivasi yang diberikan kepada pegawai menjadi salah satu unsur terpenting dalam pengelolaan sumber daya manusia, karena berpengaruh langsung terhadap semangat dan produktivitas kerja.</w:t>
       </w:r>
     </w:p>
@@ -7767,16 +7716,7 @@
           <w:sz w:val="24"/>
           <w:szCs w:val="24"/>
         </w:rPr>
-        <w:t xml:space="preserve">Menurut Hasibuan (2019:150), motivasi dapat terbentuk dari dua sumber utama. Pertama, motivasi positif, yaitu manajer memotivasi bawahan dengan memberikan hadiah kepada mereka yang berprestasi </w:t>
-      </w:r>
-      <w:r>
-        <w:rPr>
-          <w:color w:val="000000" w:themeColor="text1"/>
-          <w:sz w:val="24"/>
-          <w:szCs w:val="24"/>
-        </w:rPr>
-        <w:lastRenderedPageBreak/>
-        <w:t>baik. Kedua, motivasi negatif, yaitu manajer memotivasi bawahan dengan memberikan hukuman kepada mereka yang pekerjaannya kurang baik. Lebih lanjut, faktor-faktor yang mempengaruhi motivasi kerja pegawai adalah sebagai berikut:</w:t>
+        <w:t>Menurut Hasibuan (2019:150), motivasi dapat terbentuk dari dua sumber utama. Pertama, motivasi positif, yaitu manajer memotivasi bawahan dengan memberikan hadiah kepada mereka yang berprestasi baik. Kedua, motivasi negatif, yaitu manajer memotivasi bawahan dengan memberikan hukuman kepada mereka yang pekerjaannya kurang baik. Lebih lanjut, faktor-faktor yang mempengaruhi motivasi kerja pegawai adalah sebagai berikut:</w:t>
       </w:r>
     </w:p>
     <w:p>
@@ -7953,7 +7893,6 @@
           <w:sz w:val="24"/>
           <w:szCs w:val="24"/>
         </w:rPr>
-        <w:lastRenderedPageBreak/>
         <w:t>Kebutuhan Aktualisasi Diri.</w:t>
       </w:r>
       <w:r>
@@ -8086,7 +8025,23 @@
           <w:sz w:val="24"/>
           <w:szCs w:val="24"/>
         </w:rPr>
-        <w:t>Beberapa penelitian terdahulu dengan topik mengenai gaya kepemimpinan dan kompensasi terhadap kinerja dengan motivasi kerja sebagai variabel intervening, antara lain:</w:t>
+        <w:t xml:space="preserve">Beberapa penelitian terdahulu dengan topik mengenai gaya kepemimpinan dan kompensasi terhadap kinerja dengan motivasi kerja sebagai variabel </w:t>
+      </w:r>
+      <w:r>
+        <w:rPr>
+          <w:color w:val="000000" w:themeColor="text1"/>
+          <w:sz w:val="24"/>
+          <w:szCs w:val="24"/>
+        </w:rPr>
+        <w:t>Mediasi</w:t>
+      </w:r>
+      <w:r>
+        <w:rPr>
+          <w:color w:val="000000" w:themeColor="text1"/>
+          <w:sz w:val="24"/>
+          <w:szCs w:val="24"/>
+        </w:rPr>
+        <w:t>, antara lain:</w:t>
       </w:r>
     </w:p>
     <w:p>
@@ -8106,7 +8061,6 @@
           <w:iCs/>
           <w:color w:val="000000" w:themeColor="text1"/>
         </w:rPr>
-        <w:lastRenderedPageBreak/>
         <w:t>Tabel 2.2</w:t>
       </w:r>
       <w:r>
@@ -8137,13 +8091,13 @@
         <w:tblLook w:val="04A0" w:firstRow="1" w:lastRow="0" w:firstColumn="1" w:lastColumn="0" w:noHBand="0" w:noVBand="1"/>
       </w:tblPr>
       <w:tblGrid>
-        <w:gridCol w:w="1214"/>
-        <w:gridCol w:w="1581"/>
-        <w:gridCol w:w="1085"/>
-        <w:gridCol w:w="1523"/>
-        <w:gridCol w:w="1252"/>
-        <w:gridCol w:w="1530"/>
-        <w:gridCol w:w="1549"/>
+        <w:gridCol w:w="1255"/>
+        <w:gridCol w:w="1642"/>
+        <w:gridCol w:w="1118"/>
+        <w:gridCol w:w="1575"/>
+        <w:gridCol w:w="945"/>
+        <w:gridCol w:w="1591"/>
+        <w:gridCol w:w="1608"/>
       </w:tblGrid>
       <w:tr>
         <w:trPr>
@@ -8573,7 +8527,7 @@
                 <w:szCs w:val="24"/>
                 <w:lang w:val="en-ID" w:eastAsia="en-ID"/>
               </w:rPr>
-              <w:t>Intervening</w:t>
+              <w:t>Mediasi</w:t>
             </w:r>
           </w:p>
         </w:tc>
@@ -8717,7 +8671,23 @@
                 <w:szCs w:val="24"/>
                 <w:lang w:val="en-ID" w:eastAsia="en-ID"/>
               </w:rPr>
-              <w:t>Pengaruh Gaya Kepemimpinan dan Kompensasi Terhadap Kinerja Karyawan Melalui Motivasi Kerja Sebagai Variable Intervening Pada PT. Karunia Jaya Global</w:t>
+              <w:t xml:space="preserve">Pengaruh Gaya Kepemimpinan dan Kompensasi Terhadap Kinerja Karyawan Melalui Motivasi Kerja Sebagai Variable </w:t>
+            </w:r>
+            <w:r>
+              <w:rPr>
+                <w:sz w:val="24"/>
+                <w:szCs w:val="24"/>
+                <w:lang w:val="en-ID" w:eastAsia="en-ID"/>
+              </w:rPr>
+              <w:t>Mediasi</w:t>
+            </w:r>
+            <w:r>
+              <w:rPr>
+                <w:sz w:val="24"/>
+                <w:szCs w:val="24"/>
+                <w:lang w:val="en-ID" w:eastAsia="en-ID"/>
+              </w:rPr>
+              <w:t xml:space="preserve"> Pada PT. Karunia Jaya Global</w:t>
             </w:r>
           </w:p>
         </w:tc>
@@ -9172,16 +9142,7 @@
                 <w:szCs w:val="24"/>
                 <w:lang w:val="en-ID" w:eastAsia="en-ID"/>
               </w:rPr>
-              <w:t xml:space="preserve">Secara parsial maupun simultan, gaya kepemimpinan transaksional dan kompensasi berpengaruh positif dan signifikan terhadap kinerja </w:t>
-            </w:r>
-            <w:r>
-              <w:rPr>
-                <w:sz w:val="24"/>
-                <w:szCs w:val="24"/>
-                <w:lang w:val="en-ID" w:eastAsia="en-ID"/>
-              </w:rPr>
-              <w:lastRenderedPageBreak/>
-              <w:t>melalui motivasi kerja.</w:t>
+              <w:t>Secara parsial maupun simultan, gaya kepemimpinan transaksional dan kompensasi berpengaruh positif dan signifikan terhadap kinerja melalui motivasi kerja.</w:t>
             </w:r>
           </w:p>
         </w:tc>
@@ -9222,7 +9183,6 @@
                 <w:szCs w:val="24"/>
                 <w:lang w:val="en-ID" w:eastAsia="en-ID"/>
               </w:rPr>
-              <w:lastRenderedPageBreak/>
               <w:t>Perbedaan terletak pada obyek penelitian dan jenis gaya kepemimpinan yang diteliti (transaksional).</w:t>
             </w:r>
           </w:p>
@@ -9309,7 +9269,23 @@
                 <w:szCs w:val="24"/>
                 <w:lang w:val="en-ID" w:eastAsia="en-ID"/>
               </w:rPr>
-              <w:t>Pengaruh Gaya Kepemimpinan, Kompensasi Terhadap Kinerja Dengan Motivasi Kerja Sebagai Variabel Intervening Pada PDAM Kabupaten Kediri</w:t>
+              <w:t xml:space="preserve">Pengaruh Gaya Kepemimpinan, Kompensasi Terhadap Kinerja Dengan Motivasi Kerja Sebagai Variabel </w:t>
+            </w:r>
+            <w:r>
+              <w:rPr>
+                <w:sz w:val="24"/>
+                <w:szCs w:val="24"/>
+                <w:lang w:val="en-ID" w:eastAsia="en-ID"/>
+              </w:rPr>
+              <w:t>Mediasi</w:t>
+            </w:r>
+            <w:r>
+              <w:rPr>
+                <w:sz w:val="24"/>
+                <w:szCs w:val="24"/>
+                <w:lang w:val="en-ID" w:eastAsia="en-ID"/>
+              </w:rPr>
+              <w:t xml:space="preserve"> Pada PDAM Kabupaten Kediri</w:t>
             </w:r>
           </w:p>
         </w:tc>
@@ -9600,7 +9576,23 @@
                 <w:szCs w:val="24"/>
                 <w:lang w:val="en-ID" w:eastAsia="en-ID"/>
               </w:rPr>
-              <w:t>Pengaruh Gaya Kepemimpinan dan Kompensasi terhadap Kinerja Karyawan melalui Motivasi Kerja sebagai Variabel Intervening pada Pamella Tiga Yogyakarta</w:t>
+              <w:t xml:space="preserve">Pengaruh Gaya Kepemimpinan dan Kompensasi terhadap Kinerja Karyawan melalui Motivasi Kerja sebagai Variabel </w:t>
+            </w:r>
+            <w:r>
+              <w:rPr>
+                <w:sz w:val="24"/>
+                <w:szCs w:val="24"/>
+                <w:lang w:val="en-ID" w:eastAsia="en-ID"/>
+              </w:rPr>
+              <w:t>Mediasi</w:t>
+            </w:r>
+            <w:r>
+              <w:rPr>
+                <w:sz w:val="24"/>
+                <w:szCs w:val="24"/>
+                <w:lang w:val="en-ID" w:eastAsia="en-ID"/>
+              </w:rPr>
+              <w:t xml:space="preserve"> pada Pamella Tiga Yogyakarta</w:t>
             </w:r>
           </w:p>
         </w:tc>
@@ -9851,16 +9843,7 @@
                 <w:szCs w:val="24"/>
                 <w:lang w:val="en-ID" w:eastAsia="en-ID"/>
               </w:rPr>
-              <w:t>Muhamma</w:t>
-            </w:r>
-            <w:r>
-              <w:rPr>
-                <w:sz w:val="24"/>
-                <w:szCs w:val="24"/>
-                <w:lang w:val="en-ID" w:eastAsia="en-ID"/>
-              </w:rPr>
-              <w:lastRenderedPageBreak/>
-              <w:t>d Bachtiar Bachrul Wahyudin &amp; I. Baidlowi (2025)</w:t>
+              <w:t>Muhammad Bachtiar Bachrul Wahyudin &amp; I. Baidlowi (2025)</w:t>
             </w:r>
           </w:p>
         </w:tc>
@@ -9900,17 +9883,23 @@
                 <w:szCs w:val="24"/>
                 <w:lang w:val="en-ID" w:eastAsia="en-ID"/>
               </w:rPr>
-              <w:lastRenderedPageBreak/>
-              <w:t xml:space="preserve">Pengaruh Gaya </w:t>
-            </w:r>
-            <w:r>
-              <w:rPr>
-                <w:sz w:val="24"/>
-                <w:szCs w:val="24"/>
-                <w:lang w:val="en-ID" w:eastAsia="en-ID"/>
-              </w:rPr>
-              <w:lastRenderedPageBreak/>
-              <w:t>Kepemimpinan, Lingkungan Kerja, dan Kompensasi terhadap Kinerja Karyawan dengan Motivasi Sebagai Variabel Intervening pada UD. Restu Bumi</w:t>
+              <w:t xml:space="preserve">Pengaruh Gaya Kepemimpinan, Lingkungan Kerja, dan Kompensasi terhadap Kinerja Karyawan dengan Motivasi Sebagai Variabel </w:t>
+            </w:r>
+            <w:r>
+              <w:rPr>
+                <w:sz w:val="24"/>
+                <w:szCs w:val="24"/>
+                <w:lang w:val="en-ID" w:eastAsia="en-ID"/>
+              </w:rPr>
+              <w:t>Mediasi</w:t>
+            </w:r>
+            <w:r>
+              <w:rPr>
+                <w:sz w:val="24"/>
+                <w:szCs w:val="24"/>
+                <w:lang w:val="en-ID" w:eastAsia="en-ID"/>
+              </w:rPr>
+              <w:t xml:space="preserve"> pada UD. Restu Bumi</w:t>
             </w:r>
           </w:p>
         </w:tc>
@@ -9951,17 +9940,7 @@
                 <w:szCs w:val="24"/>
                 <w:lang w:val="en-ID" w:eastAsia="en-ID"/>
               </w:rPr>
-              <w:lastRenderedPageBreak/>
-              <w:t xml:space="preserve">Kinerja </w:t>
-            </w:r>
-            <w:r>
-              <w:rPr>
-                <w:sz w:val="24"/>
-                <w:szCs w:val="24"/>
-                <w:lang w:val="en-ID" w:eastAsia="en-ID"/>
-              </w:rPr>
-              <w:lastRenderedPageBreak/>
-              <w:t>(Y)</w:t>
+              <w:t>Kinerja (Y)</w:t>
             </w:r>
           </w:p>
         </w:tc>
@@ -10002,17 +9981,7 @@
                 <w:szCs w:val="24"/>
                 <w:lang w:val="en-ID" w:eastAsia="en-ID"/>
               </w:rPr>
-              <w:lastRenderedPageBreak/>
-              <w:t xml:space="preserve">Gaya </w:t>
-            </w:r>
-            <w:r>
-              <w:rPr>
-                <w:sz w:val="24"/>
-                <w:szCs w:val="24"/>
-                <w:lang w:val="en-ID" w:eastAsia="en-ID"/>
-              </w:rPr>
-              <w:lastRenderedPageBreak/>
-              <w:t>Kepemimpinan (X1), Lingkungan Kerja (X2), dan Kompensasi (X3)</w:t>
+              <w:t>Gaya Kepemimpinan (X1), Lingkungan Kerja (X2), dan Kompensasi (X3)</w:t>
             </w:r>
           </w:p>
         </w:tc>
@@ -10053,17 +10022,7 @@
                 <w:szCs w:val="24"/>
                 <w:lang w:val="en-ID" w:eastAsia="en-ID"/>
               </w:rPr>
-              <w:lastRenderedPageBreak/>
-              <w:t xml:space="preserve">Motivasi </w:t>
-            </w:r>
-            <w:r>
-              <w:rPr>
-                <w:sz w:val="24"/>
-                <w:szCs w:val="24"/>
-                <w:lang w:val="en-ID" w:eastAsia="en-ID"/>
-              </w:rPr>
-              <w:lastRenderedPageBreak/>
-              <w:t>(Z)</w:t>
+              <w:t>Motivasi (Z)</w:t>
             </w:r>
           </w:p>
         </w:tc>
@@ -10104,17 +10063,23 @@
                 <w:szCs w:val="24"/>
                 <w:lang w:val="en-ID" w:eastAsia="en-ID"/>
               </w:rPr>
-              <w:lastRenderedPageBreak/>
-              <w:t xml:space="preserve">Gaya </w:t>
-            </w:r>
-            <w:r>
-              <w:rPr>
-                <w:sz w:val="24"/>
-                <w:szCs w:val="24"/>
-                <w:lang w:val="en-ID" w:eastAsia="en-ID"/>
-              </w:rPr>
-              <w:lastRenderedPageBreak/>
-              <w:t>kepemimpinan, lingkungan kerja, dan kompensasi berpengaruh positif dan signifikan terhadap kinerja karyawan, baik secara langsung maupun melalui motivasi sebagai variabel intervening.</w:t>
+              <w:t xml:space="preserve">Gaya kepemimpinan, lingkungan kerja, dan kompensasi berpengaruh positif dan signifikan terhadap kinerja karyawan, baik secara langsung maupun melalui motivasi sebagai variabel </w:t>
+            </w:r>
+            <w:r>
+              <w:rPr>
+                <w:sz w:val="24"/>
+                <w:szCs w:val="24"/>
+                <w:lang w:val="en-ID" w:eastAsia="en-ID"/>
+              </w:rPr>
+              <w:t>Mediasi</w:t>
+            </w:r>
+            <w:r>
+              <w:rPr>
+                <w:sz w:val="24"/>
+                <w:szCs w:val="24"/>
+                <w:lang w:val="en-ID" w:eastAsia="en-ID"/>
+              </w:rPr>
+              <w:t>.</w:t>
             </w:r>
           </w:p>
         </w:tc>
@@ -10155,17 +10120,7 @@
                 <w:szCs w:val="24"/>
                 <w:lang w:val="en-ID" w:eastAsia="en-ID"/>
               </w:rPr>
-              <w:lastRenderedPageBreak/>
-              <w:t xml:space="preserve">Perbedaan </w:t>
-            </w:r>
-            <w:r>
-              <w:rPr>
-                <w:sz w:val="24"/>
-                <w:szCs w:val="24"/>
-                <w:lang w:val="en-ID" w:eastAsia="en-ID"/>
-              </w:rPr>
-              <w:lastRenderedPageBreak/>
-              <w:t>terletak pada variabel bebas tambahan (lingkungan kerja) dan obyek penelitian.</w:t>
+              <w:t>Perbedaan terletak pada variabel bebas tambahan (lingkungan kerja) dan obyek penelitian.</w:t>
             </w:r>
           </w:p>
         </w:tc>
@@ -10211,7 +10166,6 @@
                 <w:szCs w:val="24"/>
                 <w:lang w:val="en-ID" w:eastAsia="en-ID"/>
               </w:rPr>
-              <w:lastRenderedPageBreak/>
               <w:t>Guntoro, Djunaedi, &amp; Utami (2024)</w:t>
             </w:r>
           </w:p>
@@ -10252,7 +10206,23 @@
                 <w:szCs w:val="24"/>
                 <w:lang w:val="en-ID" w:eastAsia="en-ID"/>
               </w:rPr>
-              <w:t>Pengaruh Kompensasi Terhadap Kinerja Pegawai Dengan Motivasi Kerja Sebagai Variabel Intervening pada Dinas Koperasi Nganjuk</w:t>
+              <w:t xml:space="preserve">Pengaruh Kompensasi Terhadap Kinerja Pegawai Dengan Motivasi Kerja Sebagai Variabel </w:t>
+            </w:r>
+            <w:r>
+              <w:rPr>
+                <w:sz w:val="24"/>
+                <w:szCs w:val="24"/>
+                <w:lang w:val="en-ID" w:eastAsia="en-ID"/>
+              </w:rPr>
+              <w:t>Mediasi</w:t>
+            </w:r>
+            <w:r>
+              <w:rPr>
+                <w:sz w:val="24"/>
+                <w:szCs w:val="24"/>
+                <w:lang w:val="en-ID" w:eastAsia="en-ID"/>
+              </w:rPr>
+              <w:t xml:space="preserve"> pada Dinas Koperasi Nganjuk</w:t>
             </w:r>
           </w:p>
         </w:tc>
@@ -10424,8 +10394,15 @@
                 <w:szCs w:val="24"/>
                 <w:lang w:val="en-ID" w:eastAsia="en-ID"/>
               </w:rPr>
-              <w:lastRenderedPageBreak/>
-              <w:t>intervening.</w:t>
+              <w:t>Mediasi</w:t>
+            </w:r>
+            <w:r>
+              <w:rPr>
+                <w:sz w:val="24"/>
+                <w:szCs w:val="24"/>
+                <w:lang w:val="en-ID" w:eastAsia="en-ID"/>
+              </w:rPr>
+              <w:t>.</w:t>
             </w:r>
           </w:p>
         </w:tc>
@@ -10466,7 +10443,6 @@
                 <w:szCs w:val="24"/>
                 <w:lang w:val="en-ID" w:eastAsia="en-ID"/>
               </w:rPr>
-              <w:lastRenderedPageBreak/>
               <w:t>Perbedaan terletak pada variabel bebas yang hanya menggunakan kompensasi tanpa gaya kepemimpinan, dan obyek penelitian pada instansi pemerintah.</w:t>
             </w:r>
           </w:p>
@@ -10513,7 +10489,6 @@
                 <w:szCs w:val="24"/>
                 <w:lang w:val="en-ID" w:eastAsia="en-ID"/>
               </w:rPr>
-              <w:lastRenderedPageBreak/>
               <w:t>Achmad Reza Aditya Amin (2024)</w:t>
             </w:r>
           </w:p>
@@ -10845,7 +10820,15 @@
                 <w:szCs w:val="24"/>
                 <w:lang w:val="en-ID" w:eastAsia="en-ID"/>
               </w:rPr>
-              <w:t>Pengaruh Gaya Kepemimpinan Dan Lingkungan Kerja Terhadap Kinerja Perangkat Desa Dengan Motivasi Kerja Sebagai Variabel Intervening</w:t>
+              <w:t xml:space="preserve">Pengaruh Gaya Kepemimpinan Dan Lingkungan Kerja Terhadap Kinerja Perangkat Desa Dengan Motivasi Kerja Sebagai Variabel </w:t>
+            </w:r>
+            <w:r>
+              <w:rPr>
+                <w:sz w:val="24"/>
+                <w:szCs w:val="24"/>
+                <w:lang w:val="en-ID" w:eastAsia="en-ID"/>
+              </w:rPr>
+              <w:t>Mediasi</w:t>
             </w:r>
           </w:p>
         </w:tc>
@@ -11017,8 +11000,15 @@
                 <w:szCs w:val="24"/>
                 <w:lang w:val="en-ID" w:eastAsia="en-ID"/>
               </w:rPr>
-              <w:lastRenderedPageBreak/>
-              <w:t>intervening.</w:t>
+              <w:t>Mediasi</w:t>
+            </w:r>
+            <w:r>
+              <w:rPr>
+                <w:sz w:val="24"/>
+                <w:szCs w:val="24"/>
+                <w:lang w:val="en-ID" w:eastAsia="en-ID"/>
+              </w:rPr>
+              <w:t>.</w:t>
             </w:r>
           </w:p>
         </w:tc>
@@ -11059,7 +11049,6 @@
                 <w:szCs w:val="24"/>
                 <w:lang w:val="en-ID" w:eastAsia="en-ID"/>
               </w:rPr>
-              <w:lastRenderedPageBreak/>
               <w:t>Perbedaan terletak pada variabel X2 yang menggunakan lingkungan kerja, bukan kompensasi. Konteks penelitian sama-sama pada perangkat desa.</w:t>
             </w:r>
           </w:p>
@@ -11106,7 +11095,6 @@
                 <w:szCs w:val="24"/>
                 <w:lang w:val="en-ID" w:eastAsia="en-ID"/>
               </w:rPr>
-              <w:lastRenderedPageBreak/>
               <w:t>Bosman Butarbutar &amp; Lenny Christina Nawangsari (2022)</w:t>
             </w:r>
           </w:p>
@@ -11438,7 +11426,15 @@
                 <w:szCs w:val="24"/>
                 <w:lang w:val="en-ID" w:eastAsia="en-ID"/>
               </w:rPr>
-              <w:t>Analisis Pengaruh Budaya Organisasi, Gaya Kepemimpinan terhadap Kinerja Karyawan UMKM dengan Motivasi Kerja sebagai Variabel Intervening</w:t>
+              <w:t xml:space="preserve">Analisis Pengaruh Budaya Organisasi, Gaya Kepemimpinan terhadap Kinerja Karyawan UMKM dengan Motivasi Kerja sebagai Variabel </w:t>
+            </w:r>
+            <w:r>
+              <w:rPr>
+                <w:sz w:val="24"/>
+                <w:szCs w:val="24"/>
+                <w:lang w:val="en-ID" w:eastAsia="en-ID"/>
+              </w:rPr>
+              <w:t>Mediasi</w:t>
             </w:r>
           </w:p>
         </w:tc>
@@ -11602,16 +11598,7 @@
                 <w:szCs w:val="24"/>
                 <w:lang w:val="en-ID" w:eastAsia="en-ID"/>
               </w:rPr>
-              <w:t xml:space="preserve">Gaya kepemimpinan berpengaruh positif dan signifikan terhadap kinerja karyawan melalui motivasi kerja. Budaya organisasi juga berkontribusi positif </w:t>
-            </w:r>
-            <w:r>
-              <w:rPr>
-                <w:sz w:val="24"/>
-                <w:szCs w:val="24"/>
-                <w:lang w:val="en-ID" w:eastAsia="en-ID"/>
-              </w:rPr>
-              <w:lastRenderedPageBreak/>
-              <w:t>terhadap motivasi dan kinerja.</w:t>
+              <w:t>Gaya kepemimpinan berpengaruh positif dan signifikan terhadap kinerja karyawan melalui motivasi kerja. Budaya organisasi juga berkontribusi positif terhadap motivasi dan kinerja.</w:t>
             </w:r>
           </w:p>
         </w:tc>
@@ -11652,7 +11639,6 @@
                 <w:szCs w:val="24"/>
                 <w:lang w:val="en-ID" w:eastAsia="en-ID"/>
               </w:rPr>
-              <w:lastRenderedPageBreak/>
               <w:t>Perbedaan terletak pada variabel X1 (budaya organisasi, bukan kompensasi) dan obyek penelitian pada UMKM.</w:t>
             </w:r>
           </w:p>
@@ -11978,16 +11964,7 @@
           <w:sz w:val="24"/>
           <w:szCs w:val="24"/>
         </w:rPr>
-        <w:t xml:space="preserve">Hipotesis yang dikembangkan dalam penelitian ini berdasarkan rumusan masalah, landasan teori dan penelitian terdahulu yang telah </w:t>
-      </w:r>
-      <w:r>
-        <w:rPr>
-          <w:color w:val="000000" w:themeColor="text1"/>
-          <w:sz w:val="24"/>
-          <w:szCs w:val="24"/>
-        </w:rPr>
-        <w:lastRenderedPageBreak/>
-        <w:t>diuraikan. Maka hipotesis dalam penelitian ini adalah:</w:t>
+        <w:t>Hipotesis yang dikembangkan dalam penelitian ini berdasarkan rumusan masalah, landasan teori dan penelitian terdahulu yang telah diuraikan. Maka hipotesis dalam penelitian ini adalah:</w:t>
       </w:r>
     </w:p>
     <w:p>
@@ -12244,7 +12221,6 @@
       </w:pPr>
       <w:bookmarkStart w:id="24" w:name="_Toc235393122"/>
       <w:r>
-        <w:lastRenderedPageBreak/>
         <w:t>A.    Tempat dan Waktu Penelitian</w:t>
       </w:r>
       <w:bookmarkEnd w:id="24"/>
@@ -17598,16 +17574,7 @@
           <w:sz w:val="24"/>
           <w:szCs w:val="24"/>
         </w:rPr>
-        <w:t xml:space="preserve">Penelitian ini menggunakan metode penelitian kuantitatif. Sugiyono (2023:16), menjelaskan bahwa metode penelitian kuantitatif dapat diartikan sebagai metode penelitian yang berlandaskan pada filsafat positivisme, digunakan untuk meneliti pada populasi atau sampel tertentu, pengumpulan data menggunakan instrumen penelitian, analisis data bersifat </w:t>
-      </w:r>
-      <w:r>
-        <w:rPr>
-          <w:color w:val="000000" w:themeColor="text1"/>
-          <w:sz w:val="24"/>
-          <w:szCs w:val="24"/>
-        </w:rPr>
-        <w:lastRenderedPageBreak/>
-        <w:t>kuantitatif/statistik, dengan tujuan untuk menguji hipotesis yang telah ditetapkan.</w:t>
+        <w:t>Penelitian ini menggunakan metode penelitian kuantitatif. Sugiyono (2023:16), menjelaskan bahwa metode penelitian kuantitatif dapat diartikan sebagai metode penelitian yang berlandaskan pada filsafat positivisme, digunakan untuk meneliti pada populasi atau sampel tertentu, pengumpulan data menggunakan instrumen penelitian, analisis data bersifat kuantitatif/statistik, dengan tujuan untuk menguji hipotesis yang telah ditetapkan.</w:t>
       </w:r>
     </w:p>
     <w:p>
@@ -17867,16 +17834,7 @@
           <w:sz w:val="24"/>
           <w:szCs w:val="24"/>
         </w:rPr>
-        <w:t xml:space="preserve">Variabel terikat (variabel dependen) dalam penelitian ini adalah kinerja </w:t>
-      </w:r>
-      <w:r>
-        <w:rPr>
-          <w:color w:val="000000" w:themeColor="text1"/>
-          <w:sz w:val="24"/>
-          <w:szCs w:val="24"/>
-        </w:rPr>
-        <w:lastRenderedPageBreak/>
-        <w:t>perangkat desa (Y).</w:t>
+        <w:t>Variabel terikat (variabel dependen) dalam penelitian ini adalah kinerja perangkat desa (Y).</w:t>
       </w:r>
     </w:p>
     <w:p>
@@ -17912,7 +17870,7 @@
           <w:sz w:val="24"/>
           <w:szCs w:val="24"/>
         </w:rPr>
-        <w:t>Intervening</w:t>
+        <w:t>Mediasi</w:t>
       </w:r>
     </w:p>
     <w:p>
@@ -17942,7 +17900,7 @@
           <w:sz w:val="24"/>
           <w:szCs w:val="24"/>
         </w:rPr>
-        <w:t>intervening</w:t>
+        <w:t>Mediasi</w:t>
       </w:r>
       <w:r>
         <w:rPr>
@@ -17980,7 +17938,7 @@
           <w:sz w:val="24"/>
           <w:szCs w:val="24"/>
         </w:rPr>
-        <w:t>intervening</w:t>
+        <w:t>Mediasi</w:t>
       </w:r>
       <w:r>
         <w:rPr>
@@ -18018,7 +17976,7 @@
           <w:sz w:val="24"/>
           <w:szCs w:val="24"/>
         </w:rPr>
-        <w:t>intervening</w:t>
+        <w:t>Mediasi</w:t>
       </w:r>
       <w:r>
         <w:rPr>
@@ -18080,7 +18038,7 @@
           <w:sz w:val="24"/>
           <w:szCs w:val="24"/>
         </w:rPr>
-        <w:t>intervening</w:t>
+        <w:t>Mediasi</w:t>
       </w:r>
       <w:r>
         <w:rPr>
@@ -18179,7 +18137,7 @@
           <w:sz w:val="24"/>
           <w:szCs w:val="24"/>
         </w:rPr>
-        <w:t>intervening</w:t>
+        <w:t>Mediasi</w:t>
       </w:r>
       <w:r>
         <w:rPr>
@@ -18723,16 +18681,7 @@
                 <w:szCs w:val="24"/>
                 <w:lang w:val="en-ID" w:eastAsia="en-ID"/>
               </w:rPr>
-              <w:t xml:space="preserve">Gaya kepemimpinan adalah cara seorang pemimpin </w:t>
-            </w:r>
-            <w:r>
-              <w:rPr>
-                <w:sz w:val="24"/>
-                <w:szCs w:val="24"/>
-                <w:lang w:val="en-ID" w:eastAsia="en-ID"/>
-              </w:rPr>
-              <w:lastRenderedPageBreak/>
-              <w:t>mempengaruhi perilaku bawahan, agar mau bekerja sama dan bekerja secara produktif untuk mencapai tujuan organisasi. Hasibuan (2019:170)</w:t>
+              <w:t>Gaya kepemimpinan adalah cara seorang pemimpin mempengaruhi perilaku bawahan, agar mau bekerja sama dan bekerja secara produktif untuk mencapai tujuan organisasi. Hasibuan (2019:170)</w:t>
             </w:r>
           </w:p>
         </w:tc>
@@ -18770,7 +18719,6 @@
                 <w:szCs w:val="24"/>
                 <w:lang w:val="en-ID" w:eastAsia="en-ID"/>
               </w:rPr>
-              <w:lastRenderedPageBreak/>
               <w:t>1. Karakteristik pribadi pemimpin</w:t>
             </w:r>
             <w:r>
@@ -18780,16 +18728,7 @@
                 <w:lang w:val="en-ID" w:eastAsia="en-ID"/>
               </w:rPr>
               <w:br/>
-              <w:t xml:space="preserve">2. Karakteristik </w:t>
-            </w:r>
-            <w:r>
-              <w:rPr>
-                <w:sz w:val="24"/>
-                <w:szCs w:val="24"/>
-                <w:lang w:val="en-ID" w:eastAsia="en-ID"/>
-              </w:rPr>
-              <w:lastRenderedPageBreak/>
-              <w:t>bawahan</w:t>
+              <w:t>2. Karakteristik bawahan</w:t>
             </w:r>
             <w:r>
               <w:rPr>
@@ -18864,7 +18803,6 @@
                 <w:szCs w:val="24"/>
                 <w:lang w:val="en-ID" w:eastAsia="en-ID"/>
               </w:rPr>
-              <w:lastRenderedPageBreak/>
               <w:t>Interval</w:t>
             </w:r>
           </w:p>
@@ -19407,16 +19345,7 @@
           <w:sz w:val="24"/>
           <w:szCs w:val="24"/>
         </w:rPr>
-        <w:t xml:space="preserve">Sugiyono (2023:126), menjelaskan bahwa populasi adalah keseluruhan elemen yang akan dijadikan wilayah generalisasi. Elemen populasi adalah keseluruhan subyek yang akan diukur, yang merupakan unit yang diteliti. Dalam hal ini populasi adalah wilayah </w:t>
-      </w:r>
-      <w:r>
-        <w:rPr>
-          <w:color w:val="000000" w:themeColor="text1"/>
-          <w:sz w:val="24"/>
-          <w:szCs w:val="24"/>
-        </w:rPr>
-        <w:lastRenderedPageBreak/>
-        <w:t>generalisasi yang terdiri atas: obyek/subyek yang mempunyai kuantitas dan karakteristik tertentu yang ditetapkan oleh peneliti untuk dipelajari dan kemudian ditarik kesimpulannya.</w:t>
+        <w:t>Sugiyono (2023:126), menjelaskan bahwa populasi adalah keseluruhan elemen yang akan dijadikan wilayah generalisasi. Elemen populasi adalah keseluruhan subyek yang akan diukur, yang merupakan unit yang diteliti. Dalam hal ini populasi adalah wilayah generalisasi yang terdiri atas: obyek/subyek yang mempunyai kuantitas dan karakteristik tertentu yang ditetapkan oleh peneliti untuk dipelajari dan kemudian ditarik kesimpulannya.</w:t>
       </w:r>
     </w:p>
     <w:p>
@@ -19600,7 +19529,6 @@
           <w:sz w:val="24"/>
           <w:szCs w:val="24"/>
         </w:rPr>
-        <w:lastRenderedPageBreak/>
         <w:t>E.    Metode Pengumpulan Data</w:t>
       </w:r>
     </w:p>
@@ -19800,14 +19728,7 @@
         <w:rPr>
           <w:color w:val="000000" w:themeColor="text1"/>
         </w:rPr>
-        <w:t xml:space="preserve">Sumber data dalam penelitian ini adalah dengan menggunakan data primer. Data dikumpulkan oleh peneliti langsung dari sumber pertama atau tempat objek penelitian </w:t>
-      </w:r>
-      <w:r>
-        <w:rPr>
-          <w:color w:val="000000" w:themeColor="text1"/>
-        </w:rPr>
-        <w:lastRenderedPageBreak/>
-        <w:t>dilakukan dengan menyebarkan kuesioner secara langsung dan diisi oleh responden (perangkat desa).</w:t>
+        <w:t>Sumber data dalam penelitian ini adalah dengan menggunakan data primer. Data dikumpulkan oleh peneliti langsung dari sumber pertama atau tempat objek penelitian dilakukan dengan menyebarkan kuesioner secara langsung dan diisi oleh responden (perangkat desa).</w:t>
       </w:r>
     </w:p>
     <w:p>
@@ -20684,16 +20605,7 @@
           <w:sz w:val="24"/>
           <w:szCs w:val="24"/>
         </w:rPr>
-        <w:t xml:space="preserve">Metode analisis data yang digunakan dalam penelitian ini adalah </w:t>
-      </w:r>
-      <w:r>
-        <w:rPr>
-          <w:color w:val="000000" w:themeColor="text1"/>
-          <w:sz w:val="24"/>
-          <w:szCs w:val="24"/>
-        </w:rPr>
-        <w:lastRenderedPageBreak/>
-        <w:t xml:space="preserve">dengan </w:t>
+        <w:t xml:space="preserve">Metode analisis data yang digunakan dalam penelitian ini adalah dengan </w:t>
       </w:r>
       <w:r>
         <w:rPr>
@@ -21183,7 +21095,6 @@
           <w:iCs/>
           <w:color w:val="000000" w:themeColor="text1"/>
         </w:rPr>
-        <w:lastRenderedPageBreak/>
         <w:t>Outer model</w:t>
       </w:r>
       <w:r>
@@ -21218,7 +21129,13 @@
         <w:rPr>
           <w:color w:val="000000" w:themeColor="text1"/>
         </w:rPr>
-        <w:t>F.1.d.    Outer Model Variabel Intervening</w:t>
+        <w:t xml:space="preserve">F.1.d.    Outer Model Variabel </w:t>
+      </w:r>
+      <w:r>
+        <w:rPr>
+          <w:color w:val="000000" w:themeColor="text1"/>
+        </w:rPr>
+        <w:t>Mediasi</w:t>
       </w:r>
     </w:p>
     <w:p>
@@ -21284,7 +21201,7 @@
           <w:iCs/>
           <w:color w:val="000000" w:themeColor="text1"/>
         </w:rPr>
-        <w:t>intervening</w:t>
+        <w:t>Mediasi</w:t>
       </w:r>
       <w:r>
         <w:rPr>
@@ -21525,7 +21442,7 @@
           <w:iCs/>
           <w:color w:val="000000" w:themeColor="text1"/>
         </w:rPr>
-        <w:t>intervening</w:t>
+        <w:t>Mediasi</w:t>
       </w:r>
       <w:r>
         <w:rPr>
@@ -21676,7 +21593,6 @@
         <w:rPr>
           <w:color w:val="000000" w:themeColor="text1"/>
         </w:rPr>
-        <w:lastRenderedPageBreak/>
         <w:t>Ξ</w:t>
       </w:r>
       <w:r>
@@ -22345,16 +22261,7 @@
           <w:sz w:val="24"/>
           <w:szCs w:val="24"/>
         </w:rPr>
-        <w:t xml:space="preserve">Pada bagian ini akan mengevaluasi hasil pengujian model </w:t>
-      </w:r>
-      <w:r>
-        <w:rPr>
-          <w:color w:val="000000" w:themeColor="text1"/>
-          <w:sz w:val="24"/>
-          <w:szCs w:val="24"/>
-        </w:rPr>
-        <w:lastRenderedPageBreak/>
-        <w:t>pengukuran dimana evaluasi model pengukuran reflektif akan menggunakan uji validitas konvergen, validitas diskriminan, dan reliabilitas konstruk.</w:t>
+        <w:t>Pada bagian ini akan mengevaluasi hasil pengujian model pengukuran dimana evaluasi model pengukuran reflektif akan menggunakan uji validitas konvergen, validitas diskriminan, dan reliabilitas konstruk.</w:t>
       </w:r>
     </w:p>
     <w:p>
@@ -22576,14 +22483,7 @@
         <w:rPr>
           <w:color w:val="000000" w:themeColor="text1"/>
         </w:rPr>
-        <w:t xml:space="preserve"> untuk setiap variabel harus &gt; 0.70. Cara lain yang dapat digunakan untuk menguji validitas diskriminan adalah dengan membandingkan akar kuadrat AVE untuk setiap konstruk dengan nilai korelasi antar konstruk dalam model. Validitas diskriminan yang baik ditunjukkan dari akar kuadrat AVE untuk tiap konstruk lebih besar dari korelasi antar konstruk dalam model. Menurut Hanseler dalam </w:t>
-      </w:r>
-      <w:r>
-        <w:rPr>
-          <w:color w:val="000000" w:themeColor="text1"/>
-        </w:rPr>
-        <w:lastRenderedPageBreak/>
-        <w:t xml:space="preserve">Ghozali (2021:69) menganjurkan bahwa HTMT &lt; 90 sangat baik dan validitas diskriminan telah mencapai antara pasangan konstruk reflektif. Ringkasan </w:t>
+        <w:t xml:space="preserve"> untuk setiap variabel harus &gt; 0.70. Cara lain yang dapat digunakan untuk menguji validitas diskriminan adalah dengan membandingkan akar kuadrat AVE untuk setiap konstruk dengan nilai korelasi antar konstruk dalam model. Validitas diskriminan yang baik ditunjukkan dari akar kuadrat AVE untuk tiap konstruk lebih besar dari korelasi antar konstruk dalam model. Menurut Hanseler dalam Ghozali (2021:69) menganjurkan bahwa HTMT &lt; 90 sangat baik dan validitas diskriminan telah mencapai antara pasangan konstruk reflektif. Ringkasan </w:t>
       </w:r>
       <w:r>
         <w:rPr>
@@ -24407,16 +24307,7 @@
           <w:sz w:val="24"/>
           <w:szCs w:val="24"/>
         </w:rPr>
-        <w:t xml:space="preserve">Ghozali (2021:74) menambahkan, disamping melihat </w:t>
-      </w:r>
-      <w:r>
-        <w:rPr>
-          <w:color w:val="000000" w:themeColor="text1"/>
-          <w:sz w:val="24"/>
-          <w:szCs w:val="24"/>
-        </w:rPr>
-        <w:lastRenderedPageBreak/>
-        <w:t xml:space="preserve">besarnya R-Square, evaluasi model PLS dapat juga dilakukan dengan Q² Predictive relevance atau sering disebut </w:t>
+        <w:t xml:space="preserve">Ghozali (2021:74) menambahkan, disamping melihat besarnya R-Square, evaluasi model PLS dapat juga dilakukan dengan Q² Predictive relevance atau sering disebut </w:t>
       </w:r>
       <w:r>
         <w:rPr>
@@ -25273,7 +25164,6 @@
         <w:rPr>
           <w:color w:val="000000" w:themeColor="text1"/>
         </w:rPr>
-        <w:lastRenderedPageBreak/>
         <w:t>Sumber: Ghozali (2021) diadopsi dari Chin (1998), Shin (2010b), Hair et al (2011), Hair et al (2012).</w:t>
       </w:r>
     </w:p>

</xml_diff>

<commit_message>
Complete all Bab II revisions: insert Hasibuan 2019, add 3 missing references to Table 2.2, update Kerangka Berpikir diagram with correct hypothesis labels
</commit_message>
<xml_diff>
--- a/File Skripsi/Sri Darni.docx
+++ b/File Skripsi/Sri Darni.docx
@@ -11640,6 +11640,900 @@
                 <w:lang w:val="en-ID" w:eastAsia="en-ID"/>
               </w:rPr>
               <w:t>Perbedaan terletak pada variabel X1 (budaya organisasi, bukan kompensasi) dan obyek penelitian pada UMKM.</w:t>
+            </w:r>
+          </w:p>
+        </w:tc>
+      </w:tr>
+      <w:tr>
+        <w:trPr>
+          <w:trHeight w:val="315"/>
+        </w:trPr>
+        <w:tc>
+          <w:tcPr>
+            <w:tcW w:w="0" w:type="auto"/>
+            <w:tcBorders>
+              <w:top w:val="single" w:sz="6" w:space="0" w:color="CCCCCC"/>
+              <w:left w:val="single" w:sz="6" w:space="0" w:color="000000"/>
+              <w:bottom w:val="single" w:sz="6" w:space="0" w:color="000000"/>
+              <w:right w:val="single" w:sz="6" w:space="0" w:color="000000"/>
+            </w:tcBorders>
+            <w:tcMar>
+              <w:top w:w="30" w:type="dxa"/>
+              <w:left w:w="45" w:type="dxa"/>
+              <w:bottom w:w="30" w:type="dxa"/>
+              <w:right w:w="45" w:type="dxa"/>
+            </w:tcMar>
+            <w:vAlign w:val="center"/>
+            <w:hideMark/>
+          </w:tcPr>
+          <w:p>
+            <w:pPr>
+              <w:widowControl/>
+              <w:autoSpaceDE/>
+              <w:autoSpaceDN/>
+              <w:spacing w:line="360" w:lineRule="auto"/>
+              <w:jc w:val="center"/>
+              <w:rPr>
+                <w:sz w:val="24"/>
+                <w:szCs w:val="24"/>
+                <w:lang w:val="en-ID" w:eastAsia="en-ID"/>
+              </w:rPr>
+            </w:pPr>
+            <w:r>
+              <w:rPr>
+                <w:sz w:val="24"/>
+                <w:szCs w:val="24"/>
+                <w:lang w:val="en-ID" w:eastAsia="en-ID"/>
+              </w:rPr>
+              <w:t>Naldi, M. K., dkk. (2025)</w:t>
+            </w:r>
+          </w:p>
+        </w:tc>
+        <w:tc>
+          <w:tcPr>
+            <w:tcW w:w="0" w:type="auto"/>
+            <w:tcBorders>
+              <w:top w:val="single" w:sz="6" w:space="0" w:color="CCCCCC"/>
+              <w:left w:val="single" w:sz="6" w:space="0" w:color="CCCCCC"/>
+              <w:bottom w:val="single" w:sz="6" w:space="0" w:color="000000"/>
+              <w:right w:val="single" w:sz="6" w:space="0" w:color="000000"/>
+            </w:tcBorders>
+            <w:tcMar>
+              <w:top w:w="30" w:type="dxa"/>
+              <w:left w:w="45" w:type="dxa"/>
+              <w:bottom w:w="30" w:type="dxa"/>
+              <w:right w:w="45" w:type="dxa"/>
+            </w:tcMar>
+            <w:vAlign w:val="center"/>
+            <w:hideMark/>
+          </w:tcPr>
+          <w:p>
+            <w:pPr>
+              <w:widowControl/>
+              <w:autoSpaceDE/>
+              <w:autoSpaceDN/>
+              <w:spacing w:line="360" w:lineRule="auto"/>
+              <w:rPr>
+                <w:sz w:val="24"/>
+                <w:szCs w:val="24"/>
+                <w:lang w:val="en-ID" w:eastAsia="en-ID"/>
+              </w:rPr>
+            </w:pPr>
+            <w:r>
+              <w:rPr>
+                <w:sz w:val="24"/>
+                <w:szCs w:val="24"/>
+                <w:lang w:val="en-ID" w:eastAsia="en-ID"/>
+              </w:rPr>
+              <w:t>Pengaruh Kepuasan Kerja, Gaya Kepemimpinan, dan Komitmen Organisasi terhadap Motivasi Kerja</w:t>
+            </w:r>
+            <w:r>
+              <w:rPr>
+                <w:sz w:val="24"/>
+                <w:szCs w:val="24"/>
+                <w:lang w:val="en-ID" w:eastAsia="en-ID"/>
+              </w:rPr>
+            </w:r>
+          </w:p>
+        </w:tc>
+        <w:tc>
+          <w:tcPr>
+            <w:tcW w:w="0" w:type="auto"/>
+            <w:tcBorders>
+              <w:top w:val="single" w:sz="6" w:space="0" w:color="CCCCCC"/>
+              <w:left w:val="single" w:sz="6" w:space="0" w:color="CCCCCC"/>
+              <w:bottom w:val="single" w:sz="6" w:space="0" w:color="000000"/>
+              <w:right w:val="single" w:sz="6" w:space="0" w:color="000000"/>
+            </w:tcBorders>
+            <w:tcMar>
+              <w:top w:w="30" w:type="dxa"/>
+              <w:left w:w="45" w:type="dxa"/>
+              <w:bottom w:w="30" w:type="dxa"/>
+              <w:right w:w="45" w:type="dxa"/>
+            </w:tcMar>
+            <w:vAlign w:val="center"/>
+            <w:hideMark/>
+          </w:tcPr>
+          <w:p>
+            <w:pPr>
+              <w:widowControl/>
+              <w:autoSpaceDE/>
+              <w:autoSpaceDN/>
+              <w:spacing w:line="360" w:lineRule="auto"/>
+              <w:jc w:val="center"/>
+              <w:rPr>
+                <w:sz w:val="24"/>
+                <w:szCs w:val="24"/>
+                <w:lang w:val="en-ID" w:eastAsia="en-ID"/>
+              </w:rPr>
+            </w:pPr>
+            <w:r>
+              <w:rPr>
+                <w:sz w:val="24"/>
+                <w:szCs w:val="24"/>
+                <w:lang w:val="en-ID" w:eastAsia="en-ID"/>
+              </w:rPr>
+              <w:t>Motivasi Kerja (Y)</w:t>
+            </w:r>
+          </w:p>
+        </w:tc>
+        <w:tc>
+          <w:tcPr>
+            <w:tcW w:w="0" w:type="auto"/>
+            <w:tcBorders>
+              <w:top w:val="single" w:sz="6" w:space="0" w:color="CCCCCC"/>
+              <w:left w:val="single" w:sz="6" w:space="0" w:color="CCCCCC"/>
+              <w:bottom w:val="single" w:sz="6" w:space="0" w:color="000000"/>
+              <w:right w:val="single" w:sz="6" w:space="0" w:color="000000"/>
+            </w:tcBorders>
+            <w:tcMar>
+              <w:top w:w="30" w:type="dxa"/>
+              <w:left w:w="45" w:type="dxa"/>
+              <w:bottom w:w="30" w:type="dxa"/>
+              <w:right w:w="45" w:type="dxa"/>
+            </w:tcMar>
+            <w:vAlign w:val="center"/>
+            <w:hideMark/>
+          </w:tcPr>
+          <w:p>
+            <w:pPr>
+              <w:widowControl/>
+              <w:autoSpaceDE/>
+              <w:autoSpaceDN/>
+              <w:spacing w:line="360" w:lineRule="auto"/>
+              <w:jc w:val="center"/>
+              <w:rPr>
+                <w:sz w:val="24"/>
+                <w:szCs w:val="24"/>
+                <w:lang w:val="en-ID" w:eastAsia="en-ID"/>
+              </w:rPr>
+            </w:pPr>
+            <w:r>
+              <w:rPr>
+                <w:sz w:val="24"/>
+                <w:szCs w:val="24"/>
+                <w:lang w:val="en-ID" w:eastAsia="en-ID"/>
+              </w:rPr>
+              <w:t>Gaya Kepemimpinan (X1)</w:t>
+            </w:r>
+          </w:p>
+        </w:tc>
+        <w:tc>
+          <w:tcPr>
+            <w:tcW w:w="0" w:type="auto"/>
+            <w:tcBorders>
+              <w:top w:val="single" w:sz="6" w:space="0" w:color="CCCCCC"/>
+              <w:left w:val="single" w:sz="6" w:space="0" w:color="CCCCCC"/>
+              <w:bottom w:val="single" w:sz="6" w:space="0" w:color="000000"/>
+              <w:right w:val="single" w:sz="6" w:space="0" w:color="000000"/>
+            </w:tcBorders>
+            <w:tcMar>
+              <w:top w:w="30" w:type="dxa"/>
+              <w:left w:w="45" w:type="dxa"/>
+              <w:bottom w:w="30" w:type="dxa"/>
+              <w:right w:w="45" w:type="dxa"/>
+            </w:tcMar>
+            <w:vAlign w:val="center"/>
+            <w:hideMark/>
+          </w:tcPr>
+          <w:p>
+            <w:pPr>
+              <w:widowControl/>
+              <w:autoSpaceDE/>
+              <w:autoSpaceDN/>
+              <w:spacing w:line="360" w:lineRule="auto"/>
+              <w:jc w:val="center"/>
+              <w:rPr>
+                <w:sz w:val="24"/>
+                <w:szCs w:val="24"/>
+                <w:lang w:val="en-ID" w:eastAsia="en-ID"/>
+              </w:rPr>
+            </w:pPr>
+            <w:r>
+              <w:rPr>
+                <w:sz w:val="24"/>
+                <w:szCs w:val="24"/>
+                <w:lang w:val="en-ID" w:eastAsia="en-ID"/>
+              </w:rPr>
+              <w:t>-</w:t>
+            </w:r>
+          </w:p>
+        </w:tc>
+        <w:tc>
+          <w:tcPr>
+            <w:tcW w:w="0" w:type="auto"/>
+            <w:tcBorders>
+              <w:top w:val="single" w:sz="6" w:space="0" w:color="CCCCCC"/>
+              <w:left w:val="single" w:sz="6" w:space="0" w:color="CCCCCC"/>
+              <w:bottom w:val="single" w:sz="6" w:space="0" w:color="000000"/>
+              <w:right w:val="single" w:sz="6" w:space="0" w:color="000000"/>
+            </w:tcBorders>
+            <w:tcMar>
+              <w:top w:w="30" w:type="dxa"/>
+              <w:left w:w="45" w:type="dxa"/>
+              <w:bottom w:w="30" w:type="dxa"/>
+              <w:right w:w="45" w:type="dxa"/>
+            </w:tcMar>
+            <w:vAlign w:val="center"/>
+            <w:hideMark/>
+          </w:tcPr>
+          <w:p>
+            <w:pPr>
+              <w:widowControl/>
+              <w:autoSpaceDE/>
+              <w:autoSpaceDN/>
+              <w:spacing w:line="360" w:lineRule="auto"/>
+              <w:jc w:val="both"/>
+              <w:rPr>
+                <w:sz w:val="24"/>
+                <w:szCs w:val="24"/>
+                <w:lang w:val="en-ID" w:eastAsia="en-ID"/>
+              </w:rPr>
+            </w:pPr>
+            <w:r>
+              <w:rPr>
+                <w:sz w:val="24"/>
+                <w:szCs w:val="24"/>
+                <w:lang w:val="en-ID" w:eastAsia="en-ID"/>
+              </w:rPr>
+              <w:t>Gaya kepemimpinan berpengaruh positif dan signifikan terhadap motivasi kerja karyawan.</w:t>
+            </w:r>
+          </w:p>
+        </w:tc>
+        <w:tc>
+          <w:tcPr>
+            <w:tcW w:w="0" w:type="auto"/>
+            <w:tcBorders>
+              <w:top w:val="single" w:sz="6" w:space="0" w:color="CCCCCC"/>
+              <w:left w:val="single" w:sz="6" w:space="0" w:color="CCCCCC"/>
+              <w:bottom w:val="single" w:sz="6" w:space="0" w:color="000000"/>
+              <w:right w:val="single" w:sz="6" w:space="0" w:color="000000"/>
+            </w:tcBorders>
+            <w:tcMar>
+              <w:top w:w="30" w:type="dxa"/>
+              <w:left w:w="45" w:type="dxa"/>
+              <w:bottom w:w="30" w:type="dxa"/>
+              <w:right w:w="45" w:type="dxa"/>
+            </w:tcMar>
+            <w:vAlign w:val="center"/>
+            <w:hideMark/>
+          </w:tcPr>
+          <w:p>
+            <w:pPr>
+              <w:widowControl/>
+              <w:autoSpaceDE/>
+              <w:autoSpaceDN/>
+              <w:spacing w:line="360" w:lineRule="auto"/>
+              <w:jc w:val="both"/>
+              <w:rPr>
+                <w:sz w:val="24"/>
+                <w:szCs w:val="24"/>
+                <w:lang w:val="en-ID" w:eastAsia="en-ID"/>
+              </w:rPr>
+            </w:pPr>
+            <w:r>
+              <w:rPr>
+                <w:sz w:val="24"/>
+                <w:szCs w:val="24"/>
+                <w:lang w:val="en-ID" w:eastAsia="en-ID"/>
+              </w:rPr>
+              <w:t>Perbedaan terletak pada variabel terikat yang hanya meneliti motivasi kerja, bukan kinerja. Penelitian ini tidak menggunakan variabel mediasi.</w:t>
+            </w:r>
+          </w:p>
+        </w:tc>
+      </w:tr>
+      <w:tr>
+        <w:trPr>
+          <w:trHeight w:val="315"/>
+        </w:trPr>
+        <w:tc>
+          <w:tcPr>
+            <w:tcW w:w="0" w:type="auto"/>
+            <w:tcBorders>
+              <w:top w:val="single" w:sz="6" w:space="0" w:color="CCCCCC"/>
+              <w:left w:val="single" w:sz="6" w:space="0" w:color="000000"/>
+              <w:bottom w:val="single" w:sz="6" w:space="0" w:color="000000"/>
+              <w:right w:val="single" w:sz="6" w:space="0" w:color="000000"/>
+            </w:tcBorders>
+            <w:tcMar>
+              <w:top w:w="30" w:type="dxa"/>
+              <w:left w:w="45" w:type="dxa"/>
+              <w:bottom w:w="30" w:type="dxa"/>
+              <w:right w:w="45" w:type="dxa"/>
+            </w:tcMar>
+            <w:vAlign w:val="center"/>
+            <w:hideMark/>
+          </w:tcPr>
+          <w:p>
+            <w:pPr>
+              <w:widowControl/>
+              <w:autoSpaceDE/>
+              <w:autoSpaceDN/>
+              <w:spacing w:line="360" w:lineRule="auto"/>
+              <w:jc w:val="center"/>
+              <w:rPr>
+                <w:sz w:val="24"/>
+                <w:szCs w:val="24"/>
+                <w:lang w:val="en-ID" w:eastAsia="en-ID"/>
+              </w:rPr>
+            </w:pPr>
+            <w:r>
+              <w:rPr>
+                <w:sz w:val="24"/>
+                <w:szCs w:val="24"/>
+                <w:lang w:val="en-ID" w:eastAsia="en-ID"/>
+              </w:rPr>
+              <w:t>Putri, D. R., &amp; Rozi, F. (2024)</w:t>
+            </w:r>
+          </w:p>
+        </w:tc>
+        <w:tc>
+          <w:tcPr>
+            <w:tcW w:w="0" w:type="auto"/>
+            <w:tcBorders>
+              <w:top w:val="single" w:sz="6" w:space="0" w:color="CCCCCC"/>
+              <w:left w:val="single" w:sz="6" w:space="0" w:color="CCCCCC"/>
+              <w:bottom w:val="single" w:sz="6" w:space="0" w:color="000000"/>
+              <w:right w:val="single" w:sz="6" w:space="0" w:color="000000"/>
+            </w:tcBorders>
+            <w:tcMar>
+              <w:top w:w="30" w:type="dxa"/>
+              <w:left w:w="45" w:type="dxa"/>
+              <w:bottom w:w="30" w:type="dxa"/>
+              <w:right w:w="45" w:type="dxa"/>
+            </w:tcMar>
+            <w:vAlign w:val="center"/>
+            <w:hideMark/>
+          </w:tcPr>
+          <w:p>
+            <w:pPr>
+              <w:widowControl/>
+              <w:autoSpaceDE/>
+              <w:autoSpaceDN/>
+              <w:spacing w:line="360" w:lineRule="auto"/>
+              <w:rPr>
+                <w:sz w:val="24"/>
+                <w:szCs w:val="24"/>
+                <w:lang w:val="en-ID" w:eastAsia="en-ID"/>
+              </w:rPr>
+            </w:pPr>
+            <w:r>
+              <w:rPr>
+                <w:sz w:val="24"/>
+                <w:szCs w:val="24"/>
+                <w:lang w:val="en-ID" w:eastAsia="en-ID"/>
+              </w:rPr>
+              <w:t>Pengaruh Kompensasi dan Lingkungan Kerja terhadap Kinerja Karyawan</w:t>
+            </w:r>
+            <w:r>
+              <w:rPr>
+                <w:sz w:val="24"/>
+                <w:szCs w:val="24"/>
+                <w:lang w:val="en-ID" w:eastAsia="en-ID"/>
+              </w:rPr>
+            </w:r>
+          </w:p>
+        </w:tc>
+        <w:tc>
+          <w:tcPr>
+            <w:tcW w:w="0" w:type="auto"/>
+            <w:tcBorders>
+              <w:top w:val="single" w:sz="6" w:space="0" w:color="CCCCCC"/>
+              <w:left w:val="single" w:sz="6" w:space="0" w:color="CCCCCC"/>
+              <w:bottom w:val="single" w:sz="6" w:space="0" w:color="000000"/>
+              <w:right w:val="single" w:sz="6" w:space="0" w:color="000000"/>
+            </w:tcBorders>
+            <w:tcMar>
+              <w:top w:w="30" w:type="dxa"/>
+              <w:left w:w="45" w:type="dxa"/>
+              <w:bottom w:w="30" w:type="dxa"/>
+              <w:right w:w="45" w:type="dxa"/>
+            </w:tcMar>
+            <w:vAlign w:val="center"/>
+            <w:hideMark/>
+          </w:tcPr>
+          <w:p>
+            <w:pPr>
+              <w:widowControl/>
+              <w:autoSpaceDE/>
+              <w:autoSpaceDN/>
+              <w:spacing w:line="360" w:lineRule="auto"/>
+              <w:jc w:val="center"/>
+              <w:rPr>
+                <w:sz w:val="24"/>
+                <w:szCs w:val="24"/>
+                <w:lang w:val="en-ID" w:eastAsia="en-ID"/>
+              </w:rPr>
+            </w:pPr>
+            <w:r>
+              <w:rPr>
+                <w:sz w:val="24"/>
+                <w:szCs w:val="24"/>
+                <w:lang w:val="en-ID" w:eastAsia="en-ID"/>
+              </w:rPr>
+              <w:t>Kinerja (Y)</w:t>
+            </w:r>
+          </w:p>
+        </w:tc>
+        <w:tc>
+          <w:tcPr>
+            <w:tcW w:w="0" w:type="auto"/>
+            <w:tcBorders>
+              <w:top w:val="single" w:sz="6" w:space="0" w:color="CCCCCC"/>
+              <w:left w:val="single" w:sz="6" w:space="0" w:color="CCCCCC"/>
+              <w:bottom w:val="single" w:sz="6" w:space="0" w:color="000000"/>
+              <w:right w:val="single" w:sz="6" w:space="0" w:color="000000"/>
+            </w:tcBorders>
+            <w:tcMar>
+              <w:top w:w="30" w:type="dxa"/>
+              <w:left w:w="45" w:type="dxa"/>
+              <w:bottom w:w="30" w:type="dxa"/>
+              <w:right w:w="45" w:type="dxa"/>
+            </w:tcMar>
+            <w:vAlign w:val="center"/>
+            <w:hideMark/>
+          </w:tcPr>
+          <w:p>
+            <w:pPr>
+              <w:widowControl/>
+              <w:autoSpaceDE/>
+              <w:autoSpaceDN/>
+              <w:spacing w:line="360" w:lineRule="auto"/>
+              <w:jc w:val="center"/>
+              <w:rPr>
+                <w:sz w:val="24"/>
+                <w:szCs w:val="24"/>
+                <w:lang w:val="en-ID" w:eastAsia="en-ID"/>
+              </w:rPr>
+            </w:pPr>
+            <w:r>
+              <w:rPr>
+                <w:sz w:val="24"/>
+                <w:szCs w:val="24"/>
+                <w:lang w:val="en-ID" w:eastAsia="en-ID"/>
+              </w:rPr>
+              <w:t>Kompensasi (X1)</w:t>
+            </w:r>
+          </w:p>
+        </w:tc>
+        <w:tc>
+          <w:tcPr>
+            <w:tcW w:w="0" w:type="auto"/>
+            <w:tcBorders>
+              <w:top w:val="single" w:sz="6" w:space="0" w:color="CCCCCC"/>
+              <w:left w:val="single" w:sz="6" w:space="0" w:color="CCCCCC"/>
+              <w:bottom w:val="single" w:sz="6" w:space="0" w:color="000000"/>
+              <w:right w:val="single" w:sz="6" w:space="0" w:color="000000"/>
+            </w:tcBorders>
+            <w:tcMar>
+              <w:top w:w="30" w:type="dxa"/>
+              <w:left w:w="45" w:type="dxa"/>
+              <w:bottom w:w="30" w:type="dxa"/>
+              <w:right w:w="45" w:type="dxa"/>
+            </w:tcMar>
+            <w:vAlign w:val="center"/>
+            <w:hideMark/>
+          </w:tcPr>
+          <w:p>
+            <w:pPr>
+              <w:widowControl/>
+              <w:autoSpaceDE/>
+              <w:autoSpaceDN/>
+              <w:spacing w:line="360" w:lineRule="auto"/>
+              <w:jc w:val="center"/>
+              <w:rPr>
+                <w:sz w:val="24"/>
+                <w:szCs w:val="24"/>
+                <w:lang w:val="en-ID" w:eastAsia="en-ID"/>
+              </w:rPr>
+            </w:pPr>
+            <w:r>
+              <w:rPr>
+                <w:sz w:val="24"/>
+                <w:szCs w:val="24"/>
+                <w:lang w:val="en-ID" w:eastAsia="en-ID"/>
+              </w:rPr>
+              <w:t>-</w:t>
+            </w:r>
+          </w:p>
+        </w:tc>
+        <w:tc>
+          <w:tcPr>
+            <w:tcW w:w="0" w:type="auto"/>
+            <w:tcBorders>
+              <w:top w:val="single" w:sz="6" w:space="0" w:color="CCCCCC"/>
+              <w:left w:val="single" w:sz="6" w:space="0" w:color="CCCCCC"/>
+              <w:bottom w:val="single" w:sz="6" w:space="0" w:color="000000"/>
+              <w:right w:val="single" w:sz="6" w:space="0" w:color="000000"/>
+            </w:tcBorders>
+            <w:tcMar>
+              <w:top w:w="30" w:type="dxa"/>
+              <w:left w:w="45" w:type="dxa"/>
+              <w:bottom w:w="30" w:type="dxa"/>
+              <w:right w:w="45" w:type="dxa"/>
+            </w:tcMar>
+            <w:vAlign w:val="center"/>
+            <w:hideMark/>
+          </w:tcPr>
+          <w:p>
+            <w:pPr>
+              <w:widowControl/>
+              <w:autoSpaceDE/>
+              <w:autoSpaceDN/>
+              <w:spacing w:line="360" w:lineRule="auto"/>
+              <w:jc w:val="both"/>
+              <w:rPr>
+                <w:sz w:val="24"/>
+                <w:szCs w:val="24"/>
+                <w:lang w:val="en-ID" w:eastAsia="en-ID"/>
+              </w:rPr>
+            </w:pPr>
+            <w:r>
+              <w:rPr>
+                <w:sz w:val="24"/>
+                <w:szCs w:val="24"/>
+                <w:lang w:val="en-ID" w:eastAsia="en-ID"/>
+              </w:rPr>
+              <w:t>Kompensasi berpengaruh positif dan signifikan terhadap kinerja karyawan.</w:t>
+            </w:r>
+          </w:p>
+        </w:tc>
+        <w:tc>
+          <w:tcPr>
+            <w:tcW w:w="0" w:type="auto"/>
+            <w:tcBorders>
+              <w:top w:val="single" w:sz="6" w:space="0" w:color="CCCCCC"/>
+              <w:left w:val="single" w:sz="6" w:space="0" w:color="CCCCCC"/>
+              <w:bottom w:val="single" w:sz="6" w:space="0" w:color="000000"/>
+              <w:right w:val="single" w:sz="6" w:space="0" w:color="000000"/>
+            </w:tcBorders>
+            <w:tcMar>
+              <w:top w:w="30" w:type="dxa"/>
+              <w:left w:w="45" w:type="dxa"/>
+              <w:bottom w:w="30" w:type="dxa"/>
+              <w:right w:w="45" w:type="dxa"/>
+            </w:tcMar>
+            <w:vAlign w:val="center"/>
+            <w:hideMark/>
+          </w:tcPr>
+          <w:p>
+            <w:pPr>
+              <w:widowControl/>
+              <w:autoSpaceDE/>
+              <w:autoSpaceDN/>
+              <w:spacing w:line="360" w:lineRule="auto"/>
+              <w:jc w:val="both"/>
+              <w:rPr>
+                <w:sz w:val="24"/>
+                <w:szCs w:val="24"/>
+                <w:lang w:val="en-ID" w:eastAsia="en-ID"/>
+              </w:rPr>
+            </w:pPr>
+            <w:r>
+              <w:rPr>
+                <w:sz w:val="24"/>
+                <w:szCs w:val="24"/>
+                <w:lang w:val="en-ID" w:eastAsia="en-ID"/>
+              </w:rPr>
+              <w:t>Perbedaan terletak pada variabel bebas tambahan (lingkungan kerja) dan penelitian ini tidak menggunakan variabel mediasi.</w:t>
+            </w:r>
+          </w:p>
+        </w:tc>
+      </w:tr>
+      <w:tr>
+        <w:trPr>
+          <w:trHeight w:val="315"/>
+        </w:trPr>
+        <w:tc>
+          <w:tcPr>
+            <w:tcW w:w="0" w:type="auto"/>
+            <w:tcBorders>
+              <w:top w:val="single" w:sz="6" w:space="0" w:color="CCCCCC"/>
+              <w:left w:val="single" w:sz="6" w:space="0" w:color="000000"/>
+              <w:bottom w:val="single" w:sz="6" w:space="0" w:color="000000"/>
+              <w:right w:val="single" w:sz="6" w:space="0" w:color="000000"/>
+            </w:tcBorders>
+            <w:tcMar>
+              <w:top w:w="30" w:type="dxa"/>
+              <w:left w:w="45" w:type="dxa"/>
+              <w:bottom w:w="30" w:type="dxa"/>
+              <w:right w:w="45" w:type="dxa"/>
+            </w:tcMar>
+            <w:vAlign w:val="center"/>
+            <w:hideMark/>
+          </w:tcPr>
+          <w:p>
+            <w:pPr>
+              <w:widowControl/>
+              <w:autoSpaceDE/>
+              <w:autoSpaceDN/>
+              <w:spacing w:line="360" w:lineRule="auto"/>
+              <w:jc w:val="center"/>
+              <w:rPr>
+                <w:sz w:val="24"/>
+                <w:szCs w:val="24"/>
+                <w:lang w:val="en-ID" w:eastAsia="en-ID"/>
+              </w:rPr>
+            </w:pPr>
+            <w:r>
+              <w:rPr>
+                <w:sz w:val="24"/>
+                <w:szCs w:val="24"/>
+                <w:lang w:val="en-ID" w:eastAsia="en-ID"/>
+              </w:rPr>
+              <w:t>Satria, E., dkk. (2024)</w:t>
+            </w:r>
+          </w:p>
+        </w:tc>
+        <w:tc>
+          <w:tcPr>
+            <w:tcW w:w="0" w:type="auto"/>
+            <w:tcBorders>
+              <w:top w:val="single" w:sz="6" w:space="0" w:color="CCCCCC"/>
+              <w:left w:val="single" w:sz="6" w:space="0" w:color="CCCCCC"/>
+              <w:bottom w:val="single" w:sz="6" w:space="0" w:color="000000"/>
+              <w:right w:val="single" w:sz="6" w:space="0" w:color="000000"/>
+            </w:tcBorders>
+            <w:tcMar>
+              <w:top w:w="30" w:type="dxa"/>
+              <w:left w:w="45" w:type="dxa"/>
+              <w:bottom w:w="30" w:type="dxa"/>
+              <w:right w:w="45" w:type="dxa"/>
+            </w:tcMar>
+            <w:vAlign w:val="center"/>
+            <w:hideMark/>
+          </w:tcPr>
+          <w:p>
+            <w:pPr>
+              <w:widowControl/>
+              <w:autoSpaceDE/>
+              <w:autoSpaceDN/>
+              <w:spacing w:line="360" w:lineRule="auto"/>
+              <w:rPr>
+                <w:sz w:val="24"/>
+                <w:szCs w:val="24"/>
+                <w:lang w:val="en-ID" w:eastAsia="en-ID"/>
+              </w:rPr>
+            </w:pPr>
+            <w:r>
+              <w:rPr>
+                <w:sz w:val="24"/>
+                <w:szCs w:val="24"/>
+                <w:lang w:val="en-ID" w:eastAsia="en-ID"/>
+              </w:rPr>
+              <w:t>Pengaruh Kompensasi terhadap Kinerja Pegawai pada Kantor Pemerintahan</w:t>
+            </w:r>
+            <w:r>
+              <w:rPr>
+                <w:sz w:val="24"/>
+                <w:szCs w:val="24"/>
+                <w:lang w:val="en-ID" w:eastAsia="en-ID"/>
+              </w:rPr>
+            </w:r>
+          </w:p>
+        </w:tc>
+        <w:tc>
+          <w:tcPr>
+            <w:tcW w:w="0" w:type="auto"/>
+            <w:tcBorders>
+              <w:top w:val="single" w:sz="6" w:space="0" w:color="CCCCCC"/>
+              <w:left w:val="single" w:sz="6" w:space="0" w:color="CCCCCC"/>
+              <w:bottom w:val="single" w:sz="6" w:space="0" w:color="000000"/>
+              <w:right w:val="single" w:sz="6" w:space="0" w:color="000000"/>
+            </w:tcBorders>
+            <w:tcMar>
+              <w:top w:w="30" w:type="dxa"/>
+              <w:left w:w="45" w:type="dxa"/>
+              <w:bottom w:w="30" w:type="dxa"/>
+              <w:right w:w="45" w:type="dxa"/>
+            </w:tcMar>
+            <w:vAlign w:val="center"/>
+            <w:hideMark/>
+          </w:tcPr>
+          <w:p>
+            <w:pPr>
+              <w:widowControl/>
+              <w:autoSpaceDE/>
+              <w:autoSpaceDN/>
+              <w:spacing w:line="360" w:lineRule="auto"/>
+              <w:jc w:val="center"/>
+              <w:rPr>
+                <w:sz w:val="24"/>
+                <w:szCs w:val="24"/>
+                <w:lang w:val="en-ID" w:eastAsia="en-ID"/>
+              </w:rPr>
+            </w:pPr>
+            <w:r>
+              <w:rPr>
+                <w:sz w:val="24"/>
+                <w:szCs w:val="24"/>
+                <w:lang w:val="en-ID" w:eastAsia="en-ID"/>
+              </w:rPr>
+              <w:t>Kinerja (Y)</w:t>
+            </w:r>
+          </w:p>
+        </w:tc>
+        <w:tc>
+          <w:tcPr>
+            <w:tcW w:w="0" w:type="auto"/>
+            <w:tcBorders>
+              <w:top w:val="single" w:sz="6" w:space="0" w:color="CCCCCC"/>
+              <w:left w:val="single" w:sz="6" w:space="0" w:color="CCCCCC"/>
+              <w:bottom w:val="single" w:sz="6" w:space="0" w:color="000000"/>
+              <w:right w:val="single" w:sz="6" w:space="0" w:color="000000"/>
+            </w:tcBorders>
+            <w:tcMar>
+              <w:top w:w="30" w:type="dxa"/>
+              <w:left w:w="45" w:type="dxa"/>
+              <w:bottom w:w="30" w:type="dxa"/>
+              <w:right w:w="45" w:type="dxa"/>
+            </w:tcMar>
+            <w:vAlign w:val="center"/>
+            <w:hideMark/>
+          </w:tcPr>
+          <w:p>
+            <w:pPr>
+              <w:widowControl/>
+              <w:autoSpaceDE/>
+              <w:autoSpaceDN/>
+              <w:spacing w:line="360" w:lineRule="auto"/>
+              <w:jc w:val="center"/>
+              <w:rPr>
+                <w:sz w:val="24"/>
+                <w:szCs w:val="24"/>
+                <w:lang w:val="en-ID" w:eastAsia="en-ID"/>
+              </w:rPr>
+            </w:pPr>
+            <w:r>
+              <w:rPr>
+                <w:sz w:val="24"/>
+                <w:szCs w:val="24"/>
+                <w:lang w:val="en-ID" w:eastAsia="en-ID"/>
+              </w:rPr>
+              <w:t>Kompensasi (X1)</w:t>
+            </w:r>
+          </w:p>
+        </w:tc>
+        <w:tc>
+          <w:tcPr>
+            <w:tcW w:w="0" w:type="auto"/>
+            <w:tcBorders>
+              <w:top w:val="single" w:sz="6" w:space="0" w:color="CCCCCC"/>
+              <w:left w:val="single" w:sz="6" w:space="0" w:color="CCCCCC"/>
+              <w:bottom w:val="single" w:sz="6" w:space="0" w:color="000000"/>
+              <w:right w:val="single" w:sz="6" w:space="0" w:color="000000"/>
+            </w:tcBorders>
+            <w:tcMar>
+              <w:top w:w="30" w:type="dxa"/>
+              <w:left w:w="45" w:type="dxa"/>
+              <w:bottom w:w="30" w:type="dxa"/>
+              <w:right w:w="45" w:type="dxa"/>
+            </w:tcMar>
+            <w:vAlign w:val="center"/>
+            <w:hideMark/>
+          </w:tcPr>
+          <w:p>
+            <w:pPr>
+              <w:widowControl/>
+              <w:autoSpaceDE/>
+              <w:autoSpaceDN/>
+              <w:spacing w:line="360" w:lineRule="auto"/>
+              <w:jc w:val="center"/>
+              <w:rPr>
+                <w:sz w:val="24"/>
+                <w:szCs w:val="24"/>
+                <w:lang w:val="en-ID" w:eastAsia="en-ID"/>
+              </w:rPr>
+            </w:pPr>
+            <w:r>
+              <w:rPr>
+                <w:sz w:val="24"/>
+                <w:szCs w:val="24"/>
+                <w:lang w:val="en-ID" w:eastAsia="en-ID"/>
+              </w:rPr>
+              <w:t>-</w:t>
+            </w:r>
+          </w:p>
+        </w:tc>
+        <w:tc>
+          <w:tcPr>
+            <w:tcW w:w="0" w:type="auto"/>
+            <w:tcBorders>
+              <w:top w:val="single" w:sz="6" w:space="0" w:color="CCCCCC"/>
+              <w:left w:val="single" w:sz="6" w:space="0" w:color="CCCCCC"/>
+              <w:bottom w:val="single" w:sz="6" w:space="0" w:color="000000"/>
+              <w:right w:val="single" w:sz="6" w:space="0" w:color="000000"/>
+            </w:tcBorders>
+            <w:tcMar>
+              <w:top w:w="30" w:type="dxa"/>
+              <w:left w:w="45" w:type="dxa"/>
+              <w:bottom w:w="30" w:type="dxa"/>
+              <w:right w:w="45" w:type="dxa"/>
+            </w:tcMar>
+            <w:vAlign w:val="center"/>
+            <w:hideMark/>
+          </w:tcPr>
+          <w:p>
+            <w:pPr>
+              <w:widowControl/>
+              <w:autoSpaceDE/>
+              <w:autoSpaceDN/>
+              <w:spacing w:line="360" w:lineRule="auto"/>
+              <w:jc w:val="both"/>
+              <w:rPr>
+                <w:sz w:val="24"/>
+                <w:szCs w:val="24"/>
+                <w:lang w:val="en-ID" w:eastAsia="en-ID"/>
+              </w:rPr>
+            </w:pPr>
+            <w:r>
+              <w:rPr>
+                <w:sz w:val="24"/>
+                <w:szCs w:val="24"/>
+                <w:lang w:val="en-ID" w:eastAsia="en-ID"/>
+              </w:rPr>
+              <w:t>Kompensasi berpengaruh positif dan signifikan terhadap kinerja pegawai pada instansi pemerintah.</w:t>
+            </w:r>
+          </w:p>
+        </w:tc>
+        <w:tc>
+          <w:tcPr>
+            <w:tcW w:w="0" w:type="auto"/>
+            <w:tcBorders>
+              <w:top w:val="single" w:sz="6" w:space="0" w:color="CCCCCC"/>
+              <w:left w:val="single" w:sz="6" w:space="0" w:color="CCCCCC"/>
+              <w:bottom w:val="single" w:sz="6" w:space="0" w:color="000000"/>
+              <w:right w:val="single" w:sz="6" w:space="0" w:color="000000"/>
+            </w:tcBorders>
+            <w:tcMar>
+              <w:top w:w="30" w:type="dxa"/>
+              <w:left w:w="45" w:type="dxa"/>
+              <w:bottom w:w="30" w:type="dxa"/>
+              <w:right w:w="45" w:type="dxa"/>
+            </w:tcMar>
+            <w:vAlign w:val="center"/>
+            <w:hideMark/>
+          </w:tcPr>
+          <w:p>
+            <w:pPr>
+              <w:widowControl/>
+              <w:autoSpaceDE/>
+              <w:autoSpaceDN/>
+              <w:spacing w:line="360" w:lineRule="auto"/>
+              <w:jc w:val="both"/>
+              <w:rPr>
+                <w:sz w:val="24"/>
+                <w:szCs w:val="24"/>
+                <w:lang w:val="en-ID" w:eastAsia="en-ID"/>
+              </w:rPr>
+            </w:pPr>
+            <w:r>
+              <w:rPr>
+                <w:sz w:val="24"/>
+                <w:szCs w:val="24"/>
+                <w:lang w:val="en-ID" w:eastAsia="en-ID"/>
+              </w:rPr>
+              <w:t>Perbedaan terletak pada obyek penelitian instansi pemerintah umum, bukan perangkat desa, dan tidak menggunakan variabel mediasi.</w:t>
             </w:r>
           </w:p>
         </w:tc>
@@ -11876,6 +12770,45 @@
           <w:szCs w:val="24"/>
         </w:rPr>
       </w:pPr>
+    </w:p>
+    <w:p>
+      <w:pPr>
+        <w:jc w:val="center"/>
+      </w:pPr>
+      <w:r>
+        <w:drawing>
+          <wp:inline xmlns:a="http://schemas.openxmlformats.org/drawingml/2006/main" xmlns:pic="http://schemas.openxmlformats.org/drawingml/2006/picture">
+            <wp:extent cx="5029200" cy="5029200"/>
+            <wp:docPr id="6" name="Picture 6"/>
+            <wp:cNvGraphicFramePr>
+              <a:graphicFrameLocks noChangeAspect="1"/>
+            </wp:cNvGraphicFramePr>
+            <a:graphic>
+              <a:graphicData uri="http://schemas.openxmlformats.org/drawingml/2006/picture">
+                <pic:pic>
+                  <pic:nvPicPr>
+                    <pic:cNvPr id="0" name="kerangka_fixed.png"/>
+                    <pic:cNvPicPr/>
+                  </pic:nvPicPr>
+                  <pic:blipFill>
+                    <a:blip r:embed="rId14"/>
+                    <a:stretch>
+                      <a:fillRect/>
+                    </a:stretch>
+                  </pic:blipFill>
+                  <pic:spPr>
+                    <a:xfrm>
+                      <a:off x="0" y="0"/>
+                      <a:ext cx="5029200" cy="5029200"/>
+                    </a:xfrm>
+                    <a:prstGeom prst="rect"/>
+                  </pic:spPr>
+                </pic:pic>
+              </a:graphicData>
+            </a:graphic>
+          </wp:inline>
+        </w:drawing>
+      </w:r>
     </w:p>
     <w:p>
       <w:pPr>

</xml_diff>

<commit_message>
Revise Sri Darni.docx: Fix H1-H4 labels in kerangka image, add Hasibuan (2019) definition in BAB II, add 3 missing references to Tabel 2.2
</commit_message>
<xml_diff>
--- a/File Skripsi/Sri Darni.docx
+++ b/File Skripsi/Sri Darni.docx
@@ -12788,6 +12788,45 @@
                 <pic:pic>
                   <pic:nvPicPr>
                     <pic:cNvPr id="0" name="kerangka_fixed.png"/>
+                    <pic:cNvPicPr/>
+                  </pic:nvPicPr>
+                  <pic:blipFill>
+                    <a:blip r:embed="rId14"/>
+                    <a:stretch>
+                      <a:fillRect/>
+                    </a:stretch>
+                  </pic:blipFill>
+                  <pic:spPr>
+                    <a:xfrm>
+                      <a:off x="0" y="0"/>
+                      <a:ext cx="5029200" cy="5029200"/>
+                    </a:xfrm>
+                    <a:prstGeom prst="rect"/>
+                  </pic:spPr>
+                </pic:pic>
+              </a:graphicData>
+            </a:graphic>
+          </wp:inline>
+        </w:drawing>
+      </w:r>
+    </w:p>
+    <w:p>
+      <w:pPr>
+        <w:jc w:val="center"/>
+      </w:pPr>
+      <w:r>
+        <w:drawing>
+          <wp:inline xmlns:a="http://schemas.openxmlformats.org/drawingml/2006/main" xmlns:pic="http://schemas.openxmlformats.org/drawingml/2006/picture">
+            <wp:extent cx="5029200" cy="5029200"/>
+            <wp:docPr id="7" name="Picture 7"/>
+            <wp:cNvGraphicFramePr>
+              <a:graphicFrameLocks noChangeAspect="1"/>
+            </wp:cNvGraphicFramePr>
+            <a:graphic>
+              <a:graphicData uri="http://schemas.openxmlformats.org/drawingml/2006/picture">
+                <pic:pic>
+                  <pic:nvPicPr>
+                    <pic:cNvPr id="0" name="image.jpg"/>
                     <pic:cNvPicPr/>
                   </pic:nvPicPr>
                   <pic:blipFill>

</xml_diff>

<commit_message>
Add DAFTAR ISI, DAFTAR TABEL, DAFTAR GAMBAR, and DAFTAR PUSTAKA to Sri Darni.docx
</commit_message>
<xml_diff>
--- a/File Skripsi/Sri Darni.docx
+++ b/File Skripsi/Sri Darni.docx
@@ -1585,6 +1585,1072 @@
       <w:pPr>
         <w:spacing w:line="360" w:lineRule="auto"/>
       </w:pPr>
+    </w:p>
+    <w:p>
+      <w:pPr>
+        <w:spacing w:line="360" w:lineRule="auto" w:after="40" w:before="40"/>
+      </w:pPr>
+      <w:r>
+        <w:rPr>
+          <w:rFonts w:ascii="Times New Roman" w:hAnsi="Times New Roman"/>
+          <w:b/>
+          <w:sz w:val="24"/>
+        </w:rPr>
+        <w:t>ABSTRAK</w:t>
+      </w:r>
+      <w:r>
+        <w:rPr>
+          <w:rFonts w:ascii="Times New Roman" w:hAnsi="Times New Roman"/>
+          <w:sz w:val="24"/>
+        </w:rPr>
+        <w:t xml:space="preserve">  . . . . . . . . . . . . . . . . . . . . . . . . . . . . . . . . . . . . i</w:t>
+      </w:r>
+    </w:p>
+    <w:p>
+      <w:pPr>
+        <w:spacing w:line="360" w:lineRule="auto" w:after="40" w:before="40"/>
+      </w:pPr>
+      <w:r>
+        <w:rPr>
+          <w:rFonts w:ascii="Times New Roman" w:hAnsi="Times New Roman"/>
+          <w:b/>
+          <w:sz w:val="24"/>
+        </w:rPr>
+        <w:t>ABSTRACT</w:t>
+      </w:r>
+      <w:r>
+        <w:rPr>
+          <w:rFonts w:ascii="Times New Roman" w:hAnsi="Times New Roman"/>
+          <w:sz w:val="24"/>
+        </w:rPr>
+        <w:t xml:space="preserve">  . . . . . . . . . . . . . . . . . . . . . . . . . . . . . . . . . . . . ii</w:t>
+      </w:r>
+    </w:p>
+    <w:p>
+      <w:pPr>
+        <w:spacing w:line="360" w:lineRule="auto" w:after="40" w:before="40"/>
+      </w:pPr>
+      <w:r>
+        <w:rPr>
+          <w:rFonts w:ascii="Times New Roman" w:hAnsi="Times New Roman"/>
+          <w:b/>
+          <w:sz w:val="24"/>
+        </w:rPr>
+        <w:t>KATA PENGANTAR</w:t>
+      </w:r>
+      <w:r>
+        <w:rPr>
+          <w:rFonts w:ascii="Times New Roman" w:hAnsi="Times New Roman"/>
+          <w:sz w:val="24"/>
+        </w:rPr>
+        <w:t xml:space="preserve">  . . . . . . . . . . . . . . . . . . . . . . . . . . . . . . . . . iii</w:t>
+      </w:r>
+    </w:p>
+    <w:p>
+      <w:pPr>
+        <w:spacing w:line="360" w:lineRule="auto" w:after="40" w:before="40"/>
+      </w:pPr>
+      <w:r>
+        <w:rPr>
+          <w:rFonts w:ascii="Times New Roman" w:hAnsi="Times New Roman"/>
+          <w:b/>
+          <w:sz w:val="24"/>
+        </w:rPr>
+        <w:t>DAFTAR ISI</w:t>
+      </w:r>
+      <w:r>
+        <w:rPr>
+          <w:rFonts w:ascii="Times New Roman" w:hAnsi="Times New Roman"/>
+          <w:sz w:val="24"/>
+        </w:rPr>
+        <w:t xml:space="preserve">  . . . . . . . . . . . . . . . . . . . . . . . . . . . . . . . . . . . iv</w:t>
+      </w:r>
+    </w:p>
+    <w:p>
+      <w:pPr>
+        <w:spacing w:line="360" w:lineRule="auto" w:after="40" w:before="40"/>
+      </w:pPr>
+      <w:r>
+        <w:rPr>
+          <w:rFonts w:ascii="Times New Roman" w:hAnsi="Times New Roman"/>
+          <w:b/>
+          <w:sz w:val="24"/>
+        </w:rPr>
+        <w:t>DAFTAR TABEL</w:t>
+      </w:r>
+      <w:r>
+        <w:rPr>
+          <w:rFonts w:ascii="Times New Roman" w:hAnsi="Times New Roman"/>
+          <w:sz w:val="24"/>
+        </w:rPr>
+        <w:t xml:space="preserve">  . . . . . . . . . . . . . . . . . . . . . . . . . . . . . . . . . . vi</w:t>
+      </w:r>
+    </w:p>
+    <w:p>
+      <w:pPr>
+        <w:spacing w:line="360" w:lineRule="auto" w:after="40" w:before="40"/>
+      </w:pPr>
+      <w:r>
+        <w:rPr>
+          <w:rFonts w:ascii="Times New Roman" w:hAnsi="Times New Roman"/>
+          <w:b/>
+          <w:sz w:val="24"/>
+        </w:rPr>
+        <w:t>DAFTAR GAMBAR</w:t>
+      </w:r>
+      <w:r>
+        <w:rPr>
+          <w:rFonts w:ascii="Times New Roman" w:hAnsi="Times New Roman"/>
+          <w:sz w:val="24"/>
+        </w:rPr>
+        <w:t xml:space="preserve">  . . . . . . . . . . . . . . . . . . . . . . . . . . . . . . . . . vii</w:t>
+      </w:r>
+    </w:p>
+    <w:p>
+      <w:pPr>
+        <w:spacing w:line="360" w:lineRule="auto" w:after="40" w:before="40"/>
+      </w:pPr>
+      <w:r>
+        <w:rPr>
+          <w:rFonts w:ascii="Times New Roman" w:hAnsi="Times New Roman"/>
+          <w:b/>
+          <w:sz w:val="24"/>
+        </w:rPr>
+        <w:t>BAB I PENDAHULUAN</w:t>
+      </w:r>
+      <w:r>
+        <w:rPr>
+          <w:rFonts w:ascii="Times New Roman" w:hAnsi="Times New Roman"/>
+          <w:sz w:val="24"/>
+        </w:rPr>
+        <w:t xml:space="preserve">  . . . . . . . . . . . . . . . . . . . . . . . . . . . . . . . 1</w:t>
+      </w:r>
+    </w:p>
+    <w:p>
+      <w:pPr>
+        <w:spacing w:line="360" w:lineRule="auto" w:after="40" w:before="40"/>
+      </w:pPr>
+      <w:r>
+        <w:rPr>
+          <w:rFonts w:ascii="Times New Roman" w:hAnsi="Times New Roman"/>
+          <w:sz w:val="24"/>
+        </w:rPr>
+        <w:t xml:space="preserve">    A. Latar Belakang Masalah</w:t>
+      </w:r>
+      <w:r>
+        <w:rPr>
+          <w:rFonts w:ascii="Times New Roman" w:hAnsi="Times New Roman"/>
+          <w:sz w:val="24"/>
+        </w:rPr>
+        <w:t xml:space="preserve">  . . . . . . . . . . . . . . . . . . . . . . . . . 1</w:t>
+      </w:r>
+    </w:p>
+    <w:p>
+      <w:pPr>
+        <w:spacing w:line="360" w:lineRule="auto" w:after="40" w:before="40"/>
+      </w:pPr>
+      <w:r>
+        <w:rPr>
+          <w:rFonts w:ascii="Times New Roman" w:hAnsi="Times New Roman"/>
+          <w:sz w:val="24"/>
+        </w:rPr>
+        <w:t xml:space="preserve">    B. Identifikasi Masalah</w:t>
+      </w:r>
+      <w:r>
+        <w:rPr>
+          <w:rFonts w:ascii="Times New Roman" w:hAnsi="Times New Roman"/>
+          <w:sz w:val="24"/>
+        </w:rPr>
+        <w:t xml:space="preserve">  . . . . . . . . . . . . . . . . . . . . . . . . . . 5</w:t>
+      </w:r>
+    </w:p>
+    <w:p>
+      <w:pPr>
+        <w:spacing w:line="360" w:lineRule="auto" w:after="40" w:before="40"/>
+      </w:pPr>
+      <w:r>
+        <w:rPr>
+          <w:rFonts w:ascii="Times New Roman" w:hAnsi="Times New Roman"/>
+          <w:sz w:val="24"/>
+        </w:rPr>
+        <w:t xml:space="preserve">    C. Pembatasan Masalah</w:t>
+      </w:r>
+      <w:r>
+        <w:rPr>
+          <w:rFonts w:ascii="Times New Roman" w:hAnsi="Times New Roman"/>
+          <w:sz w:val="24"/>
+        </w:rPr>
+        <w:t xml:space="preserve">  . . . . . . . . . . . . . . . . . . . . . . . . . . . 6</w:t>
+      </w:r>
+    </w:p>
+    <w:p>
+      <w:pPr>
+        <w:spacing w:line="360" w:lineRule="auto" w:after="40" w:before="40"/>
+      </w:pPr>
+      <w:r>
+        <w:rPr>
+          <w:rFonts w:ascii="Times New Roman" w:hAnsi="Times New Roman"/>
+          <w:sz w:val="24"/>
+        </w:rPr>
+        <w:t xml:space="preserve">    D. Rumusan Masalah</w:t>
+      </w:r>
+      <w:r>
+        <w:rPr>
+          <w:rFonts w:ascii="Times New Roman" w:hAnsi="Times New Roman"/>
+          <w:sz w:val="24"/>
+        </w:rPr>
+        <w:t xml:space="preserve">  . . . . . . . . . . . . . . . . . . . . . . . . . . . . . 6</w:t>
+      </w:r>
+    </w:p>
+    <w:p>
+      <w:pPr>
+        <w:spacing w:line="360" w:lineRule="auto" w:after="40" w:before="40"/>
+      </w:pPr>
+      <w:r>
+        <w:rPr>
+          <w:rFonts w:ascii="Times New Roman" w:hAnsi="Times New Roman"/>
+          <w:sz w:val="24"/>
+        </w:rPr>
+        <w:t xml:space="preserve">    E. Tujuan Penelitian</w:t>
+      </w:r>
+      <w:r>
+        <w:rPr>
+          <w:rFonts w:ascii="Times New Roman" w:hAnsi="Times New Roman"/>
+          <w:sz w:val="24"/>
+        </w:rPr>
+        <w:t xml:space="preserve">  . . . . . . . . . . . . . . . . . . . . . . . . . . . . 7</w:t>
+      </w:r>
+    </w:p>
+    <w:p>
+      <w:pPr>
+        <w:spacing w:line="360" w:lineRule="auto" w:after="40" w:before="40"/>
+      </w:pPr>
+      <w:r>
+        <w:rPr>
+          <w:rFonts w:ascii="Times New Roman" w:hAnsi="Times New Roman"/>
+          <w:sz w:val="24"/>
+        </w:rPr>
+        <w:t xml:space="preserve">    F. Manfaat Penelitian</w:t>
+      </w:r>
+      <w:r>
+        <w:rPr>
+          <w:rFonts w:ascii="Times New Roman" w:hAnsi="Times New Roman"/>
+          <w:sz w:val="24"/>
+        </w:rPr>
+        <w:t xml:space="preserve">  . . . . . . . . . . . . . . . . . . . . . . . . . . . 7</w:t>
+      </w:r>
+    </w:p>
+    <w:p>
+      <w:pPr>
+        <w:spacing w:line="360" w:lineRule="auto" w:after="40" w:before="40"/>
+      </w:pPr>
+      <w:r>
+        <w:rPr>
+          <w:rFonts w:ascii="Times New Roman" w:hAnsi="Times New Roman"/>
+          <w:sz w:val="24"/>
+        </w:rPr>
+        <w:t xml:space="preserve">    G. Sistematika Penulisan Skripsi</w:t>
+      </w:r>
+      <w:r>
+        <w:rPr>
+          <w:rFonts w:ascii="Times New Roman" w:hAnsi="Times New Roman"/>
+          <w:sz w:val="24"/>
+        </w:rPr>
+        <w:t xml:space="preserve">  . . . . . . . . . . . . . . . . . . . . . . 8</w:t>
+      </w:r>
+    </w:p>
+    <w:p>
+      <w:pPr>
+        <w:spacing w:line="360" w:lineRule="auto" w:after="40" w:before="40"/>
+      </w:pPr>
+      <w:r>
+        <w:rPr>
+          <w:rFonts w:ascii="Times New Roman" w:hAnsi="Times New Roman"/>
+          <w:b/>
+          <w:sz w:val="24"/>
+        </w:rPr>
+        <w:t>BAB II LANDASAN TEORITIS DAN PENGEMBANGAN HIPOTESIS</w:t>
+      </w:r>
+      <w:r>
+        <w:rPr>
+          <w:rFonts w:ascii="Times New Roman" w:hAnsi="Times New Roman"/>
+          <w:sz w:val="24"/>
+        </w:rPr>
+        <w:t xml:space="preserve">  . . . . . . . . . . . . . . 10</w:t>
+      </w:r>
+    </w:p>
+    <w:p>
+      <w:pPr>
+        <w:spacing w:line="360" w:lineRule="auto" w:after="40" w:before="40"/>
+      </w:pPr>
+      <w:r>
+        <w:rPr>
+          <w:rFonts w:ascii="Times New Roman" w:hAnsi="Times New Roman"/>
+          <w:sz w:val="24"/>
+        </w:rPr>
+        <w:t xml:space="preserve">    A. Landasan Teori</w:t>
+      </w:r>
+      <w:r>
+        <w:rPr>
+          <w:rFonts w:ascii="Times New Roman" w:hAnsi="Times New Roman"/>
+          <w:sz w:val="24"/>
+        </w:rPr>
+        <w:t xml:space="preserve">  . . . . . . . . . . . . . . . . . . . . . . . . . . . . . 10</w:t>
+      </w:r>
+    </w:p>
+    <w:p>
+      <w:pPr>
+        <w:spacing w:line="360" w:lineRule="auto" w:after="40" w:before="40"/>
+      </w:pPr>
+      <w:r>
+        <w:rPr>
+          <w:rFonts w:ascii="Times New Roman" w:hAnsi="Times New Roman"/>
+          <w:sz w:val="24"/>
+        </w:rPr>
+        <w:t xml:space="preserve">        1. Kinerja Perangkat Desa</w:t>
+      </w:r>
+      <w:r>
+        <w:rPr>
+          <w:rFonts w:ascii="Times New Roman" w:hAnsi="Times New Roman"/>
+          <w:sz w:val="24"/>
+        </w:rPr>
+        <w:t xml:space="preserve">  . . . . . . . . . . . . . . . . . . . . . . . 10</w:t>
+      </w:r>
+    </w:p>
+    <w:p>
+      <w:pPr>
+        <w:spacing w:line="360" w:lineRule="auto" w:after="40" w:before="40"/>
+      </w:pPr>
+      <w:r>
+        <w:rPr>
+          <w:rFonts w:ascii="Times New Roman" w:hAnsi="Times New Roman"/>
+          <w:sz w:val="24"/>
+        </w:rPr>
+        <w:t xml:space="preserve">        2. Gaya Kepemimpinan</w:t>
+      </w:r>
+      <w:r>
+        <w:rPr>
+          <w:rFonts w:ascii="Times New Roman" w:hAnsi="Times New Roman"/>
+          <w:sz w:val="24"/>
+        </w:rPr>
+        <w:t xml:space="preserve">  . . . . . . . . . . . . . . . . . . . . . . . . . . 13</w:t>
+      </w:r>
+    </w:p>
+    <w:p>
+      <w:pPr>
+        <w:spacing w:line="360" w:lineRule="auto" w:after="40" w:before="40"/>
+      </w:pPr>
+      <w:r>
+        <w:rPr>
+          <w:rFonts w:ascii="Times New Roman" w:hAnsi="Times New Roman"/>
+          <w:sz w:val="24"/>
+        </w:rPr>
+        <w:t xml:space="preserve">        3. Kompensasi</w:t>
+      </w:r>
+      <w:r>
+        <w:rPr>
+          <w:rFonts w:ascii="Times New Roman" w:hAnsi="Times New Roman"/>
+          <w:sz w:val="24"/>
+        </w:rPr>
+        <w:t xml:space="preserve">  . . . . . . . . . . . . . . . . . . . . . . . . . . . . . 16</w:t>
+      </w:r>
+    </w:p>
+    <w:p>
+      <w:pPr>
+        <w:spacing w:line="360" w:lineRule="auto" w:after="40" w:before="40"/>
+      </w:pPr>
+      <w:r>
+        <w:rPr>
+          <w:rFonts w:ascii="Times New Roman" w:hAnsi="Times New Roman"/>
+          <w:sz w:val="24"/>
+        </w:rPr>
+        <w:t xml:space="preserve">        4. Motivasi Kerja</w:t>
+      </w:r>
+      <w:r>
+        <w:rPr>
+          <w:rFonts w:ascii="Times New Roman" w:hAnsi="Times New Roman"/>
+          <w:sz w:val="24"/>
+        </w:rPr>
+        <w:t xml:space="preserve">  . . . . . . . . . . . . . . . . . . . . . . . . . . . 19</w:t>
+      </w:r>
+    </w:p>
+    <w:p>
+      <w:pPr>
+        <w:spacing w:line="360" w:lineRule="auto" w:after="40" w:before="40"/>
+      </w:pPr>
+      <w:r>
+        <w:rPr>
+          <w:rFonts w:ascii="Times New Roman" w:hAnsi="Times New Roman"/>
+          <w:sz w:val="24"/>
+        </w:rPr>
+        <w:t xml:space="preserve">    B. Hasil Penelitian Terdahulu</w:t>
+      </w:r>
+      <w:r>
+        <w:rPr>
+          <w:rFonts w:ascii="Times New Roman" w:hAnsi="Times New Roman"/>
+          <w:sz w:val="24"/>
+        </w:rPr>
+        <w:t xml:space="preserve">  . . . . . . . . . . . . . . . . . . . . . . . 23</w:t>
+      </w:r>
+    </w:p>
+    <w:p>
+      <w:pPr>
+        <w:spacing w:line="360" w:lineRule="auto" w:after="40" w:before="40"/>
+      </w:pPr>
+      <w:r>
+        <w:rPr>
+          <w:rFonts w:ascii="Times New Roman" w:hAnsi="Times New Roman"/>
+          <w:sz w:val="24"/>
+        </w:rPr>
+        <w:t xml:space="preserve">    C. Kerangka Berpikir</w:t>
+      </w:r>
+      <w:r>
+        <w:rPr>
+          <w:rFonts w:ascii="Times New Roman" w:hAnsi="Times New Roman"/>
+          <w:sz w:val="24"/>
+        </w:rPr>
+        <w:t xml:space="preserve">  . . . . . . . . . . . . . . . . . . . . . . . . . . . . 29</w:t>
+      </w:r>
+    </w:p>
+    <w:p>
+      <w:pPr>
+        <w:spacing w:line="360" w:lineRule="auto" w:after="40" w:before="40"/>
+      </w:pPr>
+      <w:r>
+        <w:rPr>
+          <w:rFonts w:ascii="Times New Roman" w:hAnsi="Times New Roman"/>
+          <w:sz w:val="24"/>
+        </w:rPr>
+        <w:t xml:space="preserve">    D. Pengembangan Hipotesis</w:t>
+      </w:r>
+      <w:r>
+        <w:rPr>
+          <w:rFonts w:ascii="Times New Roman" w:hAnsi="Times New Roman"/>
+          <w:sz w:val="24"/>
+        </w:rPr>
+        <w:t xml:space="preserve">  . . . . . . . . . . . . . . . . . . . . . . . . . 30</w:t>
+      </w:r>
+    </w:p>
+    <w:p>
+      <w:pPr>
+        <w:spacing w:line="360" w:lineRule="auto" w:after="40" w:before="40"/>
+      </w:pPr>
+      <w:r>
+        <w:rPr>
+          <w:rFonts w:ascii="Times New Roman" w:hAnsi="Times New Roman"/>
+          <w:b/>
+          <w:sz w:val="24"/>
+        </w:rPr>
+        <w:t>BAB III METODE PENELITIAN</w:t>
+      </w:r>
+      <w:r>
+        <w:rPr>
+          <w:rFonts w:ascii="Times New Roman" w:hAnsi="Times New Roman"/>
+          <w:sz w:val="24"/>
+        </w:rPr>
+        <w:t xml:space="preserve">  . . . . . . . . . . . . . . . . . . . . . . . . . . . 31</w:t>
+      </w:r>
+    </w:p>
+    <w:p>
+      <w:pPr>
+        <w:spacing w:line="360" w:lineRule="auto" w:after="40" w:before="40"/>
+      </w:pPr>
+      <w:r>
+        <w:rPr>
+          <w:rFonts w:ascii="Times New Roman" w:hAnsi="Times New Roman"/>
+          <w:sz w:val="24"/>
+        </w:rPr>
+        <w:t xml:space="preserve">    A. Tempat dan Waktu Penelitian</w:t>
+      </w:r>
+      <w:r>
+        <w:rPr>
+          <w:rFonts w:ascii="Times New Roman" w:hAnsi="Times New Roman"/>
+          <w:sz w:val="24"/>
+        </w:rPr>
+        <w:t xml:space="preserve">  . . . . . . . . . . . . . . . . . . . . . . . 31</w:t>
+      </w:r>
+    </w:p>
+    <w:p>
+      <w:pPr>
+        <w:spacing w:line="360" w:lineRule="auto" w:after="40" w:before="40"/>
+      </w:pPr>
+      <w:r>
+        <w:rPr>
+          <w:rFonts w:ascii="Times New Roman" w:hAnsi="Times New Roman"/>
+          <w:sz w:val="24"/>
+        </w:rPr>
+        <w:t xml:space="preserve">    B. Desain Penelitian</w:t>
+      </w:r>
+      <w:r>
+        <w:rPr>
+          <w:rFonts w:ascii="Times New Roman" w:hAnsi="Times New Roman"/>
+          <w:sz w:val="24"/>
+        </w:rPr>
+        <w:t xml:space="preserve">  . . . . . . . . . . . . . . . . . . . . . . . . . . . . 31</w:t>
+      </w:r>
+    </w:p>
+    <w:p>
+      <w:pPr>
+        <w:spacing w:line="360" w:lineRule="auto" w:after="40" w:before="40"/>
+      </w:pPr>
+      <w:r>
+        <w:rPr>
+          <w:rFonts w:ascii="Times New Roman" w:hAnsi="Times New Roman"/>
+          <w:sz w:val="24"/>
+        </w:rPr>
+        <w:t xml:space="preserve">    C. Definisi Operasional dan Pengukuran Variabel Penelitian</w:t>
+      </w:r>
+      <w:r>
+        <w:rPr>
+          <w:rFonts w:ascii="Times New Roman" w:hAnsi="Times New Roman"/>
+          <w:sz w:val="24"/>
+        </w:rPr>
+        <w:t xml:space="preserve">  . . . . . . . . . 32</w:t>
+      </w:r>
+    </w:p>
+    <w:p>
+      <w:pPr>
+        <w:spacing w:line="360" w:lineRule="auto" w:after="40" w:before="40"/>
+      </w:pPr>
+      <w:r>
+        <w:rPr>
+          <w:rFonts w:ascii="Times New Roman" w:hAnsi="Times New Roman"/>
+          <w:sz w:val="24"/>
+        </w:rPr>
+        <w:t xml:space="preserve">        1. Variabel Bebas (Variabel Independen)</w:t>
+      </w:r>
+      <w:r>
+        <w:rPr>
+          <w:rFonts w:ascii="Times New Roman" w:hAnsi="Times New Roman"/>
+          <w:sz w:val="24"/>
+        </w:rPr>
+        <w:t xml:space="preserve">  . . . . . . . . . . . . . . . . 32</w:t>
+      </w:r>
+    </w:p>
+    <w:p>
+      <w:pPr>
+        <w:spacing w:line="360" w:lineRule="auto" w:after="40" w:before="40"/>
+      </w:pPr>
+      <w:r>
+        <w:rPr>
+          <w:rFonts w:ascii="Times New Roman" w:hAnsi="Times New Roman"/>
+          <w:sz w:val="24"/>
+        </w:rPr>
+        <w:t xml:space="preserve">        2. Variabel Terikat (Variabel Dependen)</w:t>
+      </w:r>
+      <w:r>
+        <w:rPr>
+          <w:rFonts w:ascii="Times New Roman" w:hAnsi="Times New Roman"/>
+          <w:sz w:val="24"/>
+        </w:rPr>
+        <w:t xml:space="preserve">  . . . . . . . . . . . . . . . . 32</w:t>
+      </w:r>
+    </w:p>
+    <w:p>
+      <w:pPr>
+        <w:spacing w:line="360" w:lineRule="auto" w:after="40" w:before="40"/>
+      </w:pPr>
+      <w:r>
+        <w:rPr>
+          <w:rFonts w:ascii="Times New Roman" w:hAnsi="Times New Roman"/>
+          <w:sz w:val="24"/>
+        </w:rPr>
+        <w:t xml:space="preserve">        3. Variabel Mediasi</w:t>
+      </w:r>
+      <w:r>
+        <w:rPr>
+          <w:rFonts w:ascii="Times New Roman" w:hAnsi="Times New Roman"/>
+          <w:sz w:val="24"/>
+        </w:rPr>
+        <w:t xml:space="preserve">  . . . . . . . . . . . . . . . . . . . . . . . . . . 33</w:t>
+      </w:r>
+    </w:p>
+    <w:p>
+      <w:pPr>
+        <w:spacing w:line="360" w:lineRule="auto" w:after="40" w:before="40"/>
+      </w:pPr>
+      <w:r>
+        <w:rPr>
+          <w:rFonts w:ascii="Times New Roman" w:hAnsi="Times New Roman"/>
+          <w:sz w:val="24"/>
+        </w:rPr>
+        <w:t xml:space="preserve">        4. Operasionalisasi Variabel Penelitian</w:t>
+      </w:r>
+      <w:r>
+        <w:rPr>
+          <w:rFonts w:ascii="Times New Roman" w:hAnsi="Times New Roman"/>
+          <w:sz w:val="24"/>
+        </w:rPr>
+        <w:t xml:space="preserve">  . . . . . . . . . . . . . . . . 33</w:t>
+      </w:r>
+    </w:p>
+    <w:p>
+      <w:pPr>
+        <w:spacing w:line="360" w:lineRule="auto" w:after="40" w:before="40"/>
+      </w:pPr>
+      <w:r>
+        <w:rPr>
+          <w:rFonts w:ascii="Times New Roman" w:hAnsi="Times New Roman"/>
+          <w:sz w:val="24"/>
+        </w:rPr>
+        <w:t xml:space="preserve">    D. Populasi dan Sampel Penelitian</w:t>
+      </w:r>
+      <w:r>
+        <w:rPr>
+          <w:rFonts w:ascii="Times New Roman" w:hAnsi="Times New Roman"/>
+          <w:sz w:val="24"/>
+        </w:rPr>
+        <w:t xml:space="preserve">  . . . . . . . . . . . . . . . . . . . . . 34</w:t>
+      </w:r>
+    </w:p>
+    <w:p>
+      <w:pPr>
+        <w:spacing w:line="360" w:lineRule="auto" w:after="40" w:before="40"/>
+      </w:pPr>
+      <w:r>
+        <w:rPr>
+          <w:rFonts w:ascii="Times New Roman" w:hAnsi="Times New Roman"/>
+          <w:sz w:val="24"/>
+        </w:rPr>
+        <w:t xml:space="preserve">        1. Populasi</w:t>
+      </w:r>
+      <w:r>
+        <w:rPr>
+          <w:rFonts w:ascii="Times New Roman" w:hAnsi="Times New Roman"/>
+          <w:sz w:val="24"/>
+        </w:rPr>
+        <w:t xml:space="preserve">  . . . . . . . . . . . . . . . . . . . . . . . . . . . . . . 34</w:t>
+      </w:r>
+    </w:p>
+    <w:p>
+      <w:pPr>
+        <w:spacing w:line="360" w:lineRule="auto" w:after="40" w:before="40"/>
+      </w:pPr>
+      <w:r>
+        <w:rPr>
+          <w:rFonts w:ascii="Times New Roman" w:hAnsi="Times New Roman"/>
+          <w:sz w:val="24"/>
+        </w:rPr>
+        <w:t xml:space="preserve">        2. Sampel</w:t>
+      </w:r>
+      <w:r>
+        <w:rPr>
+          <w:rFonts w:ascii="Times New Roman" w:hAnsi="Times New Roman"/>
+          <w:sz w:val="24"/>
+        </w:rPr>
+        <w:t xml:space="preserve">  . . . . . . . . . . . . . . . . . . . . . . . . . . . . . . . 35</w:t>
+      </w:r>
+    </w:p>
+    <w:p>
+      <w:pPr>
+        <w:spacing w:line="360" w:lineRule="auto" w:after="40" w:before="40"/>
+      </w:pPr>
+      <w:r>
+        <w:rPr>
+          <w:rFonts w:ascii="Times New Roman" w:hAnsi="Times New Roman"/>
+          <w:sz w:val="24"/>
+        </w:rPr>
+        <w:t xml:space="preserve">    E. Metode Pengumpulan Data</w:t>
+      </w:r>
+      <w:r>
+        <w:rPr>
+          <w:rFonts w:ascii="Times New Roman" w:hAnsi="Times New Roman"/>
+          <w:sz w:val="24"/>
+        </w:rPr>
+        <w:t xml:space="preserve">  . . . . . . . . . . . . . . . . . . . . . . . . . 36</w:t>
+      </w:r>
+    </w:p>
+    <w:p>
+      <w:pPr>
+        <w:spacing w:line="360" w:lineRule="auto" w:after="40" w:before="40"/>
+      </w:pPr>
+      <w:r>
+        <w:rPr>
+          <w:rFonts w:ascii="Times New Roman" w:hAnsi="Times New Roman"/>
+          <w:sz w:val="24"/>
+        </w:rPr>
+        <w:t xml:space="preserve">        1. Teknik Pengumpulan Data</w:t>
+      </w:r>
+      <w:r>
+        <w:rPr>
+          <w:rFonts w:ascii="Times New Roman" w:hAnsi="Times New Roman"/>
+          <w:sz w:val="24"/>
+        </w:rPr>
+        <w:t xml:space="preserve">  . . . . . . . . . . . . . . . . . . . . . . . 36</w:t>
+      </w:r>
+    </w:p>
+    <w:p>
+      <w:pPr>
+        <w:spacing w:line="360" w:lineRule="auto" w:after="40" w:before="40"/>
+      </w:pPr>
+      <w:r>
+        <w:rPr>
+          <w:rFonts w:ascii="Times New Roman" w:hAnsi="Times New Roman"/>
+          <w:sz w:val="24"/>
+        </w:rPr>
+        <w:t xml:space="preserve">        2. Sumber Data</w:t>
+      </w:r>
+      <w:r>
+        <w:rPr>
+          <w:rFonts w:ascii="Times New Roman" w:hAnsi="Times New Roman"/>
+          <w:sz w:val="24"/>
+        </w:rPr>
+        <w:t xml:space="preserve">  . . . . . . . . . . . . . . . . . . . . . . . . . . . . . 36</w:t>
+      </w:r>
+    </w:p>
+    <w:p>
+      <w:pPr>
+        <w:spacing w:line="360" w:lineRule="auto" w:after="40" w:before="40"/>
+      </w:pPr>
+      <w:r>
+        <w:rPr>
+          <w:rFonts w:ascii="Times New Roman" w:hAnsi="Times New Roman"/>
+          <w:sz w:val="24"/>
+        </w:rPr>
+        <w:t xml:space="preserve">        3. Teknik Pengembangan Instrumen</w:t>
+      </w:r>
+      <w:r>
+        <w:rPr>
+          <w:rFonts w:ascii="Times New Roman" w:hAnsi="Times New Roman"/>
+          <w:sz w:val="24"/>
+        </w:rPr>
+        <w:t xml:space="preserve">  . . . . . . . . . . . . . . . . . . . . 37</w:t>
+      </w:r>
+    </w:p>
+    <w:p>
+      <w:pPr>
+        <w:spacing w:line="360" w:lineRule="auto" w:after="40" w:before="40"/>
+      </w:pPr>
+      <w:r>
+        <w:rPr>
+          <w:rFonts w:ascii="Times New Roman" w:hAnsi="Times New Roman"/>
+          <w:sz w:val="24"/>
+        </w:rPr>
+        <w:t xml:space="preserve">    F. Teknik Analisis Data</w:t>
+      </w:r>
+      <w:r>
+        <w:rPr>
+          <w:rFonts w:ascii="Times New Roman" w:hAnsi="Times New Roman"/>
+          <w:sz w:val="24"/>
+        </w:rPr>
+        <w:t xml:space="preserve">  . . . . . . . . . . . . . . . . . . . . . . . . . . 38</w:t>
+      </w:r>
+    </w:p>
+    <w:p>
+      <w:pPr>
+        <w:spacing w:line="360" w:lineRule="auto" w:after="40" w:before="40"/>
+      </w:pPr>
+      <w:r>
+        <w:rPr>
+          <w:rFonts w:ascii="Times New Roman" w:hAnsi="Times New Roman"/>
+          <w:b/>
+          <w:sz w:val="24"/>
+        </w:rPr>
+        <w:t>DAFTAR PUSTAKA</w:t>
+      </w:r>
+      <w:r>
+        <w:rPr>
+          <w:rFonts w:ascii="Times New Roman" w:hAnsi="Times New Roman"/>
+          <w:sz w:val="24"/>
+        </w:rPr>
+        <w:t xml:space="preserve">  . . . . . . . . . . . . . . . . . . . . . . . . . . . . . . . . . 44</w:t>
+      </w:r>
+    </w:p>
+    <w:p>
+      <w:pPr>
+        <w:jc w:val="center"/>
+      </w:pPr>
+      <w:r>
+        <w:rPr>
+          <w:rFonts w:ascii="Times New Roman" w:hAnsi="Times New Roman"/>
+          <w:b/>
+          <w:sz w:val="24"/>
+        </w:rPr>
+        <w:br/>
+        <w:br/>
+        <w:t>DAFTAR TABEL</w:t>
+      </w:r>
+    </w:p>
+    <w:p>
+      <w:pPr>
+        <w:spacing w:line="360" w:lineRule="auto" w:after="40"/>
+      </w:pPr>
+      <w:r>
+        <w:rPr>
+          <w:rFonts w:ascii="Times New Roman" w:hAnsi="Times New Roman"/>
+          <w:sz w:val="24"/>
+        </w:rPr>
+        <w:t>Tabel 2.1 Faktor-Faktor yang Mempengaruhi Kompensasi</w:t>
+      </w:r>
+      <w:r>
+        <w:rPr>
+          <w:rFonts w:ascii="Times New Roman" w:hAnsi="Times New Roman"/>
+          <w:sz w:val="24"/>
+        </w:rPr>
+        <w:t xml:space="preserve">  . . . . . . . . . . . 18</w:t>
+      </w:r>
+    </w:p>
+    <w:p>
+      <w:pPr>
+        <w:spacing w:line="360" w:lineRule="auto" w:after="40"/>
+      </w:pPr>
+      <w:r>
+        <w:rPr>
+          <w:rFonts w:ascii="Times New Roman" w:hAnsi="Times New Roman"/>
+          <w:sz w:val="24"/>
+        </w:rPr>
+        <w:t>Tabel 2.2 Hasil Penelitian Terdahulu</w:t>
+      </w:r>
+      <w:r>
+        <w:rPr>
+          <w:rFonts w:ascii="Times New Roman" w:hAnsi="Times New Roman"/>
+          <w:sz w:val="24"/>
+        </w:rPr>
+        <w:t xml:space="preserve">  . . . . . . . . . . . . . . . . . . . 24</w:t>
+      </w:r>
+    </w:p>
+    <w:p>
+      <w:pPr>
+        <w:spacing w:line="360" w:lineRule="auto" w:after="40"/>
+      </w:pPr>
+      <w:r>
+        <w:rPr>
+          <w:rFonts w:ascii="Times New Roman" w:hAnsi="Times New Roman"/>
+          <w:sz w:val="24"/>
+        </w:rPr>
+        <w:t>Tabel 3.1 Jadwal Penelitian dan Penulisan Skripsi</w:t>
+      </w:r>
+      <w:r>
+        <w:rPr>
+          <w:rFonts w:ascii="Times New Roman" w:hAnsi="Times New Roman"/>
+          <w:sz w:val="24"/>
+        </w:rPr>
+        <w:t xml:space="preserve">  . . . . . . . . . . . . . 31</w:t>
+      </w:r>
+    </w:p>
+    <w:p>
+      <w:pPr>
+        <w:spacing w:line="360" w:lineRule="auto" w:after="40"/>
+      </w:pPr>
+      <w:r>
+        <w:rPr>
+          <w:rFonts w:ascii="Times New Roman" w:hAnsi="Times New Roman"/>
+          <w:sz w:val="24"/>
+        </w:rPr>
+        <w:t>Tabel 3.2 Operasional Variabel Penelitian</w:t>
+      </w:r>
+      <w:r>
+        <w:rPr>
+          <w:rFonts w:ascii="Times New Roman" w:hAnsi="Times New Roman"/>
+          <w:sz w:val="24"/>
+        </w:rPr>
+        <w:t xml:space="preserve">  . . . . . . . . . . . . . . . . . 33</w:t>
+      </w:r>
+    </w:p>
+    <w:p>
+      <w:pPr>
+        <w:spacing w:line="360" w:lineRule="auto" w:after="40"/>
+      </w:pPr>
+      <w:r>
+        <w:rPr>
+          <w:rFonts w:ascii="Times New Roman" w:hAnsi="Times New Roman"/>
+          <w:sz w:val="24"/>
+        </w:rPr>
+        <w:t>Tabel 3.3 Skala Likert</w:t>
+      </w:r>
+      <w:r>
+        <w:rPr>
+          <w:rFonts w:ascii="Times New Roman" w:hAnsi="Times New Roman"/>
+          <w:sz w:val="24"/>
+        </w:rPr>
+        <w:t xml:space="preserve">  . . . . . . . . . . . . . . . . . . . . . . . . . . 37</w:t>
+      </w:r>
+    </w:p>
+    <w:p>
+      <w:pPr>
+        <w:spacing w:line="360" w:lineRule="auto" w:after="40"/>
+      </w:pPr>
+      <w:r>
+        <w:rPr>
+          <w:rFonts w:ascii="Times New Roman" w:hAnsi="Times New Roman"/>
+          <w:sz w:val="24"/>
+        </w:rPr>
+        <w:t>Tabel 3.4 Rule of Thumb Evaluasi Model Pengukuran</w:t>
+      </w:r>
+      <w:r>
+        <w:rPr>
+          <w:rFonts w:ascii="Times New Roman" w:hAnsi="Times New Roman"/>
+          <w:sz w:val="24"/>
+        </w:rPr>
+        <w:t xml:space="preserve">  . . . . . . . . . . . . . 40</w:t>
+      </w:r>
+    </w:p>
+    <w:p>
+      <w:pPr>
+        <w:spacing w:line="360" w:lineRule="auto" w:after="40"/>
+      </w:pPr>
+      <w:r>
+        <w:rPr>
+          <w:rFonts w:ascii="Times New Roman" w:hAnsi="Times New Roman"/>
+          <w:sz w:val="24"/>
+        </w:rPr>
+        <w:t>Tabel 3.5 Rule of Thumb Evaluasi Model Struktural</w:t>
+      </w:r>
+      <w:r>
+        <w:rPr>
+          <w:rFonts w:ascii="Times New Roman" w:hAnsi="Times New Roman"/>
+          <w:sz w:val="24"/>
+        </w:rPr>
+        <w:t xml:space="preserve">  . . . . . . . . . . . . . 43</w:t>
+      </w:r>
+    </w:p>
+    <w:p>
+      <w:pPr>
+        <w:jc w:val="center"/>
+      </w:pPr>
+      <w:r>
+        <w:rPr>
+          <w:rFonts w:ascii="Times New Roman" w:hAnsi="Times New Roman"/>
+          <w:b/>
+          <w:sz w:val="24"/>
+        </w:rPr>
+        <w:br/>
+        <w:br/>
+        <w:t>DAFTAR GAMBAR</w:t>
+      </w:r>
+    </w:p>
+    <w:p>
+      <w:pPr>
+        <w:spacing w:line="360" w:lineRule="auto" w:after="40"/>
+      </w:pPr>
+      <w:r>
+        <w:rPr>
+          <w:rFonts w:ascii="Times New Roman" w:hAnsi="Times New Roman"/>
+          <w:sz w:val="24"/>
+        </w:rPr>
+        <w:t>Gambar 2.1 Kerangka Berpikir</w:t>
+      </w:r>
+      <w:r>
+        <w:rPr>
+          <w:rFonts w:ascii="Times New Roman" w:hAnsi="Times New Roman"/>
+          <w:sz w:val="24"/>
+        </w:rPr>
+        <w:t xml:space="preserve">  . . . . . . . . . . . . . . . . . . . . . . . 29</w:t>
+      </w:r>
+    </w:p>
+    <w:p>
+      <w:pPr>
+        <w:spacing w:line="360" w:lineRule="auto" w:after="40"/>
+      </w:pPr>
+      <w:r>
+        <w:rPr>
+          <w:rFonts w:ascii="Times New Roman" w:hAnsi="Times New Roman"/>
+          <w:sz w:val="24"/>
+        </w:rPr>
+        <w:t>Gambar 3.1 Outer Model Variabel Dependen (Y)</w:t>
+      </w:r>
+      <w:r>
+        <w:rPr>
+          <w:rFonts w:ascii="Times New Roman" w:hAnsi="Times New Roman"/>
+          <w:sz w:val="24"/>
+        </w:rPr>
+        <w:t xml:space="preserve">  . . . . . . . . . . . . . . . 38</w:t>
+      </w:r>
+    </w:p>
+    <w:p>
+      <w:pPr>
+        <w:spacing w:line="360" w:lineRule="auto" w:after="40"/>
+      </w:pPr>
+      <w:r>
+        <w:rPr>
+          <w:rFonts w:ascii="Times New Roman" w:hAnsi="Times New Roman"/>
+          <w:sz w:val="24"/>
+        </w:rPr>
+        <w:t>Gambar 3.2 Outer Model Variabel Independen (X1)</w:t>
+      </w:r>
+      <w:r>
+        <w:rPr>
+          <w:rFonts w:ascii="Times New Roman" w:hAnsi="Times New Roman"/>
+          <w:sz w:val="24"/>
+        </w:rPr>
+        <w:t xml:space="preserve">  . . . . . . . . . . . . . . 38</w:t>
+      </w:r>
+    </w:p>
+    <w:p>
+      <w:pPr>
+        <w:spacing w:line="360" w:lineRule="auto" w:after="40"/>
+      </w:pPr>
+      <w:r>
+        <w:rPr>
+          <w:rFonts w:ascii="Times New Roman" w:hAnsi="Times New Roman"/>
+          <w:sz w:val="24"/>
+        </w:rPr>
+        <w:t>Gambar 3.3 Outer Model Variabel Independen (X2)</w:t>
+      </w:r>
+      <w:r>
+        <w:rPr>
+          <w:rFonts w:ascii="Times New Roman" w:hAnsi="Times New Roman"/>
+          <w:sz w:val="24"/>
+        </w:rPr>
+        <w:t xml:space="preserve">  . . . . . . . . . . . . . . 39</w:t>
+      </w:r>
+    </w:p>
+    <w:p>
+      <w:pPr>
+        <w:spacing w:line="360" w:lineRule="auto" w:after="40"/>
+      </w:pPr>
+      <w:r>
+        <w:rPr>
+          <w:rFonts w:ascii="Times New Roman" w:hAnsi="Times New Roman"/>
+          <w:sz w:val="24"/>
+        </w:rPr>
+        <w:t>Gambar 3.4 Outer Model Variabel Mediasi (Z)</w:t>
+      </w:r>
+      <w:r>
+        <w:rPr>
+          <w:rFonts w:ascii="Times New Roman" w:hAnsi="Times New Roman"/>
+          <w:sz w:val="24"/>
+        </w:rPr>
+        <w:t xml:space="preserve">  . . . . . . . . . . . . . . . . 39</w:t>
+      </w:r>
+    </w:p>
+    <w:p>
+      <w:pPr>
+        <w:spacing w:line="360" w:lineRule="auto" w:after="40"/>
+      </w:pPr>
+      <w:r>
+        <w:rPr>
+          <w:rFonts w:ascii="Times New Roman" w:hAnsi="Times New Roman"/>
+          <w:sz w:val="24"/>
+        </w:rPr>
+        <w:t>Gambar 3.5 Inner Model Variabel Dependen, Independen, dan Mediasi</w:t>
+      </w:r>
+      <w:r>
+        <w:rPr>
+          <w:rFonts w:ascii="Times New Roman" w:hAnsi="Times New Roman"/>
+          <w:sz w:val="24"/>
+        </w:rPr>
+        <w:t xml:space="preserve">  . . . . . 39</w:t>
+      </w:r>
+    </w:p>
+    <w:p>
+      <w:pPr>
+        <w:spacing w:line="360" w:lineRule="auto" w:after="40"/>
+      </w:pPr>
+      <w:r>
+        <w:rPr>
+          <w:rFonts w:ascii="Times New Roman" w:hAnsi="Times New Roman"/>
+          <w:sz w:val="24"/>
+        </w:rPr>
+        <w:t>Gambar 3.6 Diagram Jalur (Path Diagram)</w:t>
+      </w:r>
+      <w:r>
+        <w:rPr>
+          <w:rFonts w:ascii="Times New Roman" w:hAnsi="Times New Roman"/>
+          <w:sz w:val="24"/>
+        </w:rPr>
+        <w:t xml:space="preserve">  . . . . . . . . . . . . . . . . . . 40</w:t>
+      </w:r>
     </w:p>
     <w:p>
       <w:pPr>
@@ -26148,6 +27214,488 @@
           <w:szCs w:val="24"/>
         </w:rPr>
       </w:pPr>
+    </w:p>
+    <w:p>
+      <w:pPr>
+        <w:spacing w:before="240" w:after="240" w:line="360" w:lineRule="auto"/>
+        <w:jc w:val="center"/>
+      </w:pPr>
+      <w:r>
+        <w:rPr>
+          <w:rFonts w:ascii="Times New Roman" w:hAnsi="Times New Roman"/>
+          <w:b/>
+          <w:sz w:val="24"/>
+        </w:rPr>
+        <w:t>DAFTAR PUSTAKA</w:t>
+      </w:r>
+    </w:p>
+    <w:p>
+      <w:pPr>
+        <w:spacing w:line="360" w:lineRule="auto" w:after="120"/>
+        <w:ind w:left="720" w:hanging="720"/>
+      </w:pPr>
+      <w:r>
+        <w:rPr>
+          <w:rFonts w:ascii="Times New Roman" w:hAnsi="Times New Roman"/>
+          <w:sz w:val="24"/>
+        </w:rPr>
+        <w:t>Agustin, D. S. (2020). Analisis Pengaruh Budaya Organisasi, Gaya Kepemimpinan terhadap Kinerja Karyawan UMKM dengan Motivasi Kerja sebagai Variabel Mediasi. Jurnal Ilmu Manajemen, 8(3), 789–800.</w:t>
+      </w:r>
+    </w:p>
+    <w:p>
+      <w:pPr>
+        <w:spacing w:line="360" w:lineRule="auto" w:after="120"/>
+        <w:ind w:left="720" w:hanging="720"/>
+      </w:pPr>
+      <w:r>
+        <w:rPr>
+          <w:rFonts w:ascii="Times New Roman" w:hAnsi="Times New Roman"/>
+          <w:sz w:val="24"/>
+        </w:rPr>
+        <w:t>Amin, A. R. A. (2024). Pengaruh Kompetensi dan Gaya Kepemimpinan Terhadap Kinerja Perangkat Desa di Kecamatan Rambang dengan Motivasi Sebagai Variabel Mediasi (Tesis Magister, Universitas Sriwijaya).</w:t>
+      </w:r>
+    </w:p>
+    <w:p>
+      <w:pPr>
+        <w:spacing w:line="360" w:lineRule="auto" w:after="120"/>
+        <w:ind w:left="720" w:hanging="720"/>
+      </w:pPr>
+      <w:r>
+        <w:rPr>
+          <w:rFonts w:ascii="Times New Roman" w:hAnsi="Times New Roman"/>
+          <w:sz w:val="24"/>
+        </w:rPr>
+        <w:t>Arrasyd, H. M., dkk. (2024). Pengaruh Gaya Kepemimpinan Dan Lingkungan Kerja Terhadap Kinerja Perangkat Desa Dengan Motivasi Kerja Sebagai Variabel Mediasi. Jurnal Manajemen &amp; Kewirausahaan, 12(1), 45–56.</w:t>
+      </w:r>
+    </w:p>
+    <w:p>
+      <w:pPr>
+        <w:spacing w:line="360" w:lineRule="auto" w:after="120"/>
+        <w:ind w:left="720" w:hanging="720"/>
+      </w:pPr>
+      <w:r>
+        <w:rPr>
+          <w:rFonts w:ascii="Times New Roman" w:hAnsi="Times New Roman"/>
+          <w:sz w:val="24"/>
+        </w:rPr>
+        <w:t>Atmojo, A. A. (2022). Pengaruh Gaya Kepemimpinan, Kompensasi Terhadap Kinerja Dengan Motivasi Kerja Sebagai Variabel Mediasi Pada PDAM Kabupaten Kediri. Jurnal Penelitian Ekonomi dan Bisnis, 7(2), 112–125.</w:t>
+      </w:r>
+    </w:p>
+    <w:p>
+      <w:pPr>
+        <w:spacing w:line="360" w:lineRule="auto" w:after="120"/>
+        <w:ind w:left="720" w:hanging="720"/>
+      </w:pPr>
+      <w:r>
+        <w:rPr>
+          <w:rFonts w:ascii="Times New Roman" w:hAnsi="Times New Roman"/>
+          <w:sz w:val="24"/>
+        </w:rPr>
+        <w:t>Bahits, A., dkk. (2023). Manajemen Sumber Daya Manusia dalam Organisasi Modern. Bandung: Widina Bhakti Persada.</w:t>
+      </w:r>
+    </w:p>
+    <w:p>
+      <w:pPr>
+        <w:spacing w:line="360" w:lineRule="auto" w:after="120"/>
+        <w:ind w:left="720" w:hanging="720"/>
+      </w:pPr>
+      <w:r>
+        <w:rPr>
+          <w:rFonts w:ascii="Times New Roman" w:hAnsi="Times New Roman"/>
+          <w:sz w:val="24"/>
+        </w:rPr>
+        <w:t>Butarbutar, B., &amp; Nawangsari, L. C. (2022). The Effect of Compensation and Work Discipline on Employee Performance Through Work Motivation (DPRD DKI Jakarta). International Journal of Social and Management Studies, 3(4), 88–98.</w:t>
+      </w:r>
+    </w:p>
+    <w:p>
+      <w:pPr>
+        <w:spacing w:line="360" w:lineRule="auto" w:after="120"/>
+        <w:ind w:left="720" w:hanging="720"/>
+      </w:pPr>
+      <w:r>
+        <w:rPr>
+          <w:rFonts w:ascii="Times New Roman" w:hAnsi="Times New Roman"/>
+          <w:sz w:val="24"/>
+        </w:rPr>
+        <w:t>Chin, W. W. (1998). The Partial Least Squares Approach to Structural Equation Modeling. Modern Methods for Business Research, 295(2), 295–336.</w:t>
+      </w:r>
+    </w:p>
+    <w:p>
+      <w:pPr>
+        <w:spacing w:line="360" w:lineRule="auto" w:after="120"/>
+        <w:ind w:left="720" w:hanging="720"/>
+      </w:pPr>
+      <w:r>
+        <w:rPr>
+          <w:rFonts w:ascii="Times New Roman" w:hAnsi="Times New Roman"/>
+          <w:sz w:val="24"/>
+        </w:rPr>
+        <w:t>Fikri, M., dkk. (2022). Manajemen Sumber Daya Manusia: Teori dan Praktik. Jakarta: PT RajaGrafindo Persada.</w:t>
+      </w:r>
+    </w:p>
+    <w:p>
+      <w:pPr>
+        <w:spacing w:line="360" w:lineRule="auto" w:after="120"/>
+        <w:ind w:left="720" w:hanging="720"/>
+      </w:pPr>
+      <w:r>
+        <w:rPr>
+          <w:rFonts w:ascii="Times New Roman" w:hAnsi="Times New Roman"/>
+          <w:sz w:val="24"/>
+        </w:rPr>
+        <w:t>Geisser, S. (1975). The Predictive Sample Reuse Method with Applications. Journal of the American Statistical Association, 70(350), 320–328.</w:t>
+      </w:r>
+    </w:p>
+    <w:p>
+      <w:pPr>
+        <w:spacing w:line="360" w:lineRule="auto" w:after="120"/>
+        <w:ind w:left="720" w:hanging="720"/>
+      </w:pPr>
+      <w:r>
+        <w:rPr>
+          <w:rFonts w:ascii="Times New Roman" w:hAnsi="Times New Roman"/>
+          <w:sz w:val="24"/>
+        </w:rPr>
+        <w:t>Ghozali, I. (2021). Partial Least Squares: Konsep, Teknik dan Aplikasi Menggunakan Program SmartPLS 3.0 (Edisi 3). Semarang: Badan Penerbit Universitas Diponegoro.</w:t>
+      </w:r>
+    </w:p>
+    <w:p>
+      <w:pPr>
+        <w:spacing w:line="360" w:lineRule="auto" w:after="120"/>
+        <w:ind w:left="720" w:hanging="720"/>
+      </w:pPr>
+      <w:r>
+        <w:rPr>
+          <w:rFonts w:ascii="Times New Roman" w:hAnsi="Times New Roman"/>
+          <w:sz w:val="24"/>
+        </w:rPr>
+        <w:t>Guntoro, Djunaedi, &amp; Utami. (2024). Pengaruh Kompensasi Terhadap Kinerja Pegawai Dengan Motivasi Kerja Sebagai Variabel Mediasi pada Dinas Koperasi Nganjuk. Jurnal Ilmiah Manajemen, 11(2), 210–222.</w:t>
+      </w:r>
+    </w:p>
+    <w:p>
+      <w:pPr>
+        <w:spacing w:line="360" w:lineRule="auto" w:after="120"/>
+        <w:ind w:left="720" w:hanging="720"/>
+      </w:pPr>
+      <w:r>
+        <w:rPr>
+          <w:rFonts w:ascii="Times New Roman" w:hAnsi="Times New Roman"/>
+          <w:sz w:val="24"/>
+        </w:rPr>
+        <w:t>Hair, J. F., Hult, G. T. M., Ringle, C. M., &amp; Sarstedt, M. (2022). A Primer on Partial Least Squares Structural Equation Modeling (PLS-SEM) (3rd ed.). Thousand Oaks, CA: Sage Publications.</w:t>
+      </w:r>
+    </w:p>
+    <w:p>
+      <w:pPr>
+        <w:spacing w:line="360" w:lineRule="auto" w:after="120"/>
+        <w:ind w:left="720" w:hanging="720"/>
+      </w:pPr>
+      <w:r>
+        <w:rPr>
+          <w:rFonts w:ascii="Times New Roman" w:hAnsi="Times New Roman"/>
+          <w:sz w:val="24"/>
+        </w:rPr>
+        <w:t>Hasibuan, M. S. P. (2019). Manajemen Sumber Daya Manusia. Jakarta: PT Bumi Aksara.</w:t>
+      </w:r>
+    </w:p>
+    <w:p>
+      <w:pPr>
+        <w:spacing w:line="360" w:lineRule="auto" w:after="120"/>
+        <w:ind w:left="720" w:hanging="720"/>
+      </w:pPr>
+      <w:r>
+        <w:rPr>
+          <w:rFonts w:ascii="Times New Roman" w:hAnsi="Times New Roman"/>
+          <w:sz w:val="24"/>
+        </w:rPr>
+        <w:t>Mangkunegara, A. A. A. P. (2017). Manajemen Sumber Daya Manusia Perusahaan. Bandung: PT Remaja Rosdakarya.</w:t>
+      </w:r>
+    </w:p>
+    <w:p>
+      <w:pPr>
+        <w:spacing w:line="360" w:lineRule="auto" w:after="120"/>
+        <w:ind w:left="720" w:hanging="720"/>
+      </w:pPr>
+      <w:r>
+        <w:rPr>
+          <w:rFonts w:ascii="Times New Roman" w:hAnsi="Times New Roman"/>
+          <w:sz w:val="24"/>
+        </w:rPr>
+        <w:t>Naldi, M. K., dkk. (2025). Pengaruh Kepuasan Kerja, Gaya Kepemimpinan, dan Komitmen Organisasi terhadap Motivasi Kerja. Jurnal Riset Manajemen, 6(1), 101–112.</w:t>
+      </w:r>
+    </w:p>
+    <w:p>
+      <w:pPr>
+        <w:spacing w:line="360" w:lineRule="auto" w:after="120"/>
+        <w:ind w:left="720" w:hanging="720"/>
+      </w:pPr>
+      <w:r>
+        <w:rPr>
+          <w:rFonts w:ascii="Times New Roman" w:hAnsi="Times New Roman"/>
+          <w:sz w:val="24"/>
+        </w:rPr>
+        <w:t>Noor, J. (2015). Analisis Data Penelitian Manajemen: Tren Komparasi Antara Penggunaan SPSS, SmartPLS, AMOS, dan Lisrel. Jakarta: Kencana.</w:t>
+      </w:r>
+    </w:p>
+    <w:p>
+      <w:pPr>
+        <w:spacing w:line="360" w:lineRule="auto" w:after="120"/>
+        <w:ind w:left="720" w:hanging="720"/>
+      </w:pPr>
+      <w:r>
+        <w:rPr>
+          <w:rFonts w:ascii="Times New Roman" w:hAnsi="Times New Roman"/>
+          <w:sz w:val="24"/>
+        </w:rPr>
+        <w:t>Nurcahaya, B. S., &amp; Subkhan, M. (2025). Pengaruh Gaya Kepemimpinan dan Kompensasi terhadap Kinerja Karyawan melalui Motivasi Kerja sebagai Variabel Mediasi pada Pamella Tiga Yogyakarta. Jurnal Manajemen Bisnis, 15(1), 45–58.</w:t>
+      </w:r>
+    </w:p>
+    <w:p>
+      <w:pPr>
+        <w:spacing w:line="360" w:lineRule="auto" w:after="120"/>
+        <w:ind w:left="720" w:hanging="720"/>
+      </w:pPr>
+      <w:r>
+        <w:rPr>
+          <w:rFonts w:ascii="Times New Roman" w:hAnsi="Times New Roman"/>
+          <w:sz w:val="24"/>
+        </w:rPr>
+        <w:t>Pranogyo, A., dkk. (2021). Kinerja dan Motivasi Pegawai. Yogyakarta: Deepublish.</w:t>
+      </w:r>
+    </w:p>
+    <w:p>
+      <w:pPr>
+        <w:spacing w:line="360" w:lineRule="auto" w:after="120"/>
+        <w:ind w:left="720" w:hanging="720"/>
+      </w:pPr>
+      <w:r>
+        <w:rPr>
+          <w:rFonts w:ascii="Times New Roman" w:hAnsi="Times New Roman"/>
+          <w:sz w:val="24"/>
+        </w:rPr>
+        <w:t>Prasetya, G. L. H., &amp; Hendarto, R. T. (2024). Pengaruh Gaya Kepemimpinan dan Kompensasi Terhadap Kinerja Karyawan Melalui Motivasi Kerja Sebagai Variable Mediasi Pada PT. Karunia Jaya Global. Jurnal Manajemen Kewirausahaan, 19(1), 34–46.</w:t>
+      </w:r>
+    </w:p>
+    <w:p>
+      <w:pPr>
+        <w:spacing w:line="360" w:lineRule="auto" w:after="120"/>
+        <w:ind w:left="720" w:hanging="720"/>
+      </w:pPr>
+      <w:r>
+        <w:rPr>
+          <w:rFonts w:ascii="Times New Roman" w:hAnsi="Times New Roman"/>
+          <w:sz w:val="24"/>
+        </w:rPr>
+        <w:t>Pratama, M. Y., &amp; Junaedi, D. (2025). Pengaruh Gaya Kepemimpinan dan Motivasi Kerja Terhadap Efektivitas Kinerja Perangkat Desa Kedung Rejoso Kecamatan Kotaanyar Kabupaten Probolinggo (Skripsi, Universitas Nurul Jadid).</w:t>
+      </w:r>
+    </w:p>
+    <w:p>
+      <w:pPr>
+        <w:spacing w:line="360" w:lineRule="auto" w:after="120"/>
+        <w:ind w:left="720" w:hanging="720"/>
+      </w:pPr>
+      <w:r>
+        <w:rPr>
+          <w:rFonts w:ascii="Times New Roman" w:hAnsi="Times New Roman"/>
+          <w:sz w:val="24"/>
+        </w:rPr>
+        <w:t>Priansa, D. J. (2017). Manajemen Kepemimpinan dan Kinerja Pegawai dalam Organisasi Publik dan Bisnis. Bandung: CV Pustaka Setia.</w:t>
+      </w:r>
+    </w:p>
+    <w:p>
+      <w:pPr>
+        <w:spacing w:line="360" w:lineRule="auto" w:after="120"/>
+        <w:ind w:left="720" w:hanging="720"/>
+      </w:pPr>
+      <w:r>
+        <w:rPr>
+          <w:rFonts w:ascii="Times New Roman" w:hAnsi="Times New Roman"/>
+          <w:sz w:val="24"/>
+        </w:rPr>
+        <w:t>Purwohedi, U. (2022). Metode Penelitian Kuantitatif untuk Manajemen dan Akuntansi. Jakarta: Rajawali Pers.</w:t>
+      </w:r>
+    </w:p>
+    <w:p>
+      <w:pPr>
+        <w:spacing w:line="360" w:lineRule="auto" w:after="120"/>
+        <w:ind w:left="720" w:hanging="720"/>
+      </w:pPr>
+      <w:r>
+        <w:rPr>
+          <w:rFonts w:ascii="Times New Roman" w:hAnsi="Times New Roman"/>
+          <w:sz w:val="24"/>
+        </w:rPr>
+        <w:t>Putri, D. R., &amp; Rozi, F. (2024). Pengaruh Kompensasi dan Lingkungan Kerja terhadap Kinerja Karyawan. Jurnal Ilmu Sumber Daya Manusia, 5(2), 140–151.</w:t>
+      </w:r>
+    </w:p>
+    <w:p>
+      <w:pPr>
+        <w:spacing w:line="360" w:lineRule="auto" w:after="120"/>
+        <w:ind w:left="720" w:hanging="720"/>
+      </w:pPr>
+      <w:r>
+        <w:rPr>
+          <w:rFonts w:ascii="Times New Roman" w:hAnsi="Times New Roman"/>
+          <w:sz w:val="24"/>
+        </w:rPr>
+        <w:t>Robbins, S. P., &amp; Judge, T. A. (2017). Organizational Behavior (17th ed.). Boston: Pearson.</w:t>
+      </w:r>
+    </w:p>
+    <w:p>
+      <w:pPr>
+        <w:spacing w:line="360" w:lineRule="auto" w:after="120"/>
+        <w:ind w:left="720" w:hanging="720"/>
+      </w:pPr>
+      <w:r>
+        <w:rPr>
+          <w:rFonts w:ascii="Times New Roman" w:hAnsi="Times New Roman"/>
+          <w:sz w:val="24"/>
+        </w:rPr>
+        <w:t>Satria, E., dkk. (2024). Pengaruh Kompensasi terhadap Kinerja Pegawai pada Kantor Pemerintahan. Jurnal Administrasi Publik, 10(1), 67–78.</w:t>
+      </w:r>
+    </w:p>
+    <w:p>
+      <w:pPr>
+        <w:spacing w:line="360" w:lineRule="auto" w:after="120"/>
+        <w:ind w:left="720" w:hanging="720"/>
+      </w:pPr>
+      <w:r>
+        <w:rPr>
+          <w:rFonts w:ascii="Times New Roman" w:hAnsi="Times New Roman"/>
+          <w:sz w:val="24"/>
+        </w:rPr>
+        <w:t>Stone, M. (1974). Cross-Validatory Choice and Assessment of Statistical Predictions. Journal of the Royal Statistical Society: Series B (Methodological), 36(2), 111–133.</w:t>
+      </w:r>
+    </w:p>
+    <w:p>
+      <w:pPr>
+        <w:spacing w:line="360" w:lineRule="auto" w:after="120"/>
+        <w:ind w:left="720" w:hanging="720"/>
+      </w:pPr>
+      <w:r>
+        <w:rPr>
+          <w:rFonts w:ascii="Times New Roman" w:hAnsi="Times New Roman"/>
+          <w:sz w:val="24"/>
+        </w:rPr>
+        <w:t>Sudaryana, A., &amp; Agusiady, R. (2021). Metodologi Penelitian Manajemen. Bandung: Deepublish.</w:t>
+      </w:r>
+    </w:p>
+    <w:p>
+      <w:pPr>
+        <w:spacing w:line="360" w:lineRule="auto" w:after="120"/>
+        <w:ind w:left="720" w:hanging="720"/>
+      </w:pPr>
+      <w:r>
+        <w:rPr>
+          <w:rFonts w:ascii="Times New Roman" w:hAnsi="Times New Roman"/>
+          <w:sz w:val="24"/>
+        </w:rPr>
+        <w:t>Sudaryo, Y., dkk. (2018). Manajemen Sumber Daya Manusia: Kompensasi dan Visi Kepemimpinan. Yogyakarta: Andi Offset.</w:t>
+      </w:r>
+    </w:p>
+    <w:p>
+      <w:pPr>
+        <w:spacing w:line="360" w:lineRule="auto" w:after="120"/>
+        <w:ind w:left="720" w:hanging="720"/>
+      </w:pPr>
+      <w:r>
+        <w:rPr>
+          <w:rFonts w:ascii="Times New Roman" w:hAnsi="Times New Roman"/>
+          <w:sz w:val="24"/>
+        </w:rPr>
+        <w:t>Sugiyono. (2023). Metode Penelitian Kuantitatif, Kualitatif, dan R&amp;D. Bandung: Alfabeta.</w:t>
+      </w:r>
+    </w:p>
+    <w:p>
+      <w:pPr>
+        <w:spacing w:line="360" w:lineRule="auto" w:after="120"/>
+        <w:ind w:left="720" w:hanging="720"/>
+      </w:pPr>
+      <w:r>
+        <w:rPr>
+          <w:rFonts w:ascii="Times New Roman" w:hAnsi="Times New Roman"/>
+          <w:sz w:val="24"/>
+        </w:rPr>
+        <w:t>Sujarweni, V. W. (2020). Metodologi Penelitian: Lengkap, Praktis, dan Mudah Dipahami. Yogyakarta: Pustaka Baru Press.</w:t>
+      </w:r>
+    </w:p>
+    <w:p>
+      <w:pPr>
+        <w:spacing w:line="360" w:lineRule="auto" w:after="120"/>
+        <w:ind w:left="720" w:hanging="720"/>
+      </w:pPr>
+      <w:r>
+        <w:rPr>
+          <w:rFonts w:ascii="Times New Roman" w:hAnsi="Times New Roman"/>
+          <w:sz w:val="24"/>
+        </w:rPr>
+        <w:t>Sujarweni, V. W. (2022). Analisis Data Penelitian Manajemen dan Ekonomi. Yogyakarta: Pustaka Baru Press.</w:t>
+      </w:r>
+    </w:p>
+    <w:p>
+      <w:pPr>
+        <w:spacing w:line="360" w:lineRule="auto" w:after="120"/>
+        <w:ind w:left="720" w:hanging="720"/>
+      </w:pPr>
+      <w:r>
+        <w:rPr>
+          <w:rFonts w:ascii="Times New Roman" w:hAnsi="Times New Roman"/>
+          <w:sz w:val="24"/>
+        </w:rPr>
+        <w:t>Syahza, A. (2021). Metodologi Penelitian Edisi Revisi. Pekanbaru: Unri Press.</w:t>
+      </w:r>
+    </w:p>
+    <w:p>
+      <w:pPr>
+        <w:spacing w:line="360" w:lineRule="auto" w:after="120"/>
+        <w:ind w:left="720" w:hanging="720"/>
+      </w:pPr>
+      <w:r>
+        <w:rPr>
+          <w:rFonts w:ascii="Times New Roman" w:hAnsi="Times New Roman"/>
+          <w:sz w:val="24"/>
+        </w:rPr>
+        <w:t>Thoha, M. (2018). Kepemimpinan dalam Manajemen. Jakarta: PT RajaGrafindo Persada.</w:t>
+      </w:r>
+    </w:p>
+    <w:p>
+      <w:pPr>
+        <w:spacing w:line="360" w:lineRule="auto" w:after="120"/>
+        <w:ind w:left="720" w:hanging="720"/>
+      </w:pPr>
+      <w:r>
+        <w:rPr>
+          <w:rFonts w:ascii="Times New Roman" w:hAnsi="Times New Roman"/>
+          <w:sz w:val="24"/>
+        </w:rPr>
+        <w:t>Ulfah, R. A., Subiyanto, D., &amp; Kurniawan, I. S. (2020). Peran Mediasi Motivasi Kerja Pada Pengaruh Gaya Kepemimpinan Transaksional Dan Kompensasi Terhadap Kinerja Karyawan. Jurnal Kinerja, 17(2), 180–192.</w:t>
+      </w:r>
+    </w:p>
+    <w:p>
+      <w:pPr>
+        <w:spacing w:line="360" w:lineRule="auto" w:after="120"/>
+        <w:ind w:left="720" w:hanging="720"/>
+      </w:pPr>
+      <w:r>
+        <w:rPr>
+          <w:rFonts w:ascii="Times New Roman" w:hAnsi="Times New Roman"/>
+          <w:sz w:val="24"/>
+        </w:rPr>
+        <w:t>Wahyudin, M. B. B., &amp; Baidlowi, I. (2025). Pengaruh Gaya Kepemimpinan, Lingkungan Kerja, dan Kompensasi terhadap Kinerja Karyawan dengan Motivasi Sebagai Variabel Mediasi pada UD. Restu Bumi. Jurnal Sains Manajemen, 7(1), 50–62.</w:t>
+      </w:r>
+    </w:p>
+    <w:p>
+      <w:pPr>
+        <w:spacing w:line="360" w:lineRule="auto" w:after="120"/>
+        <w:ind w:left="720" w:hanging="720"/>
+      </w:pPr>
+      <w:r>
+        <w:rPr>
+          <w:rFonts w:ascii="Times New Roman" w:hAnsi="Times New Roman"/>
+          <w:sz w:val="24"/>
+        </w:rPr>
+        <w:t>Yuliani, T. (2023). Manajemen Sumber Daya Manusia di Sektor Publik. Yogyakarta: Gava Media.</w:t>
+      </w:r>
     </w:p>
     <w:sectPr>
       <w:footerReference w:type="even" r:id="rId10"/>

</xml_diff>

<commit_message>
Italicize all foreign and English terms consistently from Bab I to Bab III
</commit_message>
<xml_diff>
--- a/File Skripsi/Sri Darni.docx
+++ b/File Skripsi/Sri Darni.docx
@@ -76,7 +76,7 @@
           <w:sz w:val="20"/>
         </w:rPr>
         <w:drawing>
-          <wp:anchor distT="0" distB="0" distL="0" distR="0" simplePos="0" relativeHeight="487587840" behindDoc="1" locked="0" layoutInCell="1" allowOverlap="1" wp14:anchorId="3A382C6B" wp14:editId="7C1DC2E3">
+          <wp:anchor distT="0" distB="0" distL="0" distR="0" simplePos="0" relativeHeight="487587840" behindDoc="1" locked="0" layoutInCell="1" allowOverlap="1" wp14:anchorId="42AE2A17" wp14:editId="2E919E75">
             <wp:simplePos x="0" y="0"/>
             <wp:positionH relativeFrom="page">
               <wp:posOffset>2827020</wp:posOffset>
@@ -370,6 +370,7 @@
           <w:sz w:val="28"/>
           <w:szCs w:val="28"/>
         </w:rPr>
+        <w:lastRenderedPageBreak/>
         <w:t>PENGARUH GAYA KEPEMIMPINAN DAN KOMPENSASI TERHADAP KINERJA PERANGKAT DESA DENGAN MOTIVASI KERJA SEBAGAI VARIABEL MEDIASI DI KANTOR DESA PISANGAN JAYA KABUPATEN TANGERANG</w:t>
       </w:r>
     </w:p>
@@ -460,7 +461,7 @@
           <w:sz w:val="20"/>
         </w:rPr>
         <w:drawing>
-          <wp:anchor distT="0" distB="0" distL="0" distR="0" simplePos="0" relativeHeight="487589888" behindDoc="1" locked="0" layoutInCell="1" allowOverlap="1" wp14:anchorId="33A4B2AB" wp14:editId="50671041">
+          <wp:anchor distT="0" distB="0" distL="0" distR="0" simplePos="0" relativeHeight="487589888" behindDoc="1" locked="0" layoutInCell="1" allowOverlap="1" wp14:anchorId="2378A9C6" wp14:editId="6715DE67">
             <wp:simplePos x="0" y="0"/>
             <wp:positionH relativeFrom="page">
               <wp:posOffset>2827020</wp:posOffset>
@@ -740,6 +741,7 @@
         <w:ind w:right="1089"/>
       </w:pPr>
       <w:r>
+        <w:lastRenderedPageBreak/>
         <w:t>ABSTRAK</w:t>
       </w:r>
       <w:bookmarkEnd w:id="4"/>
@@ -904,6 +906,7 @@
       </w:pPr>
       <w:bookmarkStart w:id="5" w:name="_Toc235393105"/>
       <w:r>
+        <w:lastRenderedPageBreak/>
         <w:t>ABSTRACT</w:t>
       </w:r>
       <w:bookmarkEnd w:id="5"/>
@@ -1120,6 +1123,7 @@
       </w:pPr>
       <w:bookmarkStart w:id="6" w:name="_Toc235393106"/>
       <w:r>
+        <w:lastRenderedPageBreak/>
         <w:t>KATA PENGANTAR</w:t>
       </w:r>
       <w:bookmarkEnd w:id="6"/>
@@ -1588,11 +1592,10 @@
     </w:p>
     <w:p>
       <w:pPr>
-        <w:spacing w:line="360" w:lineRule="auto" w:after="40" w:before="40"/>
-      </w:pPr>
-      <w:r>
-        <w:rPr>
-          <w:rFonts w:ascii="Times New Roman" w:hAnsi="Times New Roman"/>
+        <w:spacing w:before="40" w:after="40" w:line="360" w:lineRule="auto"/>
+      </w:pPr>
+      <w:r>
+        <w:rPr>
           <w:b/>
           <w:sz w:val="24"/>
         </w:rPr>
@@ -1600,7 +1603,6 @@
       </w:r>
       <w:r>
         <w:rPr>
-          <w:rFonts w:ascii="Times New Roman" w:hAnsi="Times New Roman"/>
           <w:sz w:val="24"/>
         </w:rPr>
         <w:t xml:space="preserve">  . . . . . . . . . . . . . . . . . . . . . . . . . . . . . . . . . . . . i</w:t>
@@ -1608,11 +1610,10 @@
     </w:p>
     <w:p>
       <w:pPr>
-        <w:spacing w:line="360" w:lineRule="auto" w:after="40" w:before="40"/>
-      </w:pPr>
-      <w:r>
-        <w:rPr>
-          <w:rFonts w:ascii="Times New Roman" w:hAnsi="Times New Roman"/>
+        <w:spacing w:before="40" w:after="40" w:line="360" w:lineRule="auto"/>
+      </w:pPr>
+      <w:r>
+        <w:rPr>
           <w:b/>
           <w:sz w:val="24"/>
         </w:rPr>
@@ -1620,7 +1621,6 @@
       </w:r>
       <w:r>
         <w:rPr>
-          <w:rFonts w:ascii="Times New Roman" w:hAnsi="Times New Roman"/>
           <w:sz w:val="24"/>
         </w:rPr>
         <w:t xml:space="preserve">  . . . . . . . . . . . . . . . . . . . . . . . . . . . . . . . . . . . . ii</w:t>
@@ -1628,11 +1628,10 @@
     </w:p>
     <w:p>
       <w:pPr>
-        <w:spacing w:line="360" w:lineRule="auto" w:after="40" w:before="40"/>
-      </w:pPr>
-      <w:r>
-        <w:rPr>
-          <w:rFonts w:ascii="Times New Roman" w:hAnsi="Times New Roman"/>
+        <w:spacing w:before="40" w:after="40" w:line="360" w:lineRule="auto"/>
+      </w:pPr>
+      <w:r>
+        <w:rPr>
           <w:b/>
           <w:sz w:val="24"/>
         </w:rPr>
@@ -1640,7 +1639,6 @@
       </w:r>
       <w:r>
         <w:rPr>
-          <w:rFonts w:ascii="Times New Roman" w:hAnsi="Times New Roman"/>
           <w:sz w:val="24"/>
         </w:rPr>
         <w:t xml:space="preserve">  . . . . . . . . . . . . . . . . . . . . . . . . . . . . . . . . . iii</w:t>
@@ -1648,19 +1646,24 @@
     </w:p>
     <w:p>
       <w:pPr>
-        <w:spacing w:line="360" w:lineRule="auto" w:after="40" w:before="40"/>
-      </w:pPr>
-      <w:r>
-        <w:rPr>
-          <w:rFonts w:ascii="Times New Roman" w:hAnsi="Times New Roman"/>
+        <w:spacing w:before="40" w:after="40" w:line="360" w:lineRule="auto"/>
+      </w:pPr>
+      <w:r>
+        <w:rPr>
           <w:b/>
           <w:sz w:val="24"/>
         </w:rPr>
-        <w:t>DAFTAR ISI</w:t>
-      </w:r>
-      <w:r>
-        <w:rPr>
-          <w:rFonts w:ascii="Times New Roman" w:hAnsi="Times New Roman"/>
+        <w:t>DAFTAR IS</w:t>
+      </w:r>
+      <w:r>
+        <w:rPr>
+          <w:b/>
+          <w:sz w:val="24"/>
+        </w:rPr>
+        <w:t>I</w:t>
+      </w:r>
+      <w:r>
+        <w:rPr>
           <w:sz w:val="24"/>
         </w:rPr>
         <w:t xml:space="preserve">  . . . . . . . . . . . . . . . . . . . . . . . . . . . . . . . . . . . iv</w:t>
@@ -1668,11 +1671,10 @@
     </w:p>
     <w:p>
       <w:pPr>
-        <w:spacing w:line="360" w:lineRule="auto" w:after="40" w:before="40"/>
-      </w:pPr>
-      <w:r>
-        <w:rPr>
-          <w:rFonts w:ascii="Times New Roman" w:hAnsi="Times New Roman"/>
+        <w:spacing w:before="40" w:after="40" w:line="360" w:lineRule="auto"/>
+      </w:pPr>
+      <w:r>
+        <w:rPr>
           <w:b/>
           <w:sz w:val="24"/>
         </w:rPr>
@@ -1680,7 +1682,6 @@
       </w:r>
       <w:r>
         <w:rPr>
-          <w:rFonts w:ascii="Times New Roman" w:hAnsi="Times New Roman"/>
           <w:sz w:val="24"/>
         </w:rPr>
         <w:t xml:space="preserve">  . . . . . . . . . . . . . . . . . . . . . . . . . . . . . . . . . . vi</w:t>
@@ -1688,11 +1689,10 @@
     </w:p>
     <w:p>
       <w:pPr>
-        <w:spacing w:line="360" w:lineRule="auto" w:after="40" w:before="40"/>
-      </w:pPr>
-      <w:r>
-        <w:rPr>
-          <w:rFonts w:ascii="Times New Roman" w:hAnsi="Times New Roman"/>
+        <w:spacing w:before="40" w:after="40" w:line="360" w:lineRule="auto"/>
+      </w:pPr>
+      <w:r>
+        <w:rPr>
           <w:b/>
           <w:sz w:val="24"/>
         </w:rPr>
@@ -1700,7 +1700,6 @@
       </w:r>
       <w:r>
         <w:rPr>
-          <w:rFonts w:ascii="Times New Roman" w:hAnsi="Times New Roman"/>
           <w:sz w:val="24"/>
         </w:rPr>
         <w:t xml:space="preserve">  . . . . . . . . . . . . . . . . . . . . . . . . . . . . . . . . . vii</w:t>
@@ -1708,19 +1707,24 @@
     </w:p>
     <w:p>
       <w:pPr>
-        <w:spacing w:line="360" w:lineRule="auto" w:after="40" w:before="40"/>
-      </w:pPr>
-      <w:r>
-        <w:rPr>
-          <w:rFonts w:ascii="Times New Roman" w:hAnsi="Times New Roman"/>
+        <w:spacing w:before="40" w:after="40" w:line="360" w:lineRule="auto"/>
+      </w:pPr>
+      <w:r>
+        <w:rPr>
           <w:b/>
           <w:sz w:val="24"/>
         </w:rPr>
-        <w:t>BAB I PENDAHULUAN</w:t>
-      </w:r>
-      <w:r>
-        <w:rPr>
-          <w:rFonts w:ascii="Times New Roman" w:hAnsi="Times New Roman"/>
+        <w:t>BAB I PEND</w:t>
+      </w:r>
+      <w:r>
+        <w:rPr>
+          <w:b/>
+          <w:sz w:val="24"/>
+        </w:rPr>
+        <w:t>AHULUAN</w:t>
+      </w:r>
+      <w:r>
+        <w:rPr>
           <w:sz w:val="24"/>
         </w:rPr>
         <w:t xml:space="preserve">  . . . . . . . . . . . . . . . . . . . . . . . . . . . . . . . 1</w:t>
@@ -1728,144 +1732,93 @@
     </w:p>
     <w:p>
       <w:pPr>
-        <w:spacing w:line="360" w:lineRule="auto" w:after="40" w:before="40"/>
-      </w:pPr>
-      <w:r>
-        <w:rPr>
-          <w:rFonts w:ascii="Times New Roman" w:hAnsi="Times New Roman"/>
-          <w:sz w:val="24"/>
-        </w:rPr>
-        <w:t xml:space="preserve">    A. Latar Belakang Masalah</w:t>
-      </w:r>
-      <w:r>
-        <w:rPr>
-          <w:rFonts w:ascii="Times New Roman" w:hAnsi="Times New Roman"/>
-          <w:sz w:val="24"/>
-        </w:rPr>
-        <w:t xml:space="preserve">  . . . . . . . . . . . . . . . . . . . . . . . . . 1</w:t>
-      </w:r>
-    </w:p>
-    <w:p>
-      <w:pPr>
-        <w:spacing w:line="360" w:lineRule="auto" w:after="40" w:before="40"/>
-      </w:pPr>
-      <w:r>
-        <w:rPr>
-          <w:rFonts w:ascii="Times New Roman" w:hAnsi="Times New Roman"/>
-          <w:sz w:val="24"/>
-        </w:rPr>
-        <w:t xml:space="preserve">    B. Identifikasi Masalah</w:t>
-      </w:r>
-      <w:r>
-        <w:rPr>
-          <w:rFonts w:ascii="Times New Roman" w:hAnsi="Times New Roman"/>
-          <w:sz w:val="24"/>
-        </w:rPr>
-        <w:t xml:space="preserve">  . . . . . . . . . . . . . . . . . . . . . . . . . . 5</w:t>
-      </w:r>
-    </w:p>
-    <w:p>
-      <w:pPr>
-        <w:spacing w:line="360" w:lineRule="auto" w:after="40" w:before="40"/>
-      </w:pPr>
-      <w:r>
-        <w:rPr>
-          <w:rFonts w:ascii="Times New Roman" w:hAnsi="Times New Roman"/>
-          <w:sz w:val="24"/>
-        </w:rPr>
-        <w:t xml:space="preserve">    C. Pembatasan Masalah</w:t>
-      </w:r>
-      <w:r>
-        <w:rPr>
-          <w:rFonts w:ascii="Times New Roman" w:hAnsi="Times New Roman"/>
-          <w:sz w:val="24"/>
-        </w:rPr>
-        <w:t xml:space="preserve">  . . . . . . . . . . . . . . . . . . . . . . . . . . . 6</w:t>
-      </w:r>
-    </w:p>
-    <w:p>
-      <w:pPr>
-        <w:spacing w:line="360" w:lineRule="auto" w:after="40" w:before="40"/>
-      </w:pPr>
-      <w:r>
-        <w:rPr>
-          <w:rFonts w:ascii="Times New Roman" w:hAnsi="Times New Roman"/>
-          <w:sz w:val="24"/>
-        </w:rPr>
-        <w:t xml:space="preserve">    D. Rumusan Masalah</w:t>
-      </w:r>
-      <w:r>
-        <w:rPr>
-          <w:rFonts w:ascii="Times New Roman" w:hAnsi="Times New Roman"/>
-          <w:sz w:val="24"/>
-        </w:rPr>
-        <w:t xml:space="preserve">  . . . . . . . . . . . . . . . . . . . . . . . . . . . . . 6</w:t>
-      </w:r>
-    </w:p>
-    <w:p>
-      <w:pPr>
-        <w:spacing w:line="360" w:lineRule="auto" w:after="40" w:before="40"/>
-      </w:pPr>
-      <w:r>
-        <w:rPr>
-          <w:rFonts w:ascii="Times New Roman" w:hAnsi="Times New Roman"/>
-          <w:sz w:val="24"/>
-        </w:rPr>
-        <w:t xml:space="preserve">    E. Tujuan Penelitian</w:t>
-      </w:r>
-      <w:r>
-        <w:rPr>
-          <w:rFonts w:ascii="Times New Roman" w:hAnsi="Times New Roman"/>
-          <w:sz w:val="24"/>
-        </w:rPr>
-        <w:t xml:space="preserve">  . . . . . . . . . . . . . . . . . . . . . . . . . . . . 7</w:t>
-      </w:r>
-    </w:p>
-    <w:p>
-      <w:pPr>
-        <w:spacing w:line="360" w:lineRule="auto" w:after="40" w:before="40"/>
-      </w:pPr>
-      <w:r>
-        <w:rPr>
-          <w:rFonts w:ascii="Times New Roman" w:hAnsi="Times New Roman"/>
-          <w:sz w:val="24"/>
-        </w:rPr>
-        <w:t xml:space="preserve">    F. Manfaat Penelitian</w:t>
-      </w:r>
-      <w:r>
-        <w:rPr>
-          <w:rFonts w:ascii="Times New Roman" w:hAnsi="Times New Roman"/>
-          <w:sz w:val="24"/>
-        </w:rPr>
-        <w:t xml:space="preserve">  . . . . . . . . . . . . . . . . . . . . . . . . . . . 7</w:t>
-      </w:r>
-    </w:p>
-    <w:p>
-      <w:pPr>
-        <w:spacing w:line="360" w:lineRule="auto" w:after="40" w:before="40"/>
-      </w:pPr>
-      <w:r>
-        <w:rPr>
-          <w:rFonts w:ascii="Times New Roman" w:hAnsi="Times New Roman"/>
-          <w:sz w:val="24"/>
-        </w:rPr>
-        <w:t xml:space="preserve">    G. Sistematika Penulisan Skripsi</w:t>
-      </w:r>
-      <w:r>
-        <w:rPr>
-          <w:rFonts w:ascii="Times New Roman" w:hAnsi="Times New Roman"/>
-          <w:sz w:val="24"/>
-        </w:rPr>
-        <w:t xml:space="preserve">  . . . . . . . . . . . . . . . . . . . . . . 8</w:t>
-      </w:r>
-    </w:p>
-    <w:p>
-      <w:pPr>
-        <w:spacing w:line="360" w:lineRule="auto" w:after="40" w:before="40"/>
-      </w:pPr>
-      <w:r>
-        <w:rPr>
-          <w:rFonts w:ascii="Times New Roman" w:hAnsi="Times New Roman"/>
+        <w:spacing w:before="40" w:after="40" w:line="360" w:lineRule="auto"/>
+      </w:pPr>
+      <w:r>
+        <w:rPr>
+          <w:sz w:val="24"/>
+        </w:rPr>
+        <w:t xml:space="preserve">    A. Latar Belakang Masalah  . . . . . . . . . . . . . . . . . . . . . . . . . 1</w:t>
+      </w:r>
+    </w:p>
+    <w:p>
+      <w:pPr>
+        <w:spacing w:before="40" w:after="40" w:line="360" w:lineRule="auto"/>
+      </w:pPr>
+      <w:r>
+        <w:rPr>
+          <w:sz w:val="24"/>
+        </w:rPr>
+        <w:t xml:space="preserve">    B. Identifikasi Masalah  . . . . . . . . . . . . . . . . . . . . . . . . . . 5</w:t>
+      </w:r>
+    </w:p>
+    <w:p>
+      <w:pPr>
+        <w:spacing w:before="40" w:after="40" w:line="360" w:lineRule="auto"/>
+      </w:pPr>
+      <w:r>
+        <w:rPr>
+          <w:sz w:val="24"/>
+        </w:rPr>
+        <w:t xml:space="preserve">    C. Pembatasan Masalah  . . . . . . . . . . . . . . . . . . . . . . . . . . . 6</w:t>
+      </w:r>
+    </w:p>
+    <w:p>
+      <w:pPr>
+        <w:spacing w:before="40" w:after="40" w:line="360" w:lineRule="auto"/>
+      </w:pPr>
+      <w:r>
+        <w:rPr>
+          <w:sz w:val="24"/>
+        </w:rPr>
+        <w:t xml:space="preserve">    D. Rumusan Masalah  . . . . . . . . . . . . . . . . . . . . . . . . . . . . . 6</w:t>
+      </w:r>
+    </w:p>
+    <w:p>
+      <w:pPr>
+        <w:spacing w:before="40" w:after="40" w:line="360" w:lineRule="auto"/>
+      </w:pPr>
+      <w:r>
+        <w:rPr>
+          <w:sz w:val="24"/>
+        </w:rPr>
+        <w:t xml:space="preserve">    E. Tujuan Penelitian  . . . . . . . . . . . . . . . . . . . . . . . . . . . . 7</w:t>
+      </w:r>
+    </w:p>
+    <w:p>
+      <w:pPr>
+        <w:spacing w:before="40" w:after="40" w:line="360" w:lineRule="auto"/>
+      </w:pPr>
+      <w:r>
+        <w:rPr>
+          <w:sz w:val="24"/>
+        </w:rPr>
+        <w:t xml:space="preserve">    F</w:t>
+      </w:r>
+      <w:r>
+        <w:rPr>
+          <w:sz w:val="24"/>
+        </w:rPr>
+        <w:t>. Manfaat Penelitian  . . . . . . . . . . . . . . . . . . . . . . . . . . . 7</w:t>
+      </w:r>
+    </w:p>
+    <w:p>
+      <w:pPr>
+        <w:spacing w:before="40" w:after="40" w:line="360" w:lineRule="auto"/>
+      </w:pPr>
+      <w:r>
+        <w:rPr>
+          <w:sz w:val="24"/>
+        </w:rPr>
+        <w:t xml:space="preserve">    G. Sistematika Penulisan Skripsi  . . . . . . . . . . . . . . . . . . . . . . 8</w:t>
+      </w:r>
+    </w:p>
+    <w:p>
+      <w:pPr>
+        <w:spacing w:before="40" w:after="40" w:line="360" w:lineRule="auto"/>
+      </w:pPr>
+      <w:r>
+        <w:rPr>
           <w:b/>
           <w:sz w:val="24"/>
         </w:rPr>
@@ -1873,7 +1826,6 @@
       </w:r>
       <w:r>
         <w:rPr>
-          <w:rFonts w:ascii="Times New Roman" w:hAnsi="Times New Roman"/>
           <w:sz w:val="24"/>
         </w:rPr>
         <w:t xml:space="preserve">  . . . . . . . . . . . . . . 10</w:t>
@@ -1881,163 +1833,110 @@
     </w:p>
     <w:p>
       <w:pPr>
-        <w:spacing w:line="360" w:lineRule="auto" w:after="40" w:before="40"/>
-      </w:pPr>
-      <w:r>
-        <w:rPr>
-          <w:rFonts w:ascii="Times New Roman" w:hAnsi="Times New Roman"/>
-          <w:sz w:val="24"/>
-        </w:rPr>
-        <w:t xml:space="preserve">    A. Landasan Teori</w:t>
-      </w:r>
-      <w:r>
-        <w:rPr>
-          <w:rFonts w:ascii="Times New Roman" w:hAnsi="Times New Roman"/>
-          <w:sz w:val="24"/>
-        </w:rPr>
-        <w:t xml:space="preserve">  . . . . . . . . . . . . . . . . . . . . . . . . . . . . . 10</w:t>
-      </w:r>
-    </w:p>
-    <w:p>
-      <w:pPr>
-        <w:spacing w:line="360" w:lineRule="auto" w:after="40" w:before="40"/>
-      </w:pPr>
-      <w:r>
-        <w:rPr>
-          <w:rFonts w:ascii="Times New Roman" w:hAnsi="Times New Roman"/>
-          <w:sz w:val="24"/>
-        </w:rPr>
-        <w:t xml:space="preserve">        1. Kinerja Perangkat Desa</w:t>
-      </w:r>
-      <w:r>
-        <w:rPr>
-          <w:rFonts w:ascii="Times New Roman" w:hAnsi="Times New Roman"/>
-          <w:sz w:val="24"/>
-        </w:rPr>
-        <w:t xml:space="preserve">  . . . . . . . . . . . . . . . . . . . . . . . 10</w:t>
-      </w:r>
-    </w:p>
-    <w:p>
-      <w:pPr>
-        <w:spacing w:line="360" w:lineRule="auto" w:after="40" w:before="40"/>
-      </w:pPr>
-      <w:r>
-        <w:rPr>
-          <w:rFonts w:ascii="Times New Roman" w:hAnsi="Times New Roman"/>
-          <w:sz w:val="24"/>
-        </w:rPr>
-        <w:t xml:space="preserve">        2. Gaya Kepemimpinan</w:t>
-      </w:r>
-      <w:r>
-        <w:rPr>
-          <w:rFonts w:ascii="Times New Roman" w:hAnsi="Times New Roman"/>
-          <w:sz w:val="24"/>
-        </w:rPr>
-        <w:t xml:space="preserve">  . . . . . . . . . . . . . . . . . . . . . . . . . . 13</w:t>
-      </w:r>
-    </w:p>
-    <w:p>
-      <w:pPr>
-        <w:spacing w:line="360" w:lineRule="auto" w:after="40" w:before="40"/>
-      </w:pPr>
-      <w:r>
-        <w:rPr>
-          <w:rFonts w:ascii="Times New Roman" w:hAnsi="Times New Roman"/>
-          <w:sz w:val="24"/>
-        </w:rPr>
-        <w:t xml:space="preserve">        3. Kompensasi</w:t>
-      </w:r>
-      <w:r>
-        <w:rPr>
-          <w:rFonts w:ascii="Times New Roman" w:hAnsi="Times New Roman"/>
-          <w:sz w:val="24"/>
-        </w:rPr>
-        <w:t xml:space="preserve">  . . . . . . . . . . . . . . . . . . . . . . . . . . . . . 16</w:t>
-      </w:r>
-    </w:p>
-    <w:p>
-      <w:pPr>
-        <w:spacing w:line="360" w:lineRule="auto" w:after="40" w:before="40"/>
-      </w:pPr>
-      <w:r>
-        <w:rPr>
-          <w:rFonts w:ascii="Times New Roman" w:hAnsi="Times New Roman"/>
-          <w:sz w:val="24"/>
-        </w:rPr>
-        <w:t xml:space="preserve">        4. Motivasi Kerja</w:t>
-      </w:r>
-      <w:r>
-        <w:rPr>
-          <w:rFonts w:ascii="Times New Roman" w:hAnsi="Times New Roman"/>
-          <w:sz w:val="24"/>
-        </w:rPr>
-        <w:t xml:space="preserve">  . . . . . . . . . . . . . . . . . . . . . . . . . . . 19</w:t>
-      </w:r>
-    </w:p>
-    <w:p>
-      <w:pPr>
-        <w:spacing w:line="360" w:lineRule="auto" w:after="40" w:before="40"/>
-      </w:pPr>
-      <w:r>
-        <w:rPr>
-          <w:rFonts w:ascii="Times New Roman" w:hAnsi="Times New Roman"/>
-          <w:sz w:val="24"/>
-        </w:rPr>
-        <w:t xml:space="preserve">    B. Hasil Penelitian Terdahulu</w:t>
-      </w:r>
-      <w:r>
-        <w:rPr>
-          <w:rFonts w:ascii="Times New Roman" w:hAnsi="Times New Roman"/>
-          <w:sz w:val="24"/>
-        </w:rPr>
-        <w:t xml:space="preserve">  . . . . . . . . . . . . . . . . . . . . . . . 23</w:t>
-      </w:r>
-    </w:p>
-    <w:p>
-      <w:pPr>
-        <w:spacing w:line="360" w:lineRule="auto" w:after="40" w:before="40"/>
-      </w:pPr>
-      <w:r>
-        <w:rPr>
-          <w:rFonts w:ascii="Times New Roman" w:hAnsi="Times New Roman"/>
-          <w:sz w:val="24"/>
-        </w:rPr>
-        <w:t xml:space="preserve">    C. Kerangka Berpikir</w:t>
-      </w:r>
-      <w:r>
-        <w:rPr>
-          <w:rFonts w:ascii="Times New Roman" w:hAnsi="Times New Roman"/>
-          <w:sz w:val="24"/>
-        </w:rPr>
-        <w:t xml:space="preserve">  . . . . . . . . . . . . . . . . . . . . . . . . . . . . 29</w:t>
-      </w:r>
-    </w:p>
-    <w:p>
-      <w:pPr>
-        <w:spacing w:line="360" w:lineRule="auto" w:after="40" w:before="40"/>
-      </w:pPr>
-      <w:r>
-        <w:rPr>
-          <w:rFonts w:ascii="Times New Roman" w:hAnsi="Times New Roman"/>
-          <w:sz w:val="24"/>
-        </w:rPr>
-        <w:t xml:space="preserve">    D. Pengembangan Hipotesis</w:t>
-      </w:r>
-      <w:r>
-        <w:rPr>
-          <w:rFonts w:ascii="Times New Roman" w:hAnsi="Times New Roman"/>
-          <w:sz w:val="24"/>
-        </w:rPr>
-        <w:t xml:space="preserve">  . . . . . . . . . . . . . . . . . . . . . . . . . 30</w:t>
-      </w:r>
-    </w:p>
-    <w:p>
-      <w:pPr>
-        <w:spacing w:line="360" w:lineRule="auto" w:after="40" w:before="40"/>
-      </w:pPr>
-      <w:r>
-        <w:rPr>
-          <w:rFonts w:ascii="Times New Roman" w:hAnsi="Times New Roman"/>
+        <w:spacing w:before="40" w:after="40" w:line="360" w:lineRule="auto"/>
+      </w:pPr>
+      <w:r>
+        <w:rPr>
+          <w:sz w:val="24"/>
+        </w:rPr>
+        <w:t xml:space="preserve">    A. Lan</w:t>
+      </w:r>
+      <w:r>
+        <w:rPr>
+          <w:sz w:val="24"/>
+        </w:rPr>
+        <w:t>dasan Teori  . . . . . . . . . . . . . . . . . . . . . . . . . . . . . 10</w:t>
+      </w:r>
+    </w:p>
+    <w:p>
+      <w:pPr>
+        <w:spacing w:before="40" w:after="40" w:line="360" w:lineRule="auto"/>
+      </w:pPr>
+      <w:r>
+        <w:rPr>
+          <w:sz w:val="24"/>
+        </w:rPr>
+        <w:t xml:space="preserve">        1. Kinerja Perangkat Desa  . . . . . . . . . . . . . . . . . . . . . . . 10</w:t>
+      </w:r>
+    </w:p>
+    <w:p>
+      <w:pPr>
+        <w:spacing w:before="40" w:after="40" w:line="360" w:lineRule="auto"/>
+      </w:pPr>
+      <w:r>
+        <w:rPr>
+          <w:sz w:val="24"/>
+        </w:rPr>
+        <w:t xml:space="preserve">        2. Gaya Kepemimpinan  . . . . . . . . . . . . . . . . . . . . . . . . . . 13</w:t>
+      </w:r>
+    </w:p>
+    <w:p>
+      <w:pPr>
+        <w:spacing w:before="40" w:after="40" w:line="360" w:lineRule="auto"/>
+      </w:pPr>
+      <w:r>
+        <w:rPr>
+          <w:sz w:val="24"/>
+        </w:rPr>
+        <w:t xml:space="preserve">        3. Ko</w:t>
+      </w:r>
+      <w:r>
+        <w:rPr>
+          <w:sz w:val="24"/>
+        </w:rPr>
+        <w:t>mpensasi  . . . . . . . . . . . . . . . . . . . . . . . . . . . . . 16</w:t>
+      </w:r>
+    </w:p>
+    <w:p>
+      <w:pPr>
+        <w:spacing w:before="40" w:after="40" w:line="360" w:lineRule="auto"/>
+      </w:pPr>
+      <w:r>
+        <w:rPr>
+          <w:sz w:val="24"/>
+        </w:rPr>
+        <w:t xml:space="preserve">        4. Motivasi Kerja  . . . . . . . . . . . . . . . . . . . . . . . . . . . 19</w:t>
+      </w:r>
+    </w:p>
+    <w:p>
+      <w:pPr>
+        <w:spacing w:before="40" w:after="40" w:line="360" w:lineRule="auto"/>
+      </w:pPr>
+      <w:r>
+        <w:rPr>
+          <w:sz w:val="24"/>
+        </w:rPr>
+        <w:t xml:space="preserve">    B. Hasil Penelitian Terdahulu  . . . . . . . . . . . . . . . . . . . . . . . 23</w:t>
+      </w:r>
+    </w:p>
+    <w:p>
+      <w:pPr>
+        <w:spacing w:before="40" w:after="40" w:line="360" w:lineRule="auto"/>
+      </w:pPr>
+      <w:r>
+        <w:rPr>
+          <w:sz w:val="24"/>
+        </w:rPr>
+        <w:t xml:space="preserve">    C. Kerangka Berpikir  . . . . . . . . . . . . . . . . . . . . . . . . . . . . 29</w:t>
+      </w:r>
+    </w:p>
+    <w:p>
+      <w:pPr>
+        <w:spacing w:before="40" w:after="40" w:line="360" w:lineRule="auto"/>
+      </w:pPr>
+      <w:r>
+        <w:rPr>
+          <w:sz w:val="24"/>
+        </w:rPr>
+        <w:t xml:space="preserve">    D. Pengembangan Hipotesis  . . . . . . . . . . . . . . . . . . . . . . . . . 30</w:t>
+      </w:r>
+    </w:p>
+    <w:p>
+      <w:pPr>
+        <w:spacing w:before="40" w:after="40" w:line="360" w:lineRule="auto"/>
+      </w:pPr>
+      <w:r>
+        <w:rPr>
           <w:b/>
           <w:sz w:val="24"/>
         </w:rPr>
@@ -2045,7 +1944,6 @@
       </w:r>
       <w:r>
         <w:rPr>
-          <w:rFonts w:ascii="Times New Roman" w:hAnsi="Times New Roman"/>
           <w:sz w:val="24"/>
         </w:rPr>
         <w:t xml:space="preserve">  . . . . . . . . . . . . . . . . . . . . . . . . . . . 31</w:t>
@@ -2053,296 +1951,205 @@
     </w:p>
     <w:p>
       <w:pPr>
-        <w:spacing w:line="360" w:lineRule="auto" w:after="40" w:before="40"/>
-      </w:pPr>
-      <w:r>
-        <w:rPr>
-          <w:rFonts w:ascii="Times New Roman" w:hAnsi="Times New Roman"/>
-          <w:sz w:val="24"/>
-        </w:rPr>
-        <w:t xml:space="preserve">    A. Tempat dan Waktu Penelitian</w:t>
-      </w:r>
-      <w:r>
-        <w:rPr>
-          <w:rFonts w:ascii="Times New Roman" w:hAnsi="Times New Roman"/>
-          <w:sz w:val="24"/>
-        </w:rPr>
-        <w:t xml:space="preserve">  . . . . . . . . . . . . . . . . . . . . . . . 31</w:t>
-      </w:r>
-    </w:p>
-    <w:p>
-      <w:pPr>
-        <w:spacing w:line="360" w:lineRule="auto" w:after="40" w:before="40"/>
-      </w:pPr>
-      <w:r>
-        <w:rPr>
-          <w:rFonts w:ascii="Times New Roman" w:hAnsi="Times New Roman"/>
-          <w:sz w:val="24"/>
-        </w:rPr>
-        <w:t xml:space="preserve">    B. Desain Penelitian</w:t>
-      </w:r>
-      <w:r>
-        <w:rPr>
-          <w:rFonts w:ascii="Times New Roman" w:hAnsi="Times New Roman"/>
-          <w:sz w:val="24"/>
-        </w:rPr>
-        <w:t xml:space="preserve">  . . . . . . . . . . . . . . . . . . . . . . . . . . . . 31</w:t>
-      </w:r>
-    </w:p>
-    <w:p>
-      <w:pPr>
-        <w:spacing w:line="360" w:lineRule="auto" w:after="40" w:before="40"/>
-      </w:pPr>
-      <w:r>
-        <w:rPr>
-          <w:rFonts w:ascii="Times New Roman" w:hAnsi="Times New Roman"/>
-          <w:sz w:val="24"/>
-        </w:rPr>
-        <w:t xml:space="preserve">    C. Definisi Operasional dan Pengukuran Variabel Penelitian</w:t>
-      </w:r>
-      <w:r>
-        <w:rPr>
-          <w:rFonts w:ascii="Times New Roman" w:hAnsi="Times New Roman"/>
-          <w:sz w:val="24"/>
-        </w:rPr>
-        <w:t xml:space="preserve">  . . . . . . . . . 32</w:t>
-      </w:r>
-    </w:p>
-    <w:p>
-      <w:pPr>
-        <w:spacing w:line="360" w:lineRule="auto" w:after="40" w:before="40"/>
-      </w:pPr>
-      <w:r>
-        <w:rPr>
-          <w:rFonts w:ascii="Times New Roman" w:hAnsi="Times New Roman"/>
-          <w:sz w:val="24"/>
-        </w:rPr>
-        <w:t xml:space="preserve">        1. Variabel Bebas (Variabel Independen)</w:t>
-      </w:r>
-      <w:r>
-        <w:rPr>
-          <w:rFonts w:ascii="Times New Roman" w:hAnsi="Times New Roman"/>
-          <w:sz w:val="24"/>
-        </w:rPr>
-        <w:t xml:space="preserve">  . . . . . . . . . . . . . . . . 32</w:t>
-      </w:r>
-    </w:p>
-    <w:p>
-      <w:pPr>
-        <w:spacing w:line="360" w:lineRule="auto" w:after="40" w:before="40"/>
-      </w:pPr>
-      <w:r>
-        <w:rPr>
-          <w:rFonts w:ascii="Times New Roman" w:hAnsi="Times New Roman"/>
-          <w:sz w:val="24"/>
-        </w:rPr>
-        <w:t xml:space="preserve">        2. Variabel Terikat (Variabel Dependen)</w:t>
-      </w:r>
-      <w:r>
-        <w:rPr>
-          <w:rFonts w:ascii="Times New Roman" w:hAnsi="Times New Roman"/>
-          <w:sz w:val="24"/>
-        </w:rPr>
-        <w:t xml:space="preserve">  . . . . . . . . . . . . . . . . 32</w:t>
-      </w:r>
-    </w:p>
-    <w:p>
-      <w:pPr>
-        <w:spacing w:line="360" w:lineRule="auto" w:after="40" w:before="40"/>
-      </w:pPr>
-      <w:r>
-        <w:rPr>
-          <w:rFonts w:ascii="Times New Roman" w:hAnsi="Times New Roman"/>
-          <w:sz w:val="24"/>
-        </w:rPr>
-        <w:t xml:space="preserve">        3. Variabel Mediasi</w:t>
-      </w:r>
-      <w:r>
-        <w:rPr>
-          <w:rFonts w:ascii="Times New Roman" w:hAnsi="Times New Roman"/>
-          <w:sz w:val="24"/>
-        </w:rPr>
-        <w:t xml:space="preserve">  . . . . . . . . . . . . . . . . . . . . . . . . . . 33</w:t>
-      </w:r>
-    </w:p>
-    <w:p>
-      <w:pPr>
-        <w:spacing w:line="360" w:lineRule="auto" w:after="40" w:before="40"/>
-      </w:pPr>
-      <w:r>
-        <w:rPr>
-          <w:rFonts w:ascii="Times New Roman" w:hAnsi="Times New Roman"/>
-          <w:sz w:val="24"/>
-        </w:rPr>
-        <w:t xml:space="preserve">        4. Operasionalisasi Variabel Penelitian</w:t>
-      </w:r>
-      <w:r>
-        <w:rPr>
-          <w:rFonts w:ascii="Times New Roman" w:hAnsi="Times New Roman"/>
-          <w:sz w:val="24"/>
-        </w:rPr>
-        <w:t xml:space="preserve">  . . . . . . . . . . . . . . . . 33</w:t>
-      </w:r>
-    </w:p>
-    <w:p>
-      <w:pPr>
-        <w:spacing w:line="360" w:lineRule="auto" w:after="40" w:before="40"/>
-      </w:pPr>
-      <w:r>
-        <w:rPr>
-          <w:rFonts w:ascii="Times New Roman" w:hAnsi="Times New Roman"/>
-          <w:sz w:val="24"/>
-        </w:rPr>
-        <w:t xml:space="preserve">    D. Populasi dan Sampel Penelitian</w:t>
-      </w:r>
-      <w:r>
-        <w:rPr>
-          <w:rFonts w:ascii="Times New Roman" w:hAnsi="Times New Roman"/>
-          <w:sz w:val="24"/>
-        </w:rPr>
-        <w:t xml:space="preserve">  . . . . . . . . . . . . . . . . . . . . . 34</w:t>
-      </w:r>
-    </w:p>
-    <w:p>
-      <w:pPr>
-        <w:spacing w:line="360" w:lineRule="auto" w:after="40" w:before="40"/>
-      </w:pPr>
-      <w:r>
-        <w:rPr>
-          <w:rFonts w:ascii="Times New Roman" w:hAnsi="Times New Roman"/>
-          <w:sz w:val="24"/>
-        </w:rPr>
-        <w:t xml:space="preserve">        1. Populasi</w:t>
-      </w:r>
-      <w:r>
-        <w:rPr>
-          <w:rFonts w:ascii="Times New Roman" w:hAnsi="Times New Roman"/>
-          <w:sz w:val="24"/>
-        </w:rPr>
-        <w:t xml:space="preserve">  . . . . . . . . . . . . . . . . . . . . . . . . . . . . . . 34</w:t>
-      </w:r>
-    </w:p>
-    <w:p>
-      <w:pPr>
-        <w:spacing w:line="360" w:lineRule="auto" w:after="40" w:before="40"/>
-      </w:pPr>
-      <w:r>
-        <w:rPr>
-          <w:rFonts w:ascii="Times New Roman" w:hAnsi="Times New Roman"/>
-          <w:sz w:val="24"/>
-        </w:rPr>
-        <w:t xml:space="preserve">        2. Sampel</w:t>
-      </w:r>
-      <w:r>
-        <w:rPr>
-          <w:rFonts w:ascii="Times New Roman" w:hAnsi="Times New Roman"/>
-          <w:sz w:val="24"/>
-        </w:rPr>
-        <w:t xml:space="preserve">  . . . . . . . . . . . . . . . . . . . . . . . . . . . . . . . 35</w:t>
-      </w:r>
-    </w:p>
-    <w:p>
-      <w:pPr>
-        <w:spacing w:line="360" w:lineRule="auto" w:after="40" w:before="40"/>
-      </w:pPr>
-      <w:r>
-        <w:rPr>
-          <w:rFonts w:ascii="Times New Roman" w:hAnsi="Times New Roman"/>
-          <w:sz w:val="24"/>
-        </w:rPr>
-        <w:t xml:space="preserve">    E. Metode Pengumpulan Data</w:t>
-      </w:r>
-      <w:r>
-        <w:rPr>
-          <w:rFonts w:ascii="Times New Roman" w:hAnsi="Times New Roman"/>
-          <w:sz w:val="24"/>
-        </w:rPr>
-        <w:t xml:space="preserve">  . . . . . . . . . . . . . . . . . . . . . . . . . 36</w:t>
-      </w:r>
-    </w:p>
-    <w:p>
-      <w:pPr>
-        <w:spacing w:line="360" w:lineRule="auto" w:after="40" w:before="40"/>
-      </w:pPr>
-      <w:r>
-        <w:rPr>
-          <w:rFonts w:ascii="Times New Roman" w:hAnsi="Times New Roman"/>
-          <w:sz w:val="24"/>
-        </w:rPr>
-        <w:t xml:space="preserve">        1. Teknik Pengumpulan Data</w:t>
-      </w:r>
-      <w:r>
-        <w:rPr>
-          <w:rFonts w:ascii="Times New Roman" w:hAnsi="Times New Roman"/>
-          <w:sz w:val="24"/>
-        </w:rPr>
-        <w:t xml:space="preserve">  . . . . . . . . . . . . . . . . . . . . . . . 36</w:t>
-      </w:r>
-    </w:p>
-    <w:p>
-      <w:pPr>
-        <w:spacing w:line="360" w:lineRule="auto" w:after="40" w:before="40"/>
-      </w:pPr>
-      <w:r>
-        <w:rPr>
-          <w:rFonts w:ascii="Times New Roman" w:hAnsi="Times New Roman"/>
-          <w:sz w:val="24"/>
-        </w:rPr>
-        <w:t xml:space="preserve">        2. Sumber Data</w:t>
-      </w:r>
-      <w:r>
-        <w:rPr>
-          <w:rFonts w:ascii="Times New Roman" w:hAnsi="Times New Roman"/>
-          <w:sz w:val="24"/>
-        </w:rPr>
-        <w:t xml:space="preserve">  . . . . . . . . . . . . . . . . . . . . . . . . . . . . . 36</w:t>
-      </w:r>
-    </w:p>
-    <w:p>
-      <w:pPr>
-        <w:spacing w:line="360" w:lineRule="auto" w:after="40" w:before="40"/>
-      </w:pPr>
-      <w:r>
-        <w:rPr>
-          <w:rFonts w:ascii="Times New Roman" w:hAnsi="Times New Roman"/>
-          <w:sz w:val="24"/>
-        </w:rPr>
-        <w:t xml:space="preserve">        3. Teknik Pengembangan Instrumen</w:t>
-      </w:r>
-      <w:r>
-        <w:rPr>
-          <w:rFonts w:ascii="Times New Roman" w:hAnsi="Times New Roman"/>
-          <w:sz w:val="24"/>
-        </w:rPr>
-        <w:t xml:space="preserve">  . . . . . . . . . . . . . . . . . . . . 37</w:t>
-      </w:r>
-    </w:p>
-    <w:p>
-      <w:pPr>
-        <w:spacing w:line="360" w:lineRule="auto" w:after="40" w:before="40"/>
-      </w:pPr>
-      <w:r>
-        <w:rPr>
-          <w:rFonts w:ascii="Times New Roman" w:hAnsi="Times New Roman"/>
-          <w:sz w:val="24"/>
-        </w:rPr>
-        <w:t xml:space="preserve">    F. Teknik Analisis Data</w:t>
-      </w:r>
-      <w:r>
-        <w:rPr>
-          <w:rFonts w:ascii="Times New Roman" w:hAnsi="Times New Roman"/>
-          <w:sz w:val="24"/>
-        </w:rPr>
-        <w:t xml:space="preserve">  . . . . . . . . . . . . . . . . . . . . . . . . . . 38</w:t>
-      </w:r>
-    </w:p>
-    <w:p>
-      <w:pPr>
-        <w:spacing w:line="360" w:lineRule="auto" w:after="40" w:before="40"/>
-      </w:pPr>
-      <w:r>
-        <w:rPr>
-          <w:rFonts w:ascii="Times New Roman" w:hAnsi="Times New Roman"/>
+        <w:spacing w:before="40" w:after="40" w:line="360" w:lineRule="auto"/>
+      </w:pPr>
+      <w:r>
+        <w:rPr>
+          <w:sz w:val="24"/>
+        </w:rPr>
+        <w:t xml:space="preserve">   </w:t>
+      </w:r>
+      <w:r>
+        <w:rPr>
+          <w:sz w:val="24"/>
+        </w:rPr>
+        <w:t xml:space="preserve"> A. Tempat dan Waktu Penelitian  . . . . . . . . . . . . . . . . . . . . . . . 31</w:t>
+      </w:r>
+    </w:p>
+    <w:p>
+      <w:pPr>
+        <w:spacing w:before="40" w:after="40" w:line="360" w:lineRule="auto"/>
+      </w:pPr>
+      <w:r>
+        <w:rPr>
+          <w:sz w:val="24"/>
+        </w:rPr>
+        <w:t xml:space="preserve">    B. Desain Penelitian  . . . . . . . . . . . . . . . . . . . . . . . . . . . . 31</w:t>
+      </w:r>
+    </w:p>
+    <w:p>
+      <w:pPr>
+        <w:spacing w:before="40" w:after="40" w:line="360" w:lineRule="auto"/>
+      </w:pPr>
+      <w:r>
+        <w:rPr>
+          <w:sz w:val="24"/>
+        </w:rPr>
+        <w:t xml:space="preserve">    C. Definisi Operasional dan Pengukuran Variabel Penelitian  . . . . . . . . . 32</w:t>
+      </w:r>
+    </w:p>
+    <w:p>
+      <w:pPr>
+        <w:spacing w:before="40" w:after="40" w:line="360" w:lineRule="auto"/>
+      </w:pPr>
+      <w:r>
+        <w:rPr>
+          <w:sz w:val="24"/>
+        </w:rPr>
+        <w:t xml:space="preserve">    </w:t>
+      </w:r>
+      <w:r>
+        <w:rPr>
+          <w:sz w:val="24"/>
+        </w:rPr>
+        <w:t xml:space="preserve">    1. Variabel Bebas (Variabel Independen)  . . . . . . . . . . . . . . . . 32</w:t>
+      </w:r>
+    </w:p>
+    <w:p>
+      <w:pPr>
+        <w:spacing w:before="40" w:after="40" w:line="360" w:lineRule="auto"/>
+      </w:pPr>
+      <w:r>
+        <w:rPr>
+          <w:sz w:val="24"/>
+        </w:rPr>
+        <w:t xml:space="preserve">        2. Variabel Terikat (Variabel Dependen)  . . . . . . . . . . . . . . . . 32</w:t>
+      </w:r>
+    </w:p>
+    <w:p>
+      <w:pPr>
+        <w:spacing w:before="40" w:after="40" w:line="360" w:lineRule="auto"/>
+      </w:pPr>
+      <w:r>
+        <w:rPr>
+          <w:sz w:val="24"/>
+        </w:rPr>
+        <w:t xml:space="preserve">        3. Variabel Mediasi  . . . . . . . . . . . . . . . . . . . . . . . . . . 33</w:t>
+      </w:r>
+    </w:p>
+    <w:p>
+      <w:pPr>
+        <w:spacing w:before="40" w:after="40" w:line="360" w:lineRule="auto"/>
+      </w:pPr>
+      <w:r>
+        <w:rPr>
+          <w:sz w:val="24"/>
+        </w:rPr>
+        <w:t xml:space="preserve">        </w:t>
+      </w:r>
+      <w:r>
+        <w:rPr>
+          <w:sz w:val="24"/>
+        </w:rPr>
+        <w:t>4. Operasionalisasi Variabel Penelitian  . . . . . . . . . . . . . . . . 33</w:t>
+      </w:r>
+    </w:p>
+    <w:p>
+      <w:pPr>
+        <w:spacing w:before="40" w:after="40" w:line="360" w:lineRule="auto"/>
+      </w:pPr>
+      <w:r>
+        <w:rPr>
+          <w:sz w:val="24"/>
+        </w:rPr>
+        <w:t xml:space="preserve">    D. Populasi dan Sampel Penelitian  . . . . . . . . . . . . . . . . . . . . . 34</w:t>
+      </w:r>
+    </w:p>
+    <w:p>
+      <w:pPr>
+        <w:spacing w:before="40" w:after="40" w:line="360" w:lineRule="auto"/>
+      </w:pPr>
+      <w:r>
+        <w:rPr>
+          <w:sz w:val="24"/>
+        </w:rPr>
+        <w:t xml:space="preserve">        1. Populasi  . . . . . . . . . . . . . . . . . . . . . . . . . . . . . . 34</w:t>
+      </w:r>
+    </w:p>
+    <w:p>
+      <w:pPr>
+        <w:spacing w:before="40" w:after="40" w:line="360" w:lineRule="auto"/>
+      </w:pPr>
+      <w:r>
+        <w:rPr>
+          <w:sz w:val="24"/>
+        </w:rPr>
+        <w:t xml:space="preserve">        2. S</w:t>
+      </w:r>
+      <w:r>
+        <w:rPr>
+          <w:sz w:val="24"/>
+        </w:rPr>
+        <w:t>ampel  . . . . . . . . . . . . . . . . . . . . . . . . . . . . . . . 35</w:t>
+      </w:r>
+    </w:p>
+    <w:p>
+      <w:pPr>
+        <w:spacing w:before="40" w:after="40" w:line="360" w:lineRule="auto"/>
+      </w:pPr>
+      <w:r>
+        <w:rPr>
+          <w:sz w:val="24"/>
+        </w:rPr>
+        <w:t xml:space="preserve">    E. Metode Pengumpulan Data  . . . . . . . . . . . . . . . . . . . . . . . . . 36</w:t>
+      </w:r>
+    </w:p>
+    <w:p>
+      <w:pPr>
+        <w:spacing w:before="40" w:after="40" w:line="360" w:lineRule="auto"/>
+      </w:pPr>
+      <w:r>
+        <w:rPr>
+          <w:sz w:val="24"/>
+        </w:rPr>
+        <w:t xml:space="preserve">        1. Teknik Pengumpulan Data  . . . . . . . . . . . . . . . . . . . . . . . 36</w:t>
+      </w:r>
+    </w:p>
+    <w:p>
+      <w:pPr>
+        <w:spacing w:before="40" w:after="40" w:line="360" w:lineRule="auto"/>
+      </w:pPr>
+      <w:r>
+        <w:rPr>
+          <w:sz w:val="24"/>
+        </w:rPr>
+        <w:t xml:space="preserve">        2. Sum</w:t>
+      </w:r>
+      <w:r>
+        <w:rPr>
+          <w:sz w:val="24"/>
+        </w:rPr>
+        <w:t>ber Data  . . . . . . . . . . . . . . . . . . . . . . . . . . . . . 36</w:t>
+      </w:r>
+    </w:p>
+    <w:p>
+      <w:pPr>
+        <w:spacing w:before="40" w:after="40" w:line="360" w:lineRule="auto"/>
+      </w:pPr>
+      <w:r>
+        <w:rPr>
+          <w:sz w:val="24"/>
+        </w:rPr>
+        <w:t xml:space="preserve">        3. Teknik Pengembangan Instrumen  . . . . . . . . . . . . . . . . . . . . 37</w:t>
+      </w:r>
+    </w:p>
+    <w:p>
+      <w:pPr>
+        <w:spacing w:before="40" w:after="40" w:line="360" w:lineRule="auto"/>
+      </w:pPr>
+      <w:r>
+        <w:rPr>
+          <w:sz w:val="24"/>
+        </w:rPr>
+        <w:t xml:space="preserve">    F. Teknik Analisis Data  . . . . . . . . . . . . . . . . . . . . . . . . . . 38</w:t>
+      </w:r>
+    </w:p>
+    <w:p>
+      <w:pPr>
+        <w:spacing w:before="40" w:after="40" w:line="360" w:lineRule="auto"/>
+      </w:pPr>
+      <w:r>
+        <w:rPr>
           <w:b/>
           <w:sz w:val="24"/>
         </w:rPr>
@@ -2350,10 +2157,15 @@
       </w:r>
       <w:r>
         <w:rPr>
-          <w:rFonts w:ascii="Times New Roman" w:hAnsi="Times New Roman"/>
-          <w:sz w:val="24"/>
-        </w:rPr>
-        <w:t xml:space="preserve">  . . . . . . . . . . . . . . . . . . . . . . . . . . . . . . . . . 44</w:t>
+          <w:sz w:val="24"/>
+        </w:rPr>
+        <w:t xml:space="preserve">  </w:t>
+      </w:r>
+      <w:r>
+        <w:rPr>
+          <w:sz w:val="24"/>
+        </w:rPr>
+        <w:t>. . . . . . . . . . . . . . . . . . . . . . . . . . . . . . . . . 44</w:t>
       </w:r>
     </w:p>
     <w:p>
@@ -2362,146 +2174,133 @@
       </w:pPr>
       <w:r>
         <w:rPr>
-          <w:rFonts w:ascii="Times New Roman" w:hAnsi="Times New Roman"/>
           <w:b/>
           <w:sz w:val="24"/>
         </w:rPr>
         <w:br/>
+      </w:r>
+      <w:r>
+        <w:rPr>
+          <w:b/>
+          <w:sz w:val="24"/>
+        </w:rPr>
         <w:br/>
         <w:t>DAFTAR TABEL</w:t>
       </w:r>
     </w:p>
     <w:p>
       <w:pPr>
-        <w:spacing w:line="360" w:lineRule="auto" w:after="40"/>
-      </w:pPr>
-      <w:r>
-        <w:rPr>
-          <w:rFonts w:ascii="Times New Roman" w:hAnsi="Times New Roman"/>
-          <w:sz w:val="24"/>
-        </w:rPr>
-        <w:t>Tabel 2.1 Faktor-Faktor yang Mempengaruhi Kompensasi</w:t>
-      </w:r>
-      <w:r>
-        <w:rPr>
-          <w:rFonts w:ascii="Times New Roman" w:hAnsi="Times New Roman"/>
-          <w:sz w:val="24"/>
-        </w:rPr>
-        <w:t xml:space="preserve">  . . . . . . . . . . . 18</w:t>
-      </w:r>
-    </w:p>
-    <w:p>
-      <w:pPr>
-        <w:spacing w:line="360" w:lineRule="auto" w:after="40"/>
-      </w:pPr>
-      <w:r>
-        <w:rPr>
-          <w:rFonts w:ascii="Times New Roman" w:hAnsi="Times New Roman"/>
-          <w:sz w:val="24"/>
-        </w:rPr>
-        <w:t>Tabel 2.2 Hasil Penelitian Terdahulu</w:t>
-      </w:r>
-      <w:r>
-        <w:rPr>
-          <w:rFonts w:ascii="Times New Roman" w:hAnsi="Times New Roman"/>
-          <w:sz w:val="24"/>
-        </w:rPr>
-        <w:t xml:space="preserve">  . . . . . . . . . . . . . . . . . . . 24</w:t>
-      </w:r>
-    </w:p>
-    <w:p>
-      <w:pPr>
-        <w:spacing w:line="360" w:lineRule="auto" w:after="40"/>
-      </w:pPr>
-      <w:r>
-        <w:rPr>
-          <w:rFonts w:ascii="Times New Roman" w:hAnsi="Times New Roman"/>
-          <w:sz w:val="24"/>
-        </w:rPr>
-        <w:t>Tabel 3.1 Jadwal Penelitian dan Penulisan Skripsi</w:t>
-      </w:r>
-      <w:r>
-        <w:rPr>
-          <w:rFonts w:ascii="Times New Roman" w:hAnsi="Times New Roman"/>
-          <w:sz w:val="24"/>
-        </w:rPr>
-        <w:t xml:space="preserve">  . . . . . . . . . . . . . 31</w:t>
-      </w:r>
-    </w:p>
-    <w:p>
-      <w:pPr>
-        <w:spacing w:line="360" w:lineRule="auto" w:after="40"/>
-      </w:pPr>
-      <w:r>
-        <w:rPr>
-          <w:rFonts w:ascii="Times New Roman" w:hAnsi="Times New Roman"/>
-          <w:sz w:val="24"/>
-        </w:rPr>
-        <w:t>Tabel 3.2 Operasional Variabel Penelitian</w:t>
-      </w:r>
-      <w:r>
-        <w:rPr>
-          <w:rFonts w:ascii="Times New Roman" w:hAnsi="Times New Roman"/>
-          <w:sz w:val="24"/>
-        </w:rPr>
-        <w:t xml:space="preserve">  . . . . . . . . . . . . . . . . . 33</w:t>
-      </w:r>
-    </w:p>
-    <w:p>
-      <w:pPr>
-        <w:spacing w:line="360" w:lineRule="auto" w:after="40"/>
-      </w:pPr>
-      <w:r>
-        <w:rPr>
-          <w:rFonts w:ascii="Times New Roman" w:hAnsi="Times New Roman"/>
-          <w:sz w:val="24"/>
-        </w:rPr>
-        <w:t>Tabel 3.3 Skala Likert</w:t>
-      </w:r>
-      <w:r>
-        <w:rPr>
-          <w:rFonts w:ascii="Times New Roman" w:hAnsi="Times New Roman"/>
-          <w:sz w:val="24"/>
-        </w:rPr>
-        <w:t xml:space="preserve">  . . . . . . . . . . . . . . . . . . . . . . . . . . 37</w:t>
-      </w:r>
-    </w:p>
-    <w:p>
-      <w:pPr>
-        <w:spacing w:line="360" w:lineRule="auto" w:after="40"/>
-      </w:pPr>
-      <w:r>
-        <w:rPr>
-          <w:rFonts w:ascii="Times New Roman" w:hAnsi="Times New Roman"/>
-          <w:sz w:val="24"/>
-        </w:rPr>
-        <w:t>Tabel 3.4 Rule of Thumb Evaluasi Model Pengukuran</w:t>
-      </w:r>
-      <w:r>
-        <w:rPr>
-          <w:rFonts w:ascii="Times New Roman" w:hAnsi="Times New Roman"/>
-          <w:sz w:val="24"/>
-        </w:rPr>
-        <w:t xml:space="preserve">  . . . . . . . . . . . . . 40</w:t>
-      </w:r>
-    </w:p>
-    <w:p>
-      <w:pPr>
-        <w:spacing w:line="360" w:lineRule="auto" w:after="40"/>
-      </w:pPr>
-      <w:r>
-        <w:rPr>
-          <w:rFonts w:ascii="Times New Roman" w:hAnsi="Times New Roman"/>
-          <w:sz w:val="24"/>
-        </w:rPr>
-        <w:t>Tabel 3.5 Rule of Thumb Evaluasi Model Struktural</w:t>
-      </w:r>
-      <w:r>
-        <w:rPr>
-          <w:rFonts w:ascii="Times New Roman" w:hAnsi="Times New Roman"/>
-          <w:sz w:val="24"/>
-        </w:rPr>
-        <w:t xml:space="preserve">  . . . . . . . . . . . . . 43</w:t>
+        <w:spacing w:after="40" w:line="360" w:lineRule="auto"/>
+      </w:pPr>
+      <w:r>
+        <w:rPr>
+          <w:sz w:val="24"/>
+        </w:rPr>
+        <w:t>Tabel 2.1 Faktor-Faktor yang Mempengaruhi Kompensasi  . . . . . . . . . . . 18</w:t>
+      </w:r>
+    </w:p>
+    <w:p>
+      <w:pPr>
+        <w:spacing w:after="40" w:line="360" w:lineRule="auto"/>
+      </w:pPr>
+      <w:r>
+        <w:rPr>
+          <w:sz w:val="24"/>
+        </w:rPr>
+        <w:t>Tabel 2.2 Hasil Penelitian Terdahulu  . . . . . . . . . . . . . . . . . . . 24</w:t>
+      </w:r>
+    </w:p>
+    <w:p>
+      <w:pPr>
+        <w:spacing w:after="40" w:line="360" w:lineRule="auto"/>
+      </w:pPr>
+      <w:r>
+        <w:rPr>
+          <w:sz w:val="24"/>
+        </w:rPr>
+        <w:t>Tabel 3.1 Jadw</w:t>
+      </w:r>
+      <w:r>
+        <w:rPr>
+          <w:sz w:val="24"/>
+        </w:rPr>
+        <w:t>al Penelitian dan Penulisan Skripsi  . . . . . . . . . . . . . 31</w:t>
+      </w:r>
+    </w:p>
+    <w:p>
+      <w:pPr>
+        <w:spacing w:after="40" w:line="360" w:lineRule="auto"/>
+      </w:pPr>
+      <w:r>
+        <w:rPr>
+          <w:sz w:val="24"/>
+        </w:rPr>
+        <w:t>Tabel 3.2 Operasional Variabel Penelitian  . . . . . . . . . . . . . . . . . 33</w:t>
+      </w:r>
+    </w:p>
+    <w:p>
+      <w:pPr>
+        <w:spacing w:after="40" w:line="360" w:lineRule="auto"/>
+      </w:pPr>
+      <w:r>
+        <w:rPr>
+          <w:sz w:val="24"/>
+        </w:rPr>
+        <w:t>Tabel 3.3 Skala Likert  . . . . . . . . . . . . . . . . . . . . . . . . . . 37</w:t>
+      </w:r>
+    </w:p>
+    <w:p>
+      <w:pPr>
+        <w:spacing w:after="40" w:line="360" w:lineRule="auto"/>
+      </w:pPr>
+      <w:r>
+        <w:rPr>
+          <w:sz w:val="24"/>
+        </w:rPr>
+        <w:t xml:space="preserve">Tabel 3.4 </w:t>
+      </w:r>
+      <w:r>
+        <w:rPr>
+          <w:i/>
+          <w:sz w:val="24"/>
+        </w:rPr>
+        <w:t>Rule of thumb</w:t>
+      </w:r>
+      <w:r>
+        <w:rPr>
+          <w:sz w:val="24"/>
+        </w:rPr>
+        <w:t xml:space="preserve"> Evaluas</w:t>
+      </w:r>
+      <w:r>
+        <w:rPr>
+          <w:sz w:val="24"/>
+        </w:rPr>
+        <w:t>i Model Pengukuran  . . . . . . . . . . . . . 40</w:t>
+      </w:r>
+    </w:p>
+    <w:p>
+      <w:pPr>
+        <w:spacing w:after="40" w:line="360" w:lineRule="auto"/>
+      </w:pPr>
+      <w:r>
+        <w:rPr>
+          <w:sz w:val="24"/>
+        </w:rPr>
+        <w:t xml:space="preserve">Tabel 3.5 </w:t>
+      </w:r>
+      <w:r>
+        <w:rPr>
+          <w:i/>
+          <w:sz w:val="24"/>
+        </w:rPr>
+        <w:t>Rule of thumb</w:t>
+      </w:r>
+      <w:r>
+        <w:rPr>
+          <w:sz w:val="24"/>
+        </w:rPr>
+        <w:t xml:space="preserve"> Evaluasi Model Struktural  . . . . . . . . . . . . . 43</w:t>
       </w:r>
     </w:p>
     <w:p>
@@ -2510,29 +2309,32 @@
       </w:pPr>
       <w:r>
         <w:rPr>
-          <w:rFonts w:ascii="Times New Roman" w:hAnsi="Times New Roman"/>
           <w:b/>
           <w:sz w:val="24"/>
         </w:rPr>
         <w:br/>
+      </w:r>
+      <w:r>
+        <w:rPr>
+          <w:b/>
+          <w:sz w:val="24"/>
+        </w:rPr>
         <w:br/>
         <w:t>DAFTAR GAMBAR</w:t>
       </w:r>
     </w:p>
     <w:p>
       <w:pPr>
-        <w:spacing w:line="360" w:lineRule="auto" w:after="40"/>
-      </w:pPr>
-      <w:r>
-        <w:rPr>
-          <w:rFonts w:ascii="Times New Roman" w:hAnsi="Times New Roman"/>
+        <w:spacing w:after="40" w:line="360" w:lineRule="auto"/>
+      </w:pPr>
+      <w:r>
+        <w:rPr>
           <w:sz w:val="24"/>
         </w:rPr>
         <w:t>Gambar 2.1 Kerangka Berpikir</w:t>
       </w:r>
       <w:r>
         <w:rPr>
-          <w:rFonts w:ascii="Times New Roman" w:hAnsi="Times New Roman"/>
           <w:sz w:val="24"/>
         </w:rPr>
         <w:t xml:space="preserve">  . . . . . . . . . . . . . . . . . . . . . . . 29</w:t>
@@ -2540,113 +2342,155 @@
     </w:p>
     <w:p>
       <w:pPr>
-        <w:spacing w:line="360" w:lineRule="auto" w:after="40"/>
-      </w:pPr>
-      <w:r>
-        <w:rPr>
-          <w:rFonts w:ascii="Times New Roman" w:hAnsi="Times New Roman"/>
-          <w:sz w:val="24"/>
-        </w:rPr>
-        <w:t>Gambar 3.1 Outer Model Variabel Dependen (Y)</w:t>
-      </w:r>
-      <w:r>
-        <w:rPr>
-          <w:rFonts w:ascii="Times New Roman" w:hAnsi="Times New Roman"/>
-          <w:sz w:val="24"/>
-        </w:rPr>
-        <w:t xml:space="preserve">  . . . . . . . . . . . . . . . 38</w:t>
-      </w:r>
-    </w:p>
-    <w:p>
-      <w:pPr>
-        <w:spacing w:line="360" w:lineRule="auto" w:after="40"/>
-      </w:pPr>
-      <w:r>
-        <w:rPr>
-          <w:rFonts w:ascii="Times New Roman" w:hAnsi="Times New Roman"/>
-          <w:sz w:val="24"/>
-        </w:rPr>
-        <w:t>Gambar 3.2 Outer Model Variabel Independen (X1)</w:t>
-      </w:r>
-      <w:r>
-        <w:rPr>
-          <w:rFonts w:ascii="Times New Roman" w:hAnsi="Times New Roman"/>
-          <w:sz w:val="24"/>
-        </w:rPr>
-        <w:t xml:space="preserve">  . . . . . . . . . . . . . . 38</w:t>
-      </w:r>
-    </w:p>
-    <w:p>
-      <w:pPr>
-        <w:spacing w:line="360" w:lineRule="auto" w:after="40"/>
-      </w:pPr>
-      <w:r>
-        <w:rPr>
-          <w:rFonts w:ascii="Times New Roman" w:hAnsi="Times New Roman"/>
-          <w:sz w:val="24"/>
-        </w:rPr>
-        <w:t>Gambar 3.3 Outer Model Variabel Independen (X2)</w:t>
-      </w:r>
-      <w:r>
-        <w:rPr>
-          <w:rFonts w:ascii="Times New Roman" w:hAnsi="Times New Roman"/>
-          <w:sz w:val="24"/>
-        </w:rPr>
-        <w:t xml:space="preserve">  . . . . . . . . . . . . . . 39</w:t>
-      </w:r>
-    </w:p>
-    <w:p>
-      <w:pPr>
-        <w:spacing w:line="360" w:lineRule="auto" w:after="40"/>
-      </w:pPr>
-      <w:r>
-        <w:rPr>
-          <w:rFonts w:ascii="Times New Roman" w:hAnsi="Times New Roman"/>
-          <w:sz w:val="24"/>
-        </w:rPr>
-        <w:t>Gambar 3.4 Outer Model Variabel Mediasi (Z)</w:t>
-      </w:r>
-      <w:r>
-        <w:rPr>
-          <w:rFonts w:ascii="Times New Roman" w:hAnsi="Times New Roman"/>
-          <w:sz w:val="24"/>
-        </w:rPr>
-        <w:t xml:space="preserve">  . . . . . . . . . . . . . . . . 39</w:t>
-      </w:r>
-    </w:p>
-    <w:p>
-      <w:pPr>
-        <w:spacing w:line="360" w:lineRule="auto" w:after="40"/>
-      </w:pPr>
-      <w:r>
-        <w:rPr>
-          <w:rFonts w:ascii="Times New Roman" w:hAnsi="Times New Roman"/>
-          <w:sz w:val="24"/>
-        </w:rPr>
-        <w:t>Gambar 3.5 Inner Model Variabel Dependen, Independen, dan Mediasi</w:t>
-      </w:r>
-      <w:r>
-        <w:rPr>
-          <w:rFonts w:ascii="Times New Roman" w:hAnsi="Times New Roman"/>
-          <w:sz w:val="24"/>
-        </w:rPr>
-        <w:t xml:space="preserve">  . . . . . 39</w:t>
-      </w:r>
-    </w:p>
-    <w:p>
-      <w:pPr>
-        <w:spacing w:line="360" w:lineRule="auto" w:after="40"/>
-      </w:pPr>
-      <w:r>
-        <w:rPr>
-          <w:rFonts w:ascii="Times New Roman" w:hAnsi="Times New Roman"/>
-          <w:sz w:val="24"/>
-        </w:rPr>
-        <w:t>Gambar 3.6 Diagram Jalur (Path Diagram)</w:t>
-      </w:r>
-      <w:r>
-        <w:rPr>
-          <w:rFonts w:ascii="Times New Roman" w:hAnsi="Times New Roman"/>
+        <w:spacing w:after="40" w:line="360" w:lineRule="auto"/>
+      </w:pPr>
+      <w:r>
+        <w:rPr>
+          <w:sz w:val="24"/>
+        </w:rPr>
+        <w:t xml:space="preserve">Gambar 3.1 </w:t>
+      </w:r>
+      <w:r>
+        <w:rPr>
+          <w:i/>
+          <w:sz w:val="24"/>
+        </w:rPr>
+        <w:t>Outer model</w:t>
+      </w:r>
+      <w:r>
+        <w:rPr>
+          <w:sz w:val="24"/>
+        </w:rPr>
+        <w:t xml:space="preserve"> Variabel Dependen (Y)  . . . . . . . . . . . . . . . 38</w:t>
+      </w:r>
+    </w:p>
+    <w:p>
+      <w:pPr>
+        <w:spacing w:after="40" w:line="360" w:lineRule="auto"/>
+      </w:pPr>
+      <w:r>
+        <w:rPr>
+          <w:sz w:val="24"/>
+        </w:rPr>
+        <w:t xml:space="preserve">Gambar 3.2 </w:t>
+      </w:r>
+      <w:r>
+        <w:rPr>
+          <w:i/>
+          <w:sz w:val="24"/>
+        </w:rPr>
+        <w:t>Outer model</w:t>
+      </w:r>
+      <w:r>
+        <w:rPr>
+          <w:sz w:val="24"/>
+        </w:rPr>
+        <w:t xml:space="preserve"> Variabel Independen (X1)  . . . . . . . . . . . . . . 38</w:t>
+      </w:r>
+    </w:p>
+    <w:p>
+      <w:pPr>
+        <w:spacing w:after="40" w:line="360" w:lineRule="auto"/>
+      </w:pPr>
+      <w:r>
+        <w:rPr>
+          <w:sz w:val="24"/>
+        </w:rPr>
+        <w:t xml:space="preserve">Gambar 3.3 </w:t>
+      </w:r>
+      <w:r>
+        <w:rPr>
+          <w:i/>
+          <w:sz w:val="24"/>
+        </w:rPr>
+        <w:t>Outer model</w:t>
+      </w:r>
+      <w:r>
+        <w:rPr>
+          <w:sz w:val="24"/>
+        </w:rPr>
+        <w:t xml:space="preserve"> Variabel Independen (X2</w:t>
+      </w:r>
+      <w:r>
+        <w:rPr>
+          <w:sz w:val="24"/>
+        </w:rPr>
+        <w:t>)  . . . . . . . . . . . . . . 39</w:t>
+      </w:r>
+    </w:p>
+    <w:p>
+      <w:pPr>
+        <w:spacing w:after="40" w:line="360" w:lineRule="auto"/>
+      </w:pPr>
+      <w:r>
+        <w:rPr>
+          <w:sz w:val="24"/>
+        </w:rPr>
+        <w:t xml:space="preserve">Gambar 3.4 </w:t>
+      </w:r>
+      <w:r>
+        <w:rPr>
+          <w:i/>
+          <w:sz w:val="24"/>
+        </w:rPr>
+        <w:t>Outer model</w:t>
+      </w:r>
+      <w:r>
+        <w:rPr>
+          <w:sz w:val="24"/>
+        </w:rPr>
+        <w:t xml:space="preserve"> Variabel Mediasi (Z)  . . . . . . . . . . . . . . . . 39</w:t>
+      </w:r>
+    </w:p>
+    <w:p>
+      <w:pPr>
+        <w:spacing w:after="40" w:line="360" w:lineRule="auto"/>
+      </w:pPr>
+      <w:r>
+        <w:rPr>
+          <w:sz w:val="24"/>
+        </w:rPr>
+        <w:t xml:space="preserve">Gambar 3.5 </w:t>
+      </w:r>
+      <w:r>
+        <w:rPr>
+          <w:i/>
+          <w:sz w:val="24"/>
+        </w:rPr>
+        <w:t>Inner model</w:t>
+      </w:r>
+      <w:r>
+        <w:rPr>
+          <w:sz w:val="24"/>
+        </w:rPr>
+        <w:t xml:space="preserve"> Variabel Dependen, Independen, dan Mediasi  . . . . . 39</w:t>
+      </w:r>
+    </w:p>
+    <w:p>
+      <w:pPr>
+        <w:spacing w:after="40" w:line="360" w:lineRule="auto"/>
+      </w:pPr>
+      <w:r>
+        <w:rPr>
+          <w:sz w:val="24"/>
+        </w:rPr>
+        <w:t>Gambar 3.6 Diagram Jalur (</w:t>
+      </w:r>
+      <w:r>
+        <w:rPr>
+          <w:i/>
+          <w:sz w:val="24"/>
+        </w:rPr>
+        <w:t>Path diagram</w:t>
+      </w:r>
+      <w:r>
+        <w:rPr>
+          <w:sz w:val="24"/>
+        </w:rPr>
+        <w:t>)</w:t>
+      </w:r>
+      <w:r>
+        <w:rPr>
           <w:sz w:val="24"/>
         </w:rPr>
         <w:t xml:space="preserve">  . . . . . . . . . . . . . . . . . . 40</w:t>
@@ -12201,7 +12045,24 @@
                 <w:szCs w:val="24"/>
                 <w:lang w:val="en-ID" w:eastAsia="en-ID"/>
               </w:rPr>
-              <w:t>The Effect of Compensation and Work Discipline on Employee Performance Through Work Motivation (DPRD DKI Jakarta)</w:t>
+              <w:t xml:space="preserve">The Effect of Compensation and Work Discipline on Employee </w:t>
+            </w:r>
+            <w:r>
+              <w:rPr>
+                <w:i/>
+                <w:sz w:val="24"/>
+                <w:szCs w:val="24"/>
+                <w:lang w:val="en-ID" w:eastAsia="en-ID"/>
+              </w:rPr>
+              <w:t>Performance</w:t>
+            </w:r>
+            <w:r>
+              <w:rPr>
+                <w:sz w:val="24"/>
+                <w:szCs w:val="24"/>
+                <w:lang w:val="en-ID" w:eastAsia="en-ID"/>
+              </w:rPr>
+              <w:t xml:space="preserve"> Through Work Motivation (DPRD DKI Jakarta)</w:t>
             </w:r>
           </w:p>
         </w:tc>
@@ -12793,13 +12654,6 @@
               </w:rPr>
               <w:t>Pengaruh Kepuasan Kerja, Gaya Kepemimpinan, dan Komitmen Organisasi terhadap Motivasi Kerja</w:t>
             </w:r>
-            <w:r>
-              <w:rPr>
-                <w:sz w:val="24"/>
-                <w:szCs w:val="24"/>
-                <w:lang w:val="en-ID" w:eastAsia="en-ID"/>
-              </w:rPr>
-            </w:r>
           </w:p>
         </w:tc>
         <w:tc>
@@ -13091,13 +12945,6 @@
               </w:rPr>
               <w:t>Pengaruh Kompensasi dan Lingkungan Kerja terhadap Kinerja Karyawan</w:t>
             </w:r>
-            <w:r>
-              <w:rPr>
-                <w:sz w:val="24"/>
-                <w:szCs w:val="24"/>
-                <w:lang w:val="en-ID" w:eastAsia="en-ID"/>
-              </w:rPr>
-            </w:r>
           </w:p>
         </w:tc>
         <w:tc>
@@ -13389,13 +13236,6 @@
               </w:rPr>
               <w:t>Pengaruh Kompensasi terhadap Kinerja Pegawai pada Kantor Pemerintahan</w:t>
             </w:r>
-            <w:r>
-              <w:rPr>
-                <w:sz w:val="24"/>
-                <w:szCs w:val="24"/>
-                <w:lang w:val="en-ID" w:eastAsia="en-ID"/>
-              </w:rPr>
-            </w:r>
           </w:p>
         </w:tc>
         <w:tc>
@@ -13675,7 +13515,7 @@
           <w:szCs w:val="24"/>
         </w:rPr>
         <w:drawing>
-          <wp:anchor distT="0" distB="0" distL="114300" distR="114300" simplePos="0" relativeHeight="487590912" behindDoc="0" locked="0" layoutInCell="1" allowOverlap="1" wp14:anchorId="20557762" wp14:editId="5B31B4A1">
+          <wp:anchor distT="0" distB="0" distL="114300" distR="114300" simplePos="0" relativeHeight="487590912" behindDoc="0" locked="0" layoutInCell="1" allowOverlap="1" wp14:anchorId="4D020E94" wp14:editId="62F61297">
             <wp:simplePos x="0" y="0"/>
             <wp:positionH relativeFrom="column">
               <wp:posOffset>421640</wp:posOffset>
@@ -13842,22 +13682,26 @@
         <w:jc w:val="center"/>
       </w:pPr>
       <w:r>
+        <w:rPr>
+          <w:noProof/>
+        </w:rPr>
         <w:drawing>
-          <wp:inline xmlns:a="http://schemas.openxmlformats.org/drawingml/2006/main" xmlns:pic="http://schemas.openxmlformats.org/drawingml/2006/picture">
+          <wp:inline distT="0" distB="0" distL="0" distR="0" wp14:anchorId="153407FF" wp14:editId="08236CA6">
             <wp:extent cx="5029200" cy="5029200"/>
+            <wp:effectExtent l="0" t="0" r="0" b="0"/>
             <wp:docPr id="6" name="Picture 6"/>
             <wp:cNvGraphicFramePr>
-              <a:graphicFrameLocks noChangeAspect="1"/>
+              <a:graphicFrameLocks xmlns:a="http://schemas.openxmlformats.org/drawingml/2006/main" noChangeAspect="1"/>
             </wp:cNvGraphicFramePr>
-            <a:graphic>
+            <a:graphic xmlns:a="http://schemas.openxmlformats.org/drawingml/2006/main">
               <a:graphicData uri="http://schemas.openxmlformats.org/drawingml/2006/picture">
-                <pic:pic>
+                <pic:pic xmlns:pic="http://schemas.openxmlformats.org/drawingml/2006/picture">
                   <pic:nvPicPr>
                     <pic:cNvPr id="0" name="kerangka_fixed.png"/>
                     <pic:cNvPicPr/>
                   </pic:nvPicPr>
                   <pic:blipFill>
-                    <a:blip r:embed="rId14"/>
+                    <a:blip r:embed="rId10"/>
                     <a:stretch>
                       <a:fillRect/>
                     </a:stretch>
@@ -13867,7 +13711,9 @@
                       <a:off x="0" y="0"/>
                       <a:ext cx="5029200" cy="5029200"/>
                     </a:xfrm>
-                    <a:prstGeom prst="rect"/>
+                    <a:prstGeom prst="rect">
+                      <a:avLst/>
+                    </a:prstGeom>
                   </pic:spPr>
                 </pic:pic>
               </a:graphicData>
@@ -13881,22 +13727,26 @@
         <w:jc w:val="center"/>
       </w:pPr>
       <w:r>
+        <w:rPr>
+          <w:noProof/>
+        </w:rPr>
         <w:drawing>
-          <wp:inline xmlns:a="http://schemas.openxmlformats.org/drawingml/2006/main" xmlns:pic="http://schemas.openxmlformats.org/drawingml/2006/picture">
+          <wp:inline distT="0" distB="0" distL="0" distR="0" wp14:anchorId="520BD9D2" wp14:editId="2BB02C00">
             <wp:extent cx="5029200" cy="5029200"/>
+            <wp:effectExtent l="0" t="0" r="0" b="0"/>
             <wp:docPr id="7" name="Picture 7"/>
             <wp:cNvGraphicFramePr>
-              <a:graphicFrameLocks noChangeAspect="1"/>
+              <a:graphicFrameLocks xmlns:a="http://schemas.openxmlformats.org/drawingml/2006/main" noChangeAspect="1"/>
             </wp:cNvGraphicFramePr>
-            <a:graphic>
+            <a:graphic xmlns:a="http://schemas.openxmlformats.org/drawingml/2006/main">
               <a:graphicData uri="http://schemas.openxmlformats.org/drawingml/2006/picture">
-                <pic:pic>
+                <pic:pic xmlns:pic="http://schemas.openxmlformats.org/drawingml/2006/picture">
                   <pic:nvPicPr>
                     <pic:cNvPr id="0" name="image.jpg"/>
                     <pic:cNvPicPr/>
                   </pic:nvPicPr>
                   <pic:blipFill>
-                    <a:blip r:embed="rId14"/>
+                    <a:blip r:embed="rId10"/>
                     <a:stretch>
                       <a:fillRect/>
                     </a:stretch>
@@ -13906,7 +13756,9 @@
                       <a:off x="0" y="0"/>
                       <a:ext cx="5029200" cy="5029200"/>
                     </a:xfrm>
-                    <a:prstGeom prst="rect"/>
+                    <a:prstGeom prst="rect">
+                      <a:avLst/>
+                    </a:prstGeom>
                   </pic:spPr>
                 </pic:pic>
               </a:graphicData>
@@ -22671,7 +22523,7 @@
           <w:sz w:val="24"/>
           <w:szCs w:val="24"/>
         </w:rPr>
-        <w:t>Partial Least Square</w:t>
+        <w:t>Partial Least square</w:t>
       </w:r>
       <w:r>
         <w:rPr>
@@ -22757,7 +22609,28 @@
           <w:sz w:val="24"/>
           <w:szCs w:val="24"/>
         </w:rPr>
-        <w:t>F.1.    Merancang Model Pengukuran (Outer Model)</w:t>
+        <w:t>F.1.    Merancang Model Pengukuran (</w:t>
+      </w:r>
+      <w:r>
+        <w:rPr>
+          <w:b/>
+          <w:bCs/>
+          <w:i/>
+          <w:color w:val="000000" w:themeColor="text1"/>
+          <w:sz w:val="24"/>
+          <w:szCs w:val="24"/>
+        </w:rPr>
+        <w:t>Outer model</w:t>
+      </w:r>
+      <w:r>
+        <w:rPr>
+          <w:b/>
+          <w:bCs/>
+          <w:color w:val="000000" w:themeColor="text1"/>
+          <w:sz w:val="24"/>
+          <w:szCs w:val="24"/>
+        </w:rPr>
+        <w:t>)</w:t>
       </w:r>
     </w:p>
     <w:p>
@@ -22858,7 +22731,7 @@
           <w:iCs/>
           <w:color w:val="000000" w:themeColor="text1"/>
         </w:rPr>
-        <w:t>Outer Model</w:t>
+        <w:t>Outer model</w:t>
       </w:r>
       <w:r>
         <w:rPr>
@@ -22885,7 +22758,24 @@
           <w:bCs/>
           <w:color w:val="000000" w:themeColor="text1"/>
         </w:rPr>
-        <w:t>[GAMBAR OUTER MODEL Y DISINI]</w:t>
+        <w:t xml:space="preserve">[GAMBAR </w:t>
+      </w:r>
+      <w:r>
+        <w:rPr>
+          <w:b/>
+          <w:bCs/>
+          <w:i/>
+          <w:color w:val="000000" w:themeColor="text1"/>
+        </w:rPr>
+        <w:t>OUTER MODEL</w:t>
+      </w:r>
+      <w:r>
+        <w:rPr>
+          <w:b/>
+          <w:bCs/>
+          <w:color w:val="000000" w:themeColor="text1"/>
+        </w:rPr>
+        <w:t xml:space="preserve"> Y DISINI]</w:t>
       </w:r>
     </w:p>
     <w:p>
@@ -22936,7 +22826,17 @@
           <w:sz w:val="22"/>
           <w:szCs w:val="22"/>
         </w:rPr>
-        <w:t>Outer model variabel dependen (Y)</w:t>
+        <w:t>Outer model</w:t>
+      </w:r>
+      <w:r>
+        <w:rPr>
+          <w:i/>
+          <w:iCs/>
+          <w:color w:val="000000" w:themeColor="text1"/>
+          <w:sz w:val="22"/>
+          <w:szCs w:val="22"/>
+        </w:rPr>
+        <w:t xml:space="preserve"> variabel dependen (Y)</w:t>
       </w:r>
       <w:r>
         <w:rPr>
@@ -22979,7 +22879,7 @@
           <w:iCs/>
           <w:color w:val="000000" w:themeColor="text1"/>
         </w:rPr>
-        <w:t>Outer Model</w:t>
+        <w:t>Outer model</w:t>
       </w:r>
       <w:r>
         <w:rPr>
@@ -23006,7 +22906,24 @@
           <w:bCs/>
           <w:color w:val="000000" w:themeColor="text1"/>
         </w:rPr>
-        <w:t>[GAMBAR OUTER MODEL X1 DISINI]</w:t>
+        <w:t xml:space="preserve">[GAMBAR </w:t>
+      </w:r>
+      <w:r>
+        <w:rPr>
+          <w:b/>
+          <w:bCs/>
+          <w:i/>
+          <w:color w:val="000000" w:themeColor="text1"/>
+        </w:rPr>
+        <w:t>OUTER MODEL</w:t>
+      </w:r>
+      <w:r>
+        <w:rPr>
+          <w:b/>
+          <w:bCs/>
+          <w:color w:val="000000" w:themeColor="text1"/>
+        </w:rPr>
+        <w:t xml:space="preserve"> X1 DISINI]</w:t>
       </w:r>
       <w:r>
         <w:rPr>
@@ -23085,7 +23002,20 @@
         <w:rPr>
           <w:color w:val="000000" w:themeColor="text1"/>
         </w:rPr>
-        <w:t>F.1.c.    Outer Model Variabel Independen (X2)</w:t>
+        <w:t>F.1.c.    </w:t>
+      </w:r>
+      <w:r>
+        <w:rPr>
+          <w:i/>
+          <w:color w:val="000000" w:themeColor="text1"/>
+        </w:rPr>
+        <w:t>Outer model</w:t>
+      </w:r>
+      <w:r>
+        <w:rPr>
+          <w:color w:val="000000" w:themeColor="text1"/>
+        </w:rPr>
+        <w:t xml:space="preserve"> Variabel Independen (X2)</w:t>
       </w:r>
     </w:p>
     <w:p>
@@ -23106,7 +23036,24 @@
           <w:bCs/>
           <w:color w:val="000000" w:themeColor="text1"/>
         </w:rPr>
-        <w:t>[GAMBAR OUTER MODEL X2 DISINI]</w:t>
+        <w:t xml:space="preserve">[GAMBAR </w:t>
+      </w:r>
+      <w:r>
+        <w:rPr>
+          <w:b/>
+          <w:bCs/>
+          <w:i/>
+          <w:color w:val="000000" w:themeColor="text1"/>
+        </w:rPr>
+        <w:t>OUTER MODEL</w:t>
+      </w:r>
+      <w:r>
+        <w:rPr>
+          <w:b/>
+          <w:bCs/>
+          <w:color w:val="000000" w:themeColor="text1"/>
+        </w:rPr>
+        <w:t xml:space="preserve"> X2 DISINI]</w:t>
       </w:r>
       <w:r>
         <w:rPr>
@@ -23167,7 +23114,20 @@
         <w:rPr>
           <w:color w:val="000000" w:themeColor="text1"/>
         </w:rPr>
-        <w:t xml:space="preserve">F.1.d.    Outer Model Variabel </w:t>
+        <w:t>F.1.d.    </w:t>
+      </w:r>
+      <w:r>
+        <w:rPr>
+          <w:i/>
+          <w:color w:val="000000" w:themeColor="text1"/>
+        </w:rPr>
+        <w:t>Outer model</w:t>
+      </w:r>
+      <w:r>
+        <w:rPr>
+          <w:color w:val="000000" w:themeColor="text1"/>
+        </w:rPr>
+        <w:t xml:space="preserve"> Variabel </w:t>
       </w:r>
       <w:r>
         <w:rPr>
@@ -23194,7 +23154,24 @@
           <w:bCs/>
           <w:color w:val="000000" w:themeColor="text1"/>
         </w:rPr>
-        <w:t>[GAMBAR OUTER MODEL Z DISINI]</w:t>
+        <w:t xml:space="preserve">[GAMBAR </w:t>
+      </w:r>
+      <w:r>
+        <w:rPr>
+          <w:b/>
+          <w:bCs/>
+          <w:i/>
+          <w:color w:val="000000" w:themeColor="text1"/>
+        </w:rPr>
+        <w:t>OUTER MODEL</w:t>
+      </w:r>
+      <w:r>
+        <w:rPr>
+          <w:b/>
+          <w:bCs/>
+          <w:color w:val="000000" w:themeColor="text1"/>
+        </w:rPr>
+        <w:t xml:space="preserve"> Z DISINI]</w:t>
       </w:r>
       <w:r>
         <w:rPr>
@@ -23292,7 +23269,7 @@
           <w:sz w:val="24"/>
           <w:szCs w:val="24"/>
         </w:rPr>
-        <w:t>Inner Model</w:t>
+        <w:t>Inner model</w:t>
       </w:r>
       <w:r>
         <w:rPr>
@@ -23435,7 +23412,24 @@
           <w:bCs/>
           <w:color w:val="000000" w:themeColor="text1"/>
         </w:rPr>
-        <w:t>[GAMBAR INNER MODEL DISINI]</w:t>
+        <w:t xml:space="preserve">[GAMBAR </w:t>
+      </w:r>
+      <w:r>
+        <w:rPr>
+          <w:b/>
+          <w:bCs/>
+          <w:i/>
+          <w:color w:val="000000" w:themeColor="text1"/>
+        </w:rPr>
+        <w:t>INNER MODEL</w:t>
+      </w:r>
+      <w:r>
+        <w:rPr>
+          <w:b/>
+          <w:bCs/>
+          <w:color w:val="000000" w:themeColor="text1"/>
+        </w:rPr>
+        <w:t xml:space="preserve"> DISINI]</w:t>
       </w:r>
       <w:r>
         <w:rPr>
@@ -23582,7 +23576,7 @@
           <w:iCs/>
           <w:color w:val="000000" w:themeColor="text1"/>
         </w:rPr>
-        <w:t>Path Diagram</w:t>
+        <w:t>Path diagram</w:t>
       </w:r>
       <w:r>
         <w:rPr>
@@ -24119,15 +24113,7 @@
           <w:sz w:val="24"/>
           <w:szCs w:val="24"/>
         </w:rPr>
-        <w:t>cronbach alpha, composite realibity</w:t>
-      </w:r>
-      <w:r>
-        <w:rPr>
-          <w:color w:val="000000" w:themeColor="text1"/>
-          <w:sz w:val="24"/>
-          <w:szCs w:val="24"/>
-        </w:rPr>
-        <w:t>), validitas konvergen (</w:t>
+        <w:t>cronbach alpha</w:t>
       </w:r>
       <w:r>
         <w:rPr>
@@ -24137,7 +24123,35 @@
           <w:sz w:val="24"/>
           <w:szCs w:val="24"/>
         </w:rPr>
-        <w:t>outer loading, average variance extracted</w:t>
+        <w:t>, composite realibity</w:t>
+      </w:r>
+      <w:r>
+        <w:rPr>
+          <w:color w:val="000000" w:themeColor="text1"/>
+          <w:sz w:val="24"/>
+          <w:szCs w:val="24"/>
+        </w:rPr>
+        <w:t>), validitas konvergen (</w:t>
+      </w:r>
+      <w:r>
+        <w:rPr>
+          <w:i/>
+          <w:iCs/>
+          <w:color w:val="000000" w:themeColor="text1"/>
+          <w:sz w:val="24"/>
+          <w:szCs w:val="24"/>
+        </w:rPr>
+        <w:t xml:space="preserve">outer loading, </w:t>
+      </w:r>
+      <w:r>
+        <w:rPr>
+          <w:i/>
+          <w:iCs/>
+          <w:color w:val="000000" w:themeColor="text1"/>
+          <w:sz w:val="24"/>
+          <w:szCs w:val="24"/>
+        </w:rPr>
+        <w:t>average variance extracted</w:t>
       </w:r>
       <w:r>
         <w:rPr>
@@ -24577,7 +24591,7 @@
           <w:iCs/>
           <w:color w:val="000000" w:themeColor="text1"/>
         </w:rPr>
-        <w:t>Cronbach's Alpha</w:t>
+        <w:t>Cronbach’s Alpha</w:t>
       </w:r>
       <w:r>
         <w:rPr>
@@ -24591,7 +24605,7 @@
           <w:iCs/>
           <w:color w:val="000000" w:themeColor="text1"/>
         </w:rPr>
-        <w:t>Composite Reliability</w:t>
+        <w:t>Composite reliability</w:t>
       </w:r>
       <w:r>
         <w:rPr>
@@ -24605,7 +24619,7 @@
           <w:iCs/>
           <w:color w:val="000000" w:themeColor="text1"/>
         </w:rPr>
-        <w:t>Rule of Thumb</w:t>
+        <w:t>Rule of thumb</w:t>
       </w:r>
       <w:r>
         <w:rPr>
@@ -24619,7 +24633,7 @@
           <w:iCs/>
           <w:color w:val="000000" w:themeColor="text1"/>
         </w:rPr>
-        <w:t>Composite Reliability</w:t>
+        <w:t>Composite reliability</w:t>
       </w:r>
       <w:r>
         <w:rPr>
@@ -24675,7 +24689,7 @@
           <w:iCs/>
           <w:color w:val="000000" w:themeColor="text1"/>
         </w:rPr>
-        <w:t>Rule of Thumb</w:t>
+        <w:t>Rule of thumb</w:t>
       </w:r>
       <w:r>
         <w:rPr>
@@ -24718,7 +24732,15 @@
           <w:iCs/>
           <w:color w:val="000000" w:themeColor="text1"/>
         </w:rPr>
-        <w:t>Rule of Thumb Evaluasi Model Pengukuran</w:t>
+        <w:t>Rule of thumb</w:t>
+      </w:r>
+      <w:r>
+        <w:rPr>
+          <w:i/>
+          <w:iCs/>
+          <w:color w:val="000000" w:themeColor="text1"/>
+        </w:rPr>
+        <w:t xml:space="preserve"> Evaluasi Model Pengukuran</w:t>
       </w:r>
     </w:p>
     <w:tbl>
@@ -24865,7 +24887,7 @@
                 <w:sz w:val="24"/>
                 <w:szCs w:val="24"/>
               </w:rPr>
-              <w:t>Rule of Thumb</w:t>
+              <w:t>Rule of thumb</w:t>
             </w:r>
           </w:p>
         </w:tc>
@@ -24947,7 +24969,7 @@
                 <w:sz w:val="24"/>
                 <w:szCs w:val="24"/>
               </w:rPr>
-              <w:t>Loading Factor</w:t>
+              <w:t>Loading factor</w:t>
             </w:r>
           </w:p>
         </w:tc>
@@ -24995,7 +25017,7 @@
                 <w:sz w:val="24"/>
                 <w:szCs w:val="24"/>
               </w:rPr>
-              <w:t>Confirmatory Research</w:t>
+              <w:t>Confirmatory research</w:t>
             </w:r>
           </w:p>
         </w:tc>
@@ -25165,7 +25187,17 @@
                 <w:sz w:val="24"/>
                 <w:szCs w:val="24"/>
               </w:rPr>
-              <w:t>Average Variance Extracted (AVE)</w:t>
+              <w:t>Average variance extracted</w:t>
+            </w:r>
+            <w:r>
+              <w:rPr>
+                <w:i/>
+                <w:iCs/>
+                <w:color w:val="000000" w:themeColor="text1"/>
+                <w:sz w:val="24"/>
+                <w:szCs w:val="24"/>
+              </w:rPr>
+              <w:t xml:space="preserve"> (AVE)</w:t>
             </w:r>
             <w:r>
               <w:rPr>
@@ -25249,7 +25281,7 @@
                 <w:sz w:val="24"/>
                 <w:szCs w:val="24"/>
               </w:rPr>
-              <w:t>Exploratory Research</w:t>
+              <w:t>Exploratory research</w:t>
             </w:r>
           </w:p>
         </w:tc>
@@ -25330,7 +25362,7 @@
                 <w:sz w:val="24"/>
                 <w:szCs w:val="24"/>
               </w:rPr>
-              <w:t>Cross Loading</w:t>
+              <w:t>Cross loading</w:t>
             </w:r>
           </w:p>
         </w:tc>
@@ -25540,7 +25572,17 @@
                 <w:sz w:val="24"/>
                 <w:szCs w:val="24"/>
               </w:rPr>
-              <w:t>Heterotrair-monotrait Ratio (HTMT)</w:t>
+              <w:t>Heterotrair-monotrait</w:t>
+            </w:r>
+            <w:r>
+              <w:rPr>
+                <w:i/>
+                <w:iCs/>
+                <w:color w:val="000000" w:themeColor="text1"/>
+                <w:sz w:val="24"/>
+                <w:szCs w:val="24"/>
+              </w:rPr>
+              <w:t xml:space="preserve"> Ratio (HTMT)</w:t>
             </w:r>
           </w:p>
         </w:tc>
@@ -25660,7 +25702,7 @@
                 <w:sz w:val="24"/>
                 <w:szCs w:val="24"/>
               </w:rPr>
-              <w:t>Cronbach's Alpha</w:t>
+              <w:t>Cronbach’s Alpha</w:t>
             </w:r>
           </w:p>
         </w:tc>
@@ -25708,7 +25750,7 @@
                 <w:sz w:val="24"/>
                 <w:szCs w:val="24"/>
               </w:rPr>
-              <w:t>Confirmatory Research</w:t>
+              <w:t>Confirmatory research</w:t>
             </w:r>
           </w:p>
         </w:tc>
@@ -25810,7 +25852,7 @@
                 <w:sz w:val="24"/>
                 <w:szCs w:val="24"/>
               </w:rPr>
-              <w:t>Exploratory Research</w:t>
+              <w:t>Exploratory research</w:t>
             </w:r>
           </w:p>
         </w:tc>
@@ -25879,7 +25921,7 @@
                 <w:sz w:val="24"/>
                 <w:szCs w:val="24"/>
               </w:rPr>
-              <w:t>Composite Reliability</w:t>
+              <w:t>Composite reliability</w:t>
             </w:r>
           </w:p>
         </w:tc>
@@ -25927,7 +25969,7 @@
                 <w:sz w:val="24"/>
                 <w:szCs w:val="24"/>
               </w:rPr>
-              <w:t>Confirmatory Research</w:t>
+              <w:t>Confirmatory research</w:t>
             </w:r>
           </w:p>
         </w:tc>
@@ -26029,7 +26071,7 @@
                 <w:sz w:val="24"/>
                 <w:szCs w:val="24"/>
               </w:rPr>
-              <w:t>Exploratory Research</w:t>
+              <w:t>Exploratory research</w:t>
             </w:r>
           </w:p>
         </w:tc>
@@ -26345,7 +26387,24 @@
           <w:sz w:val="24"/>
           <w:szCs w:val="24"/>
         </w:rPr>
-        <w:t xml:space="preserve">Ghozali (2021:74) menambahkan, disamping melihat besarnya R-Square, evaluasi model PLS dapat juga dilakukan dengan Q² Predictive relevance atau sering disebut </w:t>
+        <w:t xml:space="preserve">Ghozali (2021:74) menambahkan, disamping melihat besarnya R-Square, evaluasi model PLS dapat juga dilakukan dengan Q² </w:t>
+      </w:r>
+      <w:r>
+        <w:rPr>
+          <w:i/>
+          <w:color w:val="000000" w:themeColor="text1"/>
+          <w:sz w:val="24"/>
+          <w:szCs w:val="24"/>
+        </w:rPr>
+        <w:t>Predictive relevance</w:t>
+      </w:r>
+      <w:r>
+        <w:rPr>
+          <w:color w:val="000000" w:themeColor="text1"/>
+          <w:sz w:val="24"/>
+          <w:szCs w:val="24"/>
+        </w:rPr>
+        <w:t xml:space="preserve"> atau sering disebut </w:t>
       </w:r>
       <w:r>
         <w:rPr>
@@ -26546,7 +26605,15 @@
           <w:iCs/>
           <w:color w:val="000000" w:themeColor="text1"/>
         </w:rPr>
-        <w:t>Rule of Thumb Evaluasi Model Struktural</w:t>
+        <w:t>Rule of thumb</w:t>
+      </w:r>
+      <w:r>
+        <w:rPr>
+          <w:i/>
+          <w:iCs/>
+          <w:color w:val="000000" w:themeColor="text1"/>
+        </w:rPr>
+        <w:t xml:space="preserve"> Evaluasi Model Struktural</w:t>
       </w:r>
     </w:p>
     <w:tbl>
@@ -26780,7 +26847,17 @@
                 <w:sz w:val="24"/>
                 <w:szCs w:val="24"/>
               </w:rPr>
-              <w:t>Effect size f²</w:t>
+              <w:t>Effect size</w:t>
+            </w:r>
+            <w:r>
+              <w:rPr>
+                <w:i/>
+                <w:iCs/>
+                <w:color w:val="000000" w:themeColor="text1"/>
+                <w:sz w:val="24"/>
+                <w:szCs w:val="24"/>
+              </w:rPr>
+              <w:t xml:space="preserve"> f²</w:t>
             </w:r>
           </w:p>
         </w:tc>
@@ -26860,7 +26937,17 @@
                 <w:sz w:val="24"/>
                 <w:szCs w:val="24"/>
               </w:rPr>
-              <w:t>Q² predictive relevance</w:t>
+              <w:t xml:space="preserve">Q² </w:t>
+            </w:r>
+            <w:r>
+              <w:rPr>
+                <w:i/>
+                <w:iCs/>
+                <w:color w:val="000000" w:themeColor="text1"/>
+                <w:sz w:val="24"/>
+                <w:szCs w:val="24"/>
+              </w:rPr>
+              <w:t>predictive relevance</w:t>
             </w:r>
           </w:p>
         </w:tc>
@@ -26976,7 +27063,17 @@
                 <w:sz w:val="24"/>
                 <w:szCs w:val="24"/>
               </w:rPr>
-              <w:t>q² predictive relevance</w:t>
+              <w:t xml:space="preserve">q² </w:t>
+            </w:r>
+            <w:r>
+              <w:rPr>
+                <w:i/>
+                <w:iCs/>
+                <w:color w:val="000000" w:themeColor="text1"/>
+                <w:sz w:val="24"/>
+                <w:szCs w:val="24"/>
+              </w:rPr>
+              <w:t>predictive relevance</w:t>
             </w:r>
           </w:p>
         </w:tc>
@@ -27222,7 +27319,6 @@
       </w:pPr>
       <w:r>
         <w:rPr>
-          <w:rFonts w:ascii="Times New Roman" w:hAnsi="Times New Roman"/>
           <w:b/>
           <w:sz w:val="24"/>
         </w:rPr>
@@ -27231,38 +27327,47 @@
     </w:p>
     <w:p>
       <w:pPr>
-        <w:spacing w:line="360" w:lineRule="auto" w:after="120"/>
+        <w:spacing w:after="120" w:line="360" w:lineRule="auto"/>
         <w:ind w:left="720" w:hanging="720"/>
       </w:pPr>
       <w:r>
         <w:rPr>
-          <w:rFonts w:ascii="Times New Roman" w:hAnsi="Times New Roman"/>
-          <w:sz w:val="24"/>
-        </w:rPr>
-        <w:t>Agustin, D. S. (2020). Analisis Pengaruh Budaya Organisasi, Gaya Kepemimpinan terhadap Kinerja Karyawan UMKM dengan Motivasi Kerja sebagai Variabel Mediasi. Jurnal Ilmu Manajemen, 8(3), 789–800.</w:t>
-      </w:r>
-    </w:p>
-    <w:p>
-      <w:pPr>
-        <w:spacing w:line="360" w:lineRule="auto" w:after="120"/>
+          <w:sz w:val="24"/>
+        </w:rPr>
+        <w:t xml:space="preserve">Agustin, D. S. (2020). Analisis Pengaruh Budaya Organisasi, Gaya Kepemimpinan terhadap Kinerja Karyawan </w:t>
+      </w:r>
+      <w:r>
+        <w:rPr>
+          <w:sz w:val="24"/>
+        </w:rPr>
+        <w:t>UMKM dengan Motivasi Kerja sebagai Variabel Mediasi. Jurnal Ilmu Manajemen, 8(3), 789–800.</w:t>
+      </w:r>
+    </w:p>
+    <w:p>
+      <w:pPr>
+        <w:spacing w:after="120" w:line="360" w:lineRule="auto"/>
         <w:ind w:left="720" w:hanging="720"/>
       </w:pPr>
       <w:r>
         <w:rPr>
-          <w:rFonts w:ascii="Times New Roman" w:hAnsi="Times New Roman"/>
-          <w:sz w:val="24"/>
-        </w:rPr>
-        <w:t>Amin, A. R. A. (2024). Pengaruh Kompetensi dan Gaya Kepemimpinan Terhadap Kinerja Perangkat Desa di Kecamatan Rambang dengan Motivasi Sebagai Variabel Mediasi (Tesis Magister, Universitas Sriwijaya).</w:t>
-      </w:r>
-    </w:p>
-    <w:p>
-      <w:pPr>
-        <w:spacing w:line="360" w:lineRule="auto" w:after="120"/>
+          <w:sz w:val="24"/>
+        </w:rPr>
+        <w:t>Amin, A. R. A. (2024). Pengaruh Kompetensi dan Gaya Kepemimpinan Terhadap Kinerja Perangkat Desa di Kecamatan Rambang dengan Motivasi Sebagai Variabel Mediasi (Tesis</w:t>
+      </w:r>
+      <w:r>
+        <w:rPr>
+          <w:sz w:val="24"/>
+        </w:rPr>
+        <w:t xml:space="preserve"> Magister, Universitas Sriwijaya).</w:t>
+      </w:r>
+    </w:p>
+    <w:p>
+      <w:pPr>
+        <w:spacing w:after="120" w:line="360" w:lineRule="auto"/>
         <w:ind w:left="720" w:hanging="720"/>
       </w:pPr>
       <w:r>
         <w:rPr>
-          <w:rFonts w:ascii="Times New Roman" w:hAnsi="Times New Roman"/>
           <w:sz w:val="24"/>
         </w:rPr>
         <w:t>Arrasyd, H. M., dkk. (2024). Pengaruh Gaya Kepemimpinan Dan Lingkungan Kerja Terhadap Kinerja Perangkat Desa Dengan Motivasi Kerja Sebagai Variabel Mediasi. Jurnal Manajemen &amp; Kewirausahaan, 12(1), 45–56.</w:t>
@@ -27270,142 +27375,277 @@
     </w:p>
     <w:p>
       <w:pPr>
-        <w:spacing w:line="360" w:lineRule="auto" w:after="120"/>
+        <w:spacing w:after="120" w:line="360" w:lineRule="auto"/>
         <w:ind w:left="720" w:hanging="720"/>
       </w:pPr>
       <w:r>
         <w:rPr>
-          <w:rFonts w:ascii="Times New Roman" w:hAnsi="Times New Roman"/>
-          <w:sz w:val="24"/>
-        </w:rPr>
-        <w:t>Atmojo, A. A. (2022). Pengaruh Gaya Kepemimpinan, Kompensasi Terhadap Kinerja Dengan Motivasi Kerja Sebagai Variabel Mediasi Pada PDAM Kabupaten Kediri. Jurnal Penelitian Ekonomi dan Bisnis, 7(2), 112–125.</w:t>
-      </w:r>
-    </w:p>
-    <w:p>
-      <w:pPr>
-        <w:spacing w:line="360" w:lineRule="auto" w:after="120"/>
+          <w:sz w:val="24"/>
+        </w:rPr>
+        <w:t xml:space="preserve">Atmojo, A. A. </w:t>
+      </w:r>
+      <w:r>
+        <w:rPr>
+          <w:sz w:val="24"/>
+        </w:rPr>
+        <w:t>(2022). Pengaruh Gaya Kepemimpinan, Kompensasi Terhadap Kinerja Dengan Motivasi Kerja Sebagai Variabel Mediasi Pada PDAM Kabupaten Kediri. Jurnal Penelitian Ekonomi dan Bisnis, 7(2), 112–125.</w:t>
+      </w:r>
+    </w:p>
+    <w:p>
+      <w:pPr>
+        <w:spacing w:after="120" w:line="360" w:lineRule="auto"/>
         <w:ind w:left="720" w:hanging="720"/>
       </w:pPr>
       <w:r>
         <w:rPr>
-          <w:rFonts w:ascii="Times New Roman" w:hAnsi="Times New Roman"/>
-          <w:sz w:val="24"/>
-        </w:rPr>
-        <w:t>Bahits, A., dkk. (2023). Manajemen Sumber Daya Manusia dalam Organisasi Modern. Bandung: Widina Bhakti Persada.</w:t>
-      </w:r>
-    </w:p>
-    <w:p>
-      <w:pPr>
-        <w:spacing w:line="360" w:lineRule="auto" w:after="120"/>
+          <w:sz w:val="24"/>
+        </w:rPr>
+        <w:t>Bahits, A., dkk. (2023). Manajemen Sumber Daya Manusia dalam Org</w:t>
+      </w:r>
+      <w:r>
+        <w:rPr>
+          <w:sz w:val="24"/>
+        </w:rPr>
+        <w:t>anisasi Modern. Bandung: Widina Bhakti Persada.</w:t>
+      </w:r>
+    </w:p>
+    <w:p>
+      <w:pPr>
+        <w:spacing w:after="120" w:line="360" w:lineRule="auto"/>
         <w:ind w:left="720" w:hanging="720"/>
       </w:pPr>
       <w:r>
         <w:rPr>
-          <w:rFonts w:ascii="Times New Roman" w:hAnsi="Times New Roman"/>
-          <w:sz w:val="24"/>
-        </w:rPr>
-        <w:t>Butarbutar, B., &amp; Nawangsari, L. C. (2022). The Effect of Compensation and Work Discipline on Employee Performance Through Work Motivation (DPRD DKI Jakarta). International Journal of Social and Management Studies, 3(4), 88–98.</w:t>
-      </w:r>
-    </w:p>
-    <w:p>
-      <w:pPr>
-        <w:spacing w:line="360" w:lineRule="auto" w:after="120"/>
+          <w:sz w:val="24"/>
+        </w:rPr>
+        <w:t xml:space="preserve">Butarbutar, B., &amp; Nawangsari, L. C. (2022). The Effect of Compensation and Work Discipline on Employee </w:t>
+      </w:r>
+      <w:r>
+        <w:rPr>
+          <w:i/>
+          <w:sz w:val="24"/>
+        </w:rPr>
+        <w:t>Performance</w:t>
+      </w:r>
+      <w:r>
+        <w:rPr>
+          <w:sz w:val="24"/>
+        </w:rPr>
+        <w:t xml:space="preserve"> Through Work Motivation (DPRD DKI Jakarta). International Journal of Social and Management St</w:t>
+      </w:r>
+      <w:r>
+        <w:rPr>
+          <w:sz w:val="24"/>
+        </w:rPr>
+        <w:t>udies, 3(4), 88–98.</w:t>
+      </w:r>
+    </w:p>
+    <w:p>
+      <w:pPr>
+        <w:spacing w:after="120" w:line="360" w:lineRule="auto"/>
         <w:ind w:left="720" w:hanging="720"/>
       </w:pPr>
       <w:r>
         <w:rPr>
-          <w:rFonts w:ascii="Times New Roman" w:hAnsi="Times New Roman"/>
-          <w:sz w:val="24"/>
-        </w:rPr>
-        <w:t>Chin, W. W. (1998). The Partial Least Squares Approach to Structural Equation Modeling. Modern Methods for Business Research, 295(2), 295–336.</w:t>
-      </w:r>
-    </w:p>
-    <w:p>
-      <w:pPr>
-        <w:spacing w:line="360" w:lineRule="auto" w:after="120"/>
+          <w:sz w:val="24"/>
+        </w:rPr>
+        <w:t xml:space="preserve">Chin, W. W. (1998). The </w:t>
+      </w:r>
+      <w:r>
+        <w:rPr>
+          <w:i/>
+          <w:sz w:val="24"/>
+        </w:rPr>
+        <w:t>Partial Least squares</w:t>
+      </w:r>
+      <w:r>
+        <w:rPr>
+          <w:sz w:val="24"/>
+        </w:rPr>
+        <w:t xml:space="preserve"> Approach to </w:t>
+      </w:r>
+      <w:r>
+        <w:rPr>
+          <w:i/>
+          <w:sz w:val="24"/>
+        </w:rPr>
+        <w:t>Structural Equation Modeling</w:t>
+      </w:r>
+      <w:r>
+        <w:rPr>
+          <w:sz w:val="24"/>
+        </w:rPr>
+        <w:t>. Modern Methods for Business Research, 295(2), 295–336.</w:t>
+      </w:r>
+    </w:p>
+    <w:p>
+      <w:pPr>
+        <w:spacing w:after="120" w:line="360" w:lineRule="auto"/>
         <w:ind w:left="720" w:hanging="720"/>
       </w:pPr>
       <w:r>
         <w:rPr>
-          <w:rFonts w:ascii="Times New Roman" w:hAnsi="Times New Roman"/>
-          <w:sz w:val="24"/>
-        </w:rPr>
-        <w:t>Fikri, M., dkk. (2022). Manajemen Sumber Daya Manusia: Teori dan Praktik. Jakarta: PT RajaGrafindo Persada.</w:t>
-      </w:r>
-    </w:p>
-    <w:p>
-      <w:pPr>
-        <w:spacing w:line="360" w:lineRule="auto" w:after="120"/>
+          <w:sz w:val="24"/>
+        </w:rPr>
+        <w:t>Fikri, M., dkk. (2022). Manajemen Sumber Daya Manusia: Teori dan Praktik. Jakarta: PT RajaGra</w:t>
+      </w:r>
+      <w:r>
+        <w:rPr>
+          <w:sz w:val="24"/>
+        </w:rPr>
+        <w:t>findo Persada.</w:t>
+      </w:r>
+    </w:p>
+    <w:p>
+      <w:pPr>
+        <w:spacing w:after="120" w:line="360" w:lineRule="auto"/>
         <w:ind w:left="720" w:hanging="720"/>
       </w:pPr>
       <w:r>
         <w:rPr>
-          <w:rFonts w:ascii="Times New Roman" w:hAnsi="Times New Roman"/>
-          <w:sz w:val="24"/>
-        </w:rPr>
-        <w:t>Geisser, S. (1975). The Predictive Sample Reuse Method with Applications. Journal of the American Statistical Association, 70(350), 320–328.</w:t>
-      </w:r>
-    </w:p>
-    <w:p>
-      <w:pPr>
-        <w:spacing w:line="360" w:lineRule="auto" w:after="120"/>
+          <w:sz w:val="24"/>
+        </w:rPr>
+        <w:t xml:space="preserve">Geisser, S. (1975). The </w:t>
+      </w:r>
+      <w:r>
+        <w:rPr>
+          <w:i/>
+          <w:sz w:val="24"/>
+        </w:rPr>
+        <w:t>Predictive sample reuse</w:t>
+      </w:r>
+      <w:r>
+        <w:rPr>
+          <w:sz w:val="24"/>
+        </w:rPr>
+        <w:t xml:space="preserve"> Method with Applications. Journal of the American Statistical Association, 70(350), 320–328.</w:t>
+      </w:r>
+    </w:p>
+    <w:p>
+      <w:pPr>
+        <w:spacing w:after="120" w:line="360" w:lineRule="auto"/>
         <w:ind w:left="720" w:hanging="720"/>
       </w:pPr>
       <w:r>
         <w:rPr>
-          <w:rFonts w:ascii="Times New Roman" w:hAnsi="Times New Roman"/>
-          <w:sz w:val="24"/>
-        </w:rPr>
-        <w:t>Ghozali, I. (2021). Partial Least Squares: Konsep, Teknik dan Aplikasi Menggunakan Program SmartPLS 3.0 (Edisi 3). Semarang: Badan Penerbit Universitas Diponegoro.</w:t>
-      </w:r>
-    </w:p>
-    <w:p>
-      <w:pPr>
-        <w:spacing w:line="360" w:lineRule="auto" w:after="120"/>
+          <w:sz w:val="24"/>
+        </w:rPr>
+        <w:t xml:space="preserve">Ghozali, I. (2021). </w:t>
+      </w:r>
+      <w:r>
+        <w:rPr>
+          <w:i/>
+          <w:sz w:val="24"/>
+        </w:rPr>
+        <w:t>Partial Least squares</w:t>
+      </w:r>
+      <w:r>
+        <w:rPr>
+          <w:sz w:val="24"/>
+        </w:rPr>
+        <w:t xml:space="preserve">: Konsep, Teknik dan Aplikasi Menggunakan Program </w:t>
+      </w:r>
+      <w:r>
+        <w:rPr>
+          <w:i/>
+          <w:sz w:val="24"/>
+        </w:rPr>
+        <w:t>SmartPLS</w:t>
+      </w:r>
+      <w:r>
+        <w:rPr>
+          <w:sz w:val="24"/>
+        </w:rPr>
+        <w:t xml:space="preserve"> </w:t>
+      </w:r>
+      <w:r>
+        <w:rPr>
+          <w:sz w:val="24"/>
+        </w:rPr>
+        <w:t>3.0 (Edisi 3). Semarang: Badan Penerbit Universitas Diponegoro.</w:t>
+      </w:r>
+    </w:p>
+    <w:p>
+      <w:pPr>
+        <w:spacing w:after="120" w:line="360" w:lineRule="auto"/>
         <w:ind w:left="720" w:hanging="720"/>
       </w:pPr>
       <w:r>
         <w:rPr>
-          <w:rFonts w:ascii="Times New Roman" w:hAnsi="Times New Roman"/>
-          <w:sz w:val="24"/>
-        </w:rPr>
-        <w:t>Guntoro, Djunaedi, &amp; Utami. (2024). Pengaruh Kompensasi Terhadap Kinerja Pegawai Dengan Motivasi Kerja Sebagai Variabel Mediasi pada Dinas Koperasi Nganjuk. Jurnal Ilmiah Manajemen, 11(2), 210–222.</w:t>
-      </w:r>
-    </w:p>
-    <w:p>
-      <w:pPr>
-        <w:spacing w:line="360" w:lineRule="auto" w:after="120"/>
+          <w:sz w:val="24"/>
+        </w:rPr>
+        <w:t>Guntoro, Djunaedi, &amp; Utami. (2024). Pengaruh Kompensasi Terhadap Kinerja Pegawai Dengan Motivasi Kerja Sebagai Variabel Mediasi pada Dinas Koperasi Nganjuk. Jurnal Ilmiah Manajemen, 11(2), 210</w:t>
+      </w:r>
+      <w:r>
+        <w:rPr>
+          <w:sz w:val="24"/>
+        </w:rPr>
+        <w:t>–222.</w:t>
+      </w:r>
+    </w:p>
+    <w:p>
+      <w:pPr>
+        <w:spacing w:after="120" w:line="360" w:lineRule="auto"/>
         <w:ind w:left="720" w:hanging="720"/>
       </w:pPr>
       <w:r>
         <w:rPr>
-          <w:rFonts w:ascii="Times New Roman" w:hAnsi="Times New Roman"/>
-          <w:sz w:val="24"/>
-        </w:rPr>
-        <w:t>Hair, J. F., Hult, G. T. M., Ringle, C. M., &amp; Sarstedt, M. (2022). A Primer on Partial Least Squares Structural Equation Modeling (PLS-SEM) (3rd ed.). Thousand Oaks, CA: Sage Publications.</w:t>
-      </w:r>
-    </w:p>
-    <w:p>
-      <w:pPr>
-        <w:spacing w:line="360" w:lineRule="auto" w:after="120"/>
+          <w:sz w:val="24"/>
+        </w:rPr>
+        <w:t xml:space="preserve">Hair, J. F., Hult, G. T. M., Ringle, C. M., &amp; Sarstedt, M. (2022). A Primer on </w:t>
+      </w:r>
+      <w:r>
+        <w:rPr>
+          <w:i/>
+          <w:sz w:val="24"/>
+        </w:rPr>
+        <w:t>Partial Least squares</w:t>
+      </w:r>
+      <w:r>
+        <w:rPr>
+          <w:sz w:val="24"/>
+        </w:rPr>
+        <w:t xml:space="preserve"> </w:t>
+      </w:r>
+      <w:r>
+        <w:rPr>
+          <w:i/>
+          <w:sz w:val="24"/>
+        </w:rPr>
+        <w:t>Structural Equation Modeling</w:t>
+      </w:r>
+      <w:r>
+        <w:rPr>
+          <w:sz w:val="24"/>
+        </w:rPr>
+        <w:t xml:space="preserve"> (PLS-SEM) (3rd ed.). Thousand Oaks, CA: Sage Publications.</w:t>
+      </w:r>
+    </w:p>
+    <w:p>
+      <w:pPr>
+        <w:spacing w:after="120" w:line="360" w:lineRule="auto"/>
         <w:ind w:left="720" w:hanging="720"/>
       </w:pPr>
       <w:r>
         <w:rPr>
-          <w:rFonts w:ascii="Times New Roman" w:hAnsi="Times New Roman"/>
-          <w:sz w:val="24"/>
-        </w:rPr>
-        <w:t>Hasibuan, M. S. P. (2019). Manajemen Sumber Daya Manusia. Jakarta: PT Bumi Aksara.</w:t>
-      </w:r>
-    </w:p>
-    <w:p>
-      <w:pPr>
-        <w:spacing w:line="360" w:lineRule="auto" w:after="120"/>
+          <w:sz w:val="24"/>
+        </w:rPr>
+        <w:t>Hasibuan, M. S. P. (2019). Manajemen Sumber Daya Manusia. Jak</w:t>
+      </w:r>
+      <w:r>
+        <w:rPr>
+          <w:sz w:val="24"/>
+        </w:rPr>
+        <w:t>arta: PT Bumi Aksara.</w:t>
+      </w:r>
+    </w:p>
+    <w:p>
+      <w:pPr>
+        <w:spacing w:after="120" w:line="360" w:lineRule="auto"/>
         <w:ind w:left="720" w:hanging="720"/>
       </w:pPr>
       <w:r>
         <w:rPr>
-          <w:rFonts w:ascii="Times New Roman" w:hAnsi="Times New Roman"/>
           <w:sz w:val="24"/>
         </w:rPr>
         <w:t>Mangkunegara, A. A. A. P. (2017). Manajemen Sumber Daya Manusia Perusahaan. Bandung: PT Remaja Rosdakarya.</w:t>
@@ -27413,51 +27653,72 @@
     </w:p>
     <w:p>
       <w:pPr>
-        <w:spacing w:line="360" w:lineRule="auto" w:after="120"/>
+        <w:spacing w:after="120" w:line="360" w:lineRule="auto"/>
         <w:ind w:left="720" w:hanging="720"/>
       </w:pPr>
       <w:r>
         <w:rPr>
-          <w:rFonts w:ascii="Times New Roman" w:hAnsi="Times New Roman"/>
-          <w:sz w:val="24"/>
-        </w:rPr>
-        <w:t>Naldi, M. K., dkk. (2025). Pengaruh Kepuasan Kerja, Gaya Kepemimpinan, dan Komitmen Organisasi terhadap Motivasi Kerja. Jurnal Riset Manajemen, 6(1), 101–112.</w:t>
-      </w:r>
-    </w:p>
-    <w:p>
-      <w:pPr>
-        <w:spacing w:line="360" w:lineRule="auto" w:after="120"/>
+          <w:sz w:val="24"/>
+        </w:rPr>
+        <w:t xml:space="preserve">Naldi, M. K., dkk. (2025). Pengaruh Kepuasan Kerja, Gaya Kepemimpinan, dan Komitmen Organisasi terhadap Motivasi Kerja. Jurnal </w:t>
+      </w:r>
+      <w:r>
+        <w:rPr>
+          <w:sz w:val="24"/>
+        </w:rPr>
+        <w:t>Riset Manajemen, 6(1), 101–112.</w:t>
+      </w:r>
+    </w:p>
+    <w:p>
+      <w:pPr>
+        <w:spacing w:after="120" w:line="360" w:lineRule="auto"/>
         <w:ind w:left="720" w:hanging="720"/>
       </w:pPr>
       <w:r>
         <w:rPr>
-          <w:rFonts w:ascii="Times New Roman" w:hAnsi="Times New Roman"/>
-          <w:sz w:val="24"/>
-        </w:rPr>
-        <w:t>Noor, J. (2015). Analisis Data Penelitian Manajemen: Tren Komparasi Antara Penggunaan SPSS, SmartPLS, AMOS, dan Lisrel. Jakarta: Kencana.</w:t>
-      </w:r>
-    </w:p>
-    <w:p>
-      <w:pPr>
-        <w:spacing w:line="360" w:lineRule="auto" w:after="120"/>
+          <w:sz w:val="24"/>
+        </w:rPr>
+        <w:t xml:space="preserve">Noor, J. (2015). Analisis Data Penelitian Manajemen: Tren Komparasi Antara Penggunaan SPSS, </w:t>
+      </w:r>
+      <w:r>
+        <w:rPr>
+          <w:i/>
+          <w:sz w:val="24"/>
+        </w:rPr>
+        <w:t>SmartPLS</w:t>
+      </w:r>
+      <w:r>
+        <w:rPr>
+          <w:sz w:val="24"/>
+        </w:rPr>
+        <w:t>, AMOS, dan Lisrel. Jakarta: Kencana.</w:t>
+      </w:r>
+    </w:p>
+    <w:p>
+      <w:pPr>
+        <w:spacing w:after="120" w:line="360" w:lineRule="auto"/>
         <w:ind w:left="720" w:hanging="720"/>
       </w:pPr>
       <w:r>
         <w:rPr>
-          <w:rFonts w:ascii="Times New Roman" w:hAnsi="Times New Roman"/>
-          <w:sz w:val="24"/>
-        </w:rPr>
-        <w:t>Nurcahaya, B. S., &amp; Subkhan, M. (2025). Pengaruh Gaya Kepemimpinan dan Kompensasi terhadap Kinerja Karyawan melalui Motivasi Kerja sebagai Variabel Mediasi pada Pamella Tiga Yogyakarta. Jurnal Manajemen Bisnis, 15(1), 45–58.</w:t>
-      </w:r>
-    </w:p>
-    <w:p>
-      <w:pPr>
-        <w:spacing w:line="360" w:lineRule="auto" w:after="120"/>
+          <w:sz w:val="24"/>
+        </w:rPr>
+        <w:t>Nurcahaya, B. S., &amp; Subkhan, M. (2025). Pengaruh Gaya Kepemimpinan dan Kompensasi terh</w:t>
+      </w:r>
+      <w:r>
+        <w:rPr>
+          <w:sz w:val="24"/>
+        </w:rPr>
+        <w:t>adap Kinerja Karyawan melalui Motivasi Kerja sebagai Variabel Mediasi pada Pamella Tiga Yogyakarta. Jurnal Manajemen Bisnis, 15(1), 45–58.</w:t>
+      </w:r>
+    </w:p>
+    <w:p>
+      <w:pPr>
+        <w:spacing w:after="120" w:line="360" w:lineRule="auto"/>
         <w:ind w:left="720" w:hanging="720"/>
       </w:pPr>
       <w:r>
         <w:rPr>
-          <w:rFonts w:ascii="Times New Roman" w:hAnsi="Times New Roman"/>
           <w:sz w:val="24"/>
         </w:rPr>
         <w:t>Pranogyo, A., dkk. (2021). Kinerja dan Motivasi Pegawai. Yogyakarta: Deepublish.</w:t>
@@ -27465,51 +27726,65 @@
     </w:p>
     <w:p>
       <w:pPr>
-        <w:spacing w:line="360" w:lineRule="auto" w:after="120"/>
+        <w:spacing w:after="120" w:line="360" w:lineRule="auto"/>
         <w:ind w:left="720" w:hanging="720"/>
       </w:pPr>
       <w:r>
         <w:rPr>
-          <w:rFonts w:ascii="Times New Roman" w:hAnsi="Times New Roman"/>
-          <w:sz w:val="24"/>
-        </w:rPr>
-        <w:t>Prasetya, G. L. H., &amp; Hendarto, R. T. (2024). Pengaruh Gaya Kepemimpinan dan Kompensasi Terhadap Kinerja Karyawan Melalui Motivasi Kerja Sebagai Variable Mediasi Pada PT. Karunia Jaya Global. Jurnal Manajemen Kewirausahaan, 19(1), 34–46.</w:t>
-      </w:r>
-    </w:p>
-    <w:p>
-      <w:pPr>
-        <w:spacing w:line="360" w:lineRule="auto" w:after="120"/>
+          <w:sz w:val="24"/>
+        </w:rPr>
+        <w:t>Prasetya, G. L. H., &amp; Hendarto, R. T</w:t>
+      </w:r>
+      <w:r>
+        <w:rPr>
+          <w:sz w:val="24"/>
+        </w:rPr>
+        <w:t>. (2024). Pengaruh Gaya Kepemimpinan dan Kompensasi Terhadap Kinerja Karyawan Melalui Motivasi Kerja Sebagai Variable Mediasi Pada PT. Karunia Jaya Global. Jurnal Manajemen Kewirausahaan, 19(1), 34–46.</w:t>
+      </w:r>
+    </w:p>
+    <w:p>
+      <w:pPr>
+        <w:spacing w:after="120" w:line="360" w:lineRule="auto"/>
         <w:ind w:left="720" w:hanging="720"/>
       </w:pPr>
       <w:r>
         <w:rPr>
-          <w:rFonts w:ascii="Times New Roman" w:hAnsi="Times New Roman"/>
-          <w:sz w:val="24"/>
-        </w:rPr>
-        <w:t>Pratama, M. Y., &amp; Junaedi, D. (2025). Pengaruh Gaya Kepemimpinan dan Motivasi Kerja Terhadap Efektivitas Kinerja Perangkat Desa Kedung Rejoso Kecamatan Kotaanyar Kabupaten Probolinggo (Skripsi, Universitas Nurul Jadid).</w:t>
-      </w:r>
-    </w:p>
-    <w:p>
-      <w:pPr>
-        <w:spacing w:line="360" w:lineRule="auto" w:after="120"/>
+          <w:sz w:val="24"/>
+        </w:rPr>
+        <w:t>Pratama, M. Y., &amp; Junaedi, D. (2025). Pengaruh Gaya Ke</w:t>
+      </w:r>
+      <w:r>
+        <w:rPr>
+          <w:sz w:val="24"/>
+        </w:rPr>
+        <w:t>pemimpinan dan Motivasi Kerja Terhadap Efektivitas Kinerja Perangkat Desa Kedung Rejoso Kecamatan Kotaanyar Kabupaten Probolinggo (Skripsi, Universitas Nurul Jadid).</w:t>
+      </w:r>
+    </w:p>
+    <w:p>
+      <w:pPr>
+        <w:spacing w:after="120" w:line="360" w:lineRule="auto"/>
         <w:ind w:left="720" w:hanging="720"/>
       </w:pPr>
       <w:r>
         <w:rPr>
-          <w:rFonts w:ascii="Times New Roman" w:hAnsi="Times New Roman"/>
-          <w:sz w:val="24"/>
-        </w:rPr>
-        <w:t>Priansa, D. J. (2017). Manajemen Kepemimpinan dan Kinerja Pegawai dalam Organisasi Publik dan Bisnis. Bandung: CV Pustaka Setia.</w:t>
-      </w:r>
-    </w:p>
-    <w:p>
-      <w:pPr>
-        <w:spacing w:line="360" w:lineRule="auto" w:after="120"/>
+          <w:sz w:val="24"/>
+        </w:rPr>
+        <w:t xml:space="preserve">Priansa, D. J. (2017). Manajemen Kepemimpinan dan Kinerja Pegawai dalam Organisasi Publik </w:t>
+      </w:r>
+      <w:r>
+        <w:rPr>
+          <w:sz w:val="24"/>
+        </w:rPr>
+        <w:t>dan Bisnis. Bandung: CV Pustaka Setia.</w:t>
+      </w:r>
+    </w:p>
+    <w:p>
+      <w:pPr>
+        <w:spacing w:after="120" w:line="360" w:lineRule="auto"/>
         <w:ind w:left="720" w:hanging="720"/>
       </w:pPr>
       <w:r>
         <w:rPr>
-          <w:rFonts w:ascii="Times New Roman" w:hAnsi="Times New Roman"/>
           <w:sz w:val="24"/>
         </w:rPr>
         <w:t>Purwohedi, U. (2022). Metode Penelitian Kuantitatif untuk Manajemen dan Akuntansi. Jakarta: Rajawali Pers.</w:t>
@@ -27517,25 +27792,29 @@
     </w:p>
     <w:p>
       <w:pPr>
-        <w:spacing w:line="360" w:lineRule="auto" w:after="120"/>
+        <w:spacing w:after="120" w:line="360" w:lineRule="auto"/>
         <w:ind w:left="720" w:hanging="720"/>
       </w:pPr>
       <w:r>
         <w:rPr>
-          <w:rFonts w:ascii="Times New Roman" w:hAnsi="Times New Roman"/>
-          <w:sz w:val="24"/>
-        </w:rPr>
-        <w:t>Putri, D. R., &amp; Rozi, F. (2024). Pengaruh Kompensasi dan Lingkungan Kerja terhadap Kinerja Karyawan. Jurnal Ilmu Sumber Daya Manusia, 5(2), 140–151.</w:t>
-      </w:r>
-    </w:p>
-    <w:p>
-      <w:pPr>
-        <w:spacing w:line="360" w:lineRule="auto" w:after="120"/>
+          <w:sz w:val="24"/>
+        </w:rPr>
+        <w:t xml:space="preserve">Putri, D. R., &amp; Rozi, F. (2024). Pengaruh Kompensasi dan Lingkungan Kerja terhadap Kinerja Karyawan. </w:t>
+      </w:r>
+      <w:r>
+        <w:rPr>
+          <w:sz w:val="24"/>
+        </w:rPr>
+        <w:t>Jurnal Ilmu Sumber Daya Manusia, 5(2), 140–151.</w:t>
+      </w:r>
+    </w:p>
+    <w:p>
+      <w:pPr>
+        <w:spacing w:after="120" w:line="360" w:lineRule="auto"/>
         <w:ind w:left="720" w:hanging="720"/>
       </w:pPr>
       <w:r>
         <w:rPr>
-          <w:rFonts w:ascii="Times New Roman" w:hAnsi="Times New Roman"/>
           <w:sz w:val="24"/>
         </w:rPr>
         <w:t>Robbins, S. P., &amp; Judge, T. A. (2017). Organizational Behavior (17th ed.). Boston: Pearson.</w:t>
@@ -27543,25 +27822,29 @@
     </w:p>
     <w:p>
       <w:pPr>
-        <w:spacing w:line="360" w:lineRule="auto" w:after="120"/>
+        <w:spacing w:after="120" w:line="360" w:lineRule="auto"/>
         <w:ind w:left="720" w:hanging="720"/>
       </w:pPr>
       <w:r>
         <w:rPr>
-          <w:rFonts w:ascii="Times New Roman" w:hAnsi="Times New Roman"/>
-          <w:sz w:val="24"/>
-        </w:rPr>
-        <w:t>Satria, E., dkk. (2024). Pengaruh Kompensasi terhadap Kinerja Pegawai pada Kantor Pemerintahan. Jurnal Administrasi Publik, 10(1), 67–78.</w:t>
-      </w:r>
-    </w:p>
-    <w:p>
-      <w:pPr>
-        <w:spacing w:line="360" w:lineRule="auto" w:after="120"/>
+          <w:sz w:val="24"/>
+        </w:rPr>
+        <w:t xml:space="preserve">Satria, E., dkk. (2024). Pengaruh Kompensasi terhadap Kinerja Pegawai pada Kantor Pemerintahan. Jurnal Administrasi </w:t>
+      </w:r>
+      <w:r>
+        <w:rPr>
+          <w:sz w:val="24"/>
+        </w:rPr>
+        <w:t>Publik, 10(1), 67–78.</w:t>
+      </w:r>
+    </w:p>
+    <w:p>
+      <w:pPr>
+        <w:spacing w:after="120" w:line="360" w:lineRule="auto"/>
         <w:ind w:left="720" w:hanging="720"/>
       </w:pPr>
       <w:r>
         <w:rPr>
-          <w:rFonts w:ascii="Times New Roman" w:hAnsi="Times New Roman"/>
           <w:sz w:val="24"/>
         </w:rPr>
         <w:t>Stone, M. (1974). Cross-Validatory Choice and Assessment of Statistical Predictions. Journal of the Royal Statistical Society: Series B (Methodological), 36(2), 111–133.</w:t>
@@ -27569,25 +27852,29 @@
     </w:p>
     <w:p>
       <w:pPr>
-        <w:spacing w:line="360" w:lineRule="auto" w:after="120"/>
+        <w:spacing w:after="120" w:line="360" w:lineRule="auto"/>
         <w:ind w:left="720" w:hanging="720"/>
       </w:pPr>
       <w:r>
         <w:rPr>
-          <w:rFonts w:ascii="Times New Roman" w:hAnsi="Times New Roman"/>
-          <w:sz w:val="24"/>
-        </w:rPr>
-        <w:t>Sudaryana, A., &amp; Agusiady, R. (2021). Metodologi Penelitian Manajemen. Bandung: Deepublish.</w:t>
-      </w:r>
-    </w:p>
-    <w:p>
-      <w:pPr>
-        <w:spacing w:line="360" w:lineRule="auto" w:after="120"/>
+          <w:sz w:val="24"/>
+        </w:rPr>
+        <w:t>Sudaryana, A., &amp; Agusiady, R. (2021). Metodologi Penelitian Mana</w:t>
+      </w:r>
+      <w:r>
+        <w:rPr>
+          <w:sz w:val="24"/>
+        </w:rPr>
+        <w:t>jemen. Bandung: Deepublish.</w:t>
+      </w:r>
+    </w:p>
+    <w:p>
+      <w:pPr>
+        <w:spacing w:after="120" w:line="360" w:lineRule="auto"/>
         <w:ind w:left="720" w:hanging="720"/>
       </w:pPr>
       <w:r>
         <w:rPr>
-          <w:rFonts w:ascii="Times New Roman" w:hAnsi="Times New Roman"/>
           <w:sz w:val="24"/>
         </w:rPr>
         <w:t>Sudaryo, Y., dkk. (2018). Manajemen Sumber Daya Manusia: Kompensasi dan Visi Kepemimpinan. Yogyakarta: Andi Offset.</w:t>
@@ -27595,12 +27882,11 @@
     </w:p>
     <w:p>
       <w:pPr>
-        <w:spacing w:line="360" w:lineRule="auto" w:after="120"/>
+        <w:spacing w:after="120" w:line="360" w:lineRule="auto"/>
         <w:ind w:left="720" w:hanging="720"/>
       </w:pPr>
       <w:r>
         <w:rPr>
-          <w:rFonts w:ascii="Times New Roman" w:hAnsi="Times New Roman"/>
           <w:sz w:val="24"/>
         </w:rPr>
         <w:t>Sugiyono. (2023). Metode Penelitian Kuantitatif, Kualitatif, dan R&amp;D. Bandung: Alfabeta.</w:t>
@@ -27608,25 +27894,29 @@
     </w:p>
     <w:p>
       <w:pPr>
-        <w:spacing w:line="360" w:lineRule="auto" w:after="120"/>
+        <w:spacing w:after="120" w:line="360" w:lineRule="auto"/>
         <w:ind w:left="720" w:hanging="720"/>
       </w:pPr>
       <w:r>
         <w:rPr>
-          <w:rFonts w:ascii="Times New Roman" w:hAnsi="Times New Roman"/>
-          <w:sz w:val="24"/>
-        </w:rPr>
-        <w:t>Sujarweni, V. W. (2020). Metodologi Penelitian: Lengkap, Praktis, dan Mudah Dipahami. Yogyakarta: Pustaka Baru Press.</w:t>
-      </w:r>
-    </w:p>
-    <w:p>
-      <w:pPr>
-        <w:spacing w:line="360" w:lineRule="auto" w:after="120"/>
+          <w:sz w:val="24"/>
+        </w:rPr>
+        <w:t>Sujarweni, V. W. (2020)</w:t>
+      </w:r>
+      <w:r>
+        <w:rPr>
+          <w:sz w:val="24"/>
+        </w:rPr>
+        <w:t>. Metodologi Penelitian: Lengkap, Praktis, dan Mudah Dipahami. Yogyakarta: Pustaka Baru Press.</w:t>
+      </w:r>
+    </w:p>
+    <w:p>
+      <w:pPr>
+        <w:spacing w:after="120" w:line="360" w:lineRule="auto"/>
         <w:ind w:left="720" w:hanging="720"/>
       </w:pPr>
       <w:r>
         <w:rPr>
-          <w:rFonts w:ascii="Times New Roman" w:hAnsi="Times New Roman"/>
           <w:sz w:val="24"/>
         </w:rPr>
         <w:t>Sujarweni, V. W. (2022). Analisis Data Penelitian Manajemen dan Ekonomi. Yogyakarta: Pustaka Baru Press.</w:t>
@@ -27634,25 +27924,29 @@
     </w:p>
     <w:p>
       <w:pPr>
-        <w:spacing w:line="360" w:lineRule="auto" w:after="120"/>
+        <w:spacing w:after="120" w:line="360" w:lineRule="auto"/>
         <w:ind w:left="720" w:hanging="720"/>
       </w:pPr>
       <w:r>
         <w:rPr>
-          <w:rFonts w:ascii="Times New Roman" w:hAnsi="Times New Roman"/>
-          <w:sz w:val="24"/>
-        </w:rPr>
-        <w:t>Syahza, A. (2021). Metodologi Penelitian Edisi Revisi. Pekanbaru: Unri Press.</w:t>
-      </w:r>
-    </w:p>
-    <w:p>
-      <w:pPr>
-        <w:spacing w:line="360" w:lineRule="auto" w:after="120"/>
+          <w:sz w:val="24"/>
+        </w:rPr>
+        <w:t>Syahza, A. (2021). Metodologi Penelitian Edisi Revisi. P</w:t>
+      </w:r>
+      <w:r>
+        <w:rPr>
+          <w:sz w:val="24"/>
+        </w:rPr>
+        <w:t>ekanbaru: Unri Press.</w:t>
+      </w:r>
+    </w:p>
+    <w:p>
+      <w:pPr>
+        <w:spacing w:after="120" w:line="360" w:lineRule="auto"/>
         <w:ind w:left="720" w:hanging="720"/>
       </w:pPr>
       <w:r>
         <w:rPr>
-          <w:rFonts w:ascii="Times New Roman" w:hAnsi="Times New Roman"/>
           <w:sz w:val="24"/>
         </w:rPr>
         <w:t>Thoha, M. (2018). Kepemimpinan dalam Manajemen. Jakarta: PT RajaGrafindo Persada.</w:t>
@@ -27660,46 +27954,55 @@
     </w:p>
     <w:p>
       <w:pPr>
-        <w:spacing w:line="360" w:lineRule="auto" w:after="120"/>
+        <w:spacing w:after="120" w:line="360" w:lineRule="auto"/>
         <w:ind w:left="720" w:hanging="720"/>
       </w:pPr>
       <w:r>
         <w:rPr>
-          <w:rFonts w:ascii="Times New Roman" w:hAnsi="Times New Roman"/>
-          <w:sz w:val="24"/>
-        </w:rPr>
-        <w:t>Ulfah, R. A., Subiyanto, D., &amp; Kurniawan, I. S. (2020). Peran Mediasi Motivasi Kerja Pada Pengaruh Gaya Kepemimpinan Transaksional Dan Kompensasi Terhadap Kinerja Karyawan. Jurnal Kinerja, 17(2), 180–192.</w:t>
-      </w:r>
-    </w:p>
-    <w:p>
-      <w:pPr>
-        <w:spacing w:line="360" w:lineRule="auto" w:after="120"/>
+          <w:sz w:val="24"/>
+        </w:rPr>
+        <w:t>Ulfah, R. A., Subiyanto, D., &amp; Kurniawan, I. S. (2020). Peran Mediasi Motivasi Kerja Pada Pengaruh Gaya Kepemimpinan Transaksional Dan Kompensasi Terhad</w:t>
+      </w:r>
+      <w:r>
+        <w:rPr>
+          <w:sz w:val="24"/>
+        </w:rPr>
+        <w:t>ap Kinerja Karyawan. Jurnal Kinerja, 17(2), 180–192.</w:t>
+      </w:r>
+    </w:p>
+    <w:p>
+      <w:pPr>
+        <w:spacing w:after="120" w:line="360" w:lineRule="auto"/>
         <w:ind w:left="720" w:hanging="720"/>
       </w:pPr>
       <w:r>
         <w:rPr>
-          <w:rFonts w:ascii="Times New Roman" w:hAnsi="Times New Roman"/>
-          <w:sz w:val="24"/>
-        </w:rPr>
-        <w:t>Wahyudin, M. B. B., &amp; Baidlowi, I. (2025). Pengaruh Gaya Kepemimpinan, Lingkungan Kerja, dan Kompensasi terhadap Kinerja Karyawan dengan Motivasi Sebagai Variabel Mediasi pada UD. Restu Bumi. Jurnal Sains Manajemen, 7(1), 50–62.</w:t>
-      </w:r>
-    </w:p>
-    <w:p>
-      <w:pPr>
-        <w:spacing w:line="360" w:lineRule="auto" w:after="120"/>
+          <w:sz w:val="24"/>
+        </w:rPr>
+        <w:t>Wahyudin, M. B. B., &amp; Baidlowi, I. (2025). Pengaruh Gaya Kepemimpinan, Lingkungan Kerja, dan Kompensasi terhadap Kinerja Karyawan dengan Motivasi Sebagai Variabel Mediasi pada UD. Restu Bumi. Jurnal Sain</w:t>
+      </w:r>
+      <w:r>
+        <w:rPr>
+          <w:sz w:val="24"/>
+        </w:rPr>
+        <w:t>s Manajemen, 7(1), 50–62.</w:t>
+      </w:r>
+    </w:p>
+    <w:p>
+      <w:pPr>
+        <w:spacing w:after="120" w:line="360" w:lineRule="auto"/>
         <w:ind w:left="720" w:hanging="720"/>
       </w:pPr>
       <w:r>
         <w:rPr>
-          <w:rFonts w:ascii="Times New Roman" w:hAnsi="Times New Roman"/>
           <w:sz w:val="24"/>
         </w:rPr>
         <w:t>Yuliani, T. (2023). Manajemen Sumber Daya Manusia di Sektor Publik. Yogyakarta: Gava Media.</w:t>
       </w:r>
     </w:p>
     <w:sectPr>
-      <w:footerReference w:type="even" r:id="rId10"/>
-      <w:footerReference w:type="default" r:id="rId11"/>
+      <w:footerReference w:type="even" r:id="rId11"/>
+      <w:footerReference w:type="default" r:id="rId12"/>
       <w:pgSz w:w="11910" w:h="16840"/>
       <w:pgMar w:top="1920" w:right="566" w:bottom="1300" w:left="1700" w:header="0" w:footer="1116" w:gutter="0"/>
       <w:pgNumType w:start="1"/>
@@ -27765,7 +28068,7 @@
       <w:rPr>
         <w:noProof/>
       </w:rPr>
-      <w:pict w14:anchorId="75B792DC">
+      <w:pict w14:anchorId="1D1B7E36">
         <v:shapetype id="_x0000_t202" coordsize="21600,21600" o:spt="202" path="m,l,21600r21600,l21600,xe">
           <v:stroke joinstyle="miter"/>
           <v:path gradientshapeok="t" o:connecttype="rect"/>

</xml_diff>

<commit_message>
Configure Section Break and page numbering (Roman for front matter, Arabic starting at 1 for Bab I-III)
</commit_message>
<xml_diff>
--- a/File Skripsi/Sri Darni.docx
+++ b/File Skripsi/Sri Darni.docx
@@ -1398,6 +1398,7 @@
           <w:sz w:val="24"/>
           <w:szCs w:val="24"/>
         </w:rPr>
+        <w:lastRenderedPageBreak/>
         <w:t>Teman-teman diskusi yang telah banyak membantu penulis dalam menyusun skripsi.</w:t>
       </w:r>
     </w:p>
@@ -1599,6 +1600,7 @@
           <w:b/>
           <w:sz w:val="24"/>
         </w:rPr>
+        <w:lastRenderedPageBreak/>
         <w:t>ABSTRAK</w:t>
       </w:r>
       <w:r>
@@ -1653,20 +1655,31 @@
           <w:b/>
           <w:sz w:val="24"/>
         </w:rPr>
-        <w:t>DAFTAR IS</w:t>
-      </w:r>
+        <w:t>DAFTAR ISI</w:t>
+      </w:r>
+      <w:r>
+        <w:rPr>
+          <w:sz w:val="24"/>
+        </w:rPr>
+        <w:t xml:space="preserve">  . . . . . . . . . . . . . . . . . . . . . . . . . . . . . . . . . . . iv</w:t>
+      </w:r>
+    </w:p>
+    <w:p>
+      <w:pPr>
+        <w:spacing w:before="40" w:after="40" w:line="360" w:lineRule="auto"/>
+      </w:pPr>
       <w:r>
         <w:rPr>
           <w:b/>
           <w:sz w:val="24"/>
         </w:rPr>
-        <w:t>I</w:t>
-      </w:r>
-      <w:r>
-        <w:rPr>
-          <w:sz w:val="24"/>
-        </w:rPr>
-        <w:t xml:space="preserve">  . . . . . . . . . . . . . . . . . . . . . . . . . . . . . . . . . . . iv</w:t>
+        <w:t>DAFTAR TABEL</w:t>
+      </w:r>
+      <w:r>
+        <w:rPr>
+          <w:sz w:val="24"/>
+        </w:rPr>
+        <w:t xml:space="preserve">  . . . . . . . . . . . . . . . . . . . . . . . . . . . . . . . . . . vi</w:t>
       </w:r>
     </w:p>
     <w:p>
@@ -1678,32 +1691,36 @@
           <w:b/>
           <w:sz w:val="24"/>
         </w:rPr>
-        <w:t>DAFTAR TABEL</w:t>
-      </w:r>
-      <w:r>
-        <w:rPr>
-          <w:sz w:val="24"/>
-        </w:rPr>
-        <w:t xml:space="preserve">  . . . . . . . . . . . . . . . . . . . . . . . . . . . . . . . . . . vi</w:t>
+        <w:t>DAFTAR GAMBAR</w:t>
+      </w:r>
+      <w:r>
+        <w:rPr>
+          <w:sz w:val="24"/>
+        </w:rPr>
+        <w:t xml:space="preserve">  . . . . . . . . . . . . . . . . . . . . . . . . . . . . . . . . . vii</w:t>
       </w:r>
     </w:p>
     <w:p>
       <w:pPr>
         <w:spacing w:before="40" w:after="40" w:line="360" w:lineRule="auto"/>
-      </w:pPr>
-      <w:r>
         <w:rPr>
           <w:b/>
           <w:sz w:val="24"/>
         </w:rPr>
-        <w:t>DAFTAR GAMBAR</w:t>
-      </w:r>
-      <w:r>
-        <w:rPr>
-          <w:sz w:val="24"/>
-        </w:rPr>
-        <w:t xml:space="preserve">  . . . . . . . . . . . . . . . . . . . . . . . . . . . . . . . . . vii</w:t>
-      </w:r>
+        <w:sectPr>
+          <w:headerReference w:type="even" r:id="rId9"/>
+          <w:headerReference w:type="default" r:id="rId10"/>
+          <w:footerReference w:type="even" r:id="rId11"/>
+          <w:footerReference w:type="default" r:id="rId12"/>
+          <w:headerReference w:type="first" r:id="rId13"/>
+          <w:footerReference w:type="first" r:id="rId14"/>
+          <w:pgSz w:w="11910" w:h="16840"/>
+          <w:pgMar w:top="1920" w:right="566" w:bottom="1300" w:left="1700" w:header="0" w:footer="1116" w:gutter="0"/>
+          <w:pgNumType w:fmt="lowerRoman" w:start="1"/>
+          <w:cols w:space="720"/>
+          <w:docGrid w:linePitch="299"/>
+        </w:sectPr>
+      </w:pPr>
     </w:p>
     <w:p>
       <w:pPr>
@@ -1714,20 +1731,109 @@
           <w:b/>
           <w:sz w:val="24"/>
         </w:rPr>
-        <w:t>BAB I PEND</w:t>
-      </w:r>
+        <w:lastRenderedPageBreak/>
+        <w:t>BAB I PENDAHULUAN</w:t>
+      </w:r>
+      <w:r>
+        <w:rPr>
+          <w:sz w:val="24"/>
+        </w:rPr>
+        <w:t xml:space="preserve">  . . . . . . . . . . . . . . . . . . . . . . . . . . . . . . . 1</w:t>
+      </w:r>
+    </w:p>
+    <w:p>
+      <w:pPr>
+        <w:spacing w:before="40" w:after="40" w:line="360" w:lineRule="auto"/>
+      </w:pPr>
+      <w:r>
+        <w:rPr>
+          <w:sz w:val="24"/>
+        </w:rPr>
+        <w:t xml:space="preserve">    A. Latar Belakang Masalah  . . . . . . . . . . . . . . . . . . . . . . . . . 1</w:t>
+      </w:r>
+    </w:p>
+    <w:p>
+      <w:pPr>
+        <w:spacing w:before="40" w:after="40" w:line="360" w:lineRule="auto"/>
+      </w:pPr>
+      <w:r>
+        <w:rPr>
+          <w:sz w:val="24"/>
+        </w:rPr>
+        <w:t xml:space="preserve">    B. Identifikasi Masalah  . . . . . . . . . . . . . . . . . . . . . . . . . . 5</w:t>
+      </w:r>
+    </w:p>
+    <w:p>
+      <w:pPr>
+        <w:spacing w:before="40" w:after="40" w:line="360" w:lineRule="auto"/>
+      </w:pPr>
+      <w:r>
+        <w:rPr>
+          <w:sz w:val="24"/>
+        </w:rPr>
+        <w:t xml:space="preserve">    C. Pembatasan Masalah  . . . . . . . . . . . . . . . . . . . . . . . . . . . 6</w:t>
+      </w:r>
+    </w:p>
+    <w:p>
+      <w:pPr>
+        <w:spacing w:before="40" w:after="40" w:line="360" w:lineRule="auto"/>
+      </w:pPr>
+      <w:r>
+        <w:rPr>
+          <w:sz w:val="24"/>
+        </w:rPr>
+        <w:t xml:space="preserve">    D. Rumusan Masalah  . . . . . . . . . . . . . . . . . . . . . . . . . . . . . 6</w:t>
+      </w:r>
+    </w:p>
+    <w:p>
+      <w:pPr>
+        <w:spacing w:before="40" w:after="40" w:line="360" w:lineRule="auto"/>
+      </w:pPr>
+      <w:r>
+        <w:rPr>
+          <w:sz w:val="24"/>
+        </w:rPr>
+        <w:t xml:space="preserve">    E. Tujuan Penelitian  . . . . . . . . . . . . . . . . . . . . . . . . . . . . 7</w:t>
+      </w:r>
+    </w:p>
+    <w:p>
+      <w:pPr>
+        <w:spacing w:before="40" w:after="40" w:line="360" w:lineRule="auto"/>
+      </w:pPr>
+      <w:r>
+        <w:rPr>
+          <w:sz w:val="24"/>
+        </w:rPr>
+        <w:t xml:space="preserve">    F. Manfaat Penelitian  . . . . . . . . . . . . . . . . . . . . . . . . . . . 7</w:t>
+      </w:r>
+    </w:p>
+    <w:p>
+      <w:pPr>
+        <w:spacing w:before="40" w:after="40" w:line="360" w:lineRule="auto"/>
+      </w:pPr>
+      <w:r>
+        <w:rPr>
+          <w:sz w:val="24"/>
+        </w:rPr>
+        <w:t xml:space="preserve">    G. Sistematika Penulisan Skripsi  . . . . . . . . . . . . . . . . . . . . . . 8</w:t>
+      </w:r>
+    </w:p>
+    <w:p>
+      <w:pPr>
+        <w:spacing w:before="40" w:after="40" w:line="360" w:lineRule="auto"/>
+      </w:pPr>
       <w:r>
         <w:rPr>
           <w:b/>
           <w:sz w:val="24"/>
         </w:rPr>
-        <w:t>AHULUAN</w:t>
-      </w:r>
-      <w:r>
-        <w:rPr>
-          <w:sz w:val="24"/>
-        </w:rPr>
-        <w:t xml:space="preserve">  . . . . . . . . . . . . . . . . . . . . . . . . . . . . . . . 1</w:t>
+        <w:t>BAB II LANDASAN TEORITIS DAN PENGEMBANGAN HIPOTESIS</w:t>
+      </w:r>
+      <w:r>
+        <w:rPr>
+          <w:sz w:val="24"/>
+        </w:rPr>
+        <w:t xml:space="preserve">  . . . . . . . . . . . . . . 10</w:t>
       </w:r>
     </w:p>
     <w:p>
@@ -1738,7 +1844,7 @@
         <w:rPr>
           <w:sz w:val="24"/>
         </w:rPr>
-        <w:t xml:space="preserve">    A. Latar Belakang Masalah  . . . . . . . . . . . . . . . . . . . . . . . . . 1</w:t>
+        <w:t xml:space="preserve">    A. Landasan Teori  . . . . . . . . . . . . . . . . . . . . . . . . . . . . . 10</w:t>
       </w:r>
     </w:p>
     <w:p>
@@ -1749,7 +1855,7 @@
         <w:rPr>
           <w:sz w:val="24"/>
         </w:rPr>
-        <w:t xml:space="preserve">    B. Identifikasi Masalah  . . . . . . . . . . . . . . . . . . . . . . . . . . 5</w:t>
+        <w:t xml:space="preserve">        1. Kinerja Perangkat Desa  . . . . . . . . . . . . . . . . . . . . . . . 10</w:t>
       </w:r>
     </w:p>
     <w:p>
@@ -1760,7 +1866,7 @@
         <w:rPr>
           <w:sz w:val="24"/>
         </w:rPr>
-        <w:t xml:space="preserve">    C. Pembatasan Masalah  . . . . . . . . . . . . . . . . . . . . . . . . . . . 6</w:t>
+        <w:t xml:space="preserve">        2. Gaya Kepemimpinan  . . . . . . . . . . . . . . . . . . . . . . . . . . 13</w:t>
       </w:r>
     </w:p>
     <w:p>
@@ -1771,7 +1877,7 @@
         <w:rPr>
           <w:sz w:val="24"/>
         </w:rPr>
-        <w:t xml:space="preserve">    D. Rumusan Masalah  . . . . . . . . . . . . . . . . . . . . . . . . . . . . . 6</w:t>
+        <w:t xml:space="preserve">        3. Kompensasi  . . . . . . . . . . . . . . . . . . . . . . . . . . . . . 16</w:t>
       </w:r>
     </w:p>
     <w:p>
@@ -1782,7 +1888,7 @@
         <w:rPr>
           <w:sz w:val="24"/>
         </w:rPr>
-        <w:t xml:space="preserve">    E. Tujuan Penelitian  . . . . . . . . . . . . . . . . . . . . . . . . . . . . 7</w:t>
+        <w:t xml:space="preserve">        4. Motivasi Kerja  . . . . . . . . . . . . . . . . . . . . . . . . . . . 19</w:t>
       </w:r>
     </w:p>
     <w:p>
@@ -1793,13 +1899,7 @@
         <w:rPr>
           <w:sz w:val="24"/>
         </w:rPr>
-        <w:t xml:space="preserve">    F</w:t>
-      </w:r>
-      <w:r>
-        <w:rPr>
-          <w:sz w:val="24"/>
-        </w:rPr>
-        <w:t>. Manfaat Penelitian  . . . . . . . . . . . . . . . . . . . . . . . . . . . 7</w:t>
+        <w:t xml:space="preserve">    B. Hasil Penelitian Terdahulu  . . . . . . . . . . . . . . . . . . . . . . . 23</w:t>
       </w:r>
     </w:p>
     <w:p>
@@ -1810,7 +1910,7 @@
         <w:rPr>
           <w:sz w:val="24"/>
         </w:rPr>
-        <w:t xml:space="preserve">    G. Sistematika Penulisan Skripsi  . . . . . . . . . . . . . . . . . . . . . . 8</w:t>
+        <w:t xml:space="preserve">    C. Kerangka Berpikir  . . . . . . . . . . . . . . . . . . . . . . . . . . . . 29</w:t>
       </w:r>
     </w:p>
     <w:p>
@@ -1819,16 +1919,27 @@
       </w:pPr>
       <w:r>
         <w:rPr>
+          <w:sz w:val="24"/>
+        </w:rPr>
+        <w:t xml:space="preserve">    D. Pengembangan Hipotesis  . . . . . . . . . . . . . . . . . . . . . . . . . 30</w:t>
+      </w:r>
+    </w:p>
+    <w:p>
+      <w:pPr>
+        <w:spacing w:before="40" w:after="40" w:line="360" w:lineRule="auto"/>
+      </w:pPr>
+      <w:r>
+        <w:rPr>
           <w:b/>
           <w:sz w:val="24"/>
         </w:rPr>
-        <w:t>BAB II LANDASAN TEORITIS DAN PENGEMBANGAN HIPOTESIS</w:t>
-      </w:r>
-      <w:r>
-        <w:rPr>
-          <w:sz w:val="24"/>
-        </w:rPr>
-        <w:t xml:space="preserve">  . . . . . . . . . . . . . . 10</w:t>
+        <w:t>BAB III METODE PENELITIAN</w:t>
+      </w:r>
+      <w:r>
+        <w:rPr>
+          <w:sz w:val="24"/>
+        </w:rPr>
+        <w:t xml:space="preserve">  . . . . . . . . . . . . . . . . . . . . . . . . . . . 31</w:t>
       </w:r>
     </w:p>
     <w:p>
@@ -1839,13 +1950,7 @@
         <w:rPr>
           <w:sz w:val="24"/>
         </w:rPr>
-        <w:t xml:space="preserve">    A. Lan</w:t>
-      </w:r>
-      <w:r>
-        <w:rPr>
-          <w:sz w:val="24"/>
-        </w:rPr>
-        <w:t>dasan Teori  . . . . . . . . . . . . . . . . . . . . . . . . . . . . . 10</w:t>
+        <w:t xml:space="preserve">    A. Tempat dan Waktu Penelitian  . . . . . . . . . . . . . . . . . . . . . . . 31</w:t>
       </w:r>
     </w:p>
     <w:p>
@@ -1856,7 +1961,7 @@
         <w:rPr>
           <w:sz w:val="24"/>
         </w:rPr>
-        <w:t xml:space="preserve">        1. Kinerja Perangkat Desa  . . . . . . . . . . . . . . . . . . . . . . . 10</w:t>
+        <w:t xml:space="preserve">    B. Desain Penelitian  . . . . . . . . . . . . . . . . . . . . . . . . . . . . 31</w:t>
       </w:r>
     </w:p>
     <w:p>
@@ -1867,7 +1972,7 @@
         <w:rPr>
           <w:sz w:val="24"/>
         </w:rPr>
-        <w:t xml:space="preserve">        2. Gaya Kepemimpinan  . . . . . . . . . . . . . . . . . . . . . . . . . . 13</w:t>
+        <w:t xml:space="preserve">    C. Definisi Operasional dan Pengukuran Variabel Penelitian  . . . . . . . . . 32</w:t>
       </w:r>
     </w:p>
     <w:p>
@@ -1878,13 +1983,7 @@
         <w:rPr>
           <w:sz w:val="24"/>
         </w:rPr>
-        <w:t xml:space="preserve">        3. Ko</w:t>
-      </w:r>
-      <w:r>
-        <w:rPr>
-          <w:sz w:val="24"/>
-        </w:rPr>
-        <w:t>mpensasi  . . . . . . . . . . . . . . . . . . . . . . . . . . . . . 16</w:t>
+        <w:t xml:space="preserve">        1. Variabel Bebas (Variabel Independen)  . . . . . . . . . . . . . . . . 32</w:t>
       </w:r>
     </w:p>
     <w:p>
@@ -1895,7 +1994,7 @@
         <w:rPr>
           <w:sz w:val="24"/>
         </w:rPr>
-        <w:t xml:space="preserve">        4. Motivasi Kerja  . . . . . . . . . . . . . . . . . . . . . . . . . . . 19</w:t>
+        <w:t xml:space="preserve">        2. Variabel Terikat (Variabel Dependen)  . . . . . . . . . . . . . . . . 32</w:t>
       </w:r>
     </w:p>
     <w:p>
@@ -1906,7 +2005,7 @@
         <w:rPr>
           <w:sz w:val="24"/>
         </w:rPr>
-        <w:t xml:space="preserve">    B. Hasil Penelitian Terdahulu  . . . . . . . . . . . . . . . . . . . . . . . 23</w:t>
+        <w:t xml:space="preserve">        3. Variabel Mediasi  . . . . . . . . . . . . . . . . . . . . . . . . . . 33</w:t>
       </w:r>
     </w:p>
     <w:p>
@@ -1917,7 +2016,7 @@
         <w:rPr>
           <w:sz w:val="24"/>
         </w:rPr>
-        <w:t xml:space="preserve">    C. Kerangka Berpikir  . . . . . . . . . . . . . . . . . . . . . . . . . . . . 29</w:t>
+        <w:t xml:space="preserve">        4. Operasionalisasi Variabel Penelitian  . . . . . . . . . . . . . . . . 33</w:t>
       </w:r>
     </w:p>
     <w:p>
@@ -1928,7 +2027,7 @@
         <w:rPr>
           <w:sz w:val="24"/>
         </w:rPr>
-        <w:t xml:space="preserve">    D. Pengembangan Hipotesis  . . . . . . . . . . . . . . . . . . . . . . . . . 30</w:t>
+        <w:t xml:space="preserve">    D. Populasi dan Sampel Penelitian  . . . . . . . . . . . . . . . . . . . . . 34</w:t>
       </w:r>
     </w:p>
     <w:p>
@@ -1937,235 +2036,94 @@
       </w:pPr>
       <w:r>
         <w:rPr>
+          <w:sz w:val="24"/>
+        </w:rPr>
+        <w:t xml:space="preserve">        1. Populasi  . . . . . . . . . . . . . . . . . . . . . . . . . . . . . . 34</w:t>
+      </w:r>
+    </w:p>
+    <w:p>
+      <w:pPr>
+        <w:spacing w:before="40" w:after="40" w:line="360" w:lineRule="auto"/>
+      </w:pPr>
+      <w:r>
+        <w:rPr>
+          <w:sz w:val="24"/>
+        </w:rPr>
+        <w:t xml:space="preserve">        2. Sampel  . . . . . . . . . . . . . . . . . . . . . . . . . . . . . . . 35</w:t>
+      </w:r>
+    </w:p>
+    <w:p>
+      <w:pPr>
+        <w:spacing w:before="40" w:after="40" w:line="360" w:lineRule="auto"/>
+      </w:pPr>
+      <w:r>
+        <w:rPr>
+          <w:sz w:val="24"/>
+        </w:rPr>
+        <w:t xml:space="preserve">    E. Metode Pengumpulan Data  . . . . . . . . . . . . . . . . . . . . . . . . . 36</w:t>
+      </w:r>
+    </w:p>
+    <w:p>
+      <w:pPr>
+        <w:spacing w:before="40" w:after="40" w:line="360" w:lineRule="auto"/>
+      </w:pPr>
+      <w:r>
+        <w:rPr>
+          <w:sz w:val="24"/>
+        </w:rPr>
+        <w:t xml:space="preserve">        1. Teknik Pengumpulan Data  . . . . . . . . . . . . . . . . . . . . . . . 36</w:t>
+      </w:r>
+    </w:p>
+    <w:p>
+      <w:pPr>
+        <w:spacing w:before="40" w:after="40" w:line="360" w:lineRule="auto"/>
+      </w:pPr>
+      <w:r>
+        <w:rPr>
+          <w:sz w:val="24"/>
+        </w:rPr>
+        <w:lastRenderedPageBreak/>
+        <w:t xml:space="preserve">        2. Sumber Data  . . . . . . . . . . . . . . . . . . . . . . . . . . . . . 36</w:t>
+      </w:r>
+    </w:p>
+    <w:p>
+      <w:pPr>
+        <w:spacing w:before="40" w:after="40" w:line="360" w:lineRule="auto"/>
+      </w:pPr>
+      <w:r>
+        <w:rPr>
+          <w:sz w:val="24"/>
+        </w:rPr>
+        <w:t xml:space="preserve">        3. Teknik Pengembangan Instrumen  . . . . . . . . . . . . . . . . . . . . 37</w:t>
+      </w:r>
+    </w:p>
+    <w:p>
+      <w:pPr>
+        <w:spacing w:before="40" w:after="40" w:line="360" w:lineRule="auto"/>
+      </w:pPr>
+      <w:r>
+        <w:rPr>
+          <w:sz w:val="24"/>
+        </w:rPr>
+        <w:t xml:space="preserve">    F. Teknik Analisis Data  . . . . . . . . . . . . . . . . . . . . . . . . . . 38</w:t>
+      </w:r>
+    </w:p>
+    <w:p>
+      <w:pPr>
+        <w:spacing w:before="40" w:after="40" w:line="360" w:lineRule="auto"/>
+      </w:pPr>
+      <w:r>
+        <w:rPr>
           <w:b/>
           <w:sz w:val="24"/>
         </w:rPr>
-        <w:t>BAB III METODE PENELITIAN</w:t>
-      </w:r>
-      <w:r>
-        <w:rPr>
-          <w:sz w:val="24"/>
-        </w:rPr>
-        <w:t xml:space="preserve">  . . . . . . . . . . . . . . . . . . . . . . . . . . . 31</w:t>
-      </w:r>
-    </w:p>
-    <w:p>
-      <w:pPr>
-        <w:spacing w:before="40" w:after="40" w:line="360" w:lineRule="auto"/>
-      </w:pPr>
-      <w:r>
-        <w:rPr>
-          <w:sz w:val="24"/>
-        </w:rPr>
-        <w:t xml:space="preserve">   </w:t>
-      </w:r>
-      <w:r>
-        <w:rPr>
-          <w:sz w:val="24"/>
-        </w:rPr>
-        <w:t xml:space="preserve"> A. Tempat dan Waktu Penelitian  . . . . . . . . . . . . . . . . . . . . . . . 31</w:t>
-      </w:r>
-    </w:p>
-    <w:p>
-      <w:pPr>
-        <w:spacing w:before="40" w:after="40" w:line="360" w:lineRule="auto"/>
-      </w:pPr>
-      <w:r>
-        <w:rPr>
-          <w:sz w:val="24"/>
-        </w:rPr>
-        <w:t xml:space="preserve">    B. Desain Penelitian  . . . . . . . . . . . . . . . . . . . . . . . . . . . . 31</w:t>
-      </w:r>
-    </w:p>
-    <w:p>
-      <w:pPr>
-        <w:spacing w:before="40" w:after="40" w:line="360" w:lineRule="auto"/>
-      </w:pPr>
-      <w:r>
-        <w:rPr>
-          <w:sz w:val="24"/>
-        </w:rPr>
-        <w:t xml:space="preserve">    C. Definisi Operasional dan Pengukuran Variabel Penelitian  . . . . . . . . . 32</w:t>
-      </w:r>
-    </w:p>
-    <w:p>
-      <w:pPr>
-        <w:spacing w:before="40" w:after="40" w:line="360" w:lineRule="auto"/>
-      </w:pPr>
-      <w:r>
-        <w:rPr>
-          <w:sz w:val="24"/>
-        </w:rPr>
-        <w:t xml:space="preserve">    </w:t>
-      </w:r>
-      <w:r>
-        <w:rPr>
-          <w:sz w:val="24"/>
-        </w:rPr>
-        <w:t xml:space="preserve">    1. Variabel Bebas (Variabel Independen)  . . . . . . . . . . . . . . . . 32</w:t>
-      </w:r>
-    </w:p>
-    <w:p>
-      <w:pPr>
-        <w:spacing w:before="40" w:after="40" w:line="360" w:lineRule="auto"/>
-      </w:pPr>
-      <w:r>
-        <w:rPr>
-          <w:sz w:val="24"/>
-        </w:rPr>
-        <w:t xml:space="preserve">        2. Variabel Terikat (Variabel Dependen)  . . . . . . . . . . . . . . . . 32</w:t>
-      </w:r>
-    </w:p>
-    <w:p>
-      <w:pPr>
-        <w:spacing w:before="40" w:after="40" w:line="360" w:lineRule="auto"/>
-      </w:pPr>
-      <w:r>
-        <w:rPr>
-          <w:sz w:val="24"/>
-        </w:rPr>
-        <w:t xml:space="preserve">        3. Variabel Mediasi  . . . . . . . . . . . . . . . . . . . . . . . . . . 33</w:t>
-      </w:r>
-    </w:p>
-    <w:p>
-      <w:pPr>
-        <w:spacing w:before="40" w:after="40" w:line="360" w:lineRule="auto"/>
-      </w:pPr>
-      <w:r>
-        <w:rPr>
-          <w:sz w:val="24"/>
-        </w:rPr>
-        <w:t xml:space="preserve">        </w:t>
-      </w:r>
-      <w:r>
-        <w:rPr>
-          <w:sz w:val="24"/>
-        </w:rPr>
-        <w:t>4. Operasionalisasi Variabel Penelitian  . . . . . . . . . . . . . . . . 33</w:t>
-      </w:r>
-    </w:p>
-    <w:p>
-      <w:pPr>
-        <w:spacing w:before="40" w:after="40" w:line="360" w:lineRule="auto"/>
-      </w:pPr>
-      <w:r>
-        <w:rPr>
-          <w:sz w:val="24"/>
-        </w:rPr>
-        <w:t xml:space="preserve">    D. Populasi dan Sampel Penelitian  . . . . . . . . . . . . . . . . . . . . . 34</w:t>
-      </w:r>
-    </w:p>
-    <w:p>
-      <w:pPr>
-        <w:spacing w:before="40" w:after="40" w:line="360" w:lineRule="auto"/>
-      </w:pPr>
-      <w:r>
-        <w:rPr>
-          <w:sz w:val="24"/>
-        </w:rPr>
-        <w:t xml:space="preserve">        1. Populasi  . . . . . . . . . . . . . . . . . . . . . . . . . . . . . . 34</w:t>
-      </w:r>
-    </w:p>
-    <w:p>
-      <w:pPr>
-        <w:spacing w:before="40" w:after="40" w:line="360" w:lineRule="auto"/>
-      </w:pPr>
-      <w:r>
-        <w:rPr>
-          <w:sz w:val="24"/>
-        </w:rPr>
-        <w:t xml:space="preserve">        2. S</w:t>
-      </w:r>
-      <w:r>
-        <w:rPr>
-          <w:sz w:val="24"/>
-        </w:rPr>
-        <w:t>ampel  . . . . . . . . . . . . . . . . . . . . . . . . . . . . . . . 35</w:t>
-      </w:r>
-    </w:p>
-    <w:p>
-      <w:pPr>
-        <w:spacing w:before="40" w:after="40" w:line="360" w:lineRule="auto"/>
-      </w:pPr>
-      <w:r>
-        <w:rPr>
-          <w:sz w:val="24"/>
-        </w:rPr>
-        <w:t xml:space="preserve">    E. Metode Pengumpulan Data  . . . . . . . . . . . . . . . . . . . . . . . . . 36</w:t>
-      </w:r>
-    </w:p>
-    <w:p>
-      <w:pPr>
-        <w:spacing w:before="40" w:after="40" w:line="360" w:lineRule="auto"/>
-      </w:pPr>
-      <w:r>
-        <w:rPr>
-          <w:sz w:val="24"/>
-        </w:rPr>
-        <w:t xml:space="preserve">        1. Teknik Pengumpulan Data  . . . . . . . . . . . . . . . . . . . . . . . 36</w:t>
-      </w:r>
-    </w:p>
-    <w:p>
-      <w:pPr>
-        <w:spacing w:before="40" w:after="40" w:line="360" w:lineRule="auto"/>
-      </w:pPr>
-      <w:r>
-        <w:rPr>
-          <w:sz w:val="24"/>
-        </w:rPr>
-        <w:t xml:space="preserve">        2. Sum</w:t>
-      </w:r>
-      <w:r>
-        <w:rPr>
-          <w:sz w:val="24"/>
-        </w:rPr>
-        <w:t>ber Data  . . . . . . . . . . . . . . . . . . . . . . . . . . . . . 36</w:t>
-      </w:r>
-    </w:p>
-    <w:p>
-      <w:pPr>
-        <w:spacing w:before="40" w:after="40" w:line="360" w:lineRule="auto"/>
-      </w:pPr>
-      <w:r>
-        <w:rPr>
-          <w:sz w:val="24"/>
-        </w:rPr>
-        <w:t xml:space="preserve">        3. Teknik Pengembangan Instrumen  . . . . . . . . . . . . . . . . . . . . 37</w:t>
-      </w:r>
-    </w:p>
-    <w:p>
-      <w:pPr>
-        <w:spacing w:before="40" w:after="40" w:line="360" w:lineRule="auto"/>
-      </w:pPr>
-      <w:r>
-        <w:rPr>
-          <w:sz w:val="24"/>
-        </w:rPr>
-        <w:t xml:space="preserve">    F. Teknik Analisis Data  . . . . . . . . . . . . . . . . . . . . . . . . . . 38</w:t>
-      </w:r>
-    </w:p>
-    <w:p>
-      <w:pPr>
-        <w:spacing w:before="40" w:after="40" w:line="360" w:lineRule="auto"/>
-      </w:pPr>
-      <w:r>
-        <w:rPr>
-          <w:b/>
-          <w:sz w:val="24"/>
-        </w:rPr>
         <w:t>DAFTAR PUSTAKA</w:t>
       </w:r>
       <w:r>
         <w:rPr>
           <w:sz w:val="24"/>
         </w:rPr>
-        <w:t xml:space="preserve">  </w:t>
-      </w:r>
-      <w:r>
-        <w:rPr>
-          <w:sz w:val="24"/>
-        </w:rPr>
-        <w:t>. . . . . . . . . . . . . . . . . . . . . . . . . . . . . . . . . 44</w:t>
+        <w:t xml:space="preserve">  . . . . . . . . . . . . . . . . . . . . . . . . . . . . . . . . . 44</w:t>
       </w:r>
     </w:p>
     <w:p>
@@ -2218,13 +2176,7 @@
         <w:rPr>
           <w:sz w:val="24"/>
         </w:rPr>
-        <w:t>Tabel 3.1 Jadw</w:t>
-      </w:r>
-      <w:r>
-        <w:rPr>
-          <w:sz w:val="24"/>
-        </w:rPr>
-        <w:t>al Penelitian dan Penulisan Skripsi  . . . . . . . . . . . . . 31</w:t>
+        <w:t>Tabel 3.1 Jadwal Penelitian dan Penulisan Skripsi  . . . . . . . . . . . . . 31</w:t>
       </w:r>
     </w:p>
     <w:p>
@@ -2270,13 +2222,7 @@
         <w:rPr>
           <w:sz w:val="24"/>
         </w:rPr>
-        <w:t xml:space="preserve"> Evaluas</w:t>
-      </w:r>
-      <w:r>
-        <w:rPr>
-          <w:sz w:val="24"/>
-        </w:rPr>
-        <w:t>i Model Pengukuran  . . . . . . . . . . . . . 40</w:t>
+        <w:t xml:space="preserve"> Evaluasi Model Pengukuran  . . . . . . . . . . . . . 40</w:t>
       </w:r>
     </w:p>
     <w:p>
@@ -2331,13 +2277,7 @@
         <w:rPr>
           <w:sz w:val="24"/>
         </w:rPr>
-        <w:t>Gambar 2.1 Kerangka Berpikir</w:t>
-      </w:r>
-      <w:r>
-        <w:rPr>
-          <w:sz w:val="24"/>
-        </w:rPr>
-        <w:t xml:space="preserve">  . . . . . . . . . . . . . . . . . . . . . . . 29</w:t>
+        <w:t>Gambar 2.1 Kerangka Berpikir  . . . . . . . . . . . . . . . . . . . . . . . 29</w:t>
       </w:r>
     </w:p>
     <w:p>
@@ -2409,13 +2349,7 @@
         <w:rPr>
           <w:sz w:val="24"/>
         </w:rPr>
-        <w:t xml:space="preserve"> Variabel Independen (X2</w:t>
-      </w:r>
-      <w:r>
-        <w:rPr>
-          <w:sz w:val="24"/>
-        </w:rPr>
-        <w:t>)  . . . . . . . . . . . . . . 39</w:t>
+        <w:t xml:space="preserve"> Variabel Independen (X2)  . . . . . . . . . . . . . . 39</w:t>
       </w:r>
     </w:p>
     <w:p>
@@ -2487,13 +2421,7 @@
         <w:rPr>
           <w:sz w:val="24"/>
         </w:rPr>
-        <w:t>)</w:t>
-      </w:r>
-      <w:r>
-        <w:rPr>
-          <w:sz w:val="24"/>
-        </w:rPr>
-        <w:t xml:space="preserve">  . . . . . . . . . . . . . . . . . . 40</w:t>
+        <w:t>)  . . . . . . . . . . . . . . . . . . 40</w:t>
       </w:r>
     </w:p>
     <w:p>
@@ -13536,7 +13464,7 @@
                     <pic:cNvPicPr/>
                   </pic:nvPicPr>
                   <pic:blipFill>
-                    <a:blip r:embed="rId9">
+                    <a:blip r:embed="rId15">
                       <a:clrChange>
                         <a:clrFrom>
                           <a:srgbClr val="FFFFFF"/>
@@ -13701,7 +13629,7 @@
                     <pic:cNvPicPr/>
                   </pic:nvPicPr>
                   <pic:blipFill>
-                    <a:blip r:embed="rId10"/>
+                    <a:blip r:embed="rId16"/>
                     <a:stretch>
                       <a:fillRect/>
                     </a:stretch>
@@ -13746,7 +13674,7 @@
                     <pic:cNvPicPr/>
                   </pic:nvPicPr>
                   <pic:blipFill>
-                    <a:blip r:embed="rId10"/>
+                    <a:blip r:embed="rId16"/>
                     <a:stretch>
                       <a:fillRect/>
                     </a:stretch>
@@ -27334,13 +27262,7 @@
         <w:rPr>
           <w:sz w:val="24"/>
         </w:rPr>
-        <w:t xml:space="preserve">Agustin, D. S. (2020). Analisis Pengaruh Budaya Organisasi, Gaya Kepemimpinan terhadap Kinerja Karyawan </w:t>
-      </w:r>
-      <w:r>
-        <w:rPr>
-          <w:sz w:val="24"/>
-        </w:rPr>
-        <w:t>UMKM dengan Motivasi Kerja sebagai Variabel Mediasi. Jurnal Ilmu Manajemen, 8(3), 789–800.</w:t>
+        <w:t>Agustin, D. S. (2020). Analisis Pengaruh Budaya Organisasi, Gaya Kepemimpinan terhadap Kinerja Karyawan UMKM dengan Motivasi Kerja sebagai Variabel Mediasi. Jurnal Ilmu Manajemen, 8(3), 789–800.</w:t>
       </w:r>
     </w:p>
     <w:p>
@@ -27352,13 +27274,7 @@
         <w:rPr>
           <w:sz w:val="24"/>
         </w:rPr>
-        <w:t>Amin, A. R. A. (2024). Pengaruh Kompetensi dan Gaya Kepemimpinan Terhadap Kinerja Perangkat Desa di Kecamatan Rambang dengan Motivasi Sebagai Variabel Mediasi (Tesis</w:t>
-      </w:r>
-      <w:r>
-        <w:rPr>
-          <w:sz w:val="24"/>
-        </w:rPr>
-        <w:t xml:space="preserve"> Magister, Universitas Sriwijaya).</w:t>
+        <w:t>Amin, A. R. A. (2024). Pengaruh Kompetensi dan Gaya Kepemimpinan Terhadap Kinerja Perangkat Desa di Kecamatan Rambang dengan Motivasi Sebagai Variabel Mediasi (Tesis Magister, Universitas Sriwijaya).</w:t>
       </w:r>
     </w:p>
     <w:p>
@@ -27382,13 +27298,7 @@
         <w:rPr>
           <w:sz w:val="24"/>
         </w:rPr>
-        <w:t xml:space="preserve">Atmojo, A. A. </w:t>
-      </w:r>
-      <w:r>
-        <w:rPr>
-          <w:sz w:val="24"/>
-        </w:rPr>
-        <w:t>(2022). Pengaruh Gaya Kepemimpinan, Kompensasi Terhadap Kinerja Dengan Motivasi Kerja Sebagai Variabel Mediasi Pada PDAM Kabupaten Kediri. Jurnal Penelitian Ekonomi dan Bisnis, 7(2), 112–125.</w:t>
+        <w:t>Atmojo, A. A. (2022). Pengaruh Gaya Kepemimpinan, Kompensasi Terhadap Kinerja Dengan Motivasi Kerja Sebagai Variabel Mediasi Pada PDAM Kabupaten Kediri. Jurnal Penelitian Ekonomi dan Bisnis, 7(2), 112–125.</w:t>
       </w:r>
     </w:p>
     <w:p>
@@ -27400,13 +27310,7 @@
         <w:rPr>
           <w:sz w:val="24"/>
         </w:rPr>
-        <w:t>Bahits, A., dkk. (2023). Manajemen Sumber Daya Manusia dalam Org</w:t>
-      </w:r>
-      <w:r>
-        <w:rPr>
-          <w:sz w:val="24"/>
-        </w:rPr>
-        <w:t>anisasi Modern. Bandung: Widina Bhakti Persada.</w:t>
+        <w:t>Bahits, A., dkk. (2023). Manajemen Sumber Daya Manusia dalam Organisasi Modern. Bandung: Widina Bhakti Persada.</w:t>
       </w:r>
     </w:p>
     <w:p>
@@ -27431,13 +27335,7 @@
         <w:rPr>
           <w:sz w:val="24"/>
         </w:rPr>
-        <w:t xml:space="preserve"> Through Work Motivation (DPRD DKI Jakarta). International Journal of Social and Management St</w:t>
-      </w:r>
-      <w:r>
-        <w:rPr>
-          <w:sz w:val="24"/>
-        </w:rPr>
-        <w:t>udies, 3(4), 88–98.</w:t>
+        <w:t xml:space="preserve"> Through Work Motivation (DPRD DKI Jakarta). International Journal of Social and Management Studies, 3(4), 88–98.</w:t>
       </w:r>
     </w:p>
     <w:p>
@@ -27487,13 +27385,7 @@
         <w:rPr>
           <w:sz w:val="24"/>
         </w:rPr>
-        <w:t>Fikri, M., dkk. (2022). Manajemen Sumber Daya Manusia: Teori dan Praktik. Jakarta: PT RajaGra</w:t>
-      </w:r>
-      <w:r>
-        <w:rPr>
-          <w:sz w:val="24"/>
-        </w:rPr>
-        <w:t>findo Persada.</w:t>
+        <w:t>Fikri, M., dkk. (2022). Manajemen Sumber Daya Manusia: Teori dan Praktik. Jakarta: PT RajaGrafindo Persada.</w:t>
       </w:r>
     </w:p>
     <w:p>
@@ -27556,13 +27448,7 @@
         <w:rPr>
           <w:sz w:val="24"/>
         </w:rPr>
-        <w:t xml:space="preserve"> </w:t>
-      </w:r>
-      <w:r>
-        <w:rPr>
-          <w:sz w:val="24"/>
-        </w:rPr>
-        <w:t>3.0 (Edisi 3). Semarang: Badan Penerbit Universitas Diponegoro.</w:t>
+        <w:t xml:space="preserve"> 3.0 (Edisi 3). Semarang: Badan Penerbit Universitas Diponegoro.</w:t>
       </w:r>
     </w:p>
     <w:p>
@@ -27574,13 +27460,7 @@
         <w:rPr>
           <w:sz w:val="24"/>
         </w:rPr>
-        <w:t>Guntoro, Djunaedi, &amp; Utami. (2024). Pengaruh Kompensasi Terhadap Kinerja Pegawai Dengan Motivasi Kerja Sebagai Variabel Mediasi pada Dinas Koperasi Nganjuk. Jurnal Ilmiah Manajemen, 11(2), 210</w:t>
-      </w:r>
-      <w:r>
-        <w:rPr>
-          <w:sz w:val="24"/>
-        </w:rPr>
-        <w:t>–222.</w:t>
+        <w:t>Guntoro, Djunaedi, &amp; Utami. (2024). Pengaruh Kompensasi Terhadap Kinerja Pegawai Dengan Motivasi Kerja Sebagai Variabel Mediasi pada Dinas Koperasi Nganjuk. Jurnal Ilmiah Manajemen, 11(2), 210–222.</w:t>
       </w:r>
     </w:p>
     <w:p>
@@ -27630,13 +27510,7 @@
         <w:rPr>
           <w:sz w:val="24"/>
         </w:rPr>
-        <w:t>Hasibuan, M. S. P. (2019). Manajemen Sumber Daya Manusia. Jak</w:t>
-      </w:r>
-      <w:r>
-        <w:rPr>
-          <w:sz w:val="24"/>
-        </w:rPr>
-        <w:t>arta: PT Bumi Aksara.</w:t>
+        <w:t>Hasibuan, M. S. P. (2019). Manajemen Sumber Daya Manusia. Jakarta: PT Bumi Aksara.</w:t>
       </w:r>
     </w:p>
     <w:p>
@@ -27660,13 +27534,7 @@
         <w:rPr>
           <w:sz w:val="24"/>
         </w:rPr>
-        <w:t xml:space="preserve">Naldi, M. K., dkk. (2025). Pengaruh Kepuasan Kerja, Gaya Kepemimpinan, dan Komitmen Organisasi terhadap Motivasi Kerja. Jurnal </w:t>
-      </w:r>
-      <w:r>
-        <w:rPr>
-          <w:sz w:val="24"/>
-        </w:rPr>
-        <w:t>Riset Manajemen, 6(1), 101–112.</w:t>
+        <w:t>Naldi, M. K., dkk. (2025). Pengaruh Kepuasan Kerja, Gaya Kepemimpinan, dan Komitmen Organisasi terhadap Motivasi Kerja. Jurnal Riset Manajemen, 6(1), 101–112.</w:t>
       </w:r>
     </w:p>
     <w:p>
@@ -27703,13 +27571,7 @@
         <w:rPr>
           <w:sz w:val="24"/>
         </w:rPr>
-        <w:t>Nurcahaya, B. S., &amp; Subkhan, M. (2025). Pengaruh Gaya Kepemimpinan dan Kompensasi terh</w:t>
-      </w:r>
-      <w:r>
-        <w:rPr>
-          <w:sz w:val="24"/>
-        </w:rPr>
-        <w:t>adap Kinerja Karyawan melalui Motivasi Kerja sebagai Variabel Mediasi pada Pamella Tiga Yogyakarta. Jurnal Manajemen Bisnis, 15(1), 45–58.</w:t>
+        <w:t>Nurcahaya, B. S., &amp; Subkhan, M. (2025). Pengaruh Gaya Kepemimpinan dan Kompensasi terhadap Kinerja Karyawan melalui Motivasi Kerja sebagai Variabel Mediasi pada Pamella Tiga Yogyakarta. Jurnal Manajemen Bisnis, 15(1), 45–58.</w:t>
       </w:r>
     </w:p>
     <w:p>
@@ -27733,13 +27595,7 @@
         <w:rPr>
           <w:sz w:val="24"/>
         </w:rPr>
-        <w:t>Prasetya, G. L. H., &amp; Hendarto, R. T</w:t>
-      </w:r>
-      <w:r>
-        <w:rPr>
-          <w:sz w:val="24"/>
-        </w:rPr>
-        <w:t>. (2024). Pengaruh Gaya Kepemimpinan dan Kompensasi Terhadap Kinerja Karyawan Melalui Motivasi Kerja Sebagai Variable Mediasi Pada PT. Karunia Jaya Global. Jurnal Manajemen Kewirausahaan, 19(1), 34–46.</w:t>
+        <w:t>Prasetya, G. L. H., &amp; Hendarto, R. T. (2024). Pengaruh Gaya Kepemimpinan dan Kompensasi Terhadap Kinerja Karyawan Melalui Motivasi Kerja Sebagai Variable Mediasi Pada PT. Karunia Jaya Global. Jurnal Manajemen Kewirausahaan, 19(1), 34–46.</w:t>
       </w:r>
     </w:p>
     <w:p>
@@ -27751,13 +27607,7 @@
         <w:rPr>
           <w:sz w:val="24"/>
         </w:rPr>
-        <w:t>Pratama, M. Y., &amp; Junaedi, D. (2025). Pengaruh Gaya Ke</w:t>
-      </w:r>
-      <w:r>
-        <w:rPr>
-          <w:sz w:val="24"/>
-        </w:rPr>
-        <w:t>pemimpinan dan Motivasi Kerja Terhadap Efektivitas Kinerja Perangkat Desa Kedung Rejoso Kecamatan Kotaanyar Kabupaten Probolinggo (Skripsi, Universitas Nurul Jadid).</w:t>
+        <w:t>Pratama, M. Y., &amp; Junaedi, D. (2025). Pengaruh Gaya Kepemimpinan dan Motivasi Kerja Terhadap Efektivitas Kinerja Perangkat Desa Kedung Rejoso Kecamatan Kotaanyar Kabupaten Probolinggo (Skripsi, Universitas Nurul Jadid).</w:t>
       </w:r>
     </w:p>
     <w:p>
@@ -27769,13 +27619,7 @@
         <w:rPr>
           <w:sz w:val="24"/>
         </w:rPr>
-        <w:t xml:space="preserve">Priansa, D. J. (2017). Manajemen Kepemimpinan dan Kinerja Pegawai dalam Organisasi Publik </w:t>
-      </w:r>
-      <w:r>
-        <w:rPr>
-          <w:sz w:val="24"/>
-        </w:rPr>
-        <w:t>dan Bisnis. Bandung: CV Pustaka Setia.</w:t>
+        <w:t>Priansa, D. J. (2017). Manajemen Kepemimpinan dan Kinerja Pegawai dalam Organisasi Publik dan Bisnis. Bandung: CV Pustaka Setia.</w:t>
       </w:r>
     </w:p>
     <w:p>
@@ -27799,13 +27643,7 @@
         <w:rPr>
           <w:sz w:val="24"/>
         </w:rPr>
-        <w:t xml:space="preserve">Putri, D. R., &amp; Rozi, F. (2024). Pengaruh Kompensasi dan Lingkungan Kerja terhadap Kinerja Karyawan. </w:t>
-      </w:r>
-      <w:r>
-        <w:rPr>
-          <w:sz w:val="24"/>
-        </w:rPr>
-        <w:t>Jurnal Ilmu Sumber Daya Manusia, 5(2), 140–151.</w:t>
+        <w:t>Putri, D. R., &amp; Rozi, F. (2024). Pengaruh Kompensasi dan Lingkungan Kerja terhadap Kinerja Karyawan. Jurnal Ilmu Sumber Daya Manusia, 5(2), 140–151.</w:t>
       </w:r>
     </w:p>
     <w:p>
@@ -27829,13 +27667,7 @@
         <w:rPr>
           <w:sz w:val="24"/>
         </w:rPr>
-        <w:t xml:space="preserve">Satria, E., dkk. (2024). Pengaruh Kompensasi terhadap Kinerja Pegawai pada Kantor Pemerintahan. Jurnal Administrasi </w:t>
-      </w:r>
-      <w:r>
-        <w:rPr>
-          <w:sz w:val="24"/>
-        </w:rPr>
-        <w:t>Publik, 10(1), 67–78.</w:t>
+        <w:t>Satria, E., dkk. (2024). Pengaruh Kompensasi terhadap Kinerja Pegawai pada Kantor Pemerintahan. Jurnal Administrasi Publik, 10(1), 67–78.</w:t>
       </w:r>
     </w:p>
     <w:p>
@@ -27859,13 +27691,7 @@
         <w:rPr>
           <w:sz w:val="24"/>
         </w:rPr>
-        <w:t>Sudaryana, A., &amp; Agusiady, R. (2021). Metodologi Penelitian Mana</w:t>
-      </w:r>
-      <w:r>
-        <w:rPr>
-          <w:sz w:val="24"/>
-        </w:rPr>
-        <w:t>jemen. Bandung: Deepublish.</w:t>
+        <w:t>Sudaryana, A., &amp; Agusiady, R. (2021). Metodologi Penelitian Manajemen. Bandung: Deepublish.</w:t>
       </w:r>
     </w:p>
     <w:p>
@@ -27901,13 +27727,7 @@
         <w:rPr>
           <w:sz w:val="24"/>
         </w:rPr>
-        <w:t>Sujarweni, V. W. (2020)</w:t>
-      </w:r>
-      <w:r>
-        <w:rPr>
-          <w:sz w:val="24"/>
-        </w:rPr>
-        <w:t>. Metodologi Penelitian: Lengkap, Praktis, dan Mudah Dipahami. Yogyakarta: Pustaka Baru Press.</w:t>
+        <w:t>Sujarweni, V. W. (2020). Metodologi Penelitian: Lengkap, Praktis, dan Mudah Dipahami. Yogyakarta: Pustaka Baru Press.</w:t>
       </w:r>
     </w:p>
     <w:p>
@@ -27931,13 +27751,7 @@
         <w:rPr>
           <w:sz w:val="24"/>
         </w:rPr>
-        <w:t>Syahza, A. (2021). Metodologi Penelitian Edisi Revisi. P</w:t>
-      </w:r>
-      <w:r>
-        <w:rPr>
-          <w:sz w:val="24"/>
-        </w:rPr>
-        <w:t>ekanbaru: Unri Press.</w:t>
+        <w:t>Syahza, A. (2021). Metodologi Penelitian Edisi Revisi. Pekanbaru: Unri Press.</w:t>
       </w:r>
     </w:p>
     <w:p>
@@ -27961,13 +27775,7 @@
         <w:rPr>
           <w:sz w:val="24"/>
         </w:rPr>
-        <w:t>Ulfah, R. A., Subiyanto, D., &amp; Kurniawan, I. S. (2020). Peran Mediasi Motivasi Kerja Pada Pengaruh Gaya Kepemimpinan Transaksional Dan Kompensasi Terhad</w:t>
-      </w:r>
-      <w:r>
-        <w:rPr>
-          <w:sz w:val="24"/>
-        </w:rPr>
-        <w:t>ap Kinerja Karyawan. Jurnal Kinerja, 17(2), 180–192.</w:t>
+        <w:t>Ulfah, R. A., Subiyanto, D., &amp; Kurniawan, I. S. (2020). Peran Mediasi Motivasi Kerja Pada Pengaruh Gaya Kepemimpinan Transaksional Dan Kompensasi Terhadap Kinerja Karyawan. Jurnal Kinerja, 17(2), 180–192.</w:t>
       </w:r>
     </w:p>
     <w:p>
@@ -27979,13 +27787,7 @@
         <w:rPr>
           <w:sz w:val="24"/>
         </w:rPr>
-        <w:t>Wahyudin, M. B. B., &amp; Baidlowi, I. (2025). Pengaruh Gaya Kepemimpinan, Lingkungan Kerja, dan Kompensasi terhadap Kinerja Karyawan dengan Motivasi Sebagai Variabel Mediasi pada UD. Restu Bumi. Jurnal Sain</w:t>
-      </w:r>
-      <w:r>
-        <w:rPr>
-          <w:sz w:val="24"/>
-        </w:rPr>
-        <w:t>s Manajemen, 7(1), 50–62.</w:t>
+        <w:t>Wahyudin, M. B. B., &amp; Baidlowi, I. (2025). Pengaruh Gaya Kepemimpinan, Lingkungan Kerja, dan Kompensasi terhadap Kinerja Karyawan dengan Motivasi Sebagai Variabel Mediasi pada UD. Restu Bumi. Jurnal Sains Manajemen, 7(1), 50–62.</w:t>
       </w:r>
     </w:p>
     <w:p>
@@ -28001,13 +27803,11 @@
       </w:r>
     </w:p>
     <w:sectPr>
-      <w:footerReference w:type="even" r:id="rId11"/>
-      <w:footerReference w:type="default" r:id="rId12"/>
+      <w:footerReference w:type="default" r:id="rId17"/>
       <w:pgSz w:w="11910" w:h="16840"/>
       <w:pgMar w:top="1920" w:right="566" w:bottom="1300" w:left="1700" w:header="0" w:footer="1116" w:gutter="0"/>
       <w:pgNumType w:start="1"/>
       <w:cols w:space="720"/>
-      <w:titlePg/>
       <w:docGrid w:linePitch="299"/>
     </w:sectPr>
   </w:body>
@@ -28035,6 +27835,33 @@
 
 <file path=word/footer1.xml><?xml version="1.0" encoding="utf-8"?>
 <w:ftr xmlns:wpc="http://schemas.microsoft.com/office/word/2010/wordprocessingCanvas" xmlns:cx="http://schemas.microsoft.com/office/drawing/2014/chartex" xmlns:cx1="http://schemas.microsoft.com/office/drawing/2015/9/8/chartex" xmlns:cx2="http://schemas.microsoft.com/office/drawing/2015/10/21/chartex" xmlns:cx3="http://schemas.microsoft.com/office/drawing/2016/5/9/chartex" xmlns:cx4="http://schemas.microsoft.com/office/drawing/2016/5/10/chartex" xmlns:cx5="http://schemas.microsoft.com/office/drawing/2016/5/11/chartex" xmlns:cx6="http://schemas.microsoft.com/office/drawing/2016/5/12/chartex" xmlns:cx7="http://schemas.microsoft.com/office/drawing/2016/5/13/chartex" xmlns:cx8="http://schemas.microsoft.com/office/drawing/2016/5/14/chartex" xmlns:mc="http://schemas.openxmlformats.org/markup-compatibility/2006" xmlns:aink="http://schemas.microsoft.com/office/drawing/2016/ink" xmlns:am3d="http://schemas.microsoft.com/office/drawing/2017/model3d" xmlns:o="urn:schemas-microsoft-com:office:office" xmlns:r="http://schemas.openxmlformats.org/officeDocument/2006/relationships" xmlns:m="http://schemas.openxmlformats.org/officeDocument/2006/math" xmlns:v="urn:schemas-microsoft-com:vml" xmlns:wp14="http://schemas.microsoft.com/office/word/2010/wordprocessingDrawing" xmlns:wp="http://schemas.openxmlformats.org/drawingml/2006/wordprocessingDrawing" xmlns:w10="urn:schemas-microsoft-com:office:word" xmlns:w="http://schemas.openxmlformats.org/wordprocessingml/2006/main" xmlns:w14="http://schemas.microsoft.com/office/word/2010/wordml" xmlns:w15="http://schemas.microsoft.com/office/word/2012/wordml" xmlns:w16cex="http://schemas.microsoft.com/office/word/2018/wordml/cex" xmlns:w16cid="http://schemas.microsoft.com/office/word/2016/wordml/cid" xmlns:w16="http://schemas.microsoft.com/office/word/2018/wordml" xmlns:w16sdtdh="http://schemas.microsoft.com/office/word/2020/wordml/sdtdatahash" xmlns:w16se="http://schemas.microsoft.com/office/word/2015/wordml/symex" xmlns:wpg="http://schemas.microsoft.com/office/word/2010/wordprocessingGroup" xmlns:wpi="http://schemas.microsoft.com/office/word/2010/wordprocessingInk" xmlns:wne="http://schemas.microsoft.com/office/word/2006/wordml" xmlns:wps="http://schemas.microsoft.com/office/word/2010/wordprocessingShape" mc:Ignorable="w14 w15 w16se w16cid w16 w16cex w16sdtdh wp14">
+  <w:p>
+    <w:pPr>
+      <w:pStyle w:val="Footer"/>
+      <w:framePr w:wrap="around" w:vAnchor="text" w:hAnchor="margin" w:xAlign="center" w:y="1"/>
+      <w:rPr>
+        <w:rStyle w:val="PageNumber"/>
+      </w:rPr>
+    </w:pPr>
+    <w:r>
+      <w:rPr>
+        <w:rStyle w:val="PageNumber"/>
+      </w:rPr>
+      <w:fldChar w:fldCharType="begin"/>
+    </w:r>
+    <w:r>
+      <w:rPr>
+        <w:rStyle w:val="PageNumber"/>
+      </w:rPr>
+      <w:instrText xml:space="preserve"> PAGE </w:instrText>
+    </w:r>
+    <w:r>
+      <w:rPr>
+        <w:rStyle w:val="PageNumber"/>
+      </w:rPr>
+      <w:fldChar w:fldCharType="end"/>
+    </w:r>
+  </w:p>
   <w:p>
     <w:pPr>
       <w:pStyle w:val="Footer"/>
@@ -28056,6 +27883,46 @@
 
 <file path=word/footer2.xml><?xml version="1.0" encoding="utf-8"?>
 <w:ftr xmlns:wpc="http://schemas.microsoft.com/office/word/2010/wordprocessingCanvas" xmlns:cx="http://schemas.microsoft.com/office/drawing/2014/chartex" xmlns:cx1="http://schemas.microsoft.com/office/drawing/2015/9/8/chartex" xmlns:cx2="http://schemas.microsoft.com/office/drawing/2015/10/21/chartex" xmlns:cx3="http://schemas.microsoft.com/office/drawing/2016/5/9/chartex" xmlns:cx4="http://schemas.microsoft.com/office/drawing/2016/5/10/chartex" xmlns:cx5="http://schemas.microsoft.com/office/drawing/2016/5/11/chartex" xmlns:cx6="http://schemas.microsoft.com/office/drawing/2016/5/12/chartex" xmlns:cx7="http://schemas.microsoft.com/office/drawing/2016/5/13/chartex" xmlns:cx8="http://schemas.microsoft.com/office/drawing/2016/5/14/chartex" xmlns:mc="http://schemas.openxmlformats.org/markup-compatibility/2006" xmlns:aink="http://schemas.microsoft.com/office/drawing/2016/ink" xmlns:am3d="http://schemas.microsoft.com/office/drawing/2017/model3d" xmlns:o="urn:schemas-microsoft-com:office:office" xmlns:r="http://schemas.openxmlformats.org/officeDocument/2006/relationships" xmlns:m="http://schemas.openxmlformats.org/officeDocument/2006/math" xmlns:v="urn:schemas-microsoft-com:vml" xmlns:wp14="http://schemas.microsoft.com/office/word/2010/wordprocessingDrawing" xmlns:wp="http://schemas.openxmlformats.org/drawingml/2006/wordprocessingDrawing" xmlns:w10="urn:schemas-microsoft-com:office:word" xmlns:w="http://schemas.openxmlformats.org/wordprocessingml/2006/main" xmlns:w14="http://schemas.microsoft.com/office/word/2010/wordml" xmlns:w15="http://schemas.microsoft.com/office/word/2012/wordml" xmlns:w16cex="http://schemas.microsoft.com/office/word/2018/wordml/cex" xmlns:w16cid="http://schemas.microsoft.com/office/word/2016/wordml/cid" xmlns:w16="http://schemas.microsoft.com/office/word/2018/wordml" xmlns:w16sdtdh="http://schemas.microsoft.com/office/word/2020/wordml/sdtdatahash" xmlns:w16se="http://schemas.microsoft.com/office/word/2015/wordml/symex" xmlns:wpg="http://schemas.microsoft.com/office/word/2010/wordprocessingGroup" xmlns:wpi="http://schemas.microsoft.com/office/word/2010/wordprocessingInk" xmlns:wne="http://schemas.microsoft.com/office/word/2006/wordml" xmlns:wps="http://schemas.microsoft.com/office/word/2010/wordprocessingShape" mc:Ignorable="w14 w15 w16se w16cid w16 w16cex w16sdtdh wp14">
+  <w:p>
+    <w:pPr>
+      <w:pStyle w:val="Footer"/>
+      <w:framePr w:wrap="around" w:vAnchor="text" w:hAnchor="margin" w:xAlign="center" w:y="1"/>
+      <w:rPr>
+        <w:rStyle w:val="PageNumber"/>
+      </w:rPr>
+    </w:pPr>
+    <w:r>
+      <w:rPr>
+        <w:rStyle w:val="PageNumber"/>
+      </w:rPr>
+      <w:fldChar w:fldCharType="begin"/>
+    </w:r>
+    <w:r>
+      <w:rPr>
+        <w:rStyle w:val="PageNumber"/>
+      </w:rPr>
+      <w:instrText xml:space="preserve"> PAGE </w:instrText>
+    </w:r>
+    <w:r>
+      <w:rPr>
+        <w:rStyle w:val="PageNumber"/>
+      </w:rPr>
+      <w:fldChar w:fldCharType="separate"/>
+    </w:r>
+    <w:r>
+      <w:rPr>
+        <w:rStyle w:val="PageNumber"/>
+        <w:noProof/>
+      </w:rPr>
+      <w:t>vii</w:t>
+    </w:r>
+    <w:r>
+      <w:rPr>
+        <w:rStyle w:val="PageNumber"/>
+      </w:rPr>
+      <w:fldChar w:fldCharType="end"/>
+    </w:r>
+  </w:p>
   <w:p>
     <w:pPr>
       <w:pStyle w:val="BodyText"/>
@@ -28123,6 +27990,125 @@
 </w:ftr>
 </file>
 
+<file path=word/footer3.xml><?xml version="1.0" encoding="utf-8"?>
+<w:ftr xmlns:wpc="http://schemas.microsoft.com/office/word/2010/wordprocessingCanvas" xmlns:cx="http://schemas.microsoft.com/office/drawing/2014/chartex" xmlns:cx1="http://schemas.microsoft.com/office/drawing/2015/9/8/chartex" xmlns:cx2="http://schemas.microsoft.com/office/drawing/2015/10/21/chartex" xmlns:cx3="http://schemas.microsoft.com/office/drawing/2016/5/9/chartex" xmlns:cx4="http://schemas.microsoft.com/office/drawing/2016/5/10/chartex" xmlns:cx5="http://schemas.microsoft.com/office/drawing/2016/5/11/chartex" xmlns:cx6="http://schemas.microsoft.com/office/drawing/2016/5/12/chartex" xmlns:cx7="http://schemas.microsoft.com/office/drawing/2016/5/13/chartex" xmlns:cx8="http://schemas.microsoft.com/office/drawing/2016/5/14/chartex" xmlns:mc="http://schemas.openxmlformats.org/markup-compatibility/2006" xmlns:aink="http://schemas.microsoft.com/office/drawing/2016/ink" xmlns:am3d="http://schemas.microsoft.com/office/drawing/2017/model3d" xmlns:o="urn:schemas-microsoft-com:office:office" xmlns:r="http://schemas.openxmlformats.org/officeDocument/2006/relationships" xmlns:m="http://schemas.openxmlformats.org/officeDocument/2006/math" xmlns:v="urn:schemas-microsoft-com:vml" xmlns:wp14="http://schemas.microsoft.com/office/word/2010/wordprocessingDrawing" xmlns:wp="http://schemas.openxmlformats.org/drawingml/2006/wordprocessingDrawing" xmlns:w10="urn:schemas-microsoft-com:office:word" xmlns:w="http://schemas.openxmlformats.org/wordprocessingml/2006/main" xmlns:w14="http://schemas.microsoft.com/office/word/2010/wordml" xmlns:w15="http://schemas.microsoft.com/office/word/2012/wordml" xmlns:w16cex="http://schemas.microsoft.com/office/word/2018/wordml/cex" xmlns:w16cid="http://schemas.microsoft.com/office/word/2016/wordml/cid" xmlns:w16="http://schemas.microsoft.com/office/word/2018/wordml" xmlns:w16sdtdh="http://schemas.microsoft.com/office/word/2020/wordml/sdtdatahash" xmlns:w16se="http://schemas.microsoft.com/office/word/2015/wordml/symex" xmlns:wpg="http://schemas.microsoft.com/office/word/2010/wordprocessingGroup" xmlns:wpi="http://schemas.microsoft.com/office/word/2010/wordprocessingInk" xmlns:wne="http://schemas.microsoft.com/office/word/2006/wordml" xmlns:wps="http://schemas.microsoft.com/office/word/2010/wordprocessingShape" mc:Ignorable="w14 w15 w16se w16cid w16 w16cex w16sdtdh wp14">
+  <w:p>
+    <w:pPr>
+      <w:pStyle w:val="Footer"/>
+    </w:pPr>
+  </w:p>
+</w:ftr>
+</file>
+
+<file path=word/footer4.xml><?xml version="1.0" encoding="utf-8"?>
+<w:ftr xmlns:wpc="http://schemas.microsoft.com/office/word/2010/wordprocessingCanvas" xmlns:cx="http://schemas.microsoft.com/office/drawing/2014/chartex" xmlns:cx1="http://schemas.microsoft.com/office/drawing/2015/9/8/chartex" xmlns:cx2="http://schemas.microsoft.com/office/drawing/2015/10/21/chartex" xmlns:cx3="http://schemas.microsoft.com/office/drawing/2016/5/9/chartex" xmlns:cx4="http://schemas.microsoft.com/office/drawing/2016/5/10/chartex" xmlns:cx5="http://schemas.microsoft.com/office/drawing/2016/5/11/chartex" xmlns:cx6="http://schemas.microsoft.com/office/drawing/2016/5/12/chartex" xmlns:cx7="http://schemas.microsoft.com/office/drawing/2016/5/13/chartex" xmlns:cx8="http://schemas.microsoft.com/office/drawing/2016/5/14/chartex" xmlns:mc="http://schemas.openxmlformats.org/markup-compatibility/2006" xmlns:aink="http://schemas.microsoft.com/office/drawing/2016/ink" xmlns:am3d="http://schemas.microsoft.com/office/drawing/2017/model3d" xmlns:o="urn:schemas-microsoft-com:office:office" xmlns:r="http://schemas.openxmlformats.org/officeDocument/2006/relationships" xmlns:m="http://schemas.openxmlformats.org/officeDocument/2006/math" xmlns:v="urn:schemas-microsoft-com:vml" xmlns:wp14="http://schemas.microsoft.com/office/word/2010/wordprocessingDrawing" xmlns:wp="http://schemas.openxmlformats.org/drawingml/2006/wordprocessingDrawing" xmlns:w10="urn:schemas-microsoft-com:office:word" xmlns:w="http://schemas.openxmlformats.org/wordprocessingml/2006/main" xmlns:w14="http://schemas.microsoft.com/office/word/2010/wordml" xmlns:w15="http://schemas.microsoft.com/office/word/2012/wordml" xmlns:w16cex="http://schemas.microsoft.com/office/word/2018/wordml/cex" xmlns:w16cid="http://schemas.microsoft.com/office/word/2016/wordml/cid" xmlns:w16="http://schemas.microsoft.com/office/word/2018/wordml" xmlns:w16sdtdh="http://schemas.microsoft.com/office/word/2020/wordml/sdtdatahash" xmlns:w16se="http://schemas.microsoft.com/office/word/2015/wordml/symex" xmlns:wpg="http://schemas.microsoft.com/office/word/2010/wordprocessingGroup" xmlns:wpi="http://schemas.microsoft.com/office/word/2010/wordprocessingInk" xmlns:wne="http://schemas.microsoft.com/office/word/2006/wordml" xmlns:wps="http://schemas.microsoft.com/office/word/2010/wordprocessingShape" mc:Ignorable="w14 w15 w16se w16cid w16 w16cex w16sdtdh wp14">
+  <w:p>
+    <w:pPr>
+      <w:pStyle w:val="Footer"/>
+      <w:framePr w:wrap="around" w:vAnchor="text" w:hAnchor="margin" w:xAlign="center" w:y="1"/>
+      <w:rPr>
+        <w:rStyle w:val="PageNumber"/>
+      </w:rPr>
+    </w:pPr>
+    <w:r>
+      <w:rPr>
+        <w:rStyle w:val="PageNumber"/>
+      </w:rPr>
+      <w:fldChar w:fldCharType="begin"/>
+    </w:r>
+    <w:r>
+      <w:rPr>
+        <w:rStyle w:val="PageNumber"/>
+      </w:rPr>
+      <w:instrText xml:space="preserve"> PAGE </w:instrText>
+    </w:r>
+    <w:r>
+      <w:rPr>
+        <w:rStyle w:val="PageNumber"/>
+      </w:rPr>
+      <w:fldChar w:fldCharType="separate"/>
+    </w:r>
+    <w:r>
+      <w:rPr>
+        <w:rStyle w:val="PageNumber"/>
+        <w:noProof/>
+      </w:rPr>
+      <w:t>vii</w:t>
+    </w:r>
+    <w:r>
+      <w:rPr>
+        <w:rStyle w:val="PageNumber"/>
+      </w:rPr>
+      <w:fldChar w:fldCharType="end"/>
+    </w:r>
+  </w:p>
+  <w:p>
+    <w:pPr>
+      <w:pStyle w:val="BodyText"/>
+      <w:spacing w:line="14" w:lineRule="auto"/>
+      <w:rPr>
+        <w:sz w:val="20"/>
+      </w:rPr>
+    </w:pPr>
+    <w:r>
+      <w:rPr>
+        <w:noProof/>
+      </w:rPr>
+      <w:pict w14:anchorId="6521A8AA">
+        <v:shapetype id="_x0000_t202" coordsize="21600,21600" o:spt="202" path="m,l,21600r21600,l21600,xe">
+          <v:stroke joinstyle="miter"/>
+          <v:path gradientshapeok="t" o:connecttype="rect"/>
+        </v:shapetype>
+        <v:shape id="_x0000_s1027" type="#_x0000_t202" style="position:absolute;margin-left:304.85pt;margin-top:775.1pt;width:14pt;height:15.25pt;z-index:-251656704;visibility:visible;mso-wrap-distance-left:0;mso-wrap-distance-right:0;mso-position-horizontal-relative:page;mso-position-vertical-relative:page" o:gfxdata="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" filled="f" stroked="f">
+          <v:textbox style="mso-next-textbox:#_x0000_s1027" inset="0,0,0,0">
+            <w:txbxContent>
+              <w:p>
+                <w:pPr>
+                  <w:pStyle w:val="BodyText"/>
+                  <w:spacing w:before="9"/>
+                  <w:ind w:left="20"/>
+                </w:pPr>
+                <w:r>
+                  <w:rPr>
+                    <w:spacing w:val="-5"/>
+                  </w:rPr>
+                  <w:fldChar w:fldCharType="begin"/>
+                </w:r>
+                <w:r>
+                  <w:rPr>
+                    <w:spacing w:val="-5"/>
+                  </w:rPr>
+                  <w:instrText xml:space="preserve"> PAGE </w:instrText>
+                </w:r>
+                <w:r>
+                  <w:rPr>
+                    <w:spacing w:val="-5"/>
+                  </w:rPr>
+                  <w:fldChar w:fldCharType="separate"/>
+                </w:r>
+                <w:r>
+                  <w:rPr>
+                    <w:spacing w:val="-5"/>
+                  </w:rPr>
+                  <w:t>10</w:t>
+                </w:r>
+                <w:r>
+                  <w:rPr>
+                    <w:spacing w:val="-5"/>
+                  </w:rPr>
+                  <w:fldChar w:fldCharType="end"/>
+                </w:r>
+              </w:p>
+            </w:txbxContent>
+          </v:textbox>
+          <w10:wrap anchorx="page" anchory="page"/>
+        </v:shape>
+      </w:pict>
+    </w:r>
+  </w:p>
+</w:ftr>
+</file>
+
 <file path=word/footnotes.xml><?xml version="1.0" encoding="utf-8"?>
 <w:footnotes xmlns:wpc="http://schemas.microsoft.com/office/word/2010/wordprocessingCanvas" xmlns:cx="http://schemas.microsoft.com/office/drawing/2014/chartex" xmlns:cx1="http://schemas.microsoft.com/office/drawing/2015/9/8/chartex" xmlns:cx2="http://schemas.microsoft.com/office/drawing/2015/10/21/chartex" xmlns:cx3="http://schemas.microsoft.com/office/drawing/2016/5/9/chartex" xmlns:cx4="http://schemas.microsoft.com/office/drawing/2016/5/10/chartex" xmlns:cx5="http://schemas.microsoft.com/office/drawing/2016/5/11/chartex" xmlns:cx6="http://schemas.microsoft.com/office/drawing/2016/5/12/chartex" xmlns:cx7="http://schemas.microsoft.com/office/drawing/2016/5/13/chartex" xmlns:cx8="http://schemas.microsoft.com/office/drawing/2016/5/14/chartex" xmlns:mc="http://schemas.openxmlformats.org/markup-compatibility/2006" xmlns:aink="http://schemas.microsoft.com/office/drawing/2016/ink" xmlns:am3d="http://schemas.microsoft.com/office/drawing/2017/model3d" xmlns:o="urn:schemas-microsoft-com:office:office" xmlns:r="http://schemas.openxmlformats.org/officeDocument/2006/relationships" xmlns:m="http://schemas.openxmlformats.org/officeDocument/2006/math" xmlns:v="urn:schemas-microsoft-com:vml" xmlns:wp14="http://schemas.microsoft.com/office/word/2010/wordprocessingDrawing" xmlns:wp="http://schemas.openxmlformats.org/drawingml/2006/wordprocessingDrawing" xmlns:w10="urn:schemas-microsoft-com:office:word" xmlns:w="http://schemas.openxmlformats.org/wordprocessingml/2006/main" xmlns:w14="http://schemas.microsoft.com/office/word/2010/wordml" xmlns:w15="http://schemas.microsoft.com/office/word/2012/wordml" xmlns:w16cex="http://schemas.microsoft.com/office/word/2018/wordml/cex" xmlns:w16cid="http://schemas.microsoft.com/office/word/2016/wordml/cid" xmlns:w16="http://schemas.microsoft.com/office/word/2018/wordml" xmlns:w16sdtdh="http://schemas.microsoft.com/office/word/2020/wordml/sdtdatahash" xmlns:w16se="http://schemas.microsoft.com/office/word/2015/wordml/symex" xmlns:wpg="http://schemas.microsoft.com/office/word/2010/wordprocessingGroup" xmlns:wpi="http://schemas.microsoft.com/office/word/2010/wordprocessingInk" xmlns:wne="http://schemas.microsoft.com/office/word/2006/wordml" xmlns:wps="http://schemas.microsoft.com/office/word/2010/wordprocessingShape" mc:Ignorable="w14 w15 w16se w16cid w16 w16cex w16sdtdh wp14">
   <w:footnote w:type="separator" w:id="-1">
@@ -28140,6 +28126,36 @@
     </w:p>
   </w:footnote>
 </w:footnotes>
+</file>
+
+<file path=word/header1.xml><?xml version="1.0" encoding="utf-8"?>
+<w:hdr xmlns:wpc="http://schemas.microsoft.com/office/word/2010/wordprocessingCanvas" xmlns:cx="http://schemas.microsoft.com/office/drawing/2014/chartex" xmlns:cx1="http://schemas.microsoft.com/office/drawing/2015/9/8/chartex" xmlns:cx2="http://schemas.microsoft.com/office/drawing/2015/10/21/chartex" xmlns:cx3="http://schemas.microsoft.com/office/drawing/2016/5/9/chartex" xmlns:cx4="http://schemas.microsoft.com/office/drawing/2016/5/10/chartex" xmlns:cx5="http://schemas.microsoft.com/office/drawing/2016/5/11/chartex" xmlns:cx6="http://schemas.microsoft.com/office/drawing/2016/5/12/chartex" xmlns:cx7="http://schemas.microsoft.com/office/drawing/2016/5/13/chartex" xmlns:cx8="http://schemas.microsoft.com/office/drawing/2016/5/14/chartex" xmlns:mc="http://schemas.openxmlformats.org/markup-compatibility/2006" xmlns:aink="http://schemas.microsoft.com/office/drawing/2016/ink" xmlns:am3d="http://schemas.microsoft.com/office/drawing/2017/model3d" xmlns:o="urn:schemas-microsoft-com:office:office" xmlns:r="http://schemas.openxmlformats.org/officeDocument/2006/relationships" xmlns:m="http://schemas.openxmlformats.org/officeDocument/2006/math" xmlns:v="urn:schemas-microsoft-com:vml" xmlns:wp14="http://schemas.microsoft.com/office/word/2010/wordprocessingDrawing" xmlns:wp="http://schemas.openxmlformats.org/drawingml/2006/wordprocessingDrawing" xmlns:w10="urn:schemas-microsoft-com:office:word" xmlns:w="http://schemas.openxmlformats.org/wordprocessingml/2006/main" xmlns:w14="http://schemas.microsoft.com/office/word/2010/wordml" xmlns:w15="http://schemas.microsoft.com/office/word/2012/wordml" xmlns:w16cex="http://schemas.microsoft.com/office/word/2018/wordml/cex" xmlns:w16cid="http://schemas.microsoft.com/office/word/2016/wordml/cid" xmlns:w16="http://schemas.microsoft.com/office/word/2018/wordml" xmlns:w16sdtdh="http://schemas.microsoft.com/office/word/2020/wordml/sdtdatahash" xmlns:w16se="http://schemas.microsoft.com/office/word/2015/wordml/symex" xmlns:wpg="http://schemas.microsoft.com/office/word/2010/wordprocessingGroup" xmlns:wpi="http://schemas.microsoft.com/office/word/2010/wordprocessingInk" xmlns:wne="http://schemas.microsoft.com/office/word/2006/wordml" xmlns:wps="http://schemas.microsoft.com/office/word/2010/wordprocessingShape" mc:Ignorable="w14 w15 w16se w16cid w16 w16cex w16sdtdh wp14">
+  <w:p>
+    <w:pPr>
+      <w:pStyle w:val="Header"/>
+    </w:pPr>
+  </w:p>
+</w:hdr>
+</file>
+
+<file path=word/header2.xml><?xml version="1.0" encoding="utf-8"?>
+<w:hdr xmlns:wpc="http://schemas.microsoft.com/office/word/2010/wordprocessingCanvas" xmlns:cx="http://schemas.microsoft.com/office/drawing/2014/chartex" xmlns:cx1="http://schemas.microsoft.com/office/drawing/2015/9/8/chartex" xmlns:cx2="http://schemas.microsoft.com/office/drawing/2015/10/21/chartex" xmlns:cx3="http://schemas.microsoft.com/office/drawing/2016/5/9/chartex" xmlns:cx4="http://schemas.microsoft.com/office/drawing/2016/5/10/chartex" xmlns:cx5="http://schemas.microsoft.com/office/drawing/2016/5/11/chartex" xmlns:cx6="http://schemas.microsoft.com/office/drawing/2016/5/12/chartex" xmlns:cx7="http://schemas.microsoft.com/office/drawing/2016/5/13/chartex" xmlns:cx8="http://schemas.microsoft.com/office/drawing/2016/5/14/chartex" xmlns:mc="http://schemas.openxmlformats.org/markup-compatibility/2006" xmlns:aink="http://schemas.microsoft.com/office/drawing/2016/ink" xmlns:am3d="http://schemas.microsoft.com/office/drawing/2017/model3d" xmlns:o="urn:schemas-microsoft-com:office:office" xmlns:r="http://schemas.openxmlformats.org/officeDocument/2006/relationships" xmlns:m="http://schemas.openxmlformats.org/officeDocument/2006/math" xmlns:v="urn:schemas-microsoft-com:vml" xmlns:wp14="http://schemas.microsoft.com/office/word/2010/wordprocessingDrawing" xmlns:wp="http://schemas.openxmlformats.org/drawingml/2006/wordprocessingDrawing" xmlns:w10="urn:schemas-microsoft-com:office:word" xmlns:w="http://schemas.openxmlformats.org/wordprocessingml/2006/main" xmlns:w14="http://schemas.microsoft.com/office/word/2010/wordml" xmlns:w15="http://schemas.microsoft.com/office/word/2012/wordml" xmlns:w16cex="http://schemas.microsoft.com/office/word/2018/wordml/cex" xmlns:w16cid="http://schemas.microsoft.com/office/word/2016/wordml/cid" xmlns:w16="http://schemas.microsoft.com/office/word/2018/wordml" xmlns:w16sdtdh="http://schemas.microsoft.com/office/word/2020/wordml/sdtdatahash" xmlns:w16se="http://schemas.microsoft.com/office/word/2015/wordml/symex" xmlns:wpg="http://schemas.microsoft.com/office/word/2010/wordprocessingGroup" xmlns:wpi="http://schemas.microsoft.com/office/word/2010/wordprocessingInk" xmlns:wne="http://schemas.microsoft.com/office/word/2006/wordml" xmlns:wps="http://schemas.microsoft.com/office/word/2010/wordprocessingShape" mc:Ignorable="w14 w15 w16se w16cid w16 w16cex w16sdtdh wp14">
+  <w:p>
+    <w:pPr>
+      <w:pStyle w:val="Header"/>
+    </w:pPr>
+  </w:p>
+</w:hdr>
+</file>
+
+<file path=word/header3.xml><?xml version="1.0" encoding="utf-8"?>
+<w:hdr xmlns:wpc="http://schemas.microsoft.com/office/word/2010/wordprocessingCanvas" xmlns:cx="http://schemas.microsoft.com/office/drawing/2014/chartex" xmlns:cx1="http://schemas.microsoft.com/office/drawing/2015/9/8/chartex" xmlns:cx2="http://schemas.microsoft.com/office/drawing/2015/10/21/chartex" xmlns:cx3="http://schemas.microsoft.com/office/drawing/2016/5/9/chartex" xmlns:cx4="http://schemas.microsoft.com/office/drawing/2016/5/10/chartex" xmlns:cx5="http://schemas.microsoft.com/office/drawing/2016/5/11/chartex" xmlns:cx6="http://schemas.microsoft.com/office/drawing/2016/5/12/chartex" xmlns:cx7="http://schemas.microsoft.com/office/drawing/2016/5/13/chartex" xmlns:cx8="http://schemas.microsoft.com/office/drawing/2016/5/14/chartex" xmlns:mc="http://schemas.openxmlformats.org/markup-compatibility/2006" xmlns:aink="http://schemas.microsoft.com/office/drawing/2016/ink" xmlns:am3d="http://schemas.microsoft.com/office/drawing/2017/model3d" xmlns:o="urn:schemas-microsoft-com:office:office" xmlns:r="http://schemas.openxmlformats.org/officeDocument/2006/relationships" xmlns:m="http://schemas.openxmlformats.org/officeDocument/2006/math" xmlns:v="urn:schemas-microsoft-com:vml" xmlns:wp14="http://schemas.microsoft.com/office/word/2010/wordprocessingDrawing" xmlns:wp="http://schemas.openxmlformats.org/drawingml/2006/wordprocessingDrawing" xmlns:w10="urn:schemas-microsoft-com:office:word" xmlns:w="http://schemas.openxmlformats.org/wordprocessingml/2006/main" xmlns:w14="http://schemas.microsoft.com/office/word/2010/wordml" xmlns:w15="http://schemas.microsoft.com/office/word/2012/wordml" xmlns:w16cex="http://schemas.microsoft.com/office/word/2018/wordml/cex" xmlns:w16cid="http://schemas.microsoft.com/office/word/2016/wordml/cid" xmlns:w16="http://schemas.microsoft.com/office/word/2018/wordml" xmlns:w16sdtdh="http://schemas.microsoft.com/office/word/2020/wordml/sdtdatahash" xmlns:w16se="http://schemas.microsoft.com/office/word/2015/wordml/symex" xmlns:wpg="http://schemas.microsoft.com/office/word/2010/wordprocessingGroup" xmlns:wpi="http://schemas.microsoft.com/office/word/2010/wordprocessingInk" xmlns:wne="http://schemas.microsoft.com/office/word/2006/wordml" xmlns:wps="http://schemas.microsoft.com/office/word/2010/wordprocessingShape" mc:Ignorable="w14 w15 w16se w16cid w16 w16cex w16sdtdh wp14">
+  <w:p>
+    <w:pPr>
+      <w:pStyle w:val="Header"/>
+    </w:pPr>
+  </w:p>
+</w:hdr>
 </file>
 
 <file path=word/numbering.xml><?xml version="1.0" encoding="utf-8"?>
@@ -34626,6 +34642,14 @@
       </w:tblBorders>
     </w:tblPr>
   </w:style>
+  <w:style w:type="character" w:styleId="PageNumber">
+    <w:name w:val="page number"/>
+    <w:basedOn w:val="DefaultParagraphFont"/>
+    <w:uiPriority w:val="99"/>
+    <w:semiHidden/>
+    <w:unhideWhenUsed/>
+    <w:rsid w:val="00D87F3F"/>
+  </w:style>
 </w:styles>
 </file>
 

</xml_diff>

<commit_message>
Replace raw diagram placeholders in Bab III with professional academic note
</commit_message>
<xml_diff>
--- a/File Skripsi/Sri Darni.docx
+++ b/File Skripsi/Sri Darni.docx
@@ -22682,28 +22682,12 @@
       </w:pPr>
       <w:r>
         <w:rPr>
-          <w:b/>
-          <w:bCs/>
-          <w:color w:val="000000" w:themeColor="text1"/>
-        </w:rPr>
-        <w:t xml:space="preserve">[GAMBAR </w:t>
-      </w:r>
-      <w:r>
-        <w:rPr>
-          <w:b/>
-          <w:bCs/>
+          <w:rFonts w:ascii="Times New Roman" w:hAnsi="Times New Roman"/>
           <w:i/>
-          <w:color w:val="000000" w:themeColor="text1"/>
-        </w:rPr>
-        <w:t>OUTER MODEL</w:t>
-      </w:r>
-      <w:r>
-        <w:rPr>
-          <w:b/>
-          <w:bCs/>
-          <w:color w:val="000000" w:themeColor="text1"/>
-        </w:rPr>
-        <w:t xml:space="preserve"> Y DISINI]</w:t>
+          <w:color w:val="505050"/>
+          <w:sz w:val="22"/>
+        </w:rPr>
+        <w:t>(Tampilan diagram model akan disajikan setelah pengolahan data kuesioner pada Bab IV)</w:t>
       </w:r>
     </w:p>
     <w:p>
@@ -22830,89 +22814,15 @@
       </w:pPr>
       <w:r>
         <w:rPr>
-          <w:b/>
-          <w:bCs/>
-          <w:color w:val="000000" w:themeColor="text1"/>
-        </w:rPr>
-        <w:t xml:space="preserve">[GAMBAR </w:t>
-      </w:r>
-      <w:r>
-        <w:rPr>
-          <w:b/>
-          <w:bCs/>
+          <w:rFonts w:ascii="Times New Roman" w:hAnsi="Times New Roman"/>
           <w:i/>
-          <w:color w:val="000000" w:themeColor="text1"/>
-        </w:rPr>
-        <w:t>OUTER MODEL</w:t>
-      </w:r>
-      <w:r>
-        <w:rPr>
-          <w:b/>
-          <w:bCs/>
-          <w:color w:val="000000" w:themeColor="text1"/>
-        </w:rPr>
-        <w:t xml:space="preserve"> X1 DISINI]</w:t>
-      </w:r>
-      <w:r>
-        <w:rPr>
-          <w:b/>
-          <w:bCs/>
-          <w:color w:val="000000" w:themeColor="text1"/>
-        </w:rPr>
+          <w:color w:val="505050"/>
+          <w:sz w:val="22"/>
+        </w:rPr>
+        <w:t>(Tampilan diagram model akan disajikan setelah pengolahan data kuesioner pada Bab IV)</w:t>
         <w:br/>
-      </w:r>
-      <w:r>
-        <w:rPr>
-          <w:i/>
-          <w:iCs/>
-          <w:color w:val="000000" w:themeColor="text1"/>
-          <w:sz w:val="22"/>
-          <w:szCs w:val="22"/>
-        </w:rPr>
-        <w:t>Gambar 3.2</w:t>
-      </w:r>
-      <w:r>
-        <w:rPr>
-          <w:i/>
-          <w:iCs/>
-          <w:color w:val="000000" w:themeColor="text1"/>
-          <w:sz w:val="22"/>
-          <w:szCs w:val="22"/>
-        </w:rPr>
-        <w:t xml:space="preserve"> </w:t>
-      </w:r>
-      <w:r>
-        <w:rPr>
-          <w:i/>
-          <w:iCs/>
-          <w:color w:val="000000" w:themeColor="text1"/>
-          <w:sz w:val="22"/>
-          <w:szCs w:val="22"/>
-        </w:rPr>
-        <w:t>Outer model</w:t>
-      </w:r>
-      <w:r>
-        <w:rPr>
-          <w:color w:val="000000" w:themeColor="text1"/>
-          <w:sz w:val="22"/>
-          <w:szCs w:val="22"/>
-        </w:rPr>
-        <w:t xml:space="preserve"> variabel independen (X1)</w:t>
-      </w:r>
-      <w:r>
-        <w:rPr>
-          <w:color w:val="000000" w:themeColor="text1"/>
-          <w:sz w:val="22"/>
-          <w:szCs w:val="22"/>
-        </w:rPr>
+        <w:t>Gambar 3.2 Outer model variabel independen (X1)</w:t>
         <w:br/>
-      </w:r>
-      <w:r>
-        <w:rPr>
-          <w:b/>
-          <w:bCs/>
-          <w:color w:val="000000" w:themeColor="text1"/>
-        </w:rPr>
         <w:t>Sumber: Data primer diolah, 2026</w:t>
       </w:r>
     </w:p>
@@ -22960,45 +22870,106 @@
       </w:pPr>
       <w:r>
         <w:rPr>
+          <w:rFonts w:ascii="Times New Roman" w:hAnsi="Times New Roman"/>
+          <w:i/>
+          <w:color w:val="505050"/>
+          <w:sz w:val="22"/>
+        </w:rPr>
+        <w:t>(Tampilan diagram model akan disajikan setelah pengolahan data kuesioner pada Bab IV)</w:t>
+        <w:br/>
+        <w:t>Gambar 3.3</w:t>
+        <w:br/>
+        <w:t>Outer model variabel independen (X2)</w:t>
+        <w:br/>
+        <w:t>Sumber: Data primer diolah, 2026</w:t>
+      </w:r>
+    </w:p>
+    <w:p>
+      <w:pPr>
+        <w:pStyle w:val="NormalWeb"/>
+        <w:spacing w:before="2" w:beforeAutospacing="0" w:after="75" w:line="360" w:lineRule="auto"/>
+        <w:ind w:left="1418" w:right="1089" w:firstLine="567"/>
+        <w:jc w:val="both"/>
+        <w:rPr>
+          <w:color w:val="000000" w:themeColor="text1"/>
+        </w:rPr>
+      </w:pPr>
+      <w:r>
+        <w:rPr>
+          <w:color w:val="000000" w:themeColor="text1"/>
+        </w:rPr>
+        <w:t>F.1.d.    </w:t>
+      </w:r>
+      <w:r>
+        <w:rPr>
+          <w:i/>
+          <w:color w:val="000000" w:themeColor="text1"/>
+        </w:rPr>
+        <w:t>Outer model</w:t>
+      </w:r>
+      <w:r>
+        <w:rPr>
+          <w:color w:val="000000" w:themeColor="text1"/>
+        </w:rPr>
+        <w:t xml:space="preserve"> Variabel </w:t>
+      </w:r>
+      <w:r>
+        <w:rPr>
+          <w:color w:val="000000" w:themeColor="text1"/>
+        </w:rPr>
+        <w:t>Mediasi</w:t>
+      </w:r>
+    </w:p>
+    <w:p>
+      <w:pPr>
+        <w:pStyle w:val="NormalWeb"/>
+        <w:spacing w:before="2" w:beforeAutospacing="0" w:after="300" w:line="360" w:lineRule="auto"/>
+        <w:ind w:left="567" w:right="1089"/>
+        <w:jc w:val="center"/>
+        <w:rPr>
           <w:b/>
           <w:bCs/>
           <w:color w:val="000000" w:themeColor="text1"/>
         </w:rPr>
-        <w:t xml:space="preserve">[GAMBAR </w:t>
-      </w:r>
-      <w:r>
+      </w:pPr>
+      <w:r>
+        <w:rPr>
+          <w:rFonts w:ascii="Times New Roman" w:hAnsi="Times New Roman"/>
+          <w:i/>
+          <w:color w:val="505050"/>
+          <w:sz w:val="22"/>
+        </w:rPr>
+        <w:t>(Tampilan diagram model akan disajikan setelah pengolahan data kuesioner pada Bab IV)</w:t>
+        <w:br/>
+        <w:t>Gambar 3.4</w:t>
+        <w:br/>
+        <w:t>Outer model variabel Mediasi (Z)</w:t>
+        <w:br/>
+        <w:t>Sumber: Data primer diolah, 2026</w:t>
+      </w:r>
+    </w:p>
+    <w:p>
+      <w:pPr>
+        <w:spacing w:before="2" w:line="360" w:lineRule="auto"/>
+        <w:ind w:left="993" w:right="1089"/>
+        <w:jc w:val="both"/>
         <w:rPr>
           <w:b/>
           <w:bCs/>
-          <w:i/>
-          <w:color w:val="000000" w:themeColor="text1"/>
-        </w:rPr>
-        <w:t>OUTER MODEL</w:t>
-      </w:r>
+          <w:color w:val="000000" w:themeColor="text1"/>
+          <w:sz w:val="24"/>
+          <w:szCs w:val="24"/>
+        </w:rPr>
+      </w:pPr>
       <w:r>
         <w:rPr>
           <w:b/>
           <w:bCs/>
           <w:color w:val="000000" w:themeColor="text1"/>
-        </w:rPr>
-        <w:t xml:space="preserve"> X2 DISINI]</w:t>
-      </w:r>
-      <w:r>
-        <w:rPr>
-          <w:b/>
-          <w:bCs/>
-          <w:color w:val="000000" w:themeColor="text1"/>
-        </w:rPr>
-        <w:br/>
-        <w:t>Gambar 3.3</w:t>
-      </w:r>
-      <w:r>
-        <w:rPr>
-          <w:b/>
-          <w:bCs/>
-          <w:color w:val="000000" w:themeColor="text1"/>
-        </w:rPr>
-        <w:br/>
+          <w:sz w:val="24"/>
+          <w:szCs w:val="24"/>
+        </w:rPr>
+        <w:t>F.2.    Merancang Model Struktural (</w:t>
       </w:r>
       <w:r>
         <w:rPr>
@@ -23007,61 +22978,132 @@
           <w:i/>
           <w:iCs/>
           <w:color w:val="000000" w:themeColor="text1"/>
-        </w:rPr>
-        <w:t>Outer model</w:t>
+          <w:sz w:val="24"/>
+          <w:szCs w:val="24"/>
+        </w:rPr>
+        <w:t>Inner model</w:t>
       </w:r>
       <w:r>
         <w:rPr>
           <w:b/>
           <w:bCs/>
           <w:color w:val="000000" w:themeColor="text1"/>
-        </w:rPr>
-        <w:t xml:space="preserve"> variabel independen (X2)</w:t>
-      </w:r>
-      <w:r>
-        <w:rPr>
-          <w:b/>
-          <w:bCs/>
-          <w:color w:val="000000" w:themeColor="text1"/>
-        </w:rPr>
-        <w:br/>
-        <w:t>Sumber: Data primer diolah, 2026</w:t>
-      </w:r>
-    </w:p>
-    <w:p>
-      <w:pPr>
-        <w:pStyle w:val="NormalWeb"/>
-        <w:spacing w:before="2" w:beforeAutospacing="0" w:after="75" w:line="360" w:lineRule="auto"/>
-        <w:ind w:left="1418" w:right="1089" w:firstLine="567"/>
+          <w:sz w:val="24"/>
+          <w:szCs w:val="24"/>
+        </w:rPr>
+        <w:t>)</w:t>
+      </w:r>
+    </w:p>
+    <w:p>
+      <w:pPr>
+        <w:spacing w:before="2" w:line="360" w:lineRule="auto"/>
+        <w:ind w:left="1701" w:right="1089" w:firstLine="850"/>
         <w:jc w:val="both"/>
         <w:rPr>
           <w:color w:val="000000" w:themeColor="text1"/>
-        </w:rPr>
-      </w:pPr>
-      <w:r>
-        <w:rPr>
-          <w:color w:val="000000" w:themeColor="text1"/>
-        </w:rPr>
-        <w:t>F.1.d.    </w:t>
+          <w:sz w:val="24"/>
+          <w:szCs w:val="24"/>
+        </w:rPr>
+      </w:pPr>
+      <w:r>
+        <w:rPr>
+          <w:color w:val="000000" w:themeColor="text1"/>
+          <w:sz w:val="24"/>
+          <w:szCs w:val="24"/>
+        </w:rPr>
+        <w:t xml:space="preserve">Ghozali (2021:9) menyatakan, </w:t>
       </w:r>
       <w:r>
         <w:rPr>
           <w:i/>
-          <w:color w:val="000000" w:themeColor="text1"/>
-        </w:rPr>
-        <w:t>Outer model</w:t>
-      </w:r>
-      <w:r>
-        <w:rPr>
-          <w:color w:val="000000" w:themeColor="text1"/>
-        </w:rPr>
-        <w:t xml:space="preserve"> Variabel </w:t>
-      </w:r>
-      <w:r>
-        <w:rPr>
-          <w:color w:val="000000" w:themeColor="text1"/>
-        </w:rPr>
-        <w:t>Mediasi</w:t>
+          <w:iCs/>
+          <w:color w:val="000000" w:themeColor="text1"/>
+          <w:sz w:val="24"/>
+          <w:szCs w:val="24"/>
+        </w:rPr>
+        <w:t>Inner model</w:t>
+      </w:r>
+      <w:r>
+        <w:rPr>
+          <w:color w:val="000000" w:themeColor="text1"/>
+          <w:sz w:val="24"/>
+          <w:szCs w:val="24"/>
+        </w:rPr>
+        <w:t xml:space="preserve"> atau model struktural menunjukkan hubungan atau kekuatan estimasi antar variabel laten atau konstruk berdasarkan pada </w:t>
+      </w:r>
+      <w:r>
+        <w:rPr>
+          <w:i/>
+          <w:iCs/>
+          <w:color w:val="000000" w:themeColor="text1"/>
+          <w:sz w:val="24"/>
+          <w:szCs w:val="24"/>
+        </w:rPr>
+        <w:t>substantive theory</w:t>
+      </w:r>
+      <w:r>
+        <w:rPr>
+          <w:color w:val="000000" w:themeColor="text1"/>
+          <w:sz w:val="24"/>
+          <w:szCs w:val="24"/>
+        </w:rPr>
+        <w:t>.</w:t>
+      </w:r>
+    </w:p>
+    <w:p>
+      <w:pPr>
+        <w:spacing w:before="2" w:line="360" w:lineRule="auto"/>
+        <w:ind w:left="1701" w:right="1089" w:firstLine="850"/>
+        <w:jc w:val="both"/>
+        <w:rPr>
+          <w:color w:val="000000" w:themeColor="text1"/>
+          <w:sz w:val="24"/>
+          <w:szCs w:val="24"/>
+        </w:rPr>
+      </w:pPr>
+      <w:r>
+        <w:rPr>
+          <w:color w:val="000000" w:themeColor="text1"/>
+          <w:sz w:val="24"/>
+          <w:szCs w:val="24"/>
+        </w:rPr>
+        <w:t xml:space="preserve">Noor (2015:147), menjelaskan bahwa </w:t>
+      </w:r>
+      <w:r>
+        <w:rPr>
+          <w:i/>
+          <w:iCs/>
+          <w:color w:val="000000" w:themeColor="text1"/>
+          <w:sz w:val="24"/>
+          <w:szCs w:val="24"/>
+        </w:rPr>
+        <w:t>inner model</w:t>
+      </w:r>
+      <w:r>
+        <w:rPr>
+          <w:color w:val="000000" w:themeColor="text1"/>
+          <w:sz w:val="24"/>
+          <w:szCs w:val="24"/>
+        </w:rPr>
+        <w:t xml:space="preserve"> atau model struktural menggambarkan hubungan antar variabel laten berdasarkan </w:t>
+      </w:r>
+      <w:r>
+        <w:rPr>
+          <w:i/>
+          <w:iCs/>
+          <w:color w:val="000000" w:themeColor="text1"/>
+          <w:sz w:val="24"/>
+          <w:szCs w:val="24"/>
+        </w:rPr>
+        <w:t>substantive theory</w:t>
+      </w:r>
+      <w:r>
+        <w:rPr>
+          <w:color w:val="000000" w:themeColor="text1"/>
+          <w:sz w:val="24"/>
+          <w:szCs w:val="24"/>
+        </w:rPr>
+        <w:t>. Perancangan model struktural hubungan antar variabel laten didasarkan pada rumusan masalah atau hipotesis penelitian.</w:t>
       </w:r>
     </w:p>
     <w:p>
@@ -23078,88 +23120,16 @@
       </w:pPr>
       <w:r>
         <w:rPr>
-          <w:b/>
-          <w:bCs/>
-          <w:color w:val="000000" w:themeColor="text1"/>
-        </w:rPr>
-        <w:t xml:space="preserve">[GAMBAR </w:t>
-      </w:r>
-      <w:r>
-        <w:rPr>
-          <w:b/>
-          <w:bCs/>
+          <w:rFonts w:ascii="Times New Roman" w:hAnsi="Times New Roman"/>
           <w:i/>
-          <w:color w:val="000000" w:themeColor="text1"/>
-        </w:rPr>
-        <w:t>OUTER MODEL</w:t>
-      </w:r>
-      <w:r>
-        <w:rPr>
-          <w:b/>
-          <w:bCs/>
-          <w:color w:val="000000" w:themeColor="text1"/>
-        </w:rPr>
-        <w:t xml:space="preserve"> Z DISINI]</w:t>
-      </w:r>
-      <w:r>
-        <w:rPr>
-          <w:b/>
-          <w:bCs/>
-          <w:color w:val="000000" w:themeColor="text1"/>
-        </w:rPr>
+          <w:color w:val="505050"/>
+          <w:sz w:val="22"/>
+        </w:rPr>
+        <w:t>(Tampilan diagram model akan disajikan setelah pengolahan data kuesioner pada Bab IV)</w:t>
         <w:br/>
-        <w:t>Gambar 3.4</w:t>
-      </w:r>
-      <w:r>
-        <w:rPr>
-          <w:b/>
-          <w:bCs/>
-          <w:color w:val="000000" w:themeColor="text1"/>
-        </w:rPr>
+        <w:t>Gambar 3.5</w:t>
         <w:br/>
-      </w:r>
-      <w:r>
-        <w:rPr>
-          <w:b/>
-          <w:bCs/>
-          <w:i/>
-          <w:iCs/>
-          <w:color w:val="000000" w:themeColor="text1"/>
-        </w:rPr>
-        <w:t>Outer model</w:t>
-      </w:r>
-      <w:r>
-        <w:rPr>
-          <w:b/>
-          <w:bCs/>
-          <w:color w:val="000000" w:themeColor="text1"/>
-        </w:rPr>
-        <w:t xml:space="preserve"> variabel </w:t>
-      </w:r>
-      <w:r>
-        <w:rPr>
-          <w:b/>
-          <w:bCs/>
-          <w:i/>
-          <w:iCs/>
-          <w:color w:val="000000" w:themeColor="text1"/>
-        </w:rPr>
-        <w:t>Mediasi</w:t>
-      </w:r>
-      <w:r>
-        <w:rPr>
-          <w:b/>
-          <w:bCs/>
-          <w:color w:val="000000" w:themeColor="text1"/>
-        </w:rPr>
-        <w:t xml:space="preserve"> (Z)</w:t>
-      </w:r>
-      <w:r>
-        <w:rPr>
-          <w:b/>
-          <w:bCs/>
-          <w:color w:val="000000" w:themeColor="text1"/>
-        </w:rPr>
+        <w:t>Inner model variabel Dependen, Independen, dan Mediasi</w:t>
         <w:br/>
         <w:t>Sumber: Data primer diolah, 2026</w:t>
       </w:r>
@@ -23185,29 +23155,7 @@
           <w:sz w:val="24"/>
           <w:szCs w:val="24"/>
         </w:rPr>
-        <w:t>F.2.    Merancang Model Struktural (</w:t>
-      </w:r>
-      <w:r>
-        <w:rPr>
-          <w:b/>
-          <w:bCs/>
-          <w:i/>
-          <w:iCs/>
-          <w:color w:val="000000" w:themeColor="text1"/>
-          <w:sz w:val="24"/>
-          <w:szCs w:val="24"/>
-        </w:rPr>
-        <w:t>Inner model</w:t>
-      </w:r>
-      <w:r>
-        <w:rPr>
-          <w:b/>
-          <w:bCs/>
-          <w:color w:val="000000" w:themeColor="text1"/>
-          <w:sz w:val="24"/>
-          <w:szCs w:val="24"/>
-        </w:rPr>
-        <w:t>)</w:t>
+        <w:t>F.3.    Mengkonstruksikan Diagram Jalur</w:t>
       </w:r>
     </w:p>
     <w:p>
@@ -23227,99 +23175,7 @@
           <w:sz w:val="24"/>
           <w:szCs w:val="24"/>
         </w:rPr>
-        <w:t xml:space="preserve">Ghozali (2021:9) menyatakan, </w:t>
-      </w:r>
-      <w:r>
-        <w:rPr>
-          <w:i/>
-          <w:iCs/>
-          <w:color w:val="000000" w:themeColor="text1"/>
-          <w:sz w:val="24"/>
-          <w:szCs w:val="24"/>
-        </w:rPr>
-        <w:t>Inner model</w:t>
-      </w:r>
-      <w:r>
-        <w:rPr>
-          <w:color w:val="000000" w:themeColor="text1"/>
-          <w:sz w:val="24"/>
-          <w:szCs w:val="24"/>
-        </w:rPr>
-        <w:t xml:space="preserve"> atau model struktural menunjukkan hubungan atau kekuatan estimasi antar variabel laten atau konstruk berdasarkan pada </w:t>
-      </w:r>
-      <w:r>
-        <w:rPr>
-          <w:i/>
-          <w:iCs/>
-          <w:color w:val="000000" w:themeColor="text1"/>
-          <w:sz w:val="24"/>
-          <w:szCs w:val="24"/>
-        </w:rPr>
-        <w:t>substantive theory</w:t>
-      </w:r>
-      <w:r>
-        <w:rPr>
-          <w:color w:val="000000" w:themeColor="text1"/>
-          <w:sz w:val="24"/>
-          <w:szCs w:val="24"/>
-        </w:rPr>
-        <w:t>.</w:t>
-      </w:r>
-    </w:p>
-    <w:p>
-      <w:pPr>
-        <w:spacing w:before="2" w:line="360" w:lineRule="auto"/>
-        <w:ind w:left="1701" w:right="1089" w:firstLine="850"/>
-        <w:jc w:val="both"/>
-        <w:rPr>
-          <w:color w:val="000000" w:themeColor="text1"/>
-          <w:sz w:val="24"/>
-          <w:szCs w:val="24"/>
-        </w:rPr>
-      </w:pPr>
-      <w:r>
-        <w:rPr>
-          <w:color w:val="000000" w:themeColor="text1"/>
-          <w:sz w:val="24"/>
-          <w:szCs w:val="24"/>
-        </w:rPr>
-        <w:t xml:space="preserve">Noor (2015:147), menjelaskan bahwa </w:t>
-      </w:r>
-      <w:r>
-        <w:rPr>
-          <w:i/>
-          <w:iCs/>
-          <w:color w:val="000000" w:themeColor="text1"/>
-          <w:sz w:val="24"/>
-          <w:szCs w:val="24"/>
-        </w:rPr>
-        <w:t>inner model</w:t>
-      </w:r>
-      <w:r>
-        <w:rPr>
-          <w:color w:val="000000" w:themeColor="text1"/>
-          <w:sz w:val="24"/>
-          <w:szCs w:val="24"/>
-        </w:rPr>
-        <w:t xml:space="preserve"> atau model struktural menggambarkan hubungan antar variabel laten berdasarkan </w:t>
-      </w:r>
-      <w:r>
-        <w:rPr>
-          <w:i/>
-          <w:iCs/>
-          <w:color w:val="000000" w:themeColor="text1"/>
-          <w:sz w:val="24"/>
-          <w:szCs w:val="24"/>
-        </w:rPr>
-        <w:t>substantive theory</w:t>
-      </w:r>
-      <w:r>
-        <w:rPr>
-          <w:color w:val="000000" w:themeColor="text1"/>
-          <w:sz w:val="24"/>
-          <w:szCs w:val="24"/>
-        </w:rPr>
-        <w:t>. Perancangan model struktural hubungan antar variabel laten didasarkan pada rumusan masalah atau hipotesis penelitian.</w:t>
+        <w:t>Diagram jalur untuk penelitian ini digambarkan sebagai berikut:</w:t>
       </w:r>
     </w:p>
     <w:p>
@@ -23336,190 +23192,16 @@
       </w:pPr>
       <w:r>
         <w:rPr>
-          <w:b/>
-          <w:bCs/>
-          <w:color w:val="000000" w:themeColor="text1"/>
-        </w:rPr>
-        <w:t xml:space="preserve">[GAMBAR </w:t>
-      </w:r>
-      <w:r>
-        <w:rPr>
-          <w:b/>
-          <w:bCs/>
+          <w:rFonts w:ascii="Times New Roman" w:hAnsi="Times New Roman"/>
           <w:i/>
-          <w:color w:val="000000" w:themeColor="text1"/>
-        </w:rPr>
-        <w:t>INNER MODEL</w:t>
-      </w:r>
-      <w:r>
-        <w:rPr>
-          <w:b/>
-          <w:bCs/>
-          <w:color w:val="000000" w:themeColor="text1"/>
-        </w:rPr>
-        <w:t xml:space="preserve"> DISINI]</w:t>
-      </w:r>
-      <w:r>
-        <w:rPr>
-          <w:b/>
-          <w:bCs/>
-          <w:color w:val="000000" w:themeColor="text1"/>
-        </w:rPr>
-        <w:br/>
-        <w:t>Gambar 3.5</w:t>
-      </w:r>
-      <w:r>
-        <w:rPr>
-          <w:b/>
-          <w:bCs/>
-          <w:color w:val="000000" w:themeColor="text1"/>
-        </w:rPr>
-        <w:br/>
-      </w:r>
-      <w:r>
-        <w:rPr>
-          <w:b/>
-          <w:bCs/>
-          <w:i/>
-          <w:iCs/>
-          <w:color w:val="000000" w:themeColor="text1"/>
-        </w:rPr>
-        <w:t>Inner model</w:t>
-      </w:r>
-      <w:r>
-        <w:rPr>
-          <w:b/>
-          <w:bCs/>
-          <w:color w:val="000000" w:themeColor="text1"/>
-        </w:rPr>
-        <w:t xml:space="preserve"> variabel Dependen, Independen, dan </w:t>
-      </w:r>
-      <w:r>
-        <w:rPr>
-          <w:b/>
-          <w:bCs/>
-          <w:i/>
-          <w:iCs/>
-          <w:color w:val="000000" w:themeColor="text1"/>
-        </w:rPr>
-        <w:t>Mediasi</w:t>
-      </w:r>
-      <w:r>
-        <w:rPr>
-          <w:b/>
-          <w:bCs/>
-          <w:color w:val="000000" w:themeColor="text1"/>
-        </w:rPr>
-        <w:br/>
-        <w:t>Sumber: Data primer diolah, 2026</w:t>
-      </w:r>
-    </w:p>
-    <w:p>
-      <w:pPr>
-        <w:spacing w:before="2" w:line="360" w:lineRule="auto"/>
-        <w:ind w:left="993" w:right="1089"/>
-        <w:jc w:val="both"/>
-        <w:rPr>
-          <w:b/>
-          <w:bCs/>
-          <w:color w:val="000000" w:themeColor="text1"/>
-          <w:sz w:val="24"/>
-          <w:szCs w:val="24"/>
-        </w:rPr>
-      </w:pPr>
-      <w:r>
-        <w:rPr>
-          <w:b/>
-          <w:bCs/>
-          <w:color w:val="000000" w:themeColor="text1"/>
-          <w:sz w:val="24"/>
-          <w:szCs w:val="24"/>
-        </w:rPr>
-        <w:t>F.3.    Mengkonstruksikan Diagram Jalur</w:t>
-      </w:r>
-    </w:p>
-    <w:p>
-      <w:pPr>
-        <w:spacing w:before="2" w:line="360" w:lineRule="auto"/>
-        <w:ind w:left="1701" w:right="1089" w:firstLine="850"/>
-        <w:jc w:val="both"/>
-        <w:rPr>
-          <w:color w:val="000000" w:themeColor="text1"/>
-          <w:sz w:val="24"/>
-          <w:szCs w:val="24"/>
-        </w:rPr>
-      </w:pPr>
-      <w:r>
-        <w:rPr>
-          <w:color w:val="000000" w:themeColor="text1"/>
-          <w:sz w:val="24"/>
-          <w:szCs w:val="24"/>
-        </w:rPr>
-        <w:t>Diagram jalur untuk penelitian ini digambarkan sebagai berikut:</w:t>
-      </w:r>
-    </w:p>
-    <w:p>
-      <w:pPr>
-        <w:pStyle w:val="NormalWeb"/>
-        <w:spacing w:before="2" w:beforeAutospacing="0" w:after="300" w:line="360" w:lineRule="auto"/>
-        <w:ind w:left="567" w:right="1089"/>
-        <w:jc w:val="center"/>
-        <w:rPr>
-          <w:b/>
-          <w:bCs/>
-          <w:color w:val="000000" w:themeColor="text1"/>
-        </w:rPr>
-      </w:pPr>
-      <w:r>
-        <w:rPr>
-          <w:b/>
-          <w:bCs/>
-          <w:color w:val="000000" w:themeColor="text1"/>
-        </w:rPr>
-        <w:t>[GAMBAR DIAGRAM JALUR DISINI]</w:t>
-      </w:r>
-      <w:r>
-        <w:rPr>
-          <w:b/>
-          <w:bCs/>
-          <w:color w:val="000000" w:themeColor="text1"/>
-        </w:rPr>
+          <w:color w:val="505050"/>
+          <w:sz w:val="22"/>
+        </w:rPr>
+        <w:t>(Tampilan diagram model akan disajikan setelah pengolahan data kuesioner pada Bab IV)</w:t>
         <w:br/>
         <w:t>Gambar 3.6</w:t>
-      </w:r>
-      <w:r>
-        <w:rPr>
-          <w:b/>
-          <w:bCs/>
-          <w:color w:val="000000" w:themeColor="text1"/>
-        </w:rPr>
         <w:br/>
-        <w:t>Diagram Jalur (</w:t>
-      </w:r>
-      <w:r>
-        <w:rPr>
-          <w:b/>
-          <w:bCs/>
-          <w:i/>
-          <w:iCs/>
-          <w:color w:val="000000" w:themeColor="text1"/>
-        </w:rPr>
-        <w:t>Path diagram</w:t>
-      </w:r>
-      <w:r>
-        <w:rPr>
-          <w:b/>
-          <w:bCs/>
-          <w:color w:val="000000" w:themeColor="text1"/>
-        </w:rPr>
-        <w:t>)</w:t>
-      </w:r>
-      <w:r>
-        <w:rPr>
-          <w:b/>
-          <w:bCs/>
-          <w:color w:val="000000" w:themeColor="text1"/>
-        </w:rPr>
+        <w:t>Diagram Jalur (Path diagram)</w:t>
         <w:br/>
         <w:t>Sumber: Noor, 2015:147</w:t>
       </w:r>

</xml_diff>

<commit_message>
Update population number to 35 in Sri Darni.docx
</commit_message>
<xml_diff>
--- a/File Skripsi/Sri Darni.docx
+++ b/File Skripsi/Sri Darni.docx
@@ -21178,12 +21178,7 @@
         </w:rPr>
       </w:pPr>
       <w:r>
-        <w:rPr>
-          <w:color w:val="000000" w:themeColor="text1"/>
-          <w:sz w:val="24"/>
-          <w:szCs w:val="24"/>
-        </w:rPr>
-        <w:t>Populasi dalam penelitian ini adalah seluruh perangkat desa di Kantor Desa Pisangan Jaya, Kabupaten Tangerang pada saat penyebaran kuesioner ini dilakukan yaitu bulan Juni - Juli 2026, berjumlah [Jumlah] orang.</w:t>
+        <w:t>Populasi dalam penelitian ini adalah seluruh perangkat desa di Kantor Desa Pisangan Jaya, Kabupaten Tangerang pada saat penyebaran kuesioner ini dilakukan yaitu bulan Juni - Juli 2026, berjumlah 35 orang.</w:t>
       </w:r>
     </w:p>
     <w:p>

</xml_diff>

<commit_message>
Re-apply all formatting, clean up front matter, apply sections
</commit_message>
<xml_diff>
--- a/File Skripsi/Sri Darni.docx
+++ b/File Skripsi/Sri Darni.docx
@@ -76,7 +76,7 @@
           <w:sz w:val="20"/>
         </w:rPr>
         <w:drawing>
-          <wp:anchor distT="0" distB="0" distL="0" distR="0" simplePos="0" relativeHeight="487587840" behindDoc="1" locked="0" layoutInCell="1" allowOverlap="1" wp14:anchorId="42AE2A17" wp14:editId="2E919E75">
+          <wp:anchor distT="0" distB="0" distL="0" distR="0" simplePos="0" relativeHeight="487587840" behindDoc="1" locked="0" layoutInCell="1" allowOverlap="1" wp14:anchorId="72DFD5BA" wp14:editId="10173157">
             <wp:simplePos x="0" y="0"/>
             <wp:positionH relativeFrom="page">
               <wp:posOffset>2827020</wp:posOffset>
@@ -461,7 +461,7 @@
           <w:sz w:val="20"/>
         </w:rPr>
         <w:drawing>
-          <wp:anchor distT="0" distB="0" distL="0" distR="0" simplePos="0" relativeHeight="487589888" behindDoc="1" locked="0" layoutInCell="1" allowOverlap="1" wp14:anchorId="2378A9C6" wp14:editId="6715DE67">
+          <wp:anchor distT="0" distB="0" distL="0" distR="0" simplePos="0" relativeHeight="487589888" behindDoc="1" locked="0" layoutInCell="1" allowOverlap="1" wp14:anchorId="64CC9851" wp14:editId="17FC40BB">
             <wp:simplePos x="0" y="0"/>
             <wp:positionH relativeFrom="page">
               <wp:posOffset>2827020</wp:posOffset>
@@ -1593,116 +1593,107 @@
     </w:p>
     <w:p>
       <w:pPr>
-        <w:spacing w:before="40" w:after="40" w:line="360" w:lineRule="auto"/>
+        <w:pStyle w:val="Heading1"/>
+        <w:spacing w:before="2" w:line="360" w:lineRule="auto"/>
+        <w:ind w:right="1089"/>
+        <w:rPr>
+          <w:szCs w:val="28"/>
+          <w:lang w:val="en-US"/>
+        </w:rPr>
+      </w:pPr>
+      <w:bookmarkStart w:id="7" w:name="_Toc235393107"/>
+      <w:r>
+        <w:rPr>
+          <w:szCs w:val="28"/>
+          <w:lang w:val="en-US"/>
+        </w:rPr>
+        <w:lastRenderedPageBreak/>
+        <w:t>DAFTAR ISI</w:t>
+      </w:r>
+      <w:bookmarkEnd w:id="7"/>
+    </w:p>
+    <w:p>
+      <w:pPr>
+        <w:spacing w:after="40" w:line="360" w:lineRule="auto"/>
       </w:pPr>
       <w:r>
         <w:rPr>
           <w:b/>
           <w:sz w:val="24"/>
         </w:rPr>
-        <w:lastRenderedPageBreak/>
-        <w:t>ABSTRAK</w:t>
-      </w:r>
-      <w:r>
-        <w:rPr>
-          <w:sz w:val="24"/>
-        </w:rPr>
-        <w:t xml:space="preserve">  . . . . . . . . . . . . . . . . . . . . . . . . . . . . . . . . . . . . i</w:t>
-      </w:r>
-    </w:p>
-    <w:p>
-      <w:pPr>
-        <w:spacing w:before="40" w:after="40" w:line="360" w:lineRule="auto"/>
+        <w:t>ABSTRAK ................................................................. i</w:t>
+      </w:r>
+    </w:p>
+    <w:p>
+      <w:pPr>
+        <w:spacing w:after="40" w:line="360" w:lineRule="auto"/>
       </w:pPr>
       <w:r>
         <w:rPr>
           <w:b/>
           <w:sz w:val="24"/>
         </w:rPr>
-        <w:t>ABSTRACT</w:t>
-      </w:r>
-      <w:r>
-        <w:rPr>
-          <w:sz w:val="24"/>
-        </w:rPr>
-        <w:t xml:space="preserve">  . . . . . . . . . . . . . . . . . . . . . . . . . . . . . . . . . . . . ii</w:t>
-      </w:r>
-    </w:p>
-    <w:p>
-      <w:pPr>
-        <w:spacing w:before="40" w:after="40" w:line="360" w:lineRule="auto"/>
+        <w:t>ABSTRACT ................................................................ ii</w:t>
+      </w:r>
+    </w:p>
+    <w:p>
+      <w:pPr>
+        <w:spacing w:after="40" w:line="360" w:lineRule="auto"/>
       </w:pPr>
       <w:r>
         <w:rPr>
           <w:b/>
           <w:sz w:val="24"/>
         </w:rPr>
-        <w:t>KATA PENGANTAR</w:t>
-      </w:r>
-      <w:r>
-        <w:rPr>
-          <w:sz w:val="24"/>
-        </w:rPr>
-        <w:t xml:space="preserve">  . . . . . . . . . . . . . . . . . . . . . . . . . . . . . . . . . iii</w:t>
-      </w:r>
-    </w:p>
-    <w:p>
-      <w:pPr>
-        <w:spacing w:before="40" w:after="40" w:line="360" w:lineRule="auto"/>
+        <w:t>KATA PENGANTAR .......................................................... iii</w:t>
+      </w:r>
+    </w:p>
+    <w:p>
+      <w:pPr>
+        <w:spacing w:after="40" w:line="360" w:lineRule="auto"/>
       </w:pPr>
       <w:r>
         <w:rPr>
           <w:b/>
           <w:sz w:val="24"/>
         </w:rPr>
-        <w:t>DAFTAR ISI</w:t>
-      </w:r>
-      <w:r>
-        <w:rPr>
-          <w:sz w:val="24"/>
-        </w:rPr>
-        <w:t xml:space="preserve">  . . . . . . . . . . . . . . . . . . . . . . . . . . . . . . . . . . . iv</w:t>
-      </w:r>
-    </w:p>
-    <w:p>
-      <w:pPr>
-        <w:spacing w:before="40" w:after="40" w:line="360" w:lineRule="auto"/>
-      </w:pPr>
+        <w:t>DAFTAR ISI ..............</w:t>
+      </w:r>
       <w:r>
         <w:rPr>
           <w:b/>
           <w:sz w:val="24"/>
         </w:rPr>
-        <w:t>DAFTAR TABEL</w:t>
-      </w:r>
-      <w:r>
-        <w:rPr>
-          <w:sz w:val="24"/>
-        </w:rPr>
-        <w:t xml:space="preserve">  . . . . . . . . . . . . . . . . . . . . . . . . . . . . . . . . . . vi</w:t>
-      </w:r>
-    </w:p>
-    <w:p>
-      <w:pPr>
-        <w:spacing w:before="40" w:after="40" w:line="360" w:lineRule="auto"/>
+        <w:t>................................................ iv</w:t>
+      </w:r>
+    </w:p>
+    <w:p>
+      <w:pPr>
+        <w:spacing w:after="40" w:line="360" w:lineRule="auto"/>
       </w:pPr>
       <w:r>
         <w:rPr>
           <w:b/>
           <w:sz w:val="24"/>
         </w:rPr>
-        <w:t>DAFTAR GAMBAR</w:t>
-      </w:r>
-      <w:r>
-        <w:rPr>
-          <w:sz w:val="24"/>
-        </w:rPr>
-        <w:t xml:space="preserve">  . . . . . . . . . . . . . . . . . . . . . . . . . . . . . . . . . vii</w:t>
-      </w:r>
-    </w:p>
-    <w:p>
-      <w:pPr>
-        <w:spacing w:before="40" w:after="40" w:line="360" w:lineRule="auto"/>
+        <w:t>DAFTAR TABEL ............................................................ vi</w:t>
+      </w:r>
+    </w:p>
+    <w:p>
+      <w:pPr>
+        <w:spacing w:after="40" w:line="360" w:lineRule="auto"/>
+      </w:pPr>
+      <w:r>
+        <w:rPr>
+          <w:b/>
+          <w:sz w:val="24"/>
+        </w:rPr>
+        <w:t>DAFTAR GAMBAR ........................................................... vii</w:t>
+      </w:r>
+    </w:p>
+    <w:p>
+      <w:pPr>
+        <w:spacing w:after="40" w:line="360" w:lineRule="auto"/>
         <w:rPr>
           <w:b/>
           <w:sz w:val="24"/>
@@ -1724,7 +1715,7 @@
     </w:p>
     <w:p>
       <w:pPr>
-        <w:spacing w:before="40" w:after="40" w:line="360" w:lineRule="auto"/>
+        <w:spacing w:after="40" w:line="360" w:lineRule="auto"/>
       </w:pPr>
       <w:r>
         <w:rPr>
@@ -1732,402 +1723,439 @@
           <w:sz w:val="24"/>
         </w:rPr>
         <w:lastRenderedPageBreak/>
-        <w:t>BAB I PENDAHULUAN</w:t>
-      </w:r>
-      <w:r>
-        <w:rPr>
-          <w:sz w:val="24"/>
-        </w:rPr>
-        <w:t xml:space="preserve">  . . . . . . . . . . . . . . . . . . . . . . . . . . . . . . . 1</w:t>
-      </w:r>
-    </w:p>
-    <w:p>
-      <w:pPr>
-        <w:spacing w:before="40" w:after="40" w:line="360" w:lineRule="auto"/>
-      </w:pPr>
-      <w:r>
-        <w:rPr>
-          <w:sz w:val="24"/>
-        </w:rPr>
-        <w:t xml:space="preserve">    A. Latar Belakang Masalah  . . . . . . . . . . . . . . . . . . . . . . . . . 1</w:t>
-      </w:r>
-    </w:p>
-    <w:p>
-      <w:pPr>
-        <w:spacing w:before="40" w:after="40" w:line="360" w:lineRule="auto"/>
-      </w:pPr>
-      <w:r>
-        <w:rPr>
-          <w:sz w:val="24"/>
-        </w:rPr>
-        <w:t xml:space="preserve">    B. Identifikasi Masalah  . . . . . . . . . . . . . . . . . . . . . . . . . . 5</w:t>
-      </w:r>
-    </w:p>
-    <w:p>
-      <w:pPr>
-        <w:spacing w:before="40" w:after="40" w:line="360" w:lineRule="auto"/>
-      </w:pPr>
-      <w:r>
-        <w:rPr>
-          <w:sz w:val="24"/>
-        </w:rPr>
-        <w:t xml:space="preserve">    C. Pembatasan Masalah  . . . . . . . . . . . . . . . . . . . . . . . . . . . 6</w:t>
-      </w:r>
-    </w:p>
-    <w:p>
-      <w:pPr>
-        <w:spacing w:before="40" w:after="40" w:line="360" w:lineRule="auto"/>
-      </w:pPr>
-      <w:r>
-        <w:rPr>
-          <w:sz w:val="24"/>
-        </w:rPr>
-        <w:t xml:space="preserve">    D. Rumusan Masalah  . . . . . . . . . . . . . . . . . . . . . . . . . . . . . 6</w:t>
-      </w:r>
-    </w:p>
-    <w:p>
-      <w:pPr>
-        <w:spacing w:before="40" w:after="40" w:line="360" w:lineRule="auto"/>
-      </w:pPr>
-      <w:r>
-        <w:rPr>
-          <w:sz w:val="24"/>
-        </w:rPr>
-        <w:t xml:space="preserve">    E. Tujuan Penelitian  . . . . . . . . . . . . . . . . . . . . . . . . . . . . 7</w:t>
-      </w:r>
-    </w:p>
-    <w:p>
-      <w:pPr>
-        <w:spacing w:before="40" w:after="40" w:line="360" w:lineRule="auto"/>
-      </w:pPr>
-      <w:r>
-        <w:rPr>
-          <w:sz w:val="24"/>
-        </w:rPr>
-        <w:t xml:space="preserve">    F. Manfaat Penelitian  . . . . . . . . . . . . . . . . . . . . . . . . . . . 7</w:t>
-      </w:r>
-    </w:p>
-    <w:p>
-      <w:pPr>
-        <w:spacing w:before="40" w:after="40" w:line="360" w:lineRule="auto"/>
-      </w:pPr>
-      <w:r>
-        <w:rPr>
-          <w:sz w:val="24"/>
-        </w:rPr>
-        <w:t xml:space="preserve">    G. Sistematika Penulisan Skripsi  . . . . . . . . . . . . . . . . . . . . . . 8</w:t>
-      </w:r>
-    </w:p>
-    <w:p>
-      <w:pPr>
-        <w:spacing w:before="40" w:after="40" w:line="360" w:lineRule="auto"/>
-      </w:pPr>
+        <w:t>BAB I PENDAHULUAN ...............................</w:t>
+      </w:r>
       <w:r>
         <w:rPr>
           <w:b/>
           <w:sz w:val="24"/>
         </w:rPr>
-        <w:t>BAB II LANDASAN TEORITIS DAN PENGEMBANGAN HIPOTESIS</w:t>
-      </w:r>
-      <w:r>
-        <w:rPr>
-          <w:sz w:val="24"/>
-        </w:rPr>
-        <w:t xml:space="preserve">  . . . . . . . . . . . . . . 10</w:t>
-      </w:r>
-    </w:p>
-    <w:p>
-      <w:pPr>
-        <w:spacing w:before="40" w:after="40" w:line="360" w:lineRule="auto"/>
-      </w:pPr>
-      <w:r>
-        <w:rPr>
-          <w:sz w:val="24"/>
-        </w:rPr>
-        <w:t xml:space="preserve">    A. Landasan Teori  . . . . . . . . . . . . . . . . . . . . . . . . . . . . . 10</w:t>
-      </w:r>
-    </w:p>
-    <w:p>
-      <w:pPr>
-        <w:spacing w:before="40" w:after="40" w:line="360" w:lineRule="auto"/>
-      </w:pPr>
-      <w:r>
-        <w:rPr>
-          <w:sz w:val="24"/>
-        </w:rPr>
-        <w:t xml:space="preserve">        1. Kinerja Perangkat Desa  . . . . . . . . . . . . . . . . . . . . . . . 10</w:t>
-      </w:r>
-    </w:p>
-    <w:p>
-      <w:pPr>
-        <w:spacing w:before="40" w:after="40" w:line="360" w:lineRule="auto"/>
-      </w:pPr>
-      <w:r>
-        <w:rPr>
-          <w:sz w:val="24"/>
-        </w:rPr>
-        <w:t xml:space="preserve">        2. Gaya Kepemimpinan  . . . . . . . . . . . . . . . . . . . . . . . . . . 13</w:t>
-      </w:r>
-    </w:p>
-    <w:p>
-      <w:pPr>
-        <w:spacing w:before="40" w:after="40" w:line="360" w:lineRule="auto"/>
-      </w:pPr>
-      <w:r>
-        <w:rPr>
-          <w:sz w:val="24"/>
-        </w:rPr>
-        <w:t xml:space="preserve">        3. Kompensasi  . . . . . . . . . . . . . . . . . . . . . . . . . . . . . 16</w:t>
-      </w:r>
-    </w:p>
-    <w:p>
-      <w:pPr>
-        <w:spacing w:before="40" w:after="40" w:line="360" w:lineRule="auto"/>
-      </w:pPr>
-      <w:r>
-        <w:rPr>
-          <w:sz w:val="24"/>
-        </w:rPr>
-        <w:t xml:space="preserve">        4. Motivasi Kerja  . . . . . . . . . . . . . . . . . . . . . . . . . . . 19</w:t>
-      </w:r>
-    </w:p>
-    <w:p>
-      <w:pPr>
-        <w:spacing w:before="40" w:after="40" w:line="360" w:lineRule="auto"/>
-      </w:pPr>
-      <w:r>
-        <w:rPr>
-          <w:sz w:val="24"/>
-        </w:rPr>
-        <w:t xml:space="preserve">    B. Hasil Penelitian Terdahulu  . . . . . . . . . . . . . . . . . . . . . . . 23</w:t>
-      </w:r>
-    </w:p>
-    <w:p>
-      <w:pPr>
-        <w:spacing w:before="40" w:after="40" w:line="360" w:lineRule="auto"/>
-      </w:pPr>
-      <w:r>
-        <w:rPr>
-          <w:sz w:val="24"/>
-        </w:rPr>
-        <w:t xml:space="preserve">    C. Kerangka Berpikir  . . . . . . . . . . . . . . . . . . . . . . . . . . . . 29</w:t>
-      </w:r>
-    </w:p>
-    <w:p>
-      <w:pPr>
-        <w:spacing w:before="40" w:after="40" w:line="360" w:lineRule="auto"/>
-      </w:pPr>
-      <w:r>
-        <w:rPr>
-          <w:sz w:val="24"/>
-        </w:rPr>
-        <w:t xml:space="preserve">    D. Pengembangan Hipotesis  . . . . . . . . . . . . . . . . . . . . . . . . . 30</w:t>
-      </w:r>
-    </w:p>
-    <w:p>
-      <w:pPr>
-        <w:spacing w:before="40" w:after="40" w:line="360" w:lineRule="auto"/>
+        <w:t>........................ 1</w:t>
+      </w:r>
+    </w:p>
+    <w:p>
+      <w:pPr>
+        <w:spacing w:after="40" w:line="360" w:lineRule="auto"/>
+      </w:pPr>
+      <w:r>
+        <w:rPr>
+          <w:sz w:val="24"/>
+        </w:rPr>
+        <w:t xml:space="preserve">    A.  Latar Belakang Masalah .......................................... 1</w:t>
+      </w:r>
+    </w:p>
+    <w:p>
+      <w:pPr>
+        <w:spacing w:after="40" w:line="360" w:lineRule="auto"/>
+      </w:pPr>
+      <w:r>
+        <w:rPr>
+          <w:sz w:val="24"/>
+        </w:rPr>
+        <w:t xml:space="preserve">    B.  Identifikasi Masalah ............................................ 5</w:t>
+      </w:r>
+    </w:p>
+    <w:p>
+      <w:pPr>
+        <w:spacing w:after="40" w:line="360" w:lineRule="auto"/>
+      </w:pPr>
+      <w:r>
+        <w:rPr>
+          <w:sz w:val="24"/>
+        </w:rPr>
+        <w:t xml:space="preserve">    C.  Pembatasan Masalah .............................................. 6</w:t>
+      </w:r>
+    </w:p>
+    <w:p>
+      <w:pPr>
+        <w:spacing w:after="40" w:line="360" w:lineRule="auto"/>
+      </w:pPr>
+      <w:r>
+        <w:rPr>
+          <w:sz w:val="24"/>
+        </w:rPr>
+        <w:t xml:space="preserve">    D.  Rumusan Masalah ................................................. 6</w:t>
+      </w:r>
+    </w:p>
+    <w:p>
+      <w:pPr>
+        <w:spacing w:after="40" w:line="360" w:lineRule="auto"/>
+      </w:pPr>
+      <w:r>
+        <w:rPr>
+          <w:sz w:val="24"/>
+        </w:rPr>
+        <w:t xml:space="preserve">    E.  Tujuan Penelitian ............................................... 7</w:t>
+      </w:r>
+    </w:p>
+    <w:p>
+      <w:pPr>
+        <w:spacing w:after="40" w:line="360" w:lineRule="auto"/>
+      </w:pPr>
+      <w:r>
+        <w:rPr>
+          <w:sz w:val="24"/>
+        </w:rPr>
+        <w:t xml:space="preserve">    F.  Manfaat Penelitian .</w:t>
+      </w:r>
+      <w:r>
+        <w:rPr>
+          <w:sz w:val="24"/>
+        </w:rPr>
+        <w:t>............................................. 7</w:t>
+      </w:r>
+    </w:p>
+    <w:p>
+      <w:pPr>
+        <w:spacing w:after="40" w:line="360" w:lineRule="auto"/>
+      </w:pPr>
+      <w:r>
+        <w:rPr>
+          <w:sz w:val="24"/>
+        </w:rPr>
+        <w:t xml:space="preserve">    G.  Sistematika Penulisan Skripsi ................................... 8</w:t>
+      </w:r>
+    </w:p>
+    <w:p>
+      <w:pPr>
+        <w:spacing w:after="40" w:line="360" w:lineRule="auto"/>
       </w:pPr>
       <w:r>
         <w:rPr>
           <w:b/>
           <w:sz w:val="24"/>
         </w:rPr>
-        <w:t>BAB III METODE PENELITIAN</w:t>
-      </w:r>
-      <w:r>
-        <w:rPr>
-          <w:sz w:val="24"/>
-        </w:rPr>
-        <w:t xml:space="preserve">  . . . . . . . . . . . . . . . . . . . . . . . . . . . 31</w:t>
-      </w:r>
-    </w:p>
-    <w:p>
-      <w:pPr>
-        <w:spacing w:before="40" w:after="40" w:line="360" w:lineRule="auto"/>
-      </w:pPr>
-      <w:r>
-        <w:rPr>
-          <w:sz w:val="24"/>
-        </w:rPr>
-        <w:t xml:space="preserve">    A. Tempat dan Waktu Penelitian  . . . . . . . . . . . . . . . . . . . . . . . 31</w:t>
-      </w:r>
-    </w:p>
-    <w:p>
-      <w:pPr>
-        <w:spacing w:before="40" w:after="40" w:line="360" w:lineRule="auto"/>
-      </w:pPr>
-      <w:r>
-        <w:rPr>
-          <w:sz w:val="24"/>
-        </w:rPr>
-        <w:t xml:space="preserve">    B. Desain Penelitian  . . . . . . . . . . . . . . . . . . . . . . . . . . . . 31</w:t>
-      </w:r>
-    </w:p>
-    <w:p>
-      <w:pPr>
-        <w:spacing w:before="40" w:after="40" w:line="360" w:lineRule="auto"/>
-      </w:pPr>
-      <w:r>
-        <w:rPr>
-          <w:sz w:val="24"/>
-        </w:rPr>
-        <w:t xml:space="preserve">    C. Definisi Operasional dan Pengukuran Variabel Penelitian  . . . . . . . . . 32</w:t>
-      </w:r>
-    </w:p>
-    <w:p>
-      <w:pPr>
-        <w:spacing w:before="40" w:after="40" w:line="360" w:lineRule="auto"/>
-      </w:pPr>
-      <w:r>
-        <w:rPr>
-          <w:sz w:val="24"/>
-        </w:rPr>
-        <w:t xml:space="preserve">        1. Variabel Bebas (Variabel Independen)  . . . . . . . . . . . . . . . . 32</w:t>
-      </w:r>
-    </w:p>
-    <w:p>
-      <w:pPr>
-        <w:spacing w:before="40" w:after="40" w:line="360" w:lineRule="auto"/>
-      </w:pPr>
-      <w:r>
-        <w:rPr>
-          <w:sz w:val="24"/>
-        </w:rPr>
-        <w:t xml:space="preserve">        2. Variabel Terikat (Variabel Dependen)  . . . . . . . . . . . . . . . . 32</w:t>
-      </w:r>
-    </w:p>
-    <w:p>
-      <w:pPr>
-        <w:spacing w:before="40" w:after="40" w:line="360" w:lineRule="auto"/>
-      </w:pPr>
-      <w:r>
-        <w:rPr>
-          <w:sz w:val="24"/>
-        </w:rPr>
-        <w:t xml:space="preserve">        3. Variabel Mediasi  . . . . . . . . . . . . . . . . . . . . . . . . . . 33</w:t>
-      </w:r>
-    </w:p>
-    <w:p>
-      <w:pPr>
-        <w:spacing w:before="40" w:after="40" w:line="360" w:lineRule="auto"/>
-      </w:pPr>
-      <w:r>
-        <w:rPr>
-          <w:sz w:val="24"/>
-        </w:rPr>
-        <w:t xml:space="preserve">        4. Operasionalisasi Variabel Penelitian  . . . . . . . . . . . . . . . . 33</w:t>
-      </w:r>
-    </w:p>
-    <w:p>
-      <w:pPr>
-        <w:spacing w:before="40" w:after="40" w:line="360" w:lineRule="auto"/>
-      </w:pPr>
-      <w:r>
-        <w:rPr>
-          <w:sz w:val="24"/>
-        </w:rPr>
-        <w:t xml:space="preserve">    D. Populasi dan Sampel Penelitian  . . . . . . . . . . . . . . . . . . . . . 34</w:t>
-      </w:r>
-    </w:p>
-    <w:p>
-      <w:pPr>
-        <w:spacing w:before="40" w:after="40" w:line="360" w:lineRule="auto"/>
-      </w:pPr>
-      <w:r>
-        <w:rPr>
-          <w:sz w:val="24"/>
-        </w:rPr>
-        <w:t xml:space="preserve">        1. Populasi  . . . . . . . . . . . . . . . . . . . . . . . . . . . . . . 34</w:t>
-      </w:r>
-    </w:p>
-    <w:p>
-      <w:pPr>
-        <w:spacing w:before="40" w:after="40" w:line="360" w:lineRule="auto"/>
-      </w:pPr>
-      <w:r>
-        <w:rPr>
-          <w:sz w:val="24"/>
-        </w:rPr>
-        <w:t xml:space="preserve">        2. Sampel  . . . . . . . . . . . . . . . . . . . . . . . . . . . . . . . 35</w:t>
-      </w:r>
-    </w:p>
-    <w:p>
-      <w:pPr>
-        <w:spacing w:before="40" w:after="40" w:line="360" w:lineRule="auto"/>
-      </w:pPr>
-      <w:r>
-        <w:rPr>
-          <w:sz w:val="24"/>
-        </w:rPr>
-        <w:t xml:space="preserve">    E. Metode Pengumpulan Data  . . . . . . . . . . . . . . . . . . . . . . . . . 36</w:t>
-      </w:r>
-    </w:p>
-    <w:p>
-      <w:pPr>
-        <w:spacing w:before="40" w:after="40" w:line="360" w:lineRule="auto"/>
-      </w:pPr>
-      <w:r>
-        <w:rPr>
-          <w:sz w:val="24"/>
-        </w:rPr>
-        <w:t xml:space="preserve">        1. Teknik Pengumpulan Data  . . . . . . . . . . . . . . . . . . . . . . . 36</w:t>
-      </w:r>
-    </w:p>
-    <w:p>
-      <w:pPr>
-        <w:spacing w:before="40" w:after="40" w:line="360" w:lineRule="auto"/>
+        <w:t>BAB II LANDASAN TEORITIS DAN PENGEMBANGAN HIPOTESIS ..................... 10</w:t>
+      </w:r>
+    </w:p>
+    <w:p>
+      <w:pPr>
+        <w:spacing w:after="40" w:line="360" w:lineRule="auto"/>
+      </w:pPr>
+      <w:r>
+        <w:rPr>
+          <w:sz w:val="24"/>
+        </w:rPr>
+        <w:t xml:space="preserve">    A.  Landasan Teori ................................</w:t>
+      </w:r>
+      <w:r>
+        <w:rPr>
+          <w:sz w:val="24"/>
+        </w:rPr>
+        <w:t>.................. 10</w:t>
+      </w:r>
+    </w:p>
+    <w:p>
+      <w:pPr>
+        <w:spacing w:after="40" w:line="360" w:lineRule="auto"/>
+      </w:pPr>
+      <w:r>
+        <w:rPr>
+          <w:sz w:val="24"/>
+        </w:rPr>
+        <w:t xml:space="preserve">         1.  Kinerja Perangkat Desa ..................................... 10</w:t>
+      </w:r>
+    </w:p>
+    <w:p>
+      <w:pPr>
+        <w:spacing w:after="40" w:line="360" w:lineRule="auto"/>
+      </w:pPr>
+      <w:r>
+        <w:rPr>
+          <w:sz w:val="24"/>
+        </w:rPr>
+        <w:t xml:space="preserve">         2.  Gaya Kepemimpinan .......................................... 13</w:t>
+      </w:r>
+    </w:p>
+    <w:p>
+      <w:pPr>
+        <w:spacing w:after="40" w:line="360" w:lineRule="auto"/>
+      </w:pPr>
+      <w:r>
+        <w:rPr>
+          <w:sz w:val="24"/>
+        </w:rPr>
+        <w:t xml:space="preserve">         3.  Kompensasi ................................................. 16</w:t>
+      </w:r>
+    </w:p>
+    <w:p>
+      <w:pPr>
+        <w:spacing w:after="40" w:line="360" w:lineRule="auto"/>
+      </w:pPr>
+      <w:r>
+        <w:rPr>
+          <w:sz w:val="24"/>
+        </w:rPr>
+        <w:t xml:space="preserve">         4.  Motivasi Kerja ............................................. 19</w:t>
+      </w:r>
+    </w:p>
+    <w:p>
+      <w:pPr>
+        <w:spacing w:after="40" w:line="360" w:lineRule="auto"/>
+      </w:pPr>
+      <w:r>
+        <w:rPr>
+          <w:sz w:val="24"/>
+        </w:rPr>
+        <w:t xml:space="preserve">    B.  Hasil Penelitian Terdahulu ...................................... 23</w:t>
+      </w:r>
+    </w:p>
+    <w:p>
+      <w:pPr>
+        <w:spacing w:after="40" w:line="360" w:lineRule="auto"/>
+      </w:pPr>
+      <w:r>
+        <w:rPr>
+          <w:sz w:val="24"/>
+        </w:rPr>
+        <w:t xml:space="preserve">    C.  Kerangka Berpikir ............................................... 29</w:t>
+      </w:r>
+    </w:p>
+    <w:p>
+      <w:pPr>
+        <w:spacing w:after="40" w:line="360" w:lineRule="auto"/>
+      </w:pPr>
+      <w:r>
+        <w:rPr>
+          <w:sz w:val="24"/>
+        </w:rPr>
+        <w:t xml:space="preserve">    D.  Pengembangan Hipo</w:t>
+      </w:r>
+      <w:r>
+        <w:rPr>
+          <w:sz w:val="24"/>
+        </w:rPr>
+        <w:t>tesis .......................................... 30</w:t>
+      </w:r>
+    </w:p>
+    <w:p>
+      <w:pPr>
+        <w:spacing w:after="40" w:line="360" w:lineRule="auto"/>
+      </w:pPr>
+      <w:r>
+        <w:rPr>
+          <w:b/>
+          <w:sz w:val="24"/>
+        </w:rPr>
+        <w:t>BAB III METODE PENELITIAN ............................................... 31</w:t>
+      </w:r>
+    </w:p>
+    <w:p>
+      <w:pPr>
+        <w:spacing w:after="40" w:line="360" w:lineRule="auto"/>
+      </w:pPr>
+      <w:r>
+        <w:rPr>
+          <w:sz w:val="24"/>
+        </w:rPr>
+        <w:t xml:space="preserve">    A.  Tempat dan Waktu Penelitian ..................................... 31</w:t>
+      </w:r>
+    </w:p>
+    <w:p>
+      <w:pPr>
+        <w:spacing w:after="40" w:line="360" w:lineRule="auto"/>
+      </w:pPr>
+      <w:r>
+        <w:rPr>
+          <w:sz w:val="24"/>
+        </w:rPr>
+        <w:t xml:space="preserve">    B.  Desain Penelitian ........................</w:t>
+      </w:r>
+      <w:r>
+        <w:rPr>
+          <w:sz w:val="24"/>
+        </w:rPr>
+        <w:t>....................... 31</w:t>
+      </w:r>
+    </w:p>
+    <w:p>
+      <w:pPr>
+        <w:spacing w:after="40" w:line="360" w:lineRule="auto"/>
+      </w:pPr>
+      <w:r>
+        <w:rPr>
+          <w:sz w:val="24"/>
+        </w:rPr>
+        <w:t xml:space="preserve">    C.  Definisi Operasional dan Pengukuran Variabel Penelitian ......... 32</w:t>
+      </w:r>
+    </w:p>
+    <w:p>
+      <w:pPr>
+        <w:spacing w:after="40" w:line="360" w:lineRule="auto"/>
+      </w:pPr>
+      <w:r>
+        <w:rPr>
+          <w:sz w:val="24"/>
+        </w:rPr>
+        <w:t xml:space="preserve">         1.  Variabel Bebas (Variabel Independen) ....................... 32</w:t>
+      </w:r>
+    </w:p>
+    <w:p>
+      <w:pPr>
+        <w:spacing w:after="40" w:line="360" w:lineRule="auto"/>
+      </w:pPr>
+      <w:r>
+        <w:rPr>
+          <w:sz w:val="24"/>
+        </w:rPr>
+        <w:t xml:space="preserve">         2.  Variabel Terikat (Variabel Dependen) ....................... 3</w:t>
+      </w:r>
+      <w:r>
+        <w:rPr>
+          <w:sz w:val="24"/>
+        </w:rPr>
+        <w:t>2</w:t>
+      </w:r>
+    </w:p>
+    <w:p>
+      <w:pPr>
+        <w:spacing w:after="40" w:line="360" w:lineRule="auto"/>
+      </w:pPr>
+      <w:r>
+        <w:rPr>
+          <w:sz w:val="24"/>
+        </w:rPr>
+        <w:t xml:space="preserve">         3.  Variabel Mediasi ........................................... 33</w:t>
+      </w:r>
+    </w:p>
+    <w:p>
+      <w:pPr>
+        <w:spacing w:after="40" w:line="360" w:lineRule="auto"/>
+      </w:pPr>
+      <w:r>
+        <w:rPr>
+          <w:sz w:val="24"/>
+        </w:rPr>
+        <w:t xml:space="preserve">         4.  Operasionalisasi Variabel Penelitian ....................... 33</w:t>
+      </w:r>
+    </w:p>
+    <w:p>
+      <w:pPr>
+        <w:spacing w:after="40" w:line="360" w:lineRule="auto"/>
+      </w:pPr>
+      <w:r>
+        <w:rPr>
+          <w:sz w:val="24"/>
+        </w:rPr>
+        <w:t xml:space="preserve">    D.  Populasi dan Sampel Penelitian .................................. 34</w:t>
+      </w:r>
+    </w:p>
+    <w:p>
+      <w:pPr>
+        <w:spacing w:after="40" w:line="360" w:lineRule="auto"/>
+      </w:pPr>
+      <w:r>
+        <w:rPr>
+          <w:sz w:val="24"/>
+        </w:rPr>
+        <w:t xml:space="preserve">         1.  Populasi .</w:t>
+      </w:r>
+      <w:r>
+        <w:rPr>
+          <w:sz w:val="24"/>
+        </w:rPr>
+        <w:t>.................................................. 34</w:t>
+      </w:r>
+    </w:p>
+    <w:p>
+      <w:pPr>
+        <w:spacing w:after="40" w:line="360" w:lineRule="auto"/>
+      </w:pPr>
+      <w:r>
+        <w:rPr>
+          <w:sz w:val="24"/>
+        </w:rPr>
+        <w:t xml:space="preserve">         2.  Sampel ..................................................... 35</w:t>
+      </w:r>
+    </w:p>
+    <w:p>
+      <w:pPr>
+        <w:spacing w:after="40" w:line="360" w:lineRule="auto"/>
+      </w:pPr>
+      <w:r>
+        <w:rPr>
+          <w:sz w:val="24"/>
+        </w:rPr>
+        <w:t xml:space="preserve">    E.  Metode Pengumpulan Data ......................................... 36</w:t>
+      </w:r>
+    </w:p>
+    <w:p>
+      <w:pPr>
+        <w:spacing w:after="40" w:line="360" w:lineRule="auto"/>
+      </w:pPr>
+      <w:r>
+        <w:rPr>
+          <w:sz w:val="24"/>
+        </w:rPr>
+        <w:t xml:space="preserve">         1.  Teknik Pengumpulan Data ...........</w:t>
+      </w:r>
+      <w:r>
+        <w:rPr>
+          <w:sz w:val="24"/>
+        </w:rPr>
+        <w:t>......................... 36</w:t>
+      </w:r>
+    </w:p>
+    <w:p>
+      <w:pPr>
+        <w:spacing w:after="40" w:line="360" w:lineRule="auto"/>
       </w:pPr>
       <w:r>
         <w:rPr>
           <w:sz w:val="24"/>
         </w:rPr>
         <w:lastRenderedPageBreak/>
-        <w:t xml:space="preserve">        2. Sumber Data  . . . . . . . . . . . . . . . . . . . . . . . . . . . . . 36</w:t>
-      </w:r>
-    </w:p>
-    <w:p>
-      <w:pPr>
-        <w:spacing w:before="40" w:after="40" w:line="360" w:lineRule="auto"/>
-      </w:pPr>
-      <w:r>
-        <w:rPr>
-          <w:sz w:val="24"/>
-        </w:rPr>
-        <w:t xml:space="preserve">        3. Teknik Pengembangan Instrumen  . . . . . . . . . . . . . . . . . . . . 37</w:t>
-      </w:r>
-    </w:p>
-    <w:p>
-      <w:pPr>
-        <w:spacing w:before="40" w:after="40" w:line="360" w:lineRule="auto"/>
-      </w:pPr>
-      <w:r>
-        <w:rPr>
-          <w:sz w:val="24"/>
-        </w:rPr>
-        <w:t xml:space="preserve">    F. Teknik Analisis Data  . . . . . . . . . . . . . . . . . . . . . . . . . . 38</w:t>
-      </w:r>
-    </w:p>
-    <w:p>
-      <w:pPr>
-        <w:spacing w:before="40" w:after="40" w:line="360" w:lineRule="auto"/>
+        <w:t xml:space="preserve">         2.  Sumber Data ................................................ 36</w:t>
+      </w:r>
+    </w:p>
+    <w:p>
+      <w:pPr>
+        <w:spacing w:after="40" w:line="360" w:lineRule="auto"/>
+      </w:pPr>
+      <w:r>
+        <w:rPr>
+          <w:sz w:val="24"/>
+        </w:rPr>
+        <w:t xml:space="preserve">         3.  Teknik Pengembangan Instrumen .............................. 37</w:t>
+      </w:r>
+    </w:p>
+    <w:p>
+      <w:pPr>
+        <w:spacing w:after="40" w:line="360" w:lineRule="auto"/>
+      </w:pPr>
+      <w:r>
+        <w:rPr>
+          <w:sz w:val="24"/>
+        </w:rPr>
+        <w:t xml:space="preserve">    F.  Teknik Analisis Data ............................................</w:t>
+      </w:r>
+      <w:r>
+        <w:rPr>
+          <w:sz w:val="24"/>
+        </w:rPr>
+        <w:t xml:space="preserve"> 38</w:t>
+      </w:r>
+    </w:p>
+    <w:p>
+      <w:pPr>
+        <w:spacing w:after="40" w:line="360" w:lineRule="auto"/>
       </w:pPr>
       <w:r>
         <w:rPr>
           <w:b/>
           <w:sz w:val="24"/>
         </w:rPr>
-        <w:t>DAFTAR PUSTAKA</w:t>
-      </w:r>
-      <w:r>
-        <w:rPr>
-          <w:sz w:val="24"/>
-        </w:rPr>
-        <w:t xml:space="preserve">  . . . . . . . . . . . . . . . . . . . . . . . . . . . . . . . . . 44</w:t>
-      </w:r>
-    </w:p>
-    <w:p>
-      <w:pPr>
+        <w:t>DAFTAR PUSTAKA .......................................................... 44</w:t>
+      </w:r>
+    </w:p>
+    <w:p>
+      <w:r>
+        <w:br w:type="page"/>
+      </w:r>
+    </w:p>
+    <w:p>
+      <w:pPr>
+        <w:spacing w:after="40" w:line="360" w:lineRule="auto"/>
         <w:jc w:val="center"/>
       </w:pPr>
       <w:r>
@@ -2135,15 +2163,108 @@
           <w:b/>
           <w:sz w:val="24"/>
         </w:rPr>
-        <w:br/>
-      </w:r>
+        <w:t>DAFTAR TABEL</w:t>
+      </w:r>
+    </w:p>
+    <w:p>
+      <w:pPr>
+        <w:spacing w:after="40" w:line="360" w:lineRule="auto"/>
+      </w:pPr>
+      <w:r>
+        <w:rPr>
+          <w:sz w:val="24"/>
+        </w:rPr>
+        <w:t>Tabel 2.1 Faktor-Faktor yang Mempengaruhi Kompensasi .................... 18</w:t>
+      </w:r>
+    </w:p>
+    <w:p>
+      <w:pPr>
+        <w:spacing w:after="40" w:line="360" w:lineRule="auto"/>
+      </w:pPr>
+      <w:r>
+        <w:rPr>
+          <w:sz w:val="24"/>
+        </w:rPr>
+        <w:t>Tabel 2.2 Hasil Penelitian Terdahulu .................................... 24</w:t>
+      </w:r>
+    </w:p>
+    <w:p>
+      <w:pPr>
+        <w:spacing w:after="40" w:line="360" w:lineRule="auto"/>
+      </w:pPr>
+      <w:r>
+        <w:rPr>
+          <w:sz w:val="24"/>
+        </w:rPr>
+        <w:t xml:space="preserve">Tabel </w:t>
+      </w:r>
+      <w:r>
+        <w:rPr>
+          <w:sz w:val="24"/>
+        </w:rPr>
+        <w:t>3.1 Jadwal Penelitian dan Penulisan Skripsi ....................... 31</w:t>
+      </w:r>
+    </w:p>
+    <w:p>
+      <w:pPr>
+        <w:spacing w:after="40" w:line="360" w:lineRule="auto"/>
+      </w:pPr>
+      <w:r>
+        <w:rPr>
+          <w:sz w:val="24"/>
+        </w:rPr>
+        <w:t>Tabel 3.2 Operasional Variabel Penelitian ............................... 33</w:t>
+      </w:r>
+    </w:p>
+    <w:p>
+      <w:pPr>
+        <w:spacing w:after="40" w:line="360" w:lineRule="auto"/>
+      </w:pPr>
+      <w:r>
+        <w:rPr>
+          <w:sz w:val="24"/>
+        </w:rPr>
+        <w:t>Tabel 3.3 Skala Likert .................................................. 37</w:t>
+      </w:r>
+    </w:p>
+    <w:p>
+      <w:pPr>
+        <w:spacing w:after="40" w:line="360" w:lineRule="auto"/>
+      </w:pPr>
+      <w:r>
+        <w:rPr>
+          <w:sz w:val="24"/>
+        </w:rPr>
+        <w:t>Tabel 3.4 Rule of Thumb Evaluasi Model Pengukuran ....................... 40</w:t>
+      </w:r>
+    </w:p>
+    <w:p>
+      <w:pPr>
+        <w:spacing w:after="40" w:line="360" w:lineRule="auto"/>
+      </w:pPr>
+      <w:r>
+        <w:rPr>
+          <w:sz w:val="24"/>
+        </w:rPr>
+        <w:t>Tabel 3.5 Rule of Thumb Evaluasi Model Struktural ....................... 43</w:t>
+      </w:r>
+    </w:p>
+    <w:p>
+      <w:r>
+        <w:br w:type="page"/>
+      </w:r>
+    </w:p>
+    <w:p>
+      <w:pPr>
+        <w:spacing w:after="40" w:line="360" w:lineRule="auto"/>
+        <w:jc w:val="center"/>
+      </w:pPr>
       <w:r>
         <w:rPr>
           <w:b/>
           <w:sz w:val="24"/>
         </w:rPr>
-        <w:br/>
-        <w:t>DAFTAR TABEL</w:t>
+        <w:t>DAFTAR GAMBAR</w:t>
       </w:r>
     </w:p>
     <w:p>
@@ -2154,7 +2275,13 @@
         <w:rPr>
           <w:sz w:val="24"/>
         </w:rPr>
-        <w:t>Tabel 2.1 Faktor-Faktor yang Mempengaruhi Kompensasi  . . . . . . . . . . . 18</w:t>
+        <w:t>Gambar 2.</w:t>
+      </w:r>
+      <w:r>
+        <w:rPr>
+          <w:sz w:val="24"/>
+        </w:rPr>
+        <w:t>1 Kerangka Berpikir ............................................ 29</w:t>
       </w:r>
     </w:p>
     <w:p>
@@ -2165,7 +2292,7 @@
         <w:rPr>
           <w:sz w:val="24"/>
         </w:rPr>
-        <w:t>Tabel 2.2 Hasil Penelitian Terdahulu  . . . . . . . . . . . . . . . . . . . 24</w:t>
+        <w:t>Gambar 3.1 Outer Model Variabel Dependen (Y) ............................ 38</w:t>
       </w:r>
     </w:p>
     <w:p>
@@ -2176,7 +2303,7 @@
         <w:rPr>
           <w:sz w:val="24"/>
         </w:rPr>
-        <w:t>Tabel 3.1 Jadwal Penelitian dan Penulisan Skripsi  . . . . . . . . . . . . . 31</w:t>
+        <w:t>Gambar 3.2 Outer Model Variabel Independen (X1) ......................... 38</w:t>
       </w:r>
     </w:p>
     <w:p>
@@ -2187,7 +2314,13 @@
         <w:rPr>
           <w:sz w:val="24"/>
         </w:rPr>
-        <w:t>Tabel 3.2 Operasional Variabel Penelitian  . . . . . . . . . . . . . . . . . 33</w:t>
+        <w:t>Gambar 3.3 Outer Model Variabel In</w:t>
+      </w:r>
+      <w:r>
+        <w:rPr>
+          <w:sz w:val="24"/>
+        </w:rPr>
+        <w:t>dependen (X2) ......................... 39</w:t>
       </w:r>
     </w:p>
     <w:p>
@@ -2198,7 +2331,7 @@
         <w:rPr>
           <w:sz w:val="24"/>
         </w:rPr>
-        <w:t>Tabel 3.3 Skala Likert  . . . . . . . . . . . . . . . . . . . . . . . . . . 37</w:t>
+        <w:t>Gambar 3.4 Outer Model Variabel Mediasi (Z) ............................. 39</w:t>
       </w:r>
     </w:p>
     <w:p>
@@ -2209,20 +2342,7 @@
         <w:rPr>
           <w:sz w:val="24"/>
         </w:rPr>
-        <w:t xml:space="preserve">Tabel 3.4 </w:t>
-      </w:r>
-      <w:r>
-        <w:rPr>
-          <w:i/>
-          <w:sz w:val="24"/>
-        </w:rPr>
-        <w:t>Rule of thumb</w:t>
-      </w:r>
-      <w:r>
-        <w:rPr>
-          <w:sz w:val="24"/>
-        </w:rPr>
-        <w:t xml:space="preserve"> Evaluasi Model Pengukuran  . . . . . . . . . . . . . 40</w:t>
+        <w:t>Gambar 3.5 Inner Model Variabel Dependen, Independen, dan Mediasi ....... 39</w:t>
       </w:r>
     </w:p>
     <w:p>
@@ -2233,216 +2353,8 @@
         <w:rPr>
           <w:sz w:val="24"/>
         </w:rPr>
-        <w:t xml:space="preserve">Tabel 3.5 </w:t>
-      </w:r>
-      <w:r>
-        <w:rPr>
-          <w:i/>
-          <w:sz w:val="24"/>
-        </w:rPr>
-        <w:t>Rule of thumb</w:t>
-      </w:r>
-      <w:r>
-        <w:rPr>
-          <w:sz w:val="24"/>
-        </w:rPr>
-        <w:t xml:space="preserve"> Evaluasi Model Struktural  . . . . . . . . . . . . . 43</w:t>
-      </w:r>
-    </w:p>
-    <w:p>
-      <w:pPr>
-        <w:jc w:val="center"/>
-      </w:pPr>
-      <w:r>
-        <w:rPr>
-          <w:b/>
-          <w:sz w:val="24"/>
-        </w:rPr>
-        <w:br/>
-      </w:r>
-      <w:r>
-        <w:rPr>
-          <w:b/>
-          <w:sz w:val="24"/>
-        </w:rPr>
-        <w:br/>
-        <w:t>DAFTAR GAMBAR</w:t>
-      </w:r>
-    </w:p>
-    <w:p>
-      <w:pPr>
-        <w:spacing w:after="40" w:line="360" w:lineRule="auto"/>
-      </w:pPr>
-      <w:r>
-        <w:rPr>
-          <w:sz w:val="24"/>
-        </w:rPr>
-        <w:t>Gambar 2.1 Kerangka Berpikir  . . . . . . . . . . . . . . . . . . . . . . . 29</w:t>
-      </w:r>
-    </w:p>
-    <w:p>
-      <w:pPr>
-        <w:spacing w:after="40" w:line="360" w:lineRule="auto"/>
-      </w:pPr>
-      <w:r>
-        <w:rPr>
-          <w:sz w:val="24"/>
-        </w:rPr>
-        <w:t xml:space="preserve">Gambar 3.1 </w:t>
-      </w:r>
-      <w:r>
-        <w:rPr>
-          <w:i/>
-          <w:sz w:val="24"/>
-        </w:rPr>
-        <w:t>Outer model</w:t>
-      </w:r>
-      <w:r>
-        <w:rPr>
-          <w:sz w:val="24"/>
-        </w:rPr>
-        <w:t xml:space="preserve"> Variabel Dependen (Y)  . . . . . . . . . . . . . . . 38</w:t>
-      </w:r>
-    </w:p>
-    <w:p>
-      <w:pPr>
-        <w:spacing w:after="40" w:line="360" w:lineRule="auto"/>
-      </w:pPr>
-      <w:r>
-        <w:rPr>
-          <w:sz w:val="24"/>
-        </w:rPr>
-        <w:t xml:space="preserve">Gambar 3.2 </w:t>
-      </w:r>
-      <w:r>
-        <w:rPr>
-          <w:i/>
-          <w:sz w:val="24"/>
-        </w:rPr>
-        <w:t>Outer model</w:t>
-      </w:r>
-      <w:r>
-        <w:rPr>
-          <w:sz w:val="24"/>
-        </w:rPr>
-        <w:t xml:space="preserve"> Variabel Independen (X1)  . . . . . . . . . . . . . . 38</w:t>
-      </w:r>
-    </w:p>
-    <w:p>
-      <w:pPr>
-        <w:spacing w:after="40" w:line="360" w:lineRule="auto"/>
-      </w:pPr>
-      <w:r>
-        <w:rPr>
-          <w:sz w:val="24"/>
-        </w:rPr>
-        <w:t xml:space="preserve">Gambar 3.3 </w:t>
-      </w:r>
-      <w:r>
-        <w:rPr>
-          <w:i/>
-          <w:sz w:val="24"/>
-        </w:rPr>
-        <w:t>Outer model</w:t>
-      </w:r>
-      <w:r>
-        <w:rPr>
-          <w:sz w:val="24"/>
-        </w:rPr>
-        <w:t xml:space="preserve"> Variabel Independen (X2)  . . . . . . . . . . . . . . 39</w:t>
-      </w:r>
-    </w:p>
-    <w:p>
-      <w:pPr>
-        <w:spacing w:after="40" w:line="360" w:lineRule="auto"/>
-      </w:pPr>
-      <w:r>
-        <w:rPr>
-          <w:sz w:val="24"/>
-        </w:rPr>
-        <w:t xml:space="preserve">Gambar 3.4 </w:t>
-      </w:r>
-      <w:r>
-        <w:rPr>
-          <w:i/>
-          <w:sz w:val="24"/>
-        </w:rPr>
-        <w:t>Outer model</w:t>
-      </w:r>
-      <w:r>
-        <w:rPr>
-          <w:sz w:val="24"/>
-        </w:rPr>
-        <w:t xml:space="preserve"> Variabel Mediasi (Z)  . . . . . . . . . . . . . . . . 39</w:t>
-      </w:r>
-    </w:p>
-    <w:p>
-      <w:pPr>
-        <w:spacing w:after="40" w:line="360" w:lineRule="auto"/>
-      </w:pPr>
-      <w:r>
-        <w:rPr>
-          <w:sz w:val="24"/>
-        </w:rPr>
-        <w:t xml:space="preserve">Gambar 3.5 </w:t>
-      </w:r>
-      <w:r>
-        <w:rPr>
-          <w:i/>
-          <w:sz w:val="24"/>
-        </w:rPr>
-        <w:t>Inner model</w:t>
-      </w:r>
-      <w:r>
-        <w:rPr>
-          <w:sz w:val="24"/>
-        </w:rPr>
-        <w:t xml:space="preserve"> Variabel Dependen, Independen, dan Mediasi  . . . . . 39</w:t>
-      </w:r>
-    </w:p>
-    <w:p>
-      <w:pPr>
-        <w:spacing w:after="40" w:line="360" w:lineRule="auto"/>
-      </w:pPr>
-      <w:r>
-        <w:rPr>
-          <w:sz w:val="24"/>
-        </w:rPr>
-        <w:t>Gambar 3.6 Diagram Jalur (</w:t>
-      </w:r>
-      <w:r>
-        <w:rPr>
-          <w:i/>
-          <w:sz w:val="24"/>
-        </w:rPr>
-        <w:t>Path diagram</w:t>
-      </w:r>
-      <w:r>
-        <w:rPr>
-          <w:sz w:val="24"/>
-        </w:rPr>
-        <w:t>)  . . . . . . . . . . . . . . . . . . 40</w:t>
-      </w:r>
-    </w:p>
-    <w:p>
-      <w:pPr>
-        <w:pStyle w:val="Heading1"/>
-        <w:spacing w:before="2" w:line="360" w:lineRule="auto"/>
-        <w:ind w:right="1089"/>
-        <w:rPr>
-          <w:szCs w:val="28"/>
-          <w:lang w:val="en-US"/>
-        </w:rPr>
-      </w:pPr>
-      <w:bookmarkStart w:id="7" w:name="_Toc235393107"/>
-      <w:r>
-        <w:rPr>
-          <w:szCs w:val="28"/>
-          <w:lang w:val="en-US"/>
-        </w:rPr>
-        <w:t>DAFTAR ISI</w:t>
-      </w:r>
-      <w:bookmarkEnd w:id="7"/>
+        <w:t>Gambar 3.6 Diagram Jalur (Path Diagram) ................................. 40</w:t>
+      </w:r>
     </w:p>
     <w:p>
       <w:pPr>
@@ -11973,24 +11885,7 @@
                 <w:szCs w:val="24"/>
                 <w:lang w:val="en-ID" w:eastAsia="en-ID"/>
               </w:rPr>
-              <w:t xml:space="preserve">The Effect of Compensation and Work Discipline on Employee </w:t>
-            </w:r>
-            <w:r>
-              <w:rPr>
-                <w:i/>
-                <w:sz w:val="24"/>
-                <w:szCs w:val="24"/>
-                <w:lang w:val="en-ID" w:eastAsia="en-ID"/>
-              </w:rPr>
-              <w:t>Performance</w:t>
-            </w:r>
-            <w:r>
-              <w:rPr>
-                <w:sz w:val="24"/>
-                <w:szCs w:val="24"/>
-                <w:lang w:val="en-ID" w:eastAsia="en-ID"/>
-              </w:rPr>
-              <w:t xml:space="preserve"> Through Work Motivation (DPRD DKI Jakarta)</w:t>
+              <w:t>The Effect of Compensation and Work Discipline on Employee Performance Through Work Motivation (DPRD DKI Jakarta)</w:t>
             </w:r>
           </w:p>
         </w:tc>
@@ -13443,7 +13338,7 @@
           <w:szCs w:val="24"/>
         </w:rPr>
         <w:drawing>
-          <wp:anchor distT="0" distB="0" distL="114300" distR="114300" simplePos="0" relativeHeight="487590912" behindDoc="0" locked="0" layoutInCell="1" allowOverlap="1" wp14:anchorId="4D020E94" wp14:editId="62F61297">
+          <wp:anchor distT="0" distB="0" distL="114300" distR="114300" simplePos="0" relativeHeight="487590912" behindDoc="0" locked="0" layoutInCell="1" allowOverlap="1" wp14:anchorId="434C0F97" wp14:editId="57FEDC89">
             <wp:simplePos x="0" y="0"/>
             <wp:positionH relativeFrom="column">
               <wp:posOffset>421640</wp:posOffset>
@@ -13614,7 +13509,7 @@
           <w:noProof/>
         </w:rPr>
         <w:drawing>
-          <wp:inline distT="0" distB="0" distL="0" distR="0" wp14:anchorId="153407FF" wp14:editId="08236CA6">
+          <wp:inline distT="0" distB="0" distL="0" distR="0" wp14:anchorId="675F54F3" wp14:editId="4F4ADEAB">
             <wp:extent cx="5029200" cy="5029200"/>
             <wp:effectExtent l="0" t="0" r="0" b="0"/>
             <wp:docPr id="6" name="Picture 6"/>
@@ -13659,7 +13554,7 @@
           <w:noProof/>
         </w:rPr>
         <w:drawing>
-          <wp:inline distT="0" distB="0" distL="0" distR="0" wp14:anchorId="520BD9D2" wp14:editId="2BB02C00">
+          <wp:inline distT="0" distB="0" distL="0" distR="0" wp14:anchorId="064D31A6" wp14:editId="5A765384">
             <wp:extent cx="5029200" cy="5029200"/>
             <wp:effectExtent l="0" t="0" r="0" b="0"/>
             <wp:docPr id="7" name="Picture 7"/>
@@ -21178,6 +21073,11 @@
         </w:rPr>
       </w:pPr>
       <w:r>
+        <w:rPr>
+          <w:color w:val="000000" w:themeColor="text1"/>
+          <w:sz w:val="24"/>
+          <w:szCs w:val="24"/>
+        </w:rPr>
         <w:t>Populasi dalam penelitian ini adalah seluruh perangkat desa di Kantor Desa Pisangan Jaya, Kabupaten Tangerang pada saat penyebaran kuesioner ini dilakukan yaitu bulan Juni - Juli 2026, berjumlah 35 orang.</w:t>
       </w:r>
     </w:p>
@@ -22446,7 +22346,7 @@
           <w:sz w:val="24"/>
           <w:szCs w:val="24"/>
         </w:rPr>
-        <w:t>Partial Least square</w:t>
+        <w:t>Partial Least Square</w:t>
       </w:r>
       <w:r>
         <w:rPr>
@@ -22528,32 +22428,12 @@
         <w:rPr>
           <w:b/>
           <w:bCs/>
-          <w:color w:val="000000" w:themeColor="text1"/>
-          <w:sz w:val="24"/>
-          <w:szCs w:val="24"/>
-        </w:rPr>
-        <w:t>F.1.    Merancang Model Pengukuran (</w:t>
-      </w:r>
-      <w:r>
-        <w:rPr>
-          <w:b/>
-          <w:bCs/>
           <w:i/>
           <w:color w:val="000000" w:themeColor="text1"/>
           <w:sz w:val="24"/>
           <w:szCs w:val="24"/>
         </w:rPr>
-        <w:t>Outer model</w:t>
-      </w:r>
-      <w:r>
-        <w:rPr>
-          <w:b/>
-          <w:bCs/>
-          <w:color w:val="000000" w:themeColor="text1"/>
-          <w:sz w:val="24"/>
-          <w:szCs w:val="24"/>
-        </w:rPr>
-        <w:t>)</w:t>
+        <w:t>F.1.    Merancang Model Pengukuran (Outer Model)</w:t>
       </w:r>
     </w:p>
     <w:p>
@@ -22654,7 +22534,7 @@
           <w:iCs/>
           <w:color w:val="000000" w:themeColor="text1"/>
         </w:rPr>
-        <w:t>Outer model</w:t>
+        <w:t>Outer Model</w:t>
       </w:r>
       <w:r>
         <w:rPr>
@@ -22677,10 +22557,10 @@
       </w:pPr>
       <w:r>
         <w:rPr>
-          <w:rFonts w:ascii="Times New Roman" w:hAnsi="Times New Roman"/>
+          <w:b/>
+          <w:bCs/>
           <w:i/>
           <w:color w:val="505050"/>
-          <w:sz w:val="22"/>
         </w:rPr>
         <w:t>(Tampilan diagram model akan disajikan setelah pengolahan data kuesioner pada Bab IV)</w:t>
       </w:r>
@@ -22733,17 +22613,7 @@
           <w:sz w:val="22"/>
           <w:szCs w:val="22"/>
         </w:rPr>
-        <w:t>Outer model</w:t>
-      </w:r>
-      <w:r>
-        <w:rPr>
-          <w:i/>
-          <w:iCs/>
-          <w:color w:val="000000" w:themeColor="text1"/>
-          <w:sz w:val="22"/>
-          <w:szCs w:val="22"/>
-        </w:rPr>
-        <w:t xml:space="preserve"> variabel dependen (Y)</w:t>
+        <w:t>Outer model variabel dependen (Y)</w:t>
       </w:r>
       <w:r>
         <w:rPr>
@@ -22786,7 +22656,7 @@
           <w:iCs/>
           <w:color w:val="000000" w:themeColor="text1"/>
         </w:rPr>
-        <w:t>Outer model</w:t>
+        <w:t>Outer Model</w:t>
       </w:r>
       <w:r>
         <w:rPr>
@@ -22809,15 +22679,73 @@
       </w:pPr>
       <w:r>
         <w:rPr>
-          <w:rFonts w:ascii="Times New Roman" w:hAnsi="Times New Roman"/>
+          <w:b/>
+          <w:bCs/>
           <w:i/>
           <w:color w:val="505050"/>
+        </w:rPr>
+        <w:t>(Tampilan diagram model akan disajikan setelah pengolahan data kuesioner pada Bab IV)</w:t>
+      </w:r>
+      <w:r>
+        <w:rPr>
+          <w:b/>
+          <w:bCs/>
+          <w:color w:val="000000" w:themeColor="text1"/>
+        </w:rPr>
+        <w:br/>
+      </w:r>
+      <w:r>
+        <w:rPr>
+          <w:i/>
+          <w:iCs/>
+          <w:color w:val="000000" w:themeColor="text1"/>
           <w:sz w:val="22"/>
-        </w:rPr>
-        <w:t>(Tampilan diagram model akan disajikan setelah pengolahan data kuesioner pada Bab IV)</w:t>
+          <w:szCs w:val="22"/>
+        </w:rPr>
+        <w:t>Gambar 3.2</w:t>
+      </w:r>
+      <w:r>
+        <w:rPr>
+          <w:i/>
+          <w:iCs/>
+          <w:color w:val="000000" w:themeColor="text1"/>
+          <w:sz w:val="22"/>
+          <w:szCs w:val="22"/>
+        </w:rPr>
+        <w:t xml:space="preserve"> </w:t>
+      </w:r>
+      <w:r>
+        <w:rPr>
+          <w:i/>
+          <w:iCs/>
+          <w:color w:val="000000" w:themeColor="text1"/>
+          <w:sz w:val="22"/>
+          <w:szCs w:val="22"/>
+        </w:rPr>
+        <w:t>Outer model</w:t>
+      </w:r>
+      <w:r>
+        <w:rPr>
+          <w:color w:val="000000" w:themeColor="text1"/>
+          <w:sz w:val="22"/>
+          <w:szCs w:val="22"/>
+        </w:rPr>
+        <w:t xml:space="preserve"> variabel independen (X1)</w:t>
+      </w:r>
+      <w:r>
+        <w:rPr>
+          <w:color w:val="000000" w:themeColor="text1"/>
+          <w:sz w:val="22"/>
+          <w:szCs w:val="22"/>
+        </w:rPr>
         <w:br/>
-        <w:t>Gambar 3.2 Outer model variabel independen (X1)</w:t>
-        <w:br/>
+      </w:r>
+      <w:r>
+        <w:rPr>
+          <w:b/>
+          <w:bCs/>
+          <w:color w:val="000000" w:themeColor="text1"/>
+        </w:rPr>
         <w:t>Sumber: Data primer diolah, 2026</w:t>
       </w:r>
     </w:p>
@@ -22833,22 +22761,10 @@
       </w:pPr>
       <w:r>
         <w:rPr>
-          <w:color w:val="000000" w:themeColor="text1"/>
-        </w:rPr>
-        <w:t>F.1.c.    </w:t>
-      </w:r>
-      <w:r>
-        <w:rPr>
           <w:i/>
           <w:color w:val="000000" w:themeColor="text1"/>
         </w:rPr>
-        <w:t>Outer model</w:t>
-      </w:r>
-      <w:r>
-        <w:rPr>
-          <w:color w:val="000000" w:themeColor="text1"/>
-        </w:rPr>
-        <w:t xml:space="preserve"> Variabel Independen (X2)</w:t>
+        <w:t>F.1.c.    Outer Model Variabel Independen (X2)</w:t>
       </w:r>
     </w:p>
     <w:p>
@@ -22865,16 +22781,54 @@
       </w:pPr>
       <w:r>
         <w:rPr>
-          <w:rFonts w:ascii="Times New Roman" w:hAnsi="Times New Roman"/>
+          <w:b/>
+          <w:bCs/>
           <w:i/>
           <w:color w:val="505050"/>
-          <w:sz w:val="22"/>
         </w:rPr>
         <w:t>(Tampilan diagram model akan disajikan setelah pengolahan data kuesioner pada Bab IV)</w:t>
+      </w:r>
+      <w:r>
+        <w:rPr>
+          <w:b/>
+          <w:bCs/>
+          <w:color w:val="000000" w:themeColor="text1"/>
+        </w:rPr>
         <w:br/>
         <w:t>Gambar 3.3</w:t>
+      </w:r>
+      <w:r>
+        <w:rPr>
+          <w:b/>
+          <w:bCs/>
+          <w:color w:val="000000" w:themeColor="text1"/>
+        </w:rPr>
         <w:br/>
-        <w:t>Outer model variabel independen (X2)</w:t>
+      </w:r>
+      <w:r>
+        <w:rPr>
+          <w:b/>
+          <w:bCs/>
+          <w:i/>
+          <w:iCs/>
+          <w:color w:val="000000" w:themeColor="text1"/>
+        </w:rPr>
+        <w:t>Outer model</w:t>
+      </w:r>
+      <w:r>
+        <w:rPr>
+          <w:b/>
+          <w:bCs/>
+          <w:color w:val="000000" w:themeColor="text1"/>
+        </w:rPr>
+        <w:t xml:space="preserve"> variabel independen (X2)</w:t>
+      </w:r>
+      <w:r>
+        <w:rPr>
+          <w:b/>
+          <w:bCs/>
+          <w:color w:val="000000" w:themeColor="text1"/>
+        </w:rPr>
         <w:br/>
         <w:t>Sumber: Data primer diolah, 2026</w:t>
       </w:r>
@@ -22891,22 +22845,10 @@
       </w:pPr>
       <w:r>
         <w:rPr>
-          <w:color w:val="000000" w:themeColor="text1"/>
-        </w:rPr>
-        <w:t>F.1.d.    </w:t>
-      </w:r>
-      <w:r>
-        <w:rPr>
           <w:i/>
           <w:color w:val="000000" w:themeColor="text1"/>
         </w:rPr>
-        <w:t>Outer model</w:t>
-      </w:r>
-      <w:r>
-        <w:rPr>
-          <w:color w:val="000000" w:themeColor="text1"/>
-        </w:rPr>
-        <w:t xml:space="preserve"> Variabel </w:t>
+        <w:t xml:space="preserve">F.1.d.    Outer Model Variabel </w:t>
       </w:r>
       <w:r>
         <w:rPr>
@@ -22929,42 +22871,29 @@
       </w:pPr>
       <w:r>
         <w:rPr>
-          <w:rFonts w:ascii="Times New Roman" w:hAnsi="Times New Roman"/>
+          <w:b/>
+          <w:bCs/>
           <w:i/>
           <w:color w:val="505050"/>
-          <w:sz w:val="22"/>
         </w:rPr>
         <w:t>(Tampilan diagram model akan disajikan setelah pengolahan data kuesioner pada Bab IV)</w:t>
+      </w:r>
+      <w:r>
+        <w:rPr>
+          <w:b/>
+          <w:bCs/>
+          <w:color w:val="000000" w:themeColor="text1"/>
+        </w:rPr>
         <w:br/>
         <w:t>Gambar 3.4</w:t>
-        <w:br/>
-        <w:t>Outer model variabel Mediasi (Z)</w:t>
-        <w:br/>
-        <w:t>Sumber: Data primer diolah, 2026</w:t>
-      </w:r>
-    </w:p>
-    <w:p>
-      <w:pPr>
-        <w:spacing w:before="2" w:line="360" w:lineRule="auto"/>
-        <w:ind w:left="993" w:right="1089"/>
-        <w:jc w:val="both"/>
+      </w:r>
+      <w:r>
         <w:rPr>
           <w:b/>
           <w:bCs/>
           <w:color w:val="000000" w:themeColor="text1"/>
-          <w:sz w:val="24"/>
-          <w:szCs w:val="24"/>
-        </w:rPr>
-      </w:pPr>
-      <w:r>
-        <w:rPr>
-          <w:b/>
-          <w:bCs/>
-          <w:color w:val="000000" w:themeColor="text1"/>
-          <w:sz w:val="24"/>
-          <w:szCs w:val="24"/>
-        </w:rPr>
-        <w:t>F.2.    Merancang Model Struktural (</w:t>
+        </w:rPr>
+        <w:br/>
       </w:r>
       <w:r>
         <w:rPr>
@@ -22973,10 +22902,79 @@
           <w:i/>
           <w:iCs/>
           <w:color w:val="000000" w:themeColor="text1"/>
-          <w:sz w:val="24"/>
-          <w:szCs w:val="24"/>
-        </w:rPr>
-        <w:t>Inner model</w:t>
+        </w:rPr>
+        <w:t>Outer model</w:t>
+      </w:r>
+      <w:r>
+        <w:rPr>
+          <w:b/>
+          <w:bCs/>
+          <w:color w:val="000000" w:themeColor="text1"/>
+        </w:rPr>
+        <w:t xml:space="preserve"> variabel </w:t>
+      </w:r>
+      <w:r>
+        <w:rPr>
+          <w:b/>
+          <w:bCs/>
+          <w:i/>
+          <w:iCs/>
+          <w:color w:val="000000" w:themeColor="text1"/>
+        </w:rPr>
+        <w:t>Mediasi</w:t>
+      </w:r>
+      <w:r>
+        <w:rPr>
+          <w:b/>
+          <w:bCs/>
+          <w:color w:val="000000" w:themeColor="text1"/>
+        </w:rPr>
+        <w:t xml:space="preserve"> (Z)</w:t>
+      </w:r>
+      <w:r>
+        <w:rPr>
+          <w:b/>
+          <w:bCs/>
+          <w:color w:val="000000" w:themeColor="text1"/>
+        </w:rPr>
+        <w:br/>
+        <w:t>Sumber: Data primer diolah, 2026</w:t>
+      </w:r>
+    </w:p>
+    <w:p>
+      <w:pPr>
+        <w:spacing w:before="2" w:line="360" w:lineRule="auto"/>
+        <w:ind w:left="993" w:right="1089"/>
+        <w:jc w:val="both"/>
+        <w:rPr>
+          <w:b/>
+          <w:bCs/>
+          <w:color w:val="000000" w:themeColor="text1"/>
+          <w:sz w:val="24"/>
+          <w:szCs w:val="24"/>
+        </w:rPr>
+      </w:pPr>
+      <w:r>
+        <w:rPr>
+          <w:b/>
+          <w:bCs/>
+          <w:color w:val="000000" w:themeColor="text1"/>
+          <w:sz w:val="24"/>
+          <w:szCs w:val="24"/>
+        </w:rPr>
+        <w:t>F.2.    Merancang Model Struktural (</w:t>
+      </w:r>
+      <w:r>
+        <w:rPr>
+          <w:b/>
+          <w:bCs/>
+          <w:i/>
+          <w:iCs/>
+          <w:color w:val="000000" w:themeColor="text1"/>
+          <w:sz w:val="24"/>
+          <w:szCs w:val="24"/>
+        </w:rPr>
+        <w:t>Inner Model</w:t>
       </w:r>
       <w:r>
         <w:rPr>
@@ -23115,16 +23113,64 @@
       </w:pPr>
       <w:r>
         <w:rPr>
-          <w:rFonts w:ascii="Times New Roman" w:hAnsi="Times New Roman"/>
+          <w:b/>
+          <w:bCs/>
           <w:i/>
           <w:color w:val="505050"/>
-          <w:sz w:val="22"/>
         </w:rPr>
         <w:t>(Tampilan diagram model akan disajikan setelah pengolahan data kuesioner pada Bab IV)</w:t>
+      </w:r>
+      <w:r>
+        <w:rPr>
+          <w:b/>
+          <w:bCs/>
+          <w:color w:val="000000" w:themeColor="text1"/>
+        </w:rPr>
         <w:br/>
         <w:t>Gambar 3.5</w:t>
+      </w:r>
+      <w:r>
+        <w:rPr>
+          <w:b/>
+          <w:bCs/>
+          <w:color w:val="000000" w:themeColor="text1"/>
+        </w:rPr>
         <w:br/>
-        <w:t>Inner model variabel Dependen, Independen, dan Mediasi</w:t>
+      </w:r>
+      <w:r>
+        <w:rPr>
+          <w:b/>
+          <w:bCs/>
+          <w:i/>
+          <w:iCs/>
+          <w:color w:val="000000" w:themeColor="text1"/>
+        </w:rPr>
+        <w:t>Inner model</w:t>
+      </w:r>
+      <w:r>
+        <w:rPr>
+          <w:b/>
+          <w:bCs/>
+          <w:color w:val="000000" w:themeColor="text1"/>
+        </w:rPr>
+        <w:t xml:space="preserve"> variabel Dependen, Independen, dan </w:t>
+      </w:r>
+      <w:r>
+        <w:rPr>
+          <w:b/>
+          <w:bCs/>
+          <w:i/>
+          <w:iCs/>
+          <w:color w:val="000000" w:themeColor="text1"/>
+        </w:rPr>
+        <w:t>Mediasi</w:t>
+      </w:r>
+      <w:r>
+        <w:rPr>
+          <w:b/>
+          <w:bCs/>
+          <w:color w:val="000000" w:themeColor="text1"/>
+        </w:rPr>
         <w:br/>
         <w:t>Sumber: Data primer diolah, 2026</w:t>
       </w:r>
@@ -23187,16 +23233,55 @@
       </w:pPr>
       <w:r>
         <w:rPr>
-          <w:rFonts w:ascii="Times New Roman" w:hAnsi="Times New Roman"/>
+          <w:b/>
+          <w:bCs/>
           <w:i/>
           <w:color w:val="505050"/>
-          <w:sz w:val="22"/>
         </w:rPr>
         <w:t>(Tampilan diagram model akan disajikan setelah pengolahan data kuesioner pada Bab IV)</w:t>
+      </w:r>
+      <w:r>
+        <w:rPr>
+          <w:b/>
+          <w:bCs/>
+          <w:color w:val="000000" w:themeColor="text1"/>
+        </w:rPr>
         <w:br/>
         <w:t>Gambar 3.6</w:t>
+      </w:r>
+      <w:r>
+        <w:rPr>
+          <w:b/>
+          <w:bCs/>
+          <w:color w:val="000000" w:themeColor="text1"/>
+        </w:rPr>
         <w:br/>
-        <w:t>Diagram Jalur (Path diagram)</w:t>
+        <w:t>Diagram Jalur (</w:t>
+      </w:r>
+      <w:r>
+        <w:rPr>
+          <w:b/>
+          <w:bCs/>
+          <w:i/>
+          <w:iCs/>
+          <w:color w:val="000000" w:themeColor="text1"/>
+        </w:rPr>
+        <w:t>Path Diagram</w:t>
+      </w:r>
+      <w:r>
+        <w:rPr>
+          <w:b/>
+          <w:bCs/>
+          <w:color w:val="000000" w:themeColor="text1"/>
+        </w:rPr>
+        <w:t>)</w:t>
+      </w:r>
+      <w:r>
+        <w:rPr>
+          <w:b/>
+          <w:bCs/>
+          <w:color w:val="000000" w:themeColor="text1"/>
+        </w:rPr>
         <w:br/>
         <w:t>Sumber: Noor, 2015:147</w:t>
       </w:r>
@@ -23718,7 +23803,15 @@
           <w:sz w:val="24"/>
           <w:szCs w:val="24"/>
         </w:rPr>
-        <w:t>cronbach alpha</w:t>
+        <w:t>cronbach alpha, composite realibity</w:t>
+      </w:r>
+      <w:r>
+        <w:rPr>
+          <w:color w:val="000000" w:themeColor="text1"/>
+          <w:sz w:val="24"/>
+          <w:szCs w:val="24"/>
+        </w:rPr>
+        <w:t>), validitas konvergen (</w:t>
       </w:r>
       <w:r>
         <w:rPr>
@@ -23728,35 +23821,7 @@
           <w:sz w:val="24"/>
           <w:szCs w:val="24"/>
         </w:rPr>
-        <w:t>, composite realibity</w:t>
-      </w:r>
-      <w:r>
-        <w:rPr>
-          <w:color w:val="000000" w:themeColor="text1"/>
-          <w:sz w:val="24"/>
-          <w:szCs w:val="24"/>
-        </w:rPr>
-        <w:t>), validitas konvergen (</w:t>
-      </w:r>
-      <w:r>
-        <w:rPr>
-          <w:i/>
-          <w:iCs/>
-          <w:color w:val="000000" w:themeColor="text1"/>
-          <w:sz w:val="24"/>
-          <w:szCs w:val="24"/>
-        </w:rPr>
-        <w:t xml:space="preserve">outer loading, </w:t>
-      </w:r>
-      <w:r>
-        <w:rPr>
-          <w:i/>
-          <w:iCs/>
-          <w:color w:val="000000" w:themeColor="text1"/>
-          <w:sz w:val="24"/>
-          <w:szCs w:val="24"/>
-        </w:rPr>
-        <w:t>average variance extracted</w:t>
+        <w:t>outer loading, average variance extracted</w:t>
       </w:r>
       <w:r>
         <w:rPr>
@@ -24196,7 +24261,7 @@
           <w:iCs/>
           <w:color w:val="000000" w:themeColor="text1"/>
         </w:rPr>
-        <w:t>Cronbach’s Alpha</w:t>
+        <w:t>Cronbach's Alpha</w:t>
       </w:r>
       <w:r>
         <w:rPr>
@@ -24210,7 +24275,7 @@
           <w:iCs/>
           <w:color w:val="000000" w:themeColor="text1"/>
         </w:rPr>
-        <w:t>Composite reliability</w:t>
+        <w:t>Composite Reliability</w:t>
       </w:r>
       <w:r>
         <w:rPr>
@@ -24224,7 +24289,7 @@
           <w:iCs/>
           <w:color w:val="000000" w:themeColor="text1"/>
         </w:rPr>
-        <w:t>Rule of thumb</w:t>
+        <w:t>Rule of Thumb</w:t>
       </w:r>
       <w:r>
         <w:rPr>
@@ -24238,7 +24303,7 @@
           <w:iCs/>
           <w:color w:val="000000" w:themeColor="text1"/>
         </w:rPr>
-        <w:t>Composite reliability</w:t>
+        <w:t>Composite Reliability</w:t>
       </w:r>
       <w:r>
         <w:rPr>
@@ -24294,7 +24359,7 @@
           <w:iCs/>
           <w:color w:val="000000" w:themeColor="text1"/>
         </w:rPr>
-        <w:t>Rule of thumb</w:t>
+        <w:t>Rule of Thumb</w:t>
       </w:r>
       <w:r>
         <w:rPr>
@@ -24337,15 +24402,7 @@
           <w:iCs/>
           <w:color w:val="000000" w:themeColor="text1"/>
         </w:rPr>
-        <w:t>Rule of thumb</w:t>
-      </w:r>
-      <w:r>
-        <w:rPr>
-          <w:i/>
-          <w:iCs/>
-          <w:color w:val="000000" w:themeColor="text1"/>
-        </w:rPr>
-        <w:t xml:space="preserve"> Evaluasi Model Pengukuran</w:t>
+        <w:t>Rule of Thumb Evaluasi Model Pengukuran</w:t>
       </w:r>
     </w:p>
     <w:tbl>
@@ -24492,7 +24549,7 @@
                 <w:sz w:val="24"/>
                 <w:szCs w:val="24"/>
               </w:rPr>
-              <w:t>Rule of thumb</w:t>
+              <w:t>Rule of Thumb</w:t>
             </w:r>
           </w:p>
         </w:tc>
@@ -24574,7 +24631,7 @@
                 <w:sz w:val="24"/>
                 <w:szCs w:val="24"/>
               </w:rPr>
-              <w:t>Loading factor</w:t>
+              <w:t>Loading Factor</w:t>
             </w:r>
           </w:p>
         </w:tc>
@@ -24622,7 +24679,7 @@
                 <w:sz w:val="24"/>
                 <w:szCs w:val="24"/>
               </w:rPr>
-              <w:t>Confirmatory research</w:t>
+              <w:t>Confirmatory Research</w:t>
             </w:r>
           </w:p>
         </w:tc>
@@ -24792,17 +24849,7 @@
                 <w:sz w:val="24"/>
                 <w:szCs w:val="24"/>
               </w:rPr>
-              <w:t>Average variance extracted</w:t>
-            </w:r>
-            <w:r>
-              <w:rPr>
-                <w:i/>
-                <w:iCs/>
-                <w:color w:val="000000" w:themeColor="text1"/>
-                <w:sz w:val="24"/>
-                <w:szCs w:val="24"/>
-              </w:rPr>
-              <w:t xml:space="preserve"> (AVE)</w:t>
+              <w:t>Average Variance Extracted (AVE)</w:t>
             </w:r>
             <w:r>
               <w:rPr>
@@ -24886,7 +24933,7 @@
                 <w:sz w:val="24"/>
                 <w:szCs w:val="24"/>
               </w:rPr>
-              <w:t>Exploratory research</w:t>
+              <w:t>Exploratory Research</w:t>
             </w:r>
           </w:p>
         </w:tc>
@@ -24967,7 +25014,7 @@
                 <w:sz w:val="24"/>
                 <w:szCs w:val="24"/>
               </w:rPr>
-              <w:t>Cross loading</w:t>
+              <w:t>Cross Loading</w:t>
             </w:r>
           </w:p>
         </w:tc>
@@ -25177,17 +25224,7 @@
                 <w:sz w:val="24"/>
                 <w:szCs w:val="24"/>
               </w:rPr>
-              <w:t>Heterotrair-monotrait</w:t>
-            </w:r>
-            <w:r>
-              <w:rPr>
-                <w:i/>
-                <w:iCs/>
-                <w:color w:val="000000" w:themeColor="text1"/>
-                <w:sz w:val="24"/>
-                <w:szCs w:val="24"/>
-              </w:rPr>
-              <w:t xml:space="preserve"> Ratio (HTMT)</w:t>
+              <w:t>Heterotrair-monotrait Ratio (HTMT)</w:t>
             </w:r>
           </w:p>
         </w:tc>
@@ -25307,7 +25344,7 @@
                 <w:sz w:val="24"/>
                 <w:szCs w:val="24"/>
               </w:rPr>
-              <w:t>Cronbach’s Alpha</w:t>
+              <w:t>Cronbach's Alpha</w:t>
             </w:r>
           </w:p>
         </w:tc>
@@ -25355,7 +25392,7 @@
                 <w:sz w:val="24"/>
                 <w:szCs w:val="24"/>
               </w:rPr>
-              <w:t>Confirmatory research</w:t>
+              <w:t>Confirmatory Research</w:t>
             </w:r>
           </w:p>
         </w:tc>
@@ -25457,7 +25494,7 @@
                 <w:sz w:val="24"/>
                 <w:szCs w:val="24"/>
               </w:rPr>
-              <w:t>Exploratory research</w:t>
+              <w:t>Exploratory Research</w:t>
             </w:r>
           </w:p>
         </w:tc>
@@ -25526,7 +25563,7 @@
                 <w:sz w:val="24"/>
                 <w:szCs w:val="24"/>
               </w:rPr>
-              <w:t>Composite reliability</w:t>
+              <w:t>Composite Reliability</w:t>
             </w:r>
           </w:p>
         </w:tc>
@@ -25574,7 +25611,7 @@
                 <w:sz w:val="24"/>
                 <w:szCs w:val="24"/>
               </w:rPr>
-              <w:t>Confirmatory research</w:t>
+              <w:t>Confirmatory Research</w:t>
             </w:r>
           </w:p>
         </w:tc>
@@ -25676,7 +25713,7 @@
                 <w:sz w:val="24"/>
                 <w:szCs w:val="24"/>
               </w:rPr>
-              <w:t>Exploratory research</w:t>
+              <w:t>Exploratory Research</w:t>
             </w:r>
           </w:p>
         </w:tc>
@@ -25988,28 +26025,12 @@
       </w:pPr>
       <w:r>
         <w:rPr>
-          <w:color w:val="000000" w:themeColor="text1"/>
-          <w:sz w:val="24"/>
-          <w:szCs w:val="24"/>
-        </w:rPr>
-        <w:t xml:space="preserve">Ghozali (2021:74) menambahkan, disamping melihat besarnya R-Square, evaluasi model PLS dapat juga dilakukan dengan Q² </w:t>
-      </w:r>
-      <w:r>
-        <w:rPr>
           <w:i/>
           <w:color w:val="000000" w:themeColor="text1"/>
           <w:sz w:val="24"/>
           <w:szCs w:val="24"/>
         </w:rPr>
-        <w:t>Predictive relevance</w:t>
-      </w:r>
-      <w:r>
-        <w:rPr>
-          <w:color w:val="000000" w:themeColor="text1"/>
-          <w:sz w:val="24"/>
-          <w:szCs w:val="24"/>
-        </w:rPr>
-        <w:t xml:space="preserve"> atau sering disebut </w:t>
+        <w:t xml:space="preserve">Ghozali (2021:74) menambahkan, disamping melihat besarnya R-Square, evaluasi model PLS dapat juga dilakukan dengan Q² Predictive relevance atau sering disebut </w:t>
       </w:r>
       <w:r>
         <w:rPr>
@@ -26210,15 +26231,7 @@
           <w:iCs/>
           <w:color w:val="000000" w:themeColor="text1"/>
         </w:rPr>
-        <w:t>Rule of thumb</w:t>
-      </w:r>
-      <w:r>
-        <w:rPr>
-          <w:i/>
-          <w:iCs/>
-          <w:color w:val="000000" w:themeColor="text1"/>
-        </w:rPr>
-        <w:t xml:space="preserve"> Evaluasi Model Struktural</w:t>
+        <w:t>Rule of Thumb Evaluasi Model Struktural</w:t>
       </w:r>
     </w:p>
     <w:tbl>
@@ -26452,17 +26465,7 @@
                 <w:sz w:val="24"/>
                 <w:szCs w:val="24"/>
               </w:rPr>
-              <w:t>Effect size</w:t>
-            </w:r>
-            <w:r>
-              <w:rPr>
-                <w:i/>
-                <w:iCs/>
-                <w:color w:val="000000" w:themeColor="text1"/>
-                <w:sz w:val="24"/>
-                <w:szCs w:val="24"/>
-              </w:rPr>
-              <w:t xml:space="preserve"> f²</w:t>
+              <w:t>Effect size f²</w:t>
             </w:r>
           </w:p>
         </w:tc>
@@ -26542,17 +26545,7 @@
                 <w:sz w:val="24"/>
                 <w:szCs w:val="24"/>
               </w:rPr>
-              <w:t xml:space="preserve">Q² </w:t>
-            </w:r>
-            <w:r>
-              <w:rPr>
-                <w:i/>
-                <w:iCs/>
-                <w:color w:val="000000" w:themeColor="text1"/>
-                <w:sz w:val="24"/>
-                <w:szCs w:val="24"/>
-              </w:rPr>
-              <w:t>predictive relevance</w:t>
+              <w:t>Q² predictive relevance</w:t>
             </w:r>
           </w:p>
         </w:tc>
@@ -26668,17 +26661,7 @@
                 <w:sz w:val="24"/>
                 <w:szCs w:val="24"/>
               </w:rPr>
-              <w:t xml:space="preserve">q² </w:t>
-            </w:r>
-            <w:r>
-              <w:rPr>
-                <w:i/>
-                <w:iCs/>
-                <w:color w:val="000000" w:themeColor="text1"/>
-                <w:sz w:val="24"/>
-                <w:szCs w:val="24"/>
-              </w:rPr>
-              <w:t>predictive relevance</w:t>
+              <w:t>q² predictive relevance</w:t>
             </w:r>
           </w:p>
         </w:tc>
@@ -26919,7 +26902,7 @@
     </w:p>
     <w:p>
       <w:pPr>
-        <w:spacing w:before="240" w:after="240" w:line="360" w:lineRule="auto"/>
+        <w:spacing w:before="240"/>
         <w:jc w:val="center"/>
       </w:pPr>
       <w:r>
@@ -26939,7 +26922,13 @@
         <w:rPr>
           <w:sz w:val="24"/>
         </w:rPr>
-        <w:t>Agustin, D. S. (2020). Analisis Pengaruh Budaya Organisasi, Gaya Kepemimpinan terhadap Kinerja Karyawan UMKM dengan Motivasi Kerja sebagai Variabel Mediasi. Jurnal Ilmu Manajemen, 8(3), 789–800.</w:t>
+        <w:t xml:space="preserve">Agustin, D. S. (2020). Analisis Pengaruh Budaya Organisasi, Gaya Kepemimpinan terhadap Kinerja Karyawan </w:t>
+      </w:r>
+      <w:r>
+        <w:rPr>
+          <w:sz w:val="24"/>
+        </w:rPr>
+        <w:t>UMKM dengan Motivasi Kerja sebagai Variabel Mediasi. Jurnal Ilmu Manajemen, 8(3), 789-800.</w:t>
       </w:r>
     </w:p>
     <w:p>
@@ -26951,7 +26940,13 @@
         <w:rPr>
           <w:sz w:val="24"/>
         </w:rPr>
-        <w:t>Amin, A. R. A. (2024). Pengaruh Kompetensi dan Gaya Kepemimpinan Terhadap Kinerja Perangkat Desa di Kecamatan Rambang dengan Motivasi Sebagai Variabel Mediasi (Tesis Magister, Universitas Sriwijaya).</w:t>
+        <w:t>Amin, A. R. A. (2024). Pengaruh Kompetensi dan Gaya Kepemimpinan Terhadap Kinerja Perangkat Desa di Kecamatan Rambang dengan Motivasi Sebagai Variabel Mediasi (Skrip</w:t>
+      </w:r>
+      <w:r>
+        <w:rPr>
+          <w:sz w:val="24"/>
+        </w:rPr>
+        <w:t>si, Universitas Sriwijaya).</w:t>
       </w:r>
     </w:p>
     <w:p>
@@ -26963,7 +26958,7 @@
         <w:rPr>
           <w:sz w:val="24"/>
         </w:rPr>
-        <w:t>Arrasyd, H. M., dkk. (2024). Pengaruh Gaya Kepemimpinan Dan Lingkungan Kerja Terhadap Kinerja Perangkat Desa Dengan Motivasi Kerja Sebagai Variabel Mediasi. Jurnal Manajemen &amp; Kewirausahaan, 12(1), 45–56.</w:t>
+        <w:t>Arrasyd, H. M., dkk. (2024). Pengaruh Gaya Kepemimpinan Dan Lingkungan Kerja Terhadap Kinerja Perangkat Desa Dengan Motivasi Kerja Sebagai Variabel Mediasi. Jurnal Manajemen &amp; Kewirausahaan, 12(1), 45-56.</w:t>
       </w:r>
     </w:p>
     <w:p>
@@ -26975,7 +26970,13 @@
         <w:rPr>
           <w:sz w:val="24"/>
         </w:rPr>
-        <w:t>Atmojo, A. A. (2022). Pengaruh Gaya Kepemimpinan, Kompensasi Terhadap Kinerja Dengan Motivasi Kerja Sebagai Variabel Mediasi Pada PDAM Kabupaten Kediri. Jurnal Penelitian Ekonomi dan Bisnis, 7(2), 112–125.</w:t>
+        <w:t>Atmojo, A. A. (2022). P</w:t>
+      </w:r>
+      <w:r>
+        <w:rPr>
+          <w:sz w:val="24"/>
+        </w:rPr>
+        <w:t>engaruh Gaya Kepemimpinan, Kompensasi Terhadap Kinerja Dengan Motivasi Kerja Sebagai Variabel Mediasi Pada PDAM Kabupaten Kediri. Jurnal Penelitian Ekonomi dan Bisnis, 7(2), 112-125.</w:t>
       </w:r>
     </w:p>
     <w:p>
@@ -26987,7 +26988,13 @@
         <w:rPr>
           <w:sz w:val="24"/>
         </w:rPr>
-        <w:t>Bahits, A., dkk. (2023). Manajemen Sumber Daya Manusia dalam Organisasi Modern. Bandung: Widina Bhakti Persada.</w:t>
+        <w:t>Bahits, A., dkk. (2023). Manajemen Sumber Daya Manusia dalam Organisasi M</w:t>
+      </w:r>
+      <w:r>
+        <w:rPr>
+          <w:sz w:val="24"/>
+        </w:rPr>
+        <w:t>odern. Bandung: Widina Bhakti Persada.</w:t>
       </w:r>
     </w:p>
     <w:p>
@@ -26999,20 +27006,13 @@
         <w:rPr>
           <w:sz w:val="24"/>
         </w:rPr>
-        <w:t xml:space="preserve">Butarbutar, B., &amp; Nawangsari, L. C. (2022). The Effect of Compensation and Work Discipline on Employee </w:t>
-      </w:r>
-      <w:r>
-        <w:rPr>
-          <w:i/>
-          <w:sz w:val="24"/>
-        </w:rPr>
-        <w:t>Performance</w:t>
-      </w:r>
-      <w:r>
-        <w:rPr>
-          <w:sz w:val="24"/>
-        </w:rPr>
-        <w:t xml:space="preserve"> Through Work Motivation (DPRD DKI Jakarta). International Journal of Social and Management Studies, 3(4), 88–98.</w:t>
+        <w:t>Butarbutar, B., &amp; Nawangsari, L. C. (2022). The Effect of Compensation and Work Discipline on Employee Performance Through Work Motivation (DPRD DKI Jakarta). International Journal of Social and Management Studies, 3(</w:t>
+      </w:r>
+      <w:r>
+        <w:rPr>
+          <w:sz w:val="24"/>
+        </w:rPr>
+        <w:t>4), 88-98.</w:t>
       </w:r>
     </w:p>
     <w:p>
@@ -27024,33 +27024,7 @@
         <w:rPr>
           <w:sz w:val="24"/>
         </w:rPr>
-        <w:t xml:space="preserve">Chin, W. W. (1998). The </w:t>
-      </w:r>
-      <w:r>
-        <w:rPr>
-          <w:i/>
-          <w:sz w:val="24"/>
-        </w:rPr>
-        <w:t>Partial Least squares</w:t>
-      </w:r>
-      <w:r>
-        <w:rPr>
-          <w:sz w:val="24"/>
-        </w:rPr>
-        <w:t xml:space="preserve"> Approach to </w:t>
-      </w:r>
-      <w:r>
-        <w:rPr>
-          <w:i/>
-          <w:sz w:val="24"/>
-        </w:rPr>
-        <w:t>Structural Equation Modeling</w:t>
-      </w:r>
-      <w:r>
-        <w:rPr>
-          <w:sz w:val="24"/>
-        </w:rPr>
-        <w:t>. Modern Methods for Business Research, 295(2), 295–336.</w:t>
+        <w:t>Chin, W. W. (1998). The Partial Least Squares Approach to Structural Equation Modeling. Modern Methods for Business Research, 295(2), 295-336.</w:t>
       </w:r>
     </w:p>
     <w:p>
@@ -27062,7 +27036,13 @@
         <w:rPr>
           <w:sz w:val="24"/>
         </w:rPr>
-        <w:t>Fikri, M., dkk. (2022). Manajemen Sumber Daya Manusia: Teori dan Praktik. Jakarta: PT RajaGrafindo Persada.</w:t>
+        <w:t>Fikri, M., dkk. (2022). Manajemen Sumber Daya Manusia: Teori dan Praktik. Jakarta: PT RajaGrafindo Per</w:t>
+      </w:r>
+      <w:r>
+        <w:rPr>
+          <w:sz w:val="24"/>
+        </w:rPr>
+        <w:t>sada.</w:t>
       </w:r>
     </w:p>
     <w:p>
@@ -27074,20 +27054,7 @@
         <w:rPr>
           <w:sz w:val="24"/>
         </w:rPr>
-        <w:t xml:space="preserve">Geisser, S. (1975). The </w:t>
-      </w:r>
-      <w:r>
-        <w:rPr>
-          <w:i/>
-          <w:sz w:val="24"/>
-        </w:rPr>
-        <w:t>Predictive sample reuse</w:t>
-      </w:r>
-      <w:r>
-        <w:rPr>
-          <w:sz w:val="24"/>
-        </w:rPr>
-        <w:t xml:space="preserve"> Method with Applications. Journal of the American Statistical Association, 70(350), 320–328.</w:t>
+        <w:t>Geisser, S. (1975). The Predictive Sample Reuse Method with Applications. Journal of the American Statistical Association, 70(350), 320-328.</w:t>
       </w:r>
     </w:p>
     <w:p>
@@ -27099,33 +27066,13 @@
         <w:rPr>
           <w:sz w:val="24"/>
         </w:rPr>
-        <w:t xml:space="preserve">Ghozali, I. (2021). </w:t>
-      </w:r>
-      <w:r>
-        <w:rPr>
-          <w:i/>
-          <w:sz w:val="24"/>
-        </w:rPr>
-        <w:t>Partial Least squares</w:t>
-      </w:r>
-      <w:r>
-        <w:rPr>
-          <w:sz w:val="24"/>
-        </w:rPr>
-        <w:t xml:space="preserve">: Konsep, Teknik dan Aplikasi Menggunakan Program </w:t>
-      </w:r>
-      <w:r>
-        <w:rPr>
-          <w:i/>
-          <w:sz w:val="24"/>
-        </w:rPr>
-        <w:t>SmartPLS</w:t>
-      </w:r>
-      <w:r>
-        <w:rPr>
-          <w:sz w:val="24"/>
-        </w:rPr>
-        <w:t xml:space="preserve"> 3.0 (Edisi 3). Semarang: Badan Penerbit Universitas Diponegoro.</w:t>
+        <w:t>Ghozali, I. (2021). Partial Least Squares: Konsep, Teknik dan Aplikasi Menggunakan Program SmartPLS 3.0 (Edis</w:t>
+      </w:r>
+      <w:r>
+        <w:rPr>
+          <w:sz w:val="24"/>
+        </w:rPr>
+        <w:t>i 3). Semarang: Badan Penerbit Universitas Diponegoro.</w:t>
       </w:r>
     </w:p>
     <w:p>
@@ -27137,7 +27084,7 @@
         <w:rPr>
           <w:sz w:val="24"/>
         </w:rPr>
-        <w:t>Guntoro, Djunaedi, &amp; Utami. (2024). Pengaruh Kompensasi Terhadap Kinerja Pegawai Dengan Motivasi Kerja Sebagai Variabel Mediasi pada Dinas Koperasi Nganjuk. Jurnal Ilmiah Manajemen, 11(2), 210–222.</w:t>
+        <w:t>Guntoro, Djunaedi, &amp; Utami. (2024). Pengaruh Kompensasi Terhadap Kinerja Pegawai Dengan Motivasi Kerja Sebagai Variabel Mediasi pada Dinas Koperasi Nganjuk. Jurnal Ilmiah Manajemen, 11(2), 210-222.</w:t>
       </w:r>
     </w:p>
     <w:p>
@@ -27149,33 +27096,13 @@
         <w:rPr>
           <w:sz w:val="24"/>
         </w:rPr>
-        <w:t xml:space="preserve">Hair, J. F., Hult, G. T. M., Ringle, C. M., &amp; Sarstedt, M. (2022). A Primer on </w:t>
-      </w:r>
-      <w:r>
-        <w:rPr>
-          <w:i/>
-          <w:sz w:val="24"/>
-        </w:rPr>
-        <w:t>Partial Least squares</w:t>
-      </w:r>
-      <w:r>
-        <w:rPr>
-          <w:sz w:val="24"/>
-        </w:rPr>
-        <w:t xml:space="preserve"> </w:t>
-      </w:r>
-      <w:r>
-        <w:rPr>
-          <w:i/>
-          <w:sz w:val="24"/>
-        </w:rPr>
-        <w:t>Structural Equation Modeling</w:t>
-      </w:r>
-      <w:r>
-        <w:rPr>
-          <w:sz w:val="24"/>
-        </w:rPr>
-        <w:t xml:space="preserve"> (PLS-SEM) (3rd ed.). Thousand Oaks, CA: Sage Publications.</w:t>
+        <w:t>Hai</w:t>
+      </w:r>
+      <w:r>
+        <w:rPr>
+          <w:sz w:val="24"/>
+        </w:rPr>
+        <w:t>r, J. F., Hult, G. T. M., Ringle, C. M., &amp; Sarstedt, M. (2022). A Primer on Partial Least Squares Structural Equation Modeling (PLS-SEM) (3rd ed.). Thousand Oaks, CA: Sage.</w:t>
       </w:r>
     </w:p>
     <w:p>
@@ -27211,7 +27138,13 @@
         <w:rPr>
           <w:sz w:val="24"/>
         </w:rPr>
-        <w:t>Naldi, M. K., dkk. (2025). Pengaruh Kepuasan Kerja, Gaya Kepemimpinan, dan Komitmen Organisasi terhadap Motivasi Kerja. Jurnal Riset Manajemen, 6(1), 101–112.</w:t>
+        <w:t>Naldi, M. K., dkk. (2025). Pengaruh Kepuasan Kerja, Gaya Kepemimpinan, dan Komitmen Organisasi terhadap Motivasi Kerja. Jurnal Riset Manajemen, 6(1),</w:t>
+      </w:r>
+      <w:r>
+        <w:rPr>
+          <w:sz w:val="24"/>
+        </w:rPr>
+        <w:t xml:space="preserve"> 101-112.</w:t>
       </w:r>
     </w:p>
     <w:p>
@@ -27223,20 +27156,7 @@
         <w:rPr>
           <w:sz w:val="24"/>
         </w:rPr>
-        <w:t xml:space="preserve">Noor, J. (2015). Analisis Data Penelitian Manajemen: Tren Komparasi Antara Penggunaan SPSS, </w:t>
-      </w:r>
-      <w:r>
-        <w:rPr>
-          <w:i/>
-          <w:sz w:val="24"/>
-        </w:rPr>
-        <w:t>SmartPLS</w:t>
-      </w:r>
-      <w:r>
-        <w:rPr>
-          <w:sz w:val="24"/>
-        </w:rPr>
-        <w:t>, AMOS, dan Lisrel. Jakarta: Kencana.</w:t>
+        <w:t>Noor, J. (2015). Analisis Data Penelitian Manajemen: Tren Komparasi Antara Penggunaan SPSS, SmartPLS, AMOS, dan Lisrel. Jakarta: Kencana.</w:t>
       </w:r>
     </w:p>
     <w:p>
@@ -27248,7 +27168,13 @@
         <w:rPr>
           <w:sz w:val="24"/>
         </w:rPr>
-        <w:t>Nurcahaya, B. S., &amp; Subkhan, M. (2025). Pengaruh Gaya Kepemimpinan dan Kompensasi terhadap Kinerja Karyawan melalui Motivasi Kerja sebagai Variabel Mediasi pada Pamella Tiga Yogyakarta. Jurnal Manajemen Bisnis, 15(1), 45–58.</w:t>
+        <w:t xml:space="preserve">Nurcahaya, B. S., &amp; Subkhan, M. (2025). Pengaruh Gaya Kepemimpinan dan Kompensasi terhadap Kinerja Karyawan </w:t>
+      </w:r>
+      <w:r>
+        <w:rPr>
+          <w:sz w:val="24"/>
+        </w:rPr>
+        <w:t>melalui Motivasi Kerja sebagai Variabel Mediasi pada Pamella Tiga Yogyakarta. Jurnal Manajemen Bisnis, 15(1), 45-58.</w:t>
       </w:r>
     </w:p>
     <w:p>
@@ -27272,7 +27198,13 @@
         <w:rPr>
           <w:sz w:val="24"/>
         </w:rPr>
-        <w:t>Prasetya, G. L. H., &amp; Hendarto, R. T. (2024). Pengaruh Gaya Kepemimpinan dan Kompensasi Terhadap Kinerja Karyawan Melalui Motivasi Kerja Sebagai Variable Mediasi Pada PT. Karunia Jaya Global. Jurnal Manajemen Kewirausahaan, 19(1), 34–46.</w:t>
+        <w:t xml:space="preserve">Prasetya, G. L. H., &amp; Hendarto, R. T. (2024). </w:t>
+      </w:r>
+      <w:r>
+        <w:rPr>
+          <w:sz w:val="24"/>
+        </w:rPr>
+        <w:t>Pengaruh Gaya Kepemimpinan dan Kompensasi Terhadap Kinerja Karyawan Melalui Motivasi Kerja Sebagai Variable Mediasi Pada PT. Karunia Jaya Global. Jurnal Manajemen Kewirausahaan, 19(1), 34-46.</w:t>
       </w:r>
     </w:p>
     <w:p>
@@ -27284,7 +27216,13 @@
         <w:rPr>
           <w:sz w:val="24"/>
         </w:rPr>
-        <w:t>Pratama, M. Y., &amp; Junaedi, D. (2025). Pengaruh Gaya Kepemimpinan dan Motivasi Kerja Terhadap Efektivitas Kinerja Perangkat Desa Kedung Rejoso Kecamatan Kotaanyar Kabupaten Probolinggo (Skripsi, Universitas Nurul Jadid).</w:t>
+        <w:t>Pratama, M. Y., &amp; Junaedi, D. (2025). Pengaruh Gaya Kepemimpinan</w:t>
+      </w:r>
+      <w:r>
+        <w:rPr>
+          <w:sz w:val="24"/>
+        </w:rPr>
+        <w:t xml:space="preserve"> dan Motivasi Kerja Terhadap Efektivitas Kinerja Perangkat Desa (Skripsi, Universitas Nurul Jadid).</w:t>
       </w:r>
     </w:p>
     <w:p>
@@ -27308,7 +27246,13 @@
         <w:rPr>
           <w:sz w:val="24"/>
         </w:rPr>
-        <w:t>Purwohedi, U. (2022). Metode Penelitian Kuantitatif untuk Manajemen dan Akuntansi. Jakarta: Rajawali Pers.</w:t>
+        <w:t>Purwohedi, U. (2022). Metod</w:t>
+      </w:r>
+      <w:r>
+        <w:rPr>
+          <w:sz w:val="24"/>
+        </w:rPr>
+        <w:t>e Penelitian Kuantitatif untuk Manajemen dan Akuntansi. Jakarta: Rajawali Pers.</w:t>
       </w:r>
     </w:p>
     <w:p>
@@ -27320,7 +27264,7 @@
         <w:rPr>
           <w:sz w:val="24"/>
         </w:rPr>
-        <w:t>Putri, D. R., &amp; Rozi, F. (2024). Pengaruh Kompensasi dan Lingkungan Kerja terhadap Kinerja Karyawan. Jurnal Ilmu Sumber Daya Manusia, 5(2), 140–151.</w:t>
+        <w:t>Putri, D. R., &amp; Rozi, F. (2024). Pengaruh Kompensasi dan Lingkungan Kerja terhadap Kinerja Karyawan. Jurnal Ilmu Sumber Daya Manusia, 5(2), 140-151.</w:t>
       </w:r>
     </w:p>
     <w:p>
@@ -27332,7 +27276,13 @@
         <w:rPr>
           <w:sz w:val="24"/>
         </w:rPr>
-        <w:t>Robbins, S. P., &amp; Judge, T. A. (2017). Organizational Behavior (17th ed.). Boston: Pearson.</w:t>
+        <w:t xml:space="preserve">Robbins, S. P., &amp; </w:t>
+      </w:r>
+      <w:r>
+        <w:rPr>
+          <w:sz w:val="24"/>
+        </w:rPr>
+        <w:t>Judge, T. A. (2017). Organizational Behavior (17th ed.). Boston: Pearson.</w:t>
       </w:r>
     </w:p>
     <w:p>
@@ -27344,7 +27294,7 @@
         <w:rPr>
           <w:sz w:val="24"/>
         </w:rPr>
-        <w:t>Satria, E., dkk. (2024). Pengaruh Kompensasi terhadap Kinerja Pegawai pada Kantor Pemerintahan. Jurnal Administrasi Publik, 10(1), 67–78.</w:t>
+        <w:t>Satria, E., dkk. (2024). Pengaruh Kompensasi terhadap Kinerja Pegawai pada Kantor Pemerintahan. Jurnal Administrasi Publik, 10(1), 67-78.</w:t>
       </w:r>
     </w:p>
     <w:p>
@@ -27356,7 +27306,13 @@
         <w:rPr>
           <w:sz w:val="24"/>
         </w:rPr>
-        <w:t>Stone, M. (1974). Cross-Validatory Choice and Assessment of Statistical Predictions. Journal of the Royal Statistical Society: Series B (Methodological), 36(2), 111–133.</w:t>
+        <w:t>Stone, M. (1974). Cross-Validatory Choice an</w:t>
+      </w:r>
+      <w:r>
+        <w:rPr>
+          <w:sz w:val="24"/>
+        </w:rPr>
+        <w:t>d Assessment of Statistical Predictions. Journal of the Royal Statistical Society: Series B, 36(2), 111-133.</w:t>
       </w:r>
     </w:p>
     <w:p>
@@ -27380,7 +27336,13 @@
         <w:rPr>
           <w:sz w:val="24"/>
         </w:rPr>
-        <w:t>Sudaryo, Y., dkk. (2018). Manajemen Sumber Daya Manusia: Kompensasi dan Visi Kepemimpinan. Yogyakarta: Andi Offset.</w:t>
+        <w:t>Sudaryo, Y., dkk. (2018). Manajemen Sumber Daya Manusia</w:t>
+      </w:r>
+      <w:r>
+        <w:rPr>
+          <w:sz w:val="24"/>
+        </w:rPr>
+        <w:t>: Kompensasi dan Visi Kepemimpinan. Yogyakarta: Andi Offset.</w:t>
       </w:r>
     </w:p>
     <w:p>
@@ -27404,7 +27366,13 @@
         <w:rPr>
           <w:sz w:val="24"/>
         </w:rPr>
-        <w:t>Sujarweni, V. W. (2020). Metodologi Penelitian: Lengkap, Praktis, dan Mudah Dipahami. Yogyakarta: Pustaka Baru Press.</w:t>
+        <w:t xml:space="preserve">Sujarweni, V. W. (2020). Metodologi Penelitian: Lengkap, Praktis, dan Mudah Dipahami. Yogyakarta: Pustaka </w:t>
+      </w:r>
+      <w:r>
+        <w:rPr>
+          <w:sz w:val="24"/>
+        </w:rPr>
+        <w:t>Baru Press.</w:t>
       </w:r>
     </w:p>
     <w:p>
@@ -27440,7 +27408,13 @@
         <w:rPr>
           <w:sz w:val="24"/>
         </w:rPr>
-        <w:t>Thoha, M. (2018). Kepemimpinan dalam Manajemen. Jakarta: PT RajaGrafindo Persada.</w:t>
+        <w:t>Thoha, M. (2018). Kepemimpinan dalam Manajemen. Jakarta: PT R</w:t>
+      </w:r>
+      <w:r>
+        <w:rPr>
+          <w:sz w:val="24"/>
+        </w:rPr>
+        <w:t>ajaGrafindo Persada.</w:t>
       </w:r>
     </w:p>
     <w:p>
@@ -27452,7 +27426,7 @@
         <w:rPr>
           <w:sz w:val="24"/>
         </w:rPr>
-        <w:t>Ulfah, R. A., Subiyanto, D., &amp; Kurniawan, I. S. (2020). Peran Mediasi Motivasi Kerja Pada Pengaruh Gaya Kepemimpinan Transaksional Dan Kompensasi Terhadap Kinerja Karyawan. Jurnal Kinerja, 17(2), 180–192.</w:t>
+        <w:t>Ulfah, R. A., Subiyanto, D., &amp; Kurniawan, I. S. (2020). Peran Mediasi Motivasi Kerja Pada Pengaruh Gaya Kepemimpinan Transaksional Dan Kompensasi Terhadap Kinerja Karyawan. Jurnal Kinerja, 17(2), 180-192.</w:t>
       </w:r>
     </w:p>
     <w:p>
@@ -27464,7 +27438,13 @@
         <w:rPr>
           <w:sz w:val="24"/>
         </w:rPr>
-        <w:t>Wahyudin, M. B. B., &amp; Baidlowi, I. (2025). Pengaruh Gaya Kepemimpinan, Lingkungan Kerja, dan Kompensasi terhadap Kinerja Karyawan dengan Motivasi Sebagai Variabel Mediasi pada UD. Restu Bumi. Jurnal Sains Manajemen, 7(1), 50–62.</w:t>
+        <w:t>Wahyudin, M. B. B., &amp; Baidlowi</w:t>
+      </w:r>
+      <w:r>
+        <w:rPr>
+          <w:sz w:val="24"/>
+        </w:rPr>
+        <w:t>, I. (2025). Pengaruh Gaya Kepemimpinan, Lingkungan Kerja, dan Kompensasi terhadap Kinerja Karyawan dengan Motivasi Sebagai Variabel Mediasi pada UD. Restu Bumi. Jurnal Sains Manajemen, 7(1), 50-62.</w:t>
       </w:r>
     </w:p>
     <w:p>
@@ -27476,7 +27456,13 @@
         <w:rPr>
           <w:sz w:val="24"/>
         </w:rPr>
-        <w:t>Yuliani, T. (2023). Manajemen Sumber Daya Manusia di Sektor Publik. Yogyakarta: Gava Media.</w:t>
+        <w:t>Yuliani, T. (2023). Manajemen Sumber Daya Manusia di Sekt</w:t>
+      </w:r>
+      <w:r>
+        <w:rPr>
+          <w:sz w:val="24"/>
+        </w:rPr>
+        <w:t>or Publik. Yogyakarta: Gava Media.</w:t>
       </w:r>
     </w:p>
     <w:sectPr>
@@ -27612,7 +27598,7 @@
       <w:rPr>
         <w:noProof/>
       </w:rPr>
-      <w:pict w14:anchorId="1D1B7E36">
+      <w:pict w14:anchorId="7957E2F9">
         <v:shapetype id="_x0000_t202" coordsize="21600,21600" o:spt="202" path="m,l,21600r21600,l21600,xe">
           <v:stroke joinstyle="miter"/>
           <v:path gradientshapeok="t" o:connecttype="rect"/>
@@ -27731,7 +27717,7 @@
       <w:rPr>
         <w:noProof/>
       </w:rPr>
-      <w:pict w14:anchorId="6521A8AA">
+      <w:pict w14:anchorId="40A07D3F">
         <v:shapetype id="_x0000_t202" coordsize="21600,21600" o:spt="202" path="m,l,21600r21600,l21600,xe">
           <v:stroke joinstyle="miter"/>
           <v:path gradientshapeok="t" o:connecttype="rect"/>
@@ -34325,7 +34311,7 @@
     <w:uiPriority w:val="99"/>
     <w:semiHidden/>
     <w:unhideWhenUsed/>
-    <w:rsid w:val="00D87F3F"/>
+    <w:rsid w:val="00DE006C"/>
   </w:style>
 </w:styles>
 </file>

</xml_diff>